<commit_message>
adjustments to letter templates based on feedback
</commit_message>
<xml_diff>
--- a/services/core-api/app/templates/now/Acknowledgment Letter.docx
+++ b/services/core-api/app/templates/now/Acknowledgment Letter.docx
@@ -284,14 +284,16 @@
       <w:proofErr w:type="gramStart"/>
       <w:r>
         <w:rPr>
-          <w:rFonts w:ascii="BC Sans" w:hAnsi="BC Sans"/>
-        </w:rPr>
-        <w:t>d.agent</w:t>
+          <w:rFonts w:ascii="BC Sans" w:eastAsia="BC Sans" w:hAnsi="BC Sans" w:cs="BC Sans"/>
+          <w:color w:val="000000" w:themeColor="text1"/>
+        </w:rPr>
+        <w:t>d.applicant</w:t>
       </w:r>
       <w:proofErr w:type="gramEnd"/>
       <w:r>
         <w:rPr>
-          <w:rFonts w:ascii="BC Sans" w:hAnsi="BC Sans"/>
+          <w:rFonts w:ascii="BC Sans" w:eastAsia="BC Sans" w:hAnsi="BC Sans" w:cs="BC Sans"/>
+          <w:color w:val="000000" w:themeColor="text1"/>
         </w:rPr>
         <w:t>_email</w:t>
       </w:r>
@@ -328,7 +330,16 @@
           <w:b/>
           <w:bCs/>
         </w:rPr>
-        <w:t xml:space="preserve">Re: </w:t>
+        <w:t>Re</w:t>
+      </w:r>
+      <w:proofErr w:type="gramStart"/>
+      <w:r>
+        <w:rPr>
+          <w:rFonts w:ascii="BC Sans" w:hAnsi="BC Sans"/>
+          <w:b/>
+          <w:bCs/>
+        </w:rPr>
+        <w:t xml:space="preserve">: </w:t>
       </w:r>
       <w:r>
         <w:rPr>
@@ -342,7 +353,16 @@
           <w:b/>
           <w:bCs/>
         </w:rPr>
-        <w:t xml:space="preserve">Application </w:t>
+        <w:t>Application</w:t>
+      </w:r>
+      <w:proofErr w:type="gramEnd"/>
+      <w:r>
+        <w:rPr>
+          <w:rFonts w:ascii="BC Sans" w:hAnsi="BC Sans"/>
+          <w:b/>
+          <w:bCs/>
+        </w:rPr>
+        <w:t xml:space="preserve"> </w:t>
       </w:r>
       <w:r>
         <w:rPr>
@@ -360,6 +380,7 @@
         </w:rPr>
         <w:t xml:space="preserve">a </w:t>
       </w:r>
+      <w:proofErr w:type="gramStart"/>
       <w:r>
         <w:rPr>
           <w:rFonts w:ascii="BC Sans" w:hAnsi="BC Sans"/>
@@ -376,6 +397,7 @@
         </w:rPr>
         <w:t>permit</w:t>
       </w:r>
+      <w:proofErr w:type="gramEnd"/>
     </w:p>
     <w:p>
       <w:pPr>
@@ -456,7 +478,23 @@
           <w:b/>
           <w:bCs/>
         </w:rPr>
-        <w:t>}New Permit</w:t>
+        <w:t xml:space="preserve">}New </w:t>
+      </w:r>
+      <w:r>
+        <w:rPr>
+          <w:rFonts w:ascii="BC Sans" w:hAnsi="BC Sans"/>
+          <w:b/>
+          <w:bCs/>
+        </w:rPr>
+        <w:t>p</w:t>
+      </w:r>
+      <w:r>
+        <w:rPr>
+          <w:rFonts w:ascii="BC Sans" w:hAnsi="BC Sans"/>
+          <w:b/>
+          <w:bCs/>
+        </w:rPr>
+        <w:t>ermit</w:t>
       </w:r>
       <w:r>
         <w:rPr>
@@ -473,24 +511,6 @@
           <w:bCs/>
         </w:rPr>
         <w:t>{d.application_type_</w:t>
-      </w:r>
-      <w:proofErr w:type="gramStart"/>
-      <w:r>
-        <w:rPr>
-          <w:rFonts w:ascii="BC Sans" w:hAnsi="BC Sans"/>
-          <w:b/>
-          <w:bCs/>
-        </w:rPr>
-        <w:t>code}{</w:t>
-      </w:r>
-      <w:proofErr w:type="gramEnd"/>
-      <w:r>
-        <w:rPr>
-          <w:rFonts w:ascii="BC Sans" w:hAnsi="BC Sans"/>
-          <w:b/>
-          <w:bCs/>
-        </w:rPr>
-        <w:t>d.application_type_</w:t>
       </w:r>
       <w:proofErr w:type="gramStart"/>
       <w:r>
@@ -676,7 +696,16 @@
           <w:b/>
           <w:bCs/>
         </w:rPr>
-        <w:t xml:space="preserve"> name:</w:t>
+        <w:t xml:space="preserve"> </w:t>
+      </w:r>
+      <w:proofErr w:type="gramStart"/>
+      <w:r>
+        <w:rPr>
+          <w:rFonts w:ascii="BC Sans" w:hAnsi="BC Sans"/>
+          <w:b/>
+          <w:bCs/>
+        </w:rPr>
+        <w:t>name:</w:t>
       </w:r>
       <w:r>
         <w:rPr>
@@ -687,7 +716,6 @@
         <w:t xml:space="preserve"> {</w:t>
       </w:r>
       <w:proofErr w:type="spellStart"/>
-      <w:proofErr w:type="gramStart"/>
       <w:r>
         <w:rPr>
           <w:rFonts w:ascii="BC Sans" w:hAnsi="BC Sans"/>
@@ -741,7 +769,16 @@
           <w:b/>
           <w:bCs/>
         </w:rPr>
-        <w:t xml:space="preserve"> number: </w:t>
+        <w:t xml:space="preserve"> </w:t>
+      </w:r>
+      <w:proofErr w:type="gramStart"/>
+      <w:r>
+        <w:rPr>
+          <w:rFonts w:ascii="BC Sans" w:hAnsi="BC Sans"/>
+          <w:b/>
+          <w:bCs/>
+        </w:rPr>
+        <w:t xml:space="preserve">number: </w:t>
       </w:r>
       <w:r>
         <w:rPr>
@@ -752,7 +789,6 @@
         <w:t>{</w:t>
       </w:r>
       <w:proofErr w:type="spellStart"/>
-      <w:proofErr w:type="gramStart"/>
       <w:r>
         <w:rPr>
           <w:rFonts w:ascii="BC Sans" w:hAnsi="BC Sans"/>
@@ -797,7 +833,16 @@
           <w:b/>
           <w:bCs/>
         </w:rPr>
-        <w:t xml:space="preserve">Proposed permittee: </w:t>
+        <w:t xml:space="preserve">Proposed </w:t>
+      </w:r>
+      <w:proofErr w:type="gramStart"/>
+      <w:r>
+        <w:rPr>
+          <w:rFonts w:ascii="BC Sans" w:hAnsi="BC Sans"/>
+          <w:b/>
+          <w:bCs/>
+        </w:rPr>
+        <w:t xml:space="preserve">permittee: </w:t>
       </w:r>
       <w:r>
         <w:rPr>
@@ -808,7 +853,6 @@
         <w:t>{</w:t>
       </w:r>
       <w:proofErr w:type="spellStart"/>
-      <w:proofErr w:type="gramStart"/>
       <w:r>
         <w:rPr>
           <w:rFonts w:ascii="BC Sans" w:hAnsi="BC Sans"/>
@@ -1213,7 +1257,21 @@
         <w:rPr>
           <w:rFonts w:ascii="BC Sans" w:hAnsi="BC Sans"/>
         </w:rPr>
-        <w:t>conservation, protection, and reclamation of the land, watercourses and cultural heritage resources affected by the proposed activities</w:t>
+        <w:t xml:space="preserve">conservation, protection, and reclamation of the land, </w:t>
+      </w:r>
+      <w:proofErr w:type="gramStart"/>
+      <w:r>
+        <w:rPr>
+          <w:rFonts w:ascii="BC Sans" w:hAnsi="BC Sans"/>
+        </w:rPr>
+        <w:t>watercourses</w:t>
+      </w:r>
+      <w:proofErr w:type="gramEnd"/>
+      <w:r>
+        <w:rPr>
+          <w:rFonts w:ascii="BC Sans" w:hAnsi="BC Sans"/>
+        </w:rPr>
+        <w:t xml:space="preserve"> and cultural heritage resources affected by the proposed activities</w:t>
       </w:r>
       <w:r>
         <w:rPr>
@@ -1258,7 +1316,14 @@
         <w:rPr>
           <w:rFonts w:ascii="BC Sans" w:hAnsi="BC Sans"/>
         </w:rPr>
-        <w:t>Notice of Work number</w:t>
+        <w:t xml:space="preserve">Notice of Work </w:t>
+      </w:r>
+      <w:proofErr w:type="gramStart"/>
+      <w:r>
+        <w:rPr>
+          <w:rFonts w:ascii="BC Sans" w:hAnsi="BC Sans"/>
+        </w:rPr>
+        <w:t>number</w:t>
       </w:r>
       <w:r>
         <w:rPr>
@@ -1273,6 +1338,7 @@
         <w:t xml:space="preserve"> {</w:t>
       </w:r>
       <w:proofErr w:type="spellStart"/>
+      <w:proofErr w:type="gramEnd"/>
       <w:r>
         <w:rPr>
           <w:rFonts w:ascii="BC Sans" w:hAnsi="BC Sans"/>
@@ -1308,7 +1374,14 @@
         <w:rPr>
           <w:rFonts w:ascii="BC Sans" w:hAnsi="BC Sans"/>
         </w:rPr>
-        <w:t xml:space="preserve"> and accepted</w:t>
+        <w:t xml:space="preserve"> and </w:t>
+      </w:r>
+      <w:proofErr w:type="gramStart"/>
+      <w:r>
+        <w:rPr>
+          <w:rFonts w:ascii="BC Sans" w:hAnsi="BC Sans"/>
+        </w:rPr>
+        <w:t>accepted</w:t>
       </w:r>
       <w:r>
         <w:rPr>
@@ -1329,6 +1402,7 @@
         <w:t>{</w:t>
       </w:r>
       <w:proofErr w:type="spellStart"/>
+      <w:proofErr w:type="gramEnd"/>
       <w:r>
         <w:rPr>
           <w:rFonts w:ascii="BC Sans" w:hAnsi="BC Sans"/>
@@ -1382,9 +1456,22 @@
       <w:r>
         <w:rPr>
           <w:rFonts w:ascii="BC Sans" w:hAnsi="BC Sans"/>
-          <w:color w:val="FF0000"/>
-        </w:rPr>
-        <w:t>(enter date here)</w:t>
+        </w:rPr>
+        <w:t>{</w:t>
+      </w:r>
+      <w:proofErr w:type="spellStart"/>
+      <w:r>
+        <w:rPr>
+          <w:rFonts w:ascii="BC Sans" w:hAnsi="BC Sans"/>
+        </w:rPr>
+        <w:t>d.application_dt</w:t>
+      </w:r>
+      <w:proofErr w:type="spellEnd"/>
+      <w:r>
+        <w:rPr>
+          <w:rFonts w:ascii="BC Sans" w:hAnsi="BC Sans"/>
+        </w:rPr>
+        <w:t>}</w:t>
       </w:r>
     </w:p>
     <w:p>
@@ -1418,12 +1505,19 @@
         <w:rPr>
           <w:rFonts w:ascii="BC Sans" w:hAnsi="BC Sans" w:cstheme="minorHAnsi"/>
         </w:rPr>
-        <w:t xml:space="preserve"> tracking number</w:t>
-      </w:r>
+        <w:t xml:space="preserve"> tracking </w:t>
+      </w:r>
+      <w:proofErr w:type="gramStart"/>
       <w:r>
         <w:rPr>
           <w:rFonts w:ascii="BC Sans" w:hAnsi="BC Sans" w:cstheme="minorHAnsi"/>
         </w:rPr>
+        <w:t>number</w:t>
+      </w:r>
+      <w:r>
+        <w:rPr>
+          <w:rFonts w:ascii="BC Sans" w:hAnsi="BC Sans" w:cstheme="minorHAnsi"/>
+        </w:rPr>
         <w:t>:</w:t>
       </w:r>
       <w:r>
@@ -1433,6 +1527,7 @@
         <w:t xml:space="preserve"> {</w:t>
       </w:r>
       <w:proofErr w:type="spellStart"/>
+      <w:proofErr w:type="gramEnd"/>
       <w:r>
         <w:rPr>
           <w:rFonts w:ascii="BC Sans" w:hAnsi="BC Sans" w:cstheme="minorHAnsi"/>
@@ -1633,7 +1728,6 @@
           <w:rFonts w:ascii="BC Sans" w:hAnsi="BC Sans"/>
           <w:color w:val="FF0000"/>
         </w:rPr>
-        <w:lastRenderedPageBreak/>
         <w:t>O</w:t>
       </w:r>
       <w:r>
@@ -1729,7 +1823,7 @@
           <w:color w:val="auto"/>
           <w:u w:val="none"/>
         </w:rPr>
-        <w:t xml:space="preserve">Therefore, be advised that it is your responsibility to apply for </w:t>
+        <w:t xml:space="preserve">Therefore, be advised that </w:t>
       </w:r>
       <w:r>
         <w:rPr>
@@ -1738,6 +1832,16 @@
           <w:color w:val="auto"/>
           <w:u w:val="none"/>
         </w:rPr>
+        <w:lastRenderedPageBreak/>
+        <w:t xml:space="preserve">it is your responsibility to apply for </w:t>
+      </w:r>
+      <w:r>
+        <w:rPr>
+          <w:rStyle w:val="Hyperlink"/>
+          <w:rFonts w:ascii="BC Sans" w:hAnsi="BC Sans"/>
+          <w:color w:val="auto"/>
+          <w:u w:val="none"/>
+        </w:rPr>
         <w:t>an</w:t>
       </w:r>
       <w:r>
@@ -1901,7 +2005,21 @@
         <w:rPr>
           <w:rFonts w:ascii="BC Sans" w:hAnsi="BC Sans"/>
         </w:rPr>
-        <w:t xml:space="preserve">The government agency referral period is projected to be </w:t>
+        <w:t xml:space="preserve">The </w:t>
+      </w:r>
+      <w:proofErr w:type="gramStart"/>
+      <w:r>
+        <w:rPr>
+          <w:rFonts w:ascii="BC Sans" w:hAnsi="BC Sans"/>
+        </w:rPr>
+        <w:t>government agency</w:t>
+      </w:r>
+      <w:proofErr w:type="gramEnd"/>
+      <w:r>
+        <w:rPr>
+          <w:rFonts w:ascii="BC Sans" w:hAnsi="BC Sans"/>
+        </w:rPr>
+        <w:t xml:space="preserve"> referral period is projected to be </w:t>
       </w:r>
       <w:r>
         <w:rPr>
@@ -2264,126 +2382,6 @@
           <w:rFonts w:ascii="BC Sans" w:hAnsi="BC Sans"/>
         </w:rPr>
       </w:pPr>
-    </w:p>
-    <w:p>
-      <w:pPr>
-        <w:pStyle w:val="NoSpacing"/>
-        <w:jc w:val="both"/>
-        <w:rPr>
-          <w:rStyle w:val="Strong"/>
-          <w:rFonts w:ascii="BC Sans" w:hAnsi="BC Sans"/>
-          <w:b w:val="0"/>
-          <w:bCs w:val="0"/>
-        </w:rPr>
-      </w:pPr>
-      <w:r>
-        <w:rPr>
-          <w:rFonts w:ascii="BC Sans" w:hAnsi="BC Sans"/>
-        </w:rPr>
-        <w:t>I</w:t>
-      </w:r>
-      <w:r>
-        <w:rPr>
-          <w:rFonts w:ascii="BC Sans" w:hAnsi="BC Sans"/>
-        </w:rPr>
-        <w:t>n accordance with</w:t>
-      </w:r>
-      <w:r>
-        <w:rPr>
-          <w:rFonts w:ascii="BC Sans" w:hAnsi="BC Sans"/>
-        </w:rPr>
-        <w:t xml:space="preserve"> </w:t>
-      </w:r>
-      <w:r>
-        <w:rPr>
-          <w:rFonts w:ascii="BC Sans" w:hAnsi="BC Sans"/>
-        </w:rPr>
-        <w:t xml:space="preserve">the </w:t>
-      </w:r>
-      <w:r>
-        <w:rPr>
-          <w:rFonts w:ascii="BC Sans" w:hAnsi="BC Sans"/>
-        </w:rPr>
-        <w:t xml:space="preserve">Mines Act, </w:t>
-      </w:r>
-      <w:r>
-        <w:rPr>
-          <w:rFonts w:ascii="BC Sans" w:hAnsi="BC Sans"/>
-        </w:rPr>
-        <w:t xml:space="preserve">it has been assessed </w:t>
-      </w:r>
-      <w:r>
-        <w:rPr>
-          <w:rFonts w:ascii="BC Sans" w:hAnsi="BC Sans"/>
-        </w:rPr>
-        <w:t>that you are required to</w:t>
-      </w:r>
-      <w:r>
-        <w:rPr>
-          <w:rFonts w:ascii="BC Sans" w:hAnsi="BC Sans"/>
-        </w:rPr>
-        <w:t xml:space="preserve"> post </w:t>
-      </w:r>
-      <w:r>
-        <w:rPr>
-          <w:rFonts w:ascii="BC Sans" w:hAnsi="BC Sans"/>
-        </w:rPr>
-        <w:t>financial</w:t>
-      </w:r>
-      <w:r>
-        <w:rPr>
-          <w:rFonts w:ascii="BC Sans" w:hAnsi="BC Sans"/>
-        </w:rPr>
-        <w:t xml:space="preserve"> security in the amount of</w:t>
-      </w:r>
-      <w:r>
-        <w:rPr>
-          <w:rFonts w:ascii="BC Sans" w:hAnsi="BC Sans"/>
-        </w:rPr>
-        <w:t xml:space="preserve"> </w:t>
-      </w:r>
-      <w:r>
-        <w:rPr>
-          <w:rFonts w:ascii="BC Sans" w:hAnsi="BC Sans"/>
-        </w:rPr>
-        <w:t>${</w:t>
-      </w:r>
-      <w:proofErr w:type="spellStart"/>
-      <w:proofErr w:type="gramStart"/>
-      <w:r>
-        <w:rPr>
-          <w:rFonts w:ascii="BC Sans" w:hAnsi="BC Sans"/>
-        </w:rPr>
-        <w:t>d.bond</w:t>
-      </w:r>
-      <w:proofErr w:type="gramEnd"/>
-      <w:r>
-        <w:rPr>
-          <w:rFonts w:ascii="BC Sans" w:hAnsi="BC Sans"/>
-        </w:rPr>
-        <w:t>_inc_</w:t>
-      </w:r>
-      <w:proofErr w:type="gramStart"/>
-      <w:r>
-        <w:rPr>
-          <w:rFonts w:ascii="BC Sans" w:hAnsi="BC Sans"/>
-        </w:rPr>
-        <w:t>amt:formatN</w:t>
-      </w:r>
-      <w:proofErr w:type="spellEnd"/>
-      <w:proofErr w:type="gramEnd"/>
-      <w:r>
-        <w:rPr>
-          <w:rFonts w:ascii="BC Sans" w:hAnsi="BC Sans"/>
-        </w:rPr>
-        <w:t>(2)}</w:t>
-      </w:r>
-      <w:r>
-        <w:rPr>
-          <w:rFonts w:ascii="BC Sans" w:hAnsi="BC Sans"/>
-        </w:rPr>
-        <w:t>.</w:t>
-      </w:r>
     </w:p>
     <w:p>
       <w:pPr>
@@ -2413,25 +2411,7 @@
           <w:b w:val="0"/>
           <w:bCs w:val="0"/>
         </w:rPr>
-        <w:t xml:space="preserve">This </w:t>
-      </w:r>
-      <w:r>
-        <w:rPr>
-          <w:rStyle w:val="Strong"/>
-          <w:rFonts w:ascii="BC Sans" w:hAnsi="BC Sans"/>
-          <w:b w:val="0"/>
-          <w:bCs w:val="0"/>
-        </w:rPr>
-        <w:t>will bring</w:t>
-      </w:r>
-      <w:r>
-        <w:rPr>
-          <w:rStyle w:val="Strong"/>
-          <w:rFonts w:ascii="BC Sans" w:hAnsi="BC Sans"/>
-          <w:b w:val="0"/>
-          <w:bCs w:val="0"/>
-        </w:rPr>
-        <w:t xml:space="preserve"> the total amount held under</w:t>
+        <w:t>This will bring the total amount held under</w:t>
       </w:r>
       <w:r>
         <w:rPr>
@@ -2521,6 +2501,128 @@
         </w:rPr>
         <w:t>.</w:t>
       </w:r>
+      <w:r>
+        <w:rPr>
+          <w:rFonts w:ascii="BC Sans" w:hAnsi="BC Sans"/>
+        </w:rPr>
+        <w:t xml:space="preserve"> </w:t>
+      </w:r>
+      <w:r>
+        <w:rPr>
+          <w:rFonts w:ascii="BC Sans" w:hAnsi="BC Sans"/>
+        </w:rPr>
+        <w:t>I</w:t>
+      </w:r>
+      <w:r>
+        <w:rPr>
+          <w:rFonts w:ascii="BC Sans" w:hAnsi="BC Sans"/>
+        </w:rPr>
+        <w:t>n accordance with</w:t>
+      </w:r>
+      <w:r>
+        <w:rPr>
+          <w:rFonts w:ascii="BC Sans" w:hAnsi="BC Sans"/>
+        </w:rPr>
+        <w:t xml:space="preserve"> </w:t>
+      </w:r>
+      <w:r>
+        <w:rPr>
+          <w:rFonts w:ascii="BC Sans" w:hAnsi="BC Sans"/>
+        </w:rPr>
+        <w:t xml:space="preserve">the </w:t>
+      </w:r>
+      <w:r>
+        <w:rPr>
+          <w:rFonts w:ascii="BC Sans" w:hAnsi="BC Sans"/>
+        </w:rPr>
+        <w:t xml:space="preserve">Mines Act, </w:t>
+      </w:r>
+      <w:r>
+        <w:rPr>
+          <w:rFonts w:ascii="BC Sans" w:hAnsi="BC Sans"/>
+        </w:rPr>
+        <w:t xml:space="preserve">it has been assessed </w:t>
+      </w:r>
+      <w:r>
+        <w:rPr>
+          <w:rFonts w:ascii="BC Sans" w:hAnsi="BC Sans"/>
+        </w:rPr>
+        <w:t>that you are required to</w:t>
+      </w:r>
+      <w:r>
+        <w:rPr>
+          <w:rFonts w:ascii="BC Sans" w:hAnsi="BC Sans"/>
+        </w:rPr>
+        <w:t xml:space="preserve"> post </w:t>
+      </w:r>
+      <w:r>
+        <w:rPr>
+          <w:rFonts w:ascii="BC Sans" w:hAnsi="BC Sans"/>
+        </w:rPr>
+        <w:t>financial</w:t>
+      </w:r>
+      <w:r>
+        <w:rPr>
+          <w:rFonts w:ascii="BC Sans" w:hAnsi="BC Sans"/>
+        </w:rPr>
+        <w:t xml:space="preserve"> security in the amount of</w:t>
+      </w:r>
+      <w:r>
+        <w:rPr>
+          <w:rFonts w:ascii="BC Sans" w:hAnsi="BC Sans"/>
+        </w:rPr>
+        <w:t xml:space="preserve"> </w:t>
+      </w:r>
+      <w:r>
+        <w:rPr>
+          <w:rFonts w:ascii="BC Sans" w:hAnsi="BC Sans"/>
+        </w:rPr>
+        <w:t>${</w:t>
+      </w:r>
+      <w:proofErr w:type="spellStart"/>
+      <w:proofErr w:type="gramStart"/>
+      <w:r>
+        <w:rPr>
+          <w:rFonts w:ascii="BC Sans" w:hAnsi="BC Sans"/>
+        </w:rPr>
+        <w:t>d.bond</w:t>
+      </w:r>
+      <w:proofErr w:type="gramEnd"/>
+      <w:r>
+        <w:rPr>
+          <w:rFonts w:ascii="BC Sans" w:hAnsi="BC Sans"/>
+        </w:rPr>
+        <w:t>_inc_</w:t>
+      </w:r>
+      <w:proofErr w:type="gramStart"/>
+      <w:r>
+        <w:rPr>
+          <w:rFonts w:ascii="BC Sans" w:hAnsi="BC Sans"/>
+        </w:rPr>
+        <w:t>amt:formatN</w:t>
+      </w:r>
+      <w:proofErr w:type="spellEnd"/>
+      <w:proofErr w:type="gramEnd"/>
+      <w:r>
+        <w:rPr>
+          <w:rFonts w:ascii="BC Sans" w:hAnsi="BC Sans"/>
+        </w:rPr>
+        <w:t>(</w:t>
+      </w:r>
+      <w:proofErr w:type="gramStart"/>
+      <w:r>
+        <w:rPr>
+          <w:rFonts w:ascii="BC Sans" w:hAnsi="BC Sans"/>
+        </w:rPr>
+        <w:t>2)}</w:t>
+      </w:r>
+      <w:proofErr w:type="gramEnd"/>
+      <w:r>
+        <w:rPr>
+          <w:rFonts w:ascii="BC Sans" w:hAnsi="BC Sans"/>
+        </w:rPr>
+        <w:t>.</w:t>
+      </w:r>
     </w:p>
     <w:p>
       <w:pPr>
@@ -2844,12 +2946,14 @@
         </w:rPr>
         <w:t xml:space="preserve"> mail </w:t>
       </w:r>
+      <w:proofErr w:type="gramStart"/>
       <w:r>
         <w:rPr>
           <w:rFonts w:ascii="BC Sans" w:hAnsi="BC Sans"/>
         </w:rPr>
         <w:t>all reclamation</w:t>
       </w:r>
+      <w:proofErr w:type="gramEnd"/>
       <w:r>
         <w:rPr>
           <w:rFonts w:ascii="BC Sans" w:hAnsi="BC Sans"/>
@@ -3057,8 +3161,9 @@
           <w:szCs w:val="22"/>
           <w:lang w:val="en-CA"/>
         </w:rPr>
-        <w:t xml:space="preserve">Other legislation may be applicable to your operation and, as the Permittee, you may be required to obtain approvals or permits under that legislation, such as for road use </w:t>
-      </w:r>
+        <w:t xml:space="preserve">Other legislation may be applicable to your operation and, as the Permittee, you may </w:t>
+      </w:r>
+      <w:proofErr w:type="gramStart"/>
       <w:r>
         <w:rPr>
           <w:rFonts w:ascii="BC Sans" w:eastAsia="Calibri" w:hAnsi="BC Sans" w:cs="Arial"/>
@@ -3067,8 +3172,9 @@
           <w:szCs w:val="22"/>
           <w:lang w:val="en-CA"/>
         </w:rPr>
-        <w:t>or operation of a camp</w:t>
-      </w:r>
+        <w:t>be required</w:t>
+      </w:r>
+      <w:proofErr w:type="gramEnd"/>
       <w:r>
         <w:rPr>
           <w:rFonts w:ascii="BC Sans" w:eastAsia="Calibri" w:hAnsi="BC Sans" w:cs="Arial"/>
@@ -3077,7 +3183,7 @@
           <w:szCs w:val="22"/>
           <w:lang w:val="en-CA"/>
         </w:rPr>
-        <w:t xml:space="preserve">. It is your responsibility to comply with the terms and conditions of all other permits and </w:t>
+        <w:t xml:space="preserve"> to obtain approvals or permits under that legislation, such as for road use </w:t>
       </w:r>
       <w:r>
         <w:rPr>
@@ -3087,8 +3193,7 @@
           <w:szCs w:val="22"/>
           <w:lang w:val="en-CA"/>
         </w:rPr>
-        <w:lastRenderedPageBreak/>
-        <w:t xml:space="preserve">authorizations which </w:t>
+        <w:t>or operation of a camp</w:t>
       </w:r>
       <w:r>
         <w:rPr>
@@ -3098,7 +3203,7 @@
           <w:szCs w:val="22"/>
           <w:lang w:val="en-CA"/>
         </w:rPr>
-        <w:t>may b</w:t>
+        <w:t xml:space="preserve">. It is your responsibility to comply with the terms and conditions of all other permits and authorizations which </w:t>
       </w:r>
       <w:r>
         <w:rPr>
@@ -3108,7 +3213,7 @@
           <w:szCs w:val="22"/>
           <w:lang w:val="en-CA"/>
         </w:rPr>
-        <w:t xml:space="preserve">e issued </w:t>
+        <w:t>may b</w:t>
       </w:r>
       <w:r>
         <w:rPr>
@@ -3118,7 +3223,7 @@
           <w:szCs w:val="22"/>
           <w:lang w:val="en-CA"/>
         </w:rPr>
-        <w:t xml:space="preserve">to you </w:t>
+        <w:t xml:space="preserve">e issued </w:t>
       </w:r>
       <w:r>
         <w:rPr>
@@ -3128,19 +3233,7 @@
           <w:szCs w:val="22"/>
           <w:lang w:val="en-CA"/>
         </w:rPr>
-        <w:t xml:space="preserve">and all </w:t>
-      </w:r>
-      <w:r>
-        <w:rPr>
-          <w:rFonts w:ascii="BC Sans" w:eastAsia="Calibri" w:hAnsi="BC Sans" w:cs="Arial"/>
-          <w:b/>
-          <w:bCs/>
-          <w:kern w:val="2"/>
-          <w:sz w:val="22"/>
-          <w:szCs w:val="22"/>
-          <w:lang w:val="en-CA"/>
-        </w:rPr>
-        <w:t>other applicable legislation</w:t>
+        <w:t xml:space="preserve">to you </w:t>
       </w:r>
       <w:r>
         <w:rPr>
@@ -3150,7 +3243,32 @@
           <w:szCs w:val="22"/>
           <w:lang w:val="en-CA"/>
         </w:rPr>
-        <w:t xml:space="preserve"> including </w:t>
+        <w:t xml:space="preserve">and all </w:t>
+      </w:r>
+      <w:r>
+        <w:rPr>
+          <w:rFonts w:ascii="BC Sans" w:eastAsia="Calibri" w:hAnsi="BC Sans" w:cs="Arial"/>
+          <w:b/>
+          <w:bCs/>
+          <w:kern w:val="2"/>
+          <w:sz w:val="22"/>
+          <w:szCs w:val="22"/>
+          <w:lang w:val="en-CA"/>
+        </w:rPr>
+        <w:t xml:space="preserve">other applicable </w:t>
+      </w:r>
+      <w:r>
+        <w:rPr>
+          <w:rFonts w:ascii="BC Sans" w:eastAsia="Calibri" w:hAnsi="BC Sans" w:cs="Arial"/>
+          <w:b/>
+          <w:bCs/>
+          <w:kern w:val="2"/>
+          <w:sz w:val="22"/>
+          <w:szCs w:val="22"/>
+          <w:lang w:val="en-CA"/>
+        </w:rPr>
+        <w:lastRenderedPageBreak/>
+        <w:t>legislation</w:t>
       </w:r>
       <w:r>
         <w:rPr>
@@ -3160,7 +3278,39 @@
           <w:szCs w:val="22"/>
           <w:lang w:val="en-CA"/>
         </w:rPr>
-        <w:t xml:space="preserve">but not limited to </w:t>
+        <w:t xml:space="preserve"> </w:t>
+      </w:r>
+      <w:proofErr w:type="gramStart"/>
+      <w:r>
+        <w:rPr>
+          <w:rFonts w:ascii="BC Sans" w:eastAsia="Calibri" w:hAnsi="BC Sans" w:cs="Arial"/>
+          <w:kern w:val="2"/>
+          <w:sz w:val="22"/>
+          <w:szCs w:val="22"/>
+          <w:lang w:val="en-CA"/>
+        </w:rPr>
+        <w:t xml:space="preserve">including </w:t>
+      </w:r>
+      <w:r>
+        <w:rPr>
+          <w:rFonts w:ascii="BC Sans" w:eastAsia="Calibri" w:hAnsi="BC Sans" w:cs="Arial"/>
+          <w:kern w:val="2"/>
+          <w:sz w:val="22"/>
+          <w:szCs w:val="22"/>
+          <w:lang w:val="en-CA"/>
+        </w:rPr>
+        <w:t>but not limited to</w:t>
+      </w:r>
+      <w:proofErr w:type="gramEnd"/>
+      <w:r>
+        <w:rPr>
+          <w:rFonts w:ascii="BC Sans" w:eastAsia="Calibri" w:hAnsi="BC Sans" w:cs="Arial"/>
+          <w:kern w:val="2"/>
+          <w:sz w:val="22"/>
+          <w:szCs w:val="22"/>
+          <w:lang w:val="en-CA"/>
+        </w:rPr>
+        <w:t xml:space="preserve"> </w:t>
       </w:r>
       <w:r>
         <w:rPr>
@@ -3914,7 +4064,27 @@
           <w:color w:val="auto"/>
           <w:u w:val="none"/>
         </w:rPr>
-        <w:t>It is your responsibility to have all necessary authorizations in place for the operation of an industrial camp</w:t>
+        <w:t xml:space="preserve">It is your responsibility to have all necessary </w:t>
+      </w:r>
+      <w:proofErr w:type="gramStart"/>
+      <w:r>
+        <w:rPr>
+          <w:rStyle w:val="Hyperlink"/>
+          <w:rFonts w:ascii="BC Sans" w:hAnsi="BC Sans" w:cs="Calibri"/>
+          <w:color w:val="auto"/>
+          <w:u w:val="none"/>
+        </w:rPr>
+        <w:t>authorizations</w:t>
+      </w:r>
+      <w:proofErr w:type="gramEnd"/>
+      <w:r>
+        <w:rPr>
+          <w:rStyle w:val="Hyperlink"/>
+          <w:rFonts w:ascii="BC Sans" w:hAnsi="BC Sans" w:cs="Calibri"/>
+          <w:color w:val="auto"/>
+          <w:u w:val="none"/>
+        </w:rPr>
+        <w:t xml:space="preserve"> in place for the operation of an industrial camp</w:t>
       </w:r>
       <w:r>
         <w:rPr>
@@ -4081,8 +4251,16 @@
               <w:rPr>
                 <w:rFonts w:ascii="BC Sans" w:hAnsi="BC Sans"/>
               </w:rPr>
-              <w:t>Forest licensee</w:t>
+              <w:t xml:space="preserve">Forest </w:t>
             </w:r>
+            <w:proofErr w:type="gramStart"/>
+            <w:r>
+              <w:rPr>
+                <w:rFonts w:ascii="BC Sans" w:hAnsi="BC Sans"/>
+              </w:rPr>
+              <w:t>licensee</w:t>
+            </w:r>
+            <w:proofErr w:type="gramEnd"/>
           </w:p>
           <w:p>
             <w:pPr>
@@ -4300,8 +4478,16 @@
               <w:rPr>
                 <w:rFonts w:ascii="BC Sans" w:hAnsi="BC Sans"/>
               </w:rPr>
-              <w:t>transmission line</w:t>
+              <w:t xml:space="preserve">transmission </w:t>
             </w:r>
+            <w:proofErr w:type="gramStart"/>
+            <w:r>
+              <w:rPr>
+                <w:rFonts w:ascii="BC Sans" w:hAnsi="BC Sans"/>
+              </w:rPr>
+              <w:t>line</w:t>
+            </w:r>
+            <w:proofErr w:type="gramEnd"/>
             <w:r>
               <w:rPr>
                 <w:rFonts w:ascii="BC Sans" w:hAnsi="BC Sans"/>
@@ -4318,8 +4504,16 @@
               <w:rPr>
                 <w:rFonts w:ascii="BC Sans" w:hAnsi="BC Sans"/>
               </w:rPr>
-              <w:t>or other energy tenure holder</w:t>
+              <w:t xml:space="preserve">or other energy tenure </w:t>
             </w:r>
+            <w:proofErr w:type="gramStart"/>
+            <w:r>
+              <w:rPr>
+                <w:rFonts w:ascii="BC Sans" w:hAnsi="BC Sans"/>
+              </w:rPr>
+              <w:t>holder</w:t>
+            </w:r>
+            <w:proofErr w:type="gramEnd"/>
           </w:p>
           <w:p>
             <w:pPr>
@@ -4345,7 +4539,6 @@
         <w:rPr>
           <w:rFonts w:ascii="BC Sans" w:hAnsi="BC Sans"/>
         </w:rPr>
-        <w:lastRenderedPageBreak/>
         <w:t xml:space="preserve">A variety of </w:t>
       </w:r>
       <w:r>
@@ -4689,7 +4882,23 @@
           <w:rFonts w:ascii="BC Sans" w:eastAsia="BC Sans" w:hAnsi="BC Sans" w:cs="BC Sans"/>
           <w:color w:val="000000" w:themeColor="text1"/>
         </w:rPr>
-        <w:t>, among other legislation, and you are advised to familiarize yourself with the Mines Act and the Code. The Code and its guidance documents are periodically updated. Ensure to check the Code</w:t>
+        <w:t xml:space="preserve">, among other legislation, and you are advised to familiarize yourself with the Mines Act and the Code. The Code and its guidance documents are periodically updated. </w:t>
+      </w:r>
+      <w:proofErr w:type="gramStart"/>
+      <w:r>
+        <w:rPr>
+          <w:rFonts w:ascii="BC Sans" w:eastAsia="BC Sans" w:hAnsi="BC Sans" w:cs="BC Sans"/>
+          <w:color w:val="000000" w:themeColor="text1"/>
+        </w:rPr>
+        <w:t>Ensure</w:t>
+      </w:r>
+      <w:proofErr w:type="gramEnd"/>
+      <w:r>
+        <w:rPr>
+          <w:rFonts w:ascii="BC Sans" w:eastAsia="BC Sans" w:hAnsi="BC Sans" w:cs="BC Sans"/>
+          <w:color w:val="000000" w:themeColor="text1"/>
+        </w:rPr>
+        <w:t xml:space="preserve"> to check the Code</w:t>
       </w:r>
       <w:r>
         <w:rPr>
@@ -4776,13 +4985,29 @@
           <w:rFonts w:ascii="BC Sans" w:hAnsi="BC Sans"/>
           <w:lang w:val="en-CA"/>
         </w:rPr>
-        <w:t xml:space="preserve"> public advertising will be required for this application</w:t>
-      </w:r>
+        <w:t xml:space="preserve"> public advertising will </w:t>
+      </w:r>
+      <w:proofErr w:type="gramStart"/>
       <w:r>
         <w:rPr>
           <w:rFonts w:ascii="BC Sans" w:hAnsi="BC Sans"/>
           <w:lang w:val="en-CA"/>
         </w:rPr>
+        <w:t>be required</w:t>
+      </w:r>
+      <w:proofErr w:type="gramEnd"/>
+      <w:r>
+        <w:rPr>
+          <w:rFonts w:ascii="BC Sans" w:hAnsi="BC Sans"/>
+          <w:lang w:val="en-CA"/>
+        </w:rPr>
+        <w:t xml:space="preserve"> for this application</w:t>
+      </w:r>
+      <w:r>
+        <w:rPr>
+          <w:rFonts w:ascii="BC Sans" w:hAnsi="BC Sans"/>
+          <w:lang w:val="en-CA"/>
+        </w:rPr>
         <w:t xml:space="preserve">. </w:t>
       </w:r>
       <w:r>
@@ -4790,15 +5015,31 @@
           <w:rFonts w:ascii="BC Sans" w:hAnsi="BC Sans"/>
           <w:lang w:val="en-CA"/>
         </w:rPr>
-        <w:t xml:space="preserve">You are required to publish a </w:t>
-      </w:r>
-      <w:r>
-        <w:rPr>
-          <w:rFonts w:ascii="BC Sans" w:hAnsi="BC Sans"/>
-          <w:b/>
-          <w:bCs/>
+        <w:t xml:space="preserve">You </w:t>
+      </w:r>
+      <w:proofErr w:type="gramStart"/>
+      <w:r>
+        <w:rPr>
+          <w:rFonts w:ascii="BC Sans" w:hAnsi="BC Sans"/>
           <w:lang w:val="en-CA"/>
         </w:rPr>
+        <w:t>are required</w:t>
+      </w:r>
+      <w:proofErr w:type="gramEnd"/>
+      <w:r>
+        <w:rPr>
+          <w:rFonts w:ascii="BC Sans" w:hAnsi="BC Sans"/>
+          <w:lang w:val="en-CA"/>
+        </w:rPr>
+        <w:t xml:space="preserve"> to publish a </w:t>
+      </w:r>
+      <w:r>
+        <w:rPr>
+          <w:rFonts w:ascii="BC Sans" w:hAnsi="BC Sans"/>
+          <w:b/>
+          <w:bCs/>
+          <w:lang w:val="en-CA"/>
+        </w:rPr>
         <w:t>Notice of Filing</w:t>
       </w:r>
       <w:r>
@@ -4906,7 +5147,23 @@
           <w:rFonts w:ascii="BC Sans" w:hAnsi="BC Sans"/>
           <w:lang w:val="en-CA"/>
         </w:rPr>
-        <w:t>When these drafts have been approved you may then submit the</w:t>
+        <w:t xml:space="preserve">When these drafts have </w:t>
+      </w:r>
+      <w:proofErr w:type="gramStart"/>
+      <w:r>
+        <w:rPr>
+          <w:rFonts w:ascii="BC Sans" w:hAnsi="BC Sans"/>
+          <w:lang w:val="en-CA"/>
+        </w:rPr>
+        <w:t>been approved</w:t>
+      </w:r>
+      <w:proofErr w:type="gramEnd"/>
+      <w:r>
+        <w:rPr>
+          <w:rFonts w:ascii="BC Sans" w:hAnsi="BC Sans"/>
+          <w:lang w:val="en-CA"/>
+        </w:rPr>
+        <w:t xml:space="preserve"> you may then submit the</w:t>
       </w:r>
       <w:r>
         <w:rPr>
@@ -5634,19 +5891,17 @@
         <w:br/>
         <w:t xml:space="preserve">Inspector </w:t>
       </w:r>
-      <w:proofErr w:type="gramStart"/>
-      <w:r>
-        <w:rPr>
-          <w:rFonts w:ascii="BC Sans" w:hAnsi="BC Sans"/>
-        </w:rPr>
-        <w:t>Of</w:t>
-      </w:r>
-      <w:proofErr w:type="gramEnd"/>
-      <w:r>
-        <w:rPr>
-          <w:rFonts w:ascii="BC Sans" w:hAnsi="BC Sans"/>
-        </w:rPr>
-        <w:t xml:space="preserve"> Mines</w:t>
+      <w:r>
+        <w:rPr>
+          <w:rFonts w:ascii="BC Sans" w:hAnsi="BC Sans"/>
+        </w:rPr>
+        <w:t>o</w:t>
+      </w:r>
+      <w:r>
+        <w:rPr>
+          <w:rFonts w:ascii="BC Sans" w:hAnsi="BC Sans"/>
+        </w:rPr>
+        <w:t>f Mines</w:t>
       </w:r>
       <w:r>
         <w:rPr>
@@ -5818,6 +6073,12 @@
 <file path=word/footer1.xml><?xml version="1.0" encoding="utf-8"?>
 <w:ftr xmlns:wpc="http://schemas.microsoft.com/office/word/2010/wordprocessingCanvas" xmlns:cx="http://schemas.microsoft.com/office/drawing/2014/chartex" xmlns:cx1="http://schemas.microsoft.com/office/drawing/2015/9/8/chartex" xmlns:cx2="http://schemas.microsoft.com/office/drawing/2015/10/21/chartex" xmlns:cx3="http://schemas.microsoft.com/office/drawing/2016/5/9/chartex" xmlns:cx4="http://schemas.microsoft.com/office/drawing/2016/5/10/chartex" xmlns:cx5="http://schemas.microsoft.com/office/drawing/2016/5/11/chartex" xmlns:cx6="http://schemas.microsoft.com/office/drawing/2016/5/12/chartex" xmlns:cx7="http://schemas.microsoft.com/office/drawing/2016/5/13/chartex" xmlns:cx8="http://schemas.microsoft.com/office/drawing/2016/5/14/chartex" xmlns:mc="http://schemas.openxmlformats.org/markup-compatibility/2006" xmlns:aink="http://schemas.microsoft.com/office/drawing/2016/ink" xmlns:am3d="http://schemas.microsoft.com/office/drawing/2017/model3d" xmlns:o="urn:schemas-microsoft-com:office:office" xmlns:oel="http://schemas.microsoft.com/office/2019/extlst" xmlns:r="http://schemas.openxmlformats.org/officeDocument/2006/relationships" xmlns:m="http://schemas.openxmlformats.org/officeDocument/2006/math" xmlns:v="urn:schemas-microsoft-com:vml" xmlns:wp14="http://schemas.microsoft.com/office/word/2010/wordprocessingDrawing" xmlns:wp="http://schemas.openxmlformats.org/drawingml/2006/wordprocessingDrawing" xmlns:w10="urn:schemas-microsoft-com:office:word" xmlns:w="http://schemas.openxmlformats.org/wordprocessingml/2006/main" xmlns:w14="http://schemas.microsoft.com/office/word/2010/wordml" xmlns:w15="http://schemas.microsoft.com/office/word/2012/wordml" xmlns:w16cex="http://schemas.microsoft.com/office/word/2018/wordml/cex" xmlns:w16cid="http://schemas.microsoft.com/office/word/2016/wordml/cid" xmlns:w16="http://schemas.microsoft.com/office/word/2018/wordml" xmlns:w16du="http://schemas.microsoft.com/office/word/2023/wordml/word16du" xmlns:w16sdtdh="http://schemas.microsoft.com/office/word/2020/wordml/sdtdatahash" xmlns:w16sdtfl="http://schemas.microsoft.com/office/word/2024/wordml/sdtformatlock" xmlns:w16se="http://schemas.microsoft.com/office/word/2015/wordml/symex" xmlns:wpg="http://schemas.microsoft.com/office/word/2010/wordprocessingGroup" xmlns:wpi="http://schemas.microsoft.com/office/word/2010/wordprocessingInk" xmlns:wne="http://schemas.microsoft.com/office/word/2006/wordml" xmlns:wps="http://schemas.microsoft.com/office/word/2010/wordprocessingShape" mc:Ignorable="w14 w15 w16se w16cid w16 w16cex w16sdtdh w16sdtfl w16du wp14">
   <w:p>
+    <w:pPr>
+      <w:rPr>
+        <w:sz w:val="16"/>
+        <w:szCs w:val="16"/>
+      </w:rPr>
+    </w:pPr>
     <w:bookmarkStart w:id="7" w:name="OLE_LINK6"/>
     <w:bookmarkStart w:id="8" w:name="OLE_LINK7"/>
     <w:bookmarkStart w:id="9" w:name="_Hlk199502121"/>
@@ -5831,9 +6092,9 @@
       <w:tblLook w:val="0000" w:firstRow="0" w:lastRow="0" w:firstColumn="0" w:lastColumn="0" w:noHBand="0" w:noVBand="0"/>
     </w:tblPr>
     <w:tblGrid>
-      <w:gridCol w:w="3196"/>
-      <w:gridCol w:w="2934"/>
-      <w:gridCol w:w="3230"/>
+      <w:gridCol w:w="3402"/>
+      <w:gridCol w:w="2977"/>
+      <w:gridCol w:w="2981"/>
     </w:tblGrid>
     <w:tr>
       <w:trPr>
@@ -5849,14 +6110,16 @@
             <w:rPr>
               <w:rFonts w:asciiTheme="minorHAnsi" w:hAnsiTheme="minorHAnsi" w:cstheme="minorHAnsi"/>
               <w:b/>
-              <w:sz w:val="20"/>
+              <w:sz w:val="16"/>
+              <w:szCs w:val="16"/>
             </w:rPr>
           </w:pPr>
           <w:r>
             <w:rPr>
               <w:rFonts w:asciiTheme="minorHAnsi" w:hAnsiTheme="minorHAnsi" w:cstheme="minorHAnsi"/>
               <w:b/>
-              <w:sz w:val="20"/>
+              <w:sz w:val="16"/>
+              <w:szCs w:val="16"/>
             </w:rPr>
             <w:t>M</w:t>
           </w:r>
@@ -5864,7 +6127,8 @@
             <w:rPr>
               <w:rFonts w:asciiTheme="minorHAnsi" w:hAnsiTheme="minorHAnsi" w:cstheme="minorHAnsi"/>
               <w:b/>
-              <w:sz w:val="20"/>
+              <w:sz w:val="16"/>
+              <w:szCs w:val="16"/>
             </w:rPr>
             <w:t xml:space="preserve">inistry of </w:t>
           </w:r>
@@ -5872,7 +6136,8 @@
             <w:rPr>
               <w:rFonts w:asciiTheme="minorHAnsi" w:hAnsiTheme="minorHAnsi" w:cstheme="minorHAnsi"/>
               <w:b/>
-              <w:sz w:val="20"/>
+              <w:sz w:val="16"/>
+              <w:szCs w:val="16"/>
             </w:rPr>
             <w:t>Mining and Critical Minerals</w:t>
           </w:r>
@@ -5882,13 +6147,15 @@
             <w:ind w:left="-90"/>
             <w:rPr>
               <w:rFonts w:asciiTheme="minorHAnsi" w:hAnsiTheme="minorHAnsi" w:cstheme="minorBidi"/>
-              <w:sz w:val="20"/>
+              <w:sz w:val="16"/>
+              <w:szCs w:val="16"/>
             </w:rPr>
           </w:pPr>
           <w:r>
             <w:rPr>
               <w:rFonts w:asciiTheme="minorHAnsi" w:hAnsiTheme="minorHAnsi" w:cstheme="minorBidi"/>
-              <w:sz w:val="20"/>
+              <w:sz w:val="16"/>
+              <w:szCs w:val="16"/>
             </w:rPr>
             <w:t>Mine Authorizations and Competitiveness Division,</w:t>
           </w:r>
@@ -5898,13 +6165,15 @@
             <w:ind w:left="-90"/>
             <w:rPr>
               <w:rFonts w:asciiTheme="minorHAnsi" w:hAnsiTheme="minorHAnsi" w:cstheme="minorBidi"/>
-              <w:sz w:val="20"/>
+              <w:sz w:val="16"/>
+              <w:szCs w:val="16"/>
             </w:rPr>
           </w:pPr>
           <w:r>
             <w:rPr>
               <w:rFonts w:asciiTheme="minorHAnsi" w:hAnsiTheme="minorHAnsi" w:cstheme="minorBidi"/>
-              <w:sz w:val="20"/>
+              <w:sz w:val="16"/>
+              <w:szCs w:val="16"/>
             </w:rPr>
             <w:t xml:space="preserve">Regional Operations Branch  </w:t>
           </w:r>
@@ -5914,7 +6183,8 @@
             <w:rPr>
               <w:rFonts w:asciiTheme="minorHAnsi" w:hAnsiTheme="minorHAnsi" w:cstheme="minorHAnsi"/>
               <w:bCs/>
-              <w:sz w:val="20"/>
+              <w:sz w:val="16"/>
+              <w:szCs w:val="16"/>
             </w:rPr>
           </w:pPr>
         </w:p>
@@ -5928,14 +6198,16 @@
             <w:rPr>
               <w:rFonts w:asciiTheme="minorHAnsi" w:hAnsiTheme="minorHAnsi" w:cstheme="minorHAnsi"/>
               <w:b/>
-              <w:sz w:val="20"/>
+              <w:sz w:val="16"/>
+              <w:szCs w:val="16"/>
             </w:rPr>
           </w:pPr>
           <w:r>
             <w:rPr>
               <w:rFonts w:asciiTheme="minorHAnsi" w:hAnsiTheme="minorHAnsi" w:cstheme="minorHAnsi"/>
               <w:b/>
-              <w:sz w:val="20"/>
+              <w:sz w:val="16"/>
+              <w:szCs w:val="16"/>
             </w:rPr>
             <w:t>Contact</w:t>
           </w:r>
@@ -5944,14 +6216,16 @@
           <w:pPr>
             <w:rPr>
               <w:rFonts w:asciiTheme="minorHAnsi" w:hAnsiTheme="minorHAnsi" w:cstheme="minorBidi"/>
-              <w:sz w:val="20"/>
+              <w:sz w:val="16"/>
+              <w:szCs w:val="16"/>
               <w:highlight w:val="yellow"/>
             </w:rPr>
           </w:pPr>
           <w:r>
             <w:rPr>
               <w:rFonts w:asciiTheme="minorHAnsi" w:hAnsiTheme="minorHAnsi" w:cstheme="minorBidi"/>
-              <w:sz w:val="20"/>
+              <w:sz w:val="16"/>
+              <w:szCs w:val="16"/>
             </w:rPr>
             <w:t>{</w:t>
           </w:r>
@@ -5959,7 +6233,8 @@
           <w:r>
             <w:rPr>
               <w:rFonts w:asciiTheme="minorHAnsi" w:hAnsiTheme="minorHAnsi" w:cstheme="minorBidi"/>
-              <w:sz w:val="20"/>
+              <w:sz w:val="16"/>
+              <w:szCs w:val="16"/>
             </w:rPr>
             <w:t>d.rc_office_email</w:t>
           </w:r>
@@ -5967,29 +6242,26 @@
           <w:r>
             <w:rPr>
               <w:rFonts w:asciiTheme="minorHAnsi" w:hAnsiTheme="minorHAnsi" w:cstheme="minorBidi"/>
-              <w:sz w:val="20"/>
+              <w:sz w:val="16"/>
+              <w:szCs w:val="16"/>
             </w:rPr>
             <w:t>}</w:t>
           </w:r>
           <w:r>
             <w:rPr>
               <w:rFonts w:asciiTheme="minorHAnsi" w:hAnsiTheme="minorHAnsi" w:cstheme="minorBidi"/>
-              <w:sz w:val="20"/>
+              <w:sz w:val="16"/>
+              <w:szCs w:val="16"/>
             </w:rPr>
             <w:br/>
-          </w:r>
-          <w:r>
-            <w:rPr>
-              <w:rFonts w:asciiTheme="minorHAnsi" w:hAnsiTheme="minorHAnsi" w:cstheme="minorBidi"/>
-              <w:sz w:val="20"/>
-            </w:rPr>
             <w:t>{</w:t>
           </w:r>
           <w:proofErr w:type="spellStart"/>
           <w:r>
             <w:rPr>
               <w:rFonts w:asciiTheme="minorHAnsi" w:hAnsiTheme="minorHAnsi" w:cstheme="minorBidi"/>
-              <w:sz w:val="20"/>
+              <w:sz w:val="16"/>
+              <w:szCs w:val="16"/>
             </w:rPr>
             <w:t>d.rc_office_phone_number</w:t>
           </w:r>
@@ -5997,7 +6269,8 @@
           <w:r>
             <w:rPr>
               <w:rFonts w:asciiTheme="minorHAnsi" w:hAnsiTheme="minorHAnsi" w:cstheme="minorBidi"/>
-              <w:sz w:val="20"/>
+              <w:sz w:val="16"/>
+              <w:szCs w:val="16"/>
             </w:rPr>
             <w:t>}</w:t>
           </w:r>
@@ -6012,14 +6285,16 @@
             <w:rPr>
               <w:rFonts w:asciiTheme="minorHAnsi" w:hAnsiTheme="minorHAnsi" w:cstheme="minorHAnsi"/>
               <w:b/>
-              <w:sz w:val="20"/>
+              <w:sz w:val="16"/>
+              <w:szCs w:val="16"/>
             </w:rPr>
           </w:pPr>
           <w:r>
             <w:rPr>
               <w:rFonts w:asciiTheme="minorHAnsi" w:hAnsiTheme="minorHAnsi" w:cstheme="minorHAnsi"/>
               <w:b/>
-              <w:sz w:val="20"/>
+              <w:sz w:val="16"/>
+              <w:szCs w:val="16"/>
             </w:rPr>
             <w:t>Mail reclamation security to</w:t>
           </w:r>
@@ -6027,7 +6302,8 @@
             <w:rPr>
               <w:rFonts w:asciiTheme="minorHAnsi" w:hAnsiTheme="minorHAnsi" w:cstheme="minorHAnsi"/>
               <w:b/>
-              <w:sz w:val="20"/>
+              <w:sz w:val="16"/>
+              <w:szCs w:val="16"/>
             </w:rPr>
             <w:t>:</w:t>
           </w:r>
@@ -6035,15 +6311,16 @@
             <w:rPr>
               <w:rFonts w:asciiTheme="minorHAnsi" w:hAnsiTheme="minorHAnsi" w:cstheme="minorHAnsi"/>
               <w:b/>
-              <w:sz w:val="20"/>
+              <w:sz w:val="16"/>
+              <w:szCs w:val="16"/>
             </w:rPr>
             <w:br/>
           </w:r>
           <w:r>
             <w:rPr>
               <w:rFonts w:ascii="Arial" w:hAnsi="Arial" w:cs="Arial"/>
-              <w:sz w:val="18"/>
-              <w:szCs w:val="18"/>
+              <w:sz w:val="16"/>
+              <w:szCs w:val="16"/>
             </w:rPr>
             <w:t>{d.rc_office_mailing_address_line_1}</w:t>
           </w:r>
@@ -6053,14 +6330,16 @@
             <w:rPr>
               <w:rFonts w:asciiTheme="minorHAnsi" w:hAnsiTheme="minorHAnsi" w:cstheme="minorHAnsi"/>
               <w:bCs/>
-              <w:sz w:val="20"/>
+              <w:sz w:val="16"/>
+              <w:szCs w:val="16"/>
             </w:rPr>
           </w:pPr>
           <w:r>
             <w:rPr>
               <w:rFonts w:asciiTheme="minorHAnsi" w:hAnsiTheme="minorHAnsi" w:cstheme="minorHAnsi"/>
               <w:bCs/>
-              <w:sz w:val="20"/>
+              <w:sz w:val="16"/>
+              <w:szCs w:val="16"/>
             </w:rPr>
             <w:t>{d.rc_office_mailing_address_line_2}</w:t>
           </w:r>
@@ -6074,6 +6353,10 @@
   <w:p>
     <w:pPr>
       <w:pStyle w:val="Footer"/>
+      <w:rPr>
+        <w:sz w:val="16"/>
+        <w:szCs w:val="16"/>
+      </w:rPr>
     </w:pPr>
   </w:p>
 </w:ftr>
@@ -6556,7 +6839,7 @@
                   <v:stroke joinstyle="miter"/>
                   <v:path gradientshapeok="t" o:connecttype="rect"/>
                 </v:shapetype>
-                <v:shape id="Text Box 2" o:spid="_x0000_s1026" type="#_x0000_t202" style="position:absolute;left:0;text-align:left;margin-left:-14.45pt;margin-top:-11.65pt;width:123.85pt;height:60.5pt;z-index:251658240;visibility:visible;mso-wrap-style:square;mso-wrap-distance-left:9pt;mso-wrap-distance-top:0;mso-wrap-distance-right:9pt;mso-wrap-distance-bottom:0;mso-position-horizontal:absolute;mso-position-horizontal-relative:text;mso-position-vertical:absolute;mso-position-vertical-relative:text;v-text-anchor:top" o:gfxdata="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" fillcolor="white [3201]" stroked="f" strokeweight=".5pt">
+                <v:shape id="Text Box 2" o:spid="_x0000_s1026" type="#_x0000_t202" style="position:absolute;left:0;text-align:left;margin-left:-14.45pt;margin-top:-11.65pt;width:123.85pt;height:60.5pt;z-index:251658240;visibility:visible;mso-wrap-style:square;mso-wrap-distance-left:9pt;mso-wrap-distance-top:0;mso-wrap-distance-right:9pt;mso-wrap-distance-bottom:0;mso-position-horizontal:absolute;mso-position-horizontal-relative:text;mso-position-vertical:absolute;mso-position-vertical-relative:text;v-text-anchor:top" o:gfxdata="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" fillcolor="white [3201]" stroked="f" strokeweight=".5pt">
                   <v:textbox>
                     <w:txbxContent>
                       <w:p>
@@ -6587,7 +6870,7 @@
                                       <pic:cNvPicPr/>
                                     </pic:nvPicPr>
                                     <pic:blipFill>
-                                      <a:blip r:embed="rId2">
+                                      <a:blip r:embed="rId1">
                                         <a:extLst>
                                           <a:ext uri="{28A0092B-C50C-407E-A947-70E740481C1C}">
                                             <a14:useLocalDpi xmlns:a14="http://schemas.microsoft.com/office/drawing/2010/main" val="0"/>

</xml_diff>

<commit_message>
[MDS-6554] Adjustments to letter templates based on feedback (#3579)
* updated yarn.lock to fix unit tests failing in pipeline

* adjustments to letter templates based on feedback

* addressing pr comment
</commit_message>
<xml_diff>
--- a/services/core-api/app/templates/now/Acknowledgment Letter.docx
+++ b/services/core-api/app/templates/now/Acknowledgment Letter.docx
@@ -284,14 +284,16 @@
       <w:proofErr w:type="gramStart"/>
       <w:r>
         <w:rPr>
-          <w:rFonts w:ascii="BC Sans" w:hAnsi="BC Sans"/>
-        </w:rPr>
-        <w:t>d.agent</w:t>
+          <w:rFonts w:ascii="BC Sans" w:eastAsia="BC Sans" w:hAnsi="BC Sans" w:cs="BC Sans"/>
+          <w:color w:val="000000" w:themeColor="text1"/>
+        </w:rPr>
+        <w:t>d.applicant</w:t>
       </w:r>
       <w:proofErr w:type="gramEnd"/>
       <w:r>
         <w:rPr>
-          <w:rFonts w:ascii="BC Sans" w:hAnsi="BC Sans"/>
+          <w:rFonts w:ascii="BC Sans" w:eastAsia="BC Sans" w:hAnsi="BC Sans" w:cs="BC Sans"/>
+          <w:color w:val="000000" w:themeColor="text1"/>
         </w:rPr>
         <w:t>_email</w:t>
       </w:r>
@@ -328,7 +330,16 @@
           <w:b/>
           <w:bCs/>
         </w:rPr>
-        <w:t xml:space="preserve">Re: </w:t>
+        <w:t>Re</w:t>
+      </w:r>
+      <w:proofErr w:type="gramStart"/>
+      <w:r>
+        <w:rPr>
+          <w:rFonts w:ascii="BC Sans" w:hAnsi="BC Sans"/>
+          <w:b/>
+          <w:bCs/>
+        </w:rPr>
+        <w:t xml:space="preserve">: </w:t>
       </w:r>
       <w:r>
         <w:rPr>
@@ -342,7 +353,16 @@
           <w:b/>
           <w:bCs/>
         </w:rPr>
-        <w:t xml:space="preserve">Application </w:t>
+        <w:t>Application</w:t>
+      </w:r>
+      <w:proofErr w:type="gramEnd"/>
+      <w:r>
+        <w:rPr>
+          <w:rFonts w:ascii="BC Sans" w:hAnsi="BC Sans"/>
+          <w:b/>
+          <w:bCs/>
+        </w:rPr>
+        <w:t xml:space="preserve"> </w:t>
       </w:r>
       <w:r>
         <w:rPr>
@@ -360,6 +380,7 @@
         </w:rPr>
         <w:t xml:space="preserve">a </w:t>
       </w:r>
+      <w:proofErr w:type="gramStart"/>
       <w:r>
         <w:rPr>
           <w:rFonts w:ascii="BC Sans" w:hAnsi="BC Sans"/>
@@ -376,6 +397,7 @@
         </w:rPr>
         <w:t>permit</w:t>
       </w:r>
+      <w:proofErr w:type="gramEnd"/>
     </w:p>
     <w:p>
       <w:pPr>
@@ -456,7 +478,23 @@
           <w:b/>
           <w:bCs/>
         </w:rPr>
-        <w:t>}New Permit</w:t>
+        <w:t xml:space="preserve">}New </w:t>
+      </w:r>
+      <w:r>
+        <w:rPr>
+          <w:rFonts w:ascii="BC Sans" w:hAnsi="BC Sans"/>
+          <w:b/>
+          <w:bCs/>
+        </w:rPr>
+        <w:t>p</w:t>
+      </w:r>
+      <w:r>
+        <w:rPr>
+          <w:rFonts w:ascii="BC Sans" w:hAnsi="BC Sans"/>
+          <w:b/>
+          <w:bCs/>
+        </w:rPr>
+        <w:t>ermit</w:t>
       </w:r>
       <w:r>
         <w:rPr>
@@ -473,24 +511,6 @@
           <w:bCs/>
         </w:rPr>
         <w:t>{d.application_type_</w:t>
-      </w:r>
-      <w:proofErr w:type="gramStart"/>
-      <w:r>
-        <w:rPr>
-          <w:rFonts w:ascii="BC Sans" w:hAnsi="BC Sans"/>
-          <w:b/>
-          <w:bCs/>
-        </w:rPr>
-        <w:t>code}{</w:t>
-      </w:r>
-      <w:proofErr w:type="gramEnd"/>
-      <w:r>
-        <w:rPr>
-          <w:rFonts w:ascii="BC Sans" w:hAnsi="BC Sans"/>
-          <w:b/>
-          <w:bCs/>
-        </w:rPr>
-        <w:t>d.application_type_</w:t>
       </w:r>
       <w:proofErr w:type="gramStart"/>
       <w:r>
@@ -676,7 +696,16 @@
           <w:b/>
           <w:bCs/>
         </w:rPr>
-        <w:t xml:space="preserve"> name:</w:t>
+        <w:t xml:space="preserve"> </w:t>
+      </w:r>
+      <w:proofErr w:type="gramStart"/>
+      <w:r>
+        <w:rPr>
+          <w:rFonts w:ascii="BC Sans" w:hAnsi="BC Sans"/>
+          <w:b/>
+          <w:bCs/>
+        </w:rPr>
+        <w:t>name:</w:t>
       </w:r>
       <w:r>
         <w:rPr>
@@ -687,7 +716,6 @@
         <w:t xml:space="preserve"> {</w:t>
       </w:r>
       <w:proofErr w:type="spellStart"/>
-      <w:proofErr w:type="gramStart"/>
       <w:r>
         <w:rPr>
           <w:rFonts w:ascii="BC Sans" w:hAnsi="BC Sans"/>
@@ -741,7 +769,16 @@
           <w:b/>
           <w:bCs/>
         </w:rPr>
-        <w:t xml:space="preserve"> number: </w:t>
+        <w:t xml:space="preserve"> </w:t>
+      </w:r>
+      <w:proofErr w:type="gramStart"/>
+      <w:r>
+        <w:rPr>
+          <w:rFonts w:ascii="BC Sans" w:hAnsi="BC Sans"/>
+          <w:b/>
+          <w:bCs/>
+        </w:rPr>
+        <w:t xml:space="preserve">number: </w:t>
       </w:r>
       <w:r>
         <w:rPr>
@@ -752,7 +789,6 @@
         <w:t>{</w:t>
       </w:r>
       <w:proofErr w:type="spellStart"/>
-      <w:proofErr w:type="gramStart"/>
       <w:r>
         <w:rPr>
           <w:rFonts w:ascii="BC Sans" w:hAnsi="BC Sans"/>
@@ -797,7 +833,16 @@
           <w:b/>
           <w:bCs/>
         </w:rPr>
-        <w:t xml:space="preserve">Proposed permittee: </w:t>
+        <w:t xml:space="preserve">Proposed </w:t>
+      </w:r>
+      <w:proofErr w:type="gramStart"/>
+      <w:r>
+        <w:rPr>
+          <w:rFonts w:ascii="BC Sans" w:hAnsi="BC Sans"/>
+          <w:b/>
+          <w:bCs/>
+        </w:rPr>
+        <w:t xml:space="preserve">permittee: </w:t>
       </w:r>
       <w:r>
         <w:rPr>
@@ -808,7 +853,6 @@
         <w:t>{</w:t>
       </w:r>
       <w:proofErr w:type="spellStart"/>
-      <w:proofErr w:type="gramStart"/>
       <w:r>
         <w:rPr>
           <w:rFonts w:ascii="BC Sans" w:hAnsi="BC Sans"/>
@@ -1213,7 +1257,21 @@
         <w:rPr>
           <w:rFonts w:ascii="BC Sans" w:hAnsi="BC Sans"/>
         </w:rPr>
-        <w:t>conservation, protection, and reclamation of the land, watercourses and cultural heritage resources affected by the proposed activities</w:t>
+        <w:t xml:space="preserve">conservation, protection, and reclamation of the land, </w:t>
+      </w:r>
+      <w:proofErr w:type="gramStart"/>
+      <w:r>
+        <w:rPr>
+          <w:rFonts w:ascii="BC Sans" w:hAnsi="BC Sans"/>
+        </w:rPr>
+        <w:t>watercourses</w:t>
+      </w:r>
+      <w:proofErr w:type="gramEnd"/>
+      <w:r>
+        <w:rPr>
+          <w:rFonts w:ascii="BC Sans" w:hAnsi="BC Sans"/>
+        </w:rPr>
+        <w:t xml:space="preserve"> and cultural heritage resources affected by the proposed activities</w:t>
       </w:r>
       <w:r>
         <w:rPr>
@@ -1258,7 +1316,14 @@
         <w:rPr>
           <w:rFonts w:ascii="BC Sans" w:hAnsi="BC Sans"/>
         </w:rPr>
-        <w:t>Notice of Work number</w:t>
+        <w:t xml:space="preserve">Notice of Work </w:t>
+      </w:r>
+      <w:proofErr w:type="gramStart"/>
+      <w:r>
+        <w:rPr>
+          <w:rFonts w:ascii="BC Sans" w:hAnsi="BC Sans"/>
+        </w:rPr>
+        <w:t>number</w:t>
       </w:r>
       <w:r>
         <w:rPr>
@@ -1273,6 +1338,7 @@
         <w:t xml:space="preserve"> {</w:t>
       </w:r>
       <w:proofErr w:type="spellStart"/>
+      <w:proofErr w:type="gramEnd"/>
       <w:r>
         <w:rPr>
           <w:rFonts w:ascii="BC Sans" w:hAnsi="BC Sans"/>
@@ -1308,7 +1374,14 @@
         <w:rPr>
           <w:rFonts w:ascii="BC Sans" w:hAnsi="BC Sans"/>
         </w:rPr>
-        <w:t xml:space="preserve"> and accepted</w:t>
+        <w:t xml:space="preserve"> and </w:t>
+      </w:r>
+      <w:proofErr w:type="gramStart"/>
+      <w:r>
+        <w:rPr>
+          <w:rFonts w:ascii="BC Sans" w:hAnsi="BC Sans"/>
+        </w:rPr>
+        <w:t>accepted</w:t>
       </w:r>
       <w:r>
         <w:rPr>
@@ -1329,6 +1402,7 @@
         <w:t>{</w:t>
       </w:r>
       <w:proofErr w:type="spellStart"/>
+      <w:proofErr w:type="gramEnd"/>
       <w:r>
         <w:rPr>
           <w:rFonts w:ascii="BC Sans" w:hAnsi="BC Sans"/>
@@ -1382,9 +1456,22 @@
       <w:r>
         <w:rPr>
           <w:rFonts w:ascii="BC Sans" w:hAnsi="BC Sans"/>
-          <w:color w:val="FF0000"/>
-        </w:rPr>
-        <w:t>(enter date here)</w:t>
+        </w:rPr>
+        <w:t>{</w:t>
+      </w:r>
+      <w:proofErr w:type="spellStart"/>
+      <w:r>
+        <w:rPr>
+          <w:rFonts w:ascii="BC Sans" w:hAnsi="BC Sans"/>
+        </w:rPr>
+        <w:t>d.application_dt</w:t>
+      </w:r>
+      <w:proofErr w:type="spellEnd"/>
+      <w:r>
+        <w:rPr>
+          <w:rFonts w:ascii="BC Sans" w:hAnsi="BC Sans"/>
+        </w:rPr>
+        <w:t>}</w:t>
       </w:r>
     </w:p>
     <w:p>
@@ -1418,12 +1505,19 @@
         <w:rPr>
           <w:rFonts w:ascii="BC Sans" w:hAnsi="BC Sans" w:cstheme="minorHAnsi"/>
         </w:rPr>
-        <w:t xml:space="preserve"> tracking number</w:t>
-      </w:r>
+        <w:t xml:space="preserve"> tracking </w:t>
+      </w:r>
+      <w:proofErr w:type="gramStart"/>
       <w:r>
         <w:rPr>
           <w:rFonts w:ascii="BC Sans" w:hAnsi="BC Sans" w:cstheme="minorHAnsi"/>
         </w:rPr>
+        <w:t>number</w:t>
+      </w:r>
+      <w:r>
+        <w:rPr>
+          <w:rFonts w:ascii="BC Sans" w:hAnsi="BC Sans" w:cstheme="minorHAnsi"/>
+        </w:rPr>
         <w:t>:</w:t>
       </w:r>
       <w:r>
@@ -1433,6 +1527,7 @@
         <w:t xml:space="preserve"> {</w:t>
       </w:r>
       <w:proofErr w:type="spellStart"/>
+      <w:proofErr w:type="gramEnd"/>
       <w:r>
         <w:rPr>
           <w:rFonts w:ascii="BC Sans" w:hAnsi="BC Sans" w:cstheme="minorHAnsi"/>
@@ -1633,7 +1728,6 @@
           <w:rFonts w:ascii="BC Sans" w:hAnsi="BC Sans"/>
           <w:color w:val="FF0000"/>
         </w:rPr>
-        <w:lastRenderedPageBreak/>
         <w:t>O</w:t>
       </w:r>
       <w:r>
@@ -1729,7 +1823,7 @@
           <w:color w:val="auto"/>
           <w:u w:val="none"/>
         </w:rPr>
-        <w:t xml:space="preserve">Therefore, be advised that it is your responsibility to apply for </w:t>
+        <w:t xml:space="preserve">Therefore, be advised that </w:t>
       </w:r>
       <w:r>
         <w:rPr>
@@ -1738,6 +1832,16 @@
           <w:color w:val="auto"/>
           <w:u w:val="none"/>
         </w:rPr>
+        <w:lastRenderedPageBreak/>
+        <w:t xml:space="preserve">it is your responsibility to apply for </w:t>
+      </w:r>
+      <w:r>
+        <w:rPr>
+          <w:rStyle w:val="Hyperlink"/>
+          <w:rFonts w:ascii="BC Sans" w:hAnsi="BC Sans"/>
+          <w:color w:val="auto"/>
+          <w:u w:val="none"/>
+        </w:rPr>
         <w:t>an</w:t>
       </w:r>
       <w:r>
@@ -1901,7 +2005,21 @@
         <w:rPr>
           <w:rFonts w:ascii="BC Sans" w:hAnsi="BC Sans"/>
         </w:rPr>
-        <w:t xml:space="preserve">The government agency referral period is projected to be </w:t>
+        <w:t xml:space="preserve">The </w:t>
+      </w:r>
+      <w:proofErr w:type="gramStart"/>
+      <w:r>
+        <w:rPr>
+          <w:rFonts w:ascii="BC Sans" w:hAnsi="BC Sans"/>
+        </w:rPr>
+        <w:t>government agency</w:t>
+      </w:r>
+      <w:proofErr w:type="gramEnd"/>
+      <w:r>
+        <w:rPr>
+          <w:rFonts w:ascii="BC Sans" w:hAnsi="BC Sans"/>
+        </w:rPr>
+        <w:t xml:space="preserve"> referral period is projected to be </w:t>
       </w:r>
       <w:r>
         <w:rPr>
@@ -2264,126 +2382,6 @@
           <w:rFonts w:ascii="BC Sans" w:hAnsi="BC Sans"/>
         </w:rPr>
       </w:pPr>
-    </w:p>
-    <w:p>
-      <w:pPr>
-        <w:pStyle w:val="NoSpacing"/>
-        <w:jc w:val="both"/>
-        <w:rPr>
-          <w:rStyle w:val="Strong"/>
-          <w:rFonts w:ascii="BC Sans" w:hAnsi="BC Sans"/>
-          <w:b w:val="0"/>
-          <w:bCs w:val="0"/>
-        </w:rPr>
-      </w:pPr>
-      <w:r>
-        <w:rPr>
-          <w:rFonts w:ascii="BC Sans" w:hAnsi="BC Sans"/>
-        </w:rPr>
-        <w:t>I</w:t>
-      </w:r>
-      <w:r>
-        <w:rPr>
-          <w:rFonts w:ascii="BC Sans" w:hAnsi="BC Sans"/>
-        </w:rPr>
-        <w:t>n accordance with</w:t>
-      </w:r>
-      <w:r>
-        <w:rPr>
-          <w:rFonts w:ascii="BC Sans" w:hAnsi="BC Sans"/>
-        </w:rPr>
-        <w:t xml:space="preserve"> </w:t>
-      </w:r>
-      <w:r>
-        <w:rPr>
-          <w:rFonts w:ascii="BC Sans" w:hAnsi="BC Sans"/>
-        </w:rPr>
-        <w:t xml:space="preserve">the </w:t>
-      </w:r>
-      <w:r>
-        <w:rPr>
-          <w:rFonts w:ascii="BC Sans" w:hAnsi="BC Sans"/>
-        </w:rPr>
-        <w:t xml:space="preserve">Mines Act, </w:t>
-      </w:r>
-      <w:r>
-        <w:rPr>
-          <w:rFonts w:ascii="BC Sans" w:hAnsi="BC Sans"/>
-        </w:rPr>
-        <w:t xml:space="preserve">it has been assessed </w:t>
-      </w:r>
-      <w:r>
-        <w:rPr>
-          <w:rFonts w:ascii="BC Sans" w:hAnsi="BC Sans"/>
-        </w:rPr>
-        <w:t>that you are required to</w:t>
-      </w:r>
-      <w:r>
-        <w:rPr>
-          <w:rFonts w:ascii="BC Sans" w:hAnsi="BC Sans"/>
-        </w:rPr>
-        <w:t xml:space="preserve"> post </w:t>
-      </w:r>
-      <w:r>
-        <w:rPr>
-          <w:rFonts w:ascii="BC Sans" w:hAnsi="BC Sans"/>
-        </w:rPr>
-        <w:t>financial</w:t>
-      </w:r>
-      <w:r>
-        <w:rPr>
-          <w:rFonts w:ascii="BC Sans" w:hAnsi="BC Sans"/>
-        </w:rPr>
-        <w:t xml:space="preserve"> security in the amount of</w:t>
-      </w:r>
-      <w:r>
-        <w:rPr>
-          <w:rFonts w:ascii="BC Sans" w:hAnsi="BC Sans"/>
-        </w:rPr>
-        <w:t xml:space="preserve"> </w:t>
-      </w:r>
-      <w:r>
-        <w:rPr>
-          <w:rFonts w:ascii="BC Sans" w:hAnsi="BC Sans"/>
-        </w:rPr>
-        <w:t>${</w:t>
-      </w:r>
-      <w:proofErr w:type="spellStart"/>
-      <w:proofErr w:type="gramStart"/>
-      <w:r>
-        <w:rPr>
-          <w:rFonts w:ascii="BC Sans" w:hAnsi="BC Sans"/>
-        </w:rPr>
-        <w:t>d.bond</w:t>
-      </w:r>
-      <w:proofErr w:type="gramEnd"/>
-      <w:r>
-        <w:rPr>
-          <w:rFonts w:ascii="BC Sans" w:hAnsi="BC Sans"/>
-        </w:rPr>
-        <w:t>_inc_</w:t>
-      </w:r>
-      <w:proofErr w:type="gramStart"/>
-      <w:r>
-        <w:rPr>
-          <w:rFonts w:ascii="BC Sans" w:hAnsi="BC Sans"/>
-        </w:rPr>
-        <w:t>amt:formatN</w:t>
-      </w:r>
-      <w:proofErr w:type="spellEnd"/>
-      <w:proofErr w:type="gramEnd"/>
-      <w:r>
-        <w:rPr>
-          <w:rFonts w:ascii="BC Sans" w:hAnsi="BC Sans"/>
-        </w:rPr>
-        <w:t>(2)}</w:t>
-      </w:r>
-      <w:r>
-        <w:rPr>
-          <w:rFonts w:ascii="BC Sans" w:hAnsi="BC Sans"/>
-        </w:rPr>
-        <w:t>.</w:t>
-      </w:r>
     </w:p>
     <w:p>
       <w:pPr>
@@ -2413,25 +2411,7 @@
           <w:b w:val="0"/>
           <w:bCs w:val="0"/>
         </w:rPr>
-        <w:t xml:space="preserve">This </w:t>
-      </w:r>
-      <w:r>
-        <w:rPr>
-          <w:rStyle w:val="Strong"/>
-          <w:rFonts w:ascii="BC Sans" w:hAnsi="BC Sans"/>
-          <w:b w:val="0"/>
-          <w:bCs w:val="0"/>
-        </w:rPr>
-        <w:t>will bring</w:t>
-      </w:r>
-      <w:r>
-        <w:rPr>
-          <w:rStyle w:val="Strong"/>
-          <w:rFonts w:ascii="BC Sans" w:hAnsi="BC Sans"/>
-          <w:b w:val="0"/>
-          <w:bCs w:val="0"/>
-        </w:rPr>
-        <w:t xml:space="preserve"> the total amount held under</w:t>
+        <w:t>This will bring the total amount held under</w:t>
       </w:r>
       <w:r>
         <w:rPr>
@@ -2521,6 +2501,128 @@
         </w:rPr>
         <w:t>.</w:t>
       </w:r>
+      <w:r>
+        <w:rPr>
+          <w:rFonts w:ascii="BC Sans" w:hAnsi="BC Sans"/>
+        </w:rPr>
+        <w:t xml:space="preserve"> </w:t>
+      </w:r>
+      <w:r>
+        <w:rPr>
+          <w:rFonts w:ascii="BC Sans" w:hAnsi="BC Sans"/>
+        </w:rPr>
+        <w:t>I</w:t>
+      </w:r>
+      <w:r>
+        <w:rPr>
+          <w:rFonts w:ascii="BC Sans" w:hAnsi="BC Sans"/>
+        </w:rPr>
+        <w:t>n accordance with</w:t>
+      </w:r>
+      <w:r>
+        <w:rPr>
+          <w:rFonts w:ascii="BC Sans" w:hAnsi="BC Sans"/>
+        </w:rPr>
+        <w:t xml:space="preserve"> </w:t>
+      </w:r>
+      <w:r>
+        <w:rPr>
+          <w:rFonts w:ascii="BC Sans" w:hAnsi="BC Sans"/>
+        </w:rPr>
+        <w:t xml:space="preserve">the </w:t>
+      </w:r>
+      <w:r>
+        <w:rPr>
+          <w:rFonts w:ascii="BC Sans" w:hAnsi="BC Sans"/>
+        </w:rPr>
+        <w:t xml:space="preserve">Mines Act, </w:t>
+      </w:r>
+      <w:r>
+        <w:rPr>
+          <w:rFonts w:ascii="BC Sans" w:hAnsi="BC Sans"/>
+        </w:rPr>
+        <w:t xml:space="preserve">it has been assessed </w:t>
+      </w:r>
+      <w:r>
+        <w:rPr>
+          <w:rFonts w:ascii="BC Sans" w:hAnsi="BC Sans"/>
+        </w:rPr>
+        <w:t>that you are required to</w:t>
+      </w:r>
+      <w:r>
+        <w:rPr>
+          <w:rFonts w:ascii="BC Sans" w:hAnsi="BC Sans"/>
+        </w:rPr>
+        <w:t xml:space="preserve"> post </w:t>
+      </w:r>
+      <w:r>
+        <w:rPr>
+          <w:rFonts w:ascii="BC Sans" w:hAnsi="BC Sans"/>
+        </w:rPr>
+        <w:t>financial</w:t>
+      </w:r>
+      <w:r>
+        <w:rPr>
+          <w:rFonts w:ascii="BC Sans" w:hAnsi="BC Sans"/>
+        </w:rPr>
+        <w:t xml:space="preserve"> security in the amount of</w:t>
+      </w:r>
+      <w:r>
+        <w:rPr>
+          <w:rFonts w:ascii="BC Sans" w:hAnsi="BC Sans"/>
+        </w:rPr>
+        <w:t xml:space="preserve"> </w:t>
+      </w:r>
+      <w:r>
+        <w:rPr>
+          <w:rFonts w:ascii="BC Sans" w:hAnsi="BC Sans"/>
+        </w:rPr>
+        <w:t>${</w:t>
+      </w:r>
+      <w:proofErr w:type="spellStart"/>
+      <w:proofErr w:type="gramStart"/>
+      <w:r>
+        <w:rPr>
+          <w:rFonts w:ascii="BC Sans" w:hAnsi="BC Sans"/>
+        </w:rPr>
+        <w:t>d.bond</w:t>
+      </w:r>
+      <w:proofErr w:type="gramEnd"/>
+      <w:r>
+        <w:rPr>
+          <w:rFonts w:ascii="BC Sans" w:hAnsi="BC Sans"/>
+        </w:rPr>
+        <w:t>_inc_</w:t>
+      </w:r>
+      <w:proofErr w:type="gramStart"/>
+      <w:r>
+        <w:rPr>
+          <w:rFonts w:ascii="BC Sans" w:hAnsi="BC Sans"/>
+        </w:rPr>
+        <w:t>amt:formatN</w:t>
+      </w:r>
+      <w:proofErr w:type="spellEnd"/>
+      <w:proofErr w:type="gramEnd"/>
+      <w:r>
+        <w:rPr>
+          <w:rFonts w:ascii="BC Sans" w:hAnsi="BC Sans"/>
+        </w:rPr>
+        <w:t>(</w:t>
+      </w:r>
+      <w:proofErr w:type="gramStart"/>
+      <w:r>
+        <w:rPr>
+          <w:rFonts w:ascii="BC Sans" w:hAnsi="BC Sans"/>
+        </w:rPr>
+        <w:t>2)}</w:t>
+      </w:r>
+      <w:proofErr w:type="gramEnd"/>
+      <w:r>
+        <w:rPr>
+          <w:rFonts w:ascii="BC Sans" w:hAnsi="BC Sans"/>
+        </w:rPr>
+        <w:t>.</w:t>
+      </w:r>
     </w:p>
     <w:p>
       <w:pPr>
@@ -2844,12 +2946,14 @@
         </w:rPr>
         <w:t xml:space="preserve"> mail </w:t>
       </w:r>
+      <w:proofErr w:type="gramStart"/>
       <w:r>
         <w:rPr>
           <w:rFonts w:ascii="BC Sans" w:hAnsi="BC Sans"/>
         </w:rPr>
         <w:t>all reclamation</w:t>
       </w:r>
+      <w:proofErr w:type="gramEnd"/>
       <w:r>
         <w:rPr>
           <w:rFonts w:ascii="BC Sans" w:hAnsi="BC Sans"/>
@@ -3057,8 +3161,9 @@
           <w:szCs w:val="22"/>
           <w:lang w:val="en-CA"/>
         </w:rPr>
-        <w:t xml:space="preserve">Other legislation may be applicable to your operation and, as the Permittee, you may be required to obtain approvals or permits under that legislation, such as for road use </w:t>
-      </w:r>
+        <w:t xml:space="preserve">Other legislation may be applicable to your operation and, as the Permittee, you may </w:t>
+      </w:r>
+      <w:proofErr w:type="gramStart"/>
       <w:r>
         <w:rPr>
           <w:rFonts w:ascii="BC Sans" w:eastAsia="Calibri" w:hAnsi="BC Sans" w:cs="Arial"/>
@@ -3067,8 +3172,9 @@
           <w:szCs w:val="22"/>
           <w:lang w:val="en-CA"/>
         </w:rPr>
-        <w:t>or operation of a camp</w:t>
-      </w:r>
+        <w:t>be required</w:t>
+      </w:r>
+      <w:proofErr w:type="gramEnd"/>
       <w:r>
         <w:rPr>
           <w:rFonts w:ascii="BC Sans" w:eastAsia="Calibri" w:hAnsi="BC Sans" w:cs="Arial"/>
@@ -3077,7 +3183,7 @@
           <w:szCs w:val="22"/>
           <w:lang w:val="en-CA"/>
         </w:rPr>
-        <w:t xml:space="preserve">. It is your responsibility to comply with the terms and conditions of all other permits and </w:t>
+        <w:t xml:space="preserve"> to obtain approvals or permits under that legislation, such as for road use </w:t>
       </w:r>
       <w:r>
         <w:rPr>
@@ -3087,8 +3193,7 @@
           <w:szCs w:val="22"/>
           <w:lang w:val="en-CA"/>
         </w:rPr>
-        <w:lastRenderedPageBreak/>
-        <w:t xml:space="preserve">authorizations which </w:t>
+        <w:t>or operation of a camp</w:t>
       </w:r>
       <w:r>
         <w:rPr>
@@ -3098,7 +3203,7 @@
           <w:szCs w:val="22"/>
           <w:lang w:val="en-CA"/>
         </w:rPr>
-        <w:t>may b</w:t>
+        <w:t xml:space="preserve">. It is your responsibility to comply with the terms and conditions of all other permits and authorizations which </w:t>
       </w:r>
       <w:r>
         <w:rPr>
@@ -3108,7 +3213,7 @@
           <w:szCs w:val="22"/>
           <w:lang w:val="en-CA"/>
         </w:rPr>
-        <w:t xml:space="preserve">e issued </w:t>
+        <w:t>may b</w:t>
       </w:r>
       <w:r>
         <w:rPr>
@@ -3118,7 +3223,7 @@
           <w:szCs w:val="22"/>
           <w:lang w:val="en-CA"/>
         </w:rPr>
-        <w:t xml:space="preserve">to you </w:t>
+        <w:t xml:space="preserve">e issued </w:t>
       </w:r>
       <w:r>
         <w:rPr>
@@ -3128,19 +3233,7 @@
           <w:szCs w:val="22"/>
           <w:lang w:val="en-CA"/>
         </w:rPr>
-        <w:t xml:space="preserve">and all </w:t>
-      </w:r>
-      <w:r>
-        <w:rPr>
-          <w:rFonts w:ascii="BC Sans" w:eastAsia="Calibri" w:hAnsi="BC Sans" w:cs="Arial"/>
-          <w:b/>
-          <w:bCs/>
-          <w:kern w:val="2"/>
-          <w:sz w:val="22"/>
-          <w:szCs w:val="22"/>
-          <w:lang w:val="en-CA"/>
-        </w:rPr>
-        <w:t>other applicable legislation</w:t>
+        <w:t xml:space="preserve">to you </w:t>
       </w:r>
       <w:r>
         <w:rPr>
@@ -3150,7 +3243,32 @@
           <w:szCs w:val="22"/>
           <w:lang w:val="en-CA"/>
         </w:rPr>
-        <w:t xml:space="preserve"> including </w:t>
+        <w:t xml:space="preserve">and all </w:t>
+      </w:r>
+      <w:r>
+        <w:rPr>
+          <w:rFonts w:ascii="BC Sans" w:eastAsia="Calibri" w:hAnsi="BC Sans" w:cs="Arial"/>
+          <w:b/>
+          <w:bCs/>
+          <w:kern w:val="2"/>
+          <w:sz w:val="22"/>
+          <w:szCs w:val="22"/>
+          <w:lang w:val="en-CA"/>
+        </w:rPr>
+        <w:t xml:space="preserve">other applicable </w:t>
+      </w:r>
+      <w:r>
+        <w:rPr>
+          <w:rFonts w:ascii="BC Sans" w:eastAsia="Calibri" w:hAnsi="BC Sans" w:cs="Arial"/>
+          <w:b/>
+          <w:bCs/>
+          <w:kern w:val="2"/>
+          <w:sz w:val="22"/>
+          <w:szCs w:val="22"/>
+          <w:lang w:val="en-CA"/>
+        </w:rPr>
+        <w:lastRenderedPageBreak/>
+        <w:t>legislation</w:t>
       </w:r>
       <w:r>
         <w:rPr>
@@ -3160,7 +3278,39 @@
           <w:szCs w:val="22"/>
           <w:lang w:val="en-CA"/>
         </w:rPr>
-        <w:t xml:space="preserve">but not limited to </w:t>
+        <w:t xml:space="preserve"> </w:t>
+      </w:r>
+      <w:proofErr w:type="gramStart"/>
+      <w:r>
+        <w:rPr>
+          <w:rFonts w:ascii="BC Sans" w:eastAsia="Calibri" w:hAnsi="BC Sans" w:cs="Arial"/>
+          <w:kern w:val="2"/>
+          <w:sz w:val="22"/>
+          <w:szCs w:val="22"/>
+          <w:lang w:val="en-CA"/>
+        </w:rPr>
+        <w:t xml:space="preserve">including </w:t>
+      </w:r>
+      <w:r>
+        <w:rPr>
+          <w:rFonts w:ascii="BC Sans" w:eastAsia="Calibri" w:hAnsi="BC Sans" w:cs="Arial"/>
+          <w:kern w:val="2"/>
+          <w:sz w:val="22"/>
+          <w:szCs w:val="22"/>
+          <w:lang w:val="en-CA"/>
+        </w:rPr>
+        <w:t>but not limited to</w:t>
+      </w:r>
+      <w:proofErr w:type="gramEnd"/>
+      <w:r>
+        <w:rPr>
+          <w:rFonts w:ascii="BC Sans" w:eastAsia="Calibri" w:hAnsi="BC Sans" w:cs="Arial"/>
+          <w:kern w:val="2"/>
+          <w:sz w:val="22"/>
+          <w:szCs w:val="22"/>
+          <w:lang w:val="en-CA"/>
+        </w:rPr>
+        <w:t xml:space="preserve"> </w:t>
       </w:r>
       <w:r>
         <w:rPr>
@@ -3914,7 +4064,27 @@
           <w:color w:val="auto"/>
           <w:u w:val="none"/>
         </w:rPr>
-        <w:t>It is your responsibility to have all necessary authorizations in place for the operation of an industrial camp</w:t>
+        <w:t xml:space="preserve">It is your responsibility to have all necessary </w:t>
+      </w:r>
+      <w:proofErr w:type="gramStart"/>
+      <w:r>
+        <w:rPr>
+          <w:rStyle w:val="Hyperlink"/>
+          <w:rFonts w:ascii="BC Sans" w:hAnsi="BC Sans" w:cs="Calibri"/>
+          <w:color w:val="auto"/>
+          <w:u w:val="none"/>
+        </w:rPr>
+        <w:t>authorizations</w:t>
+      </w:r>
+      <w:proofErr w:type="gramEnd"/>
+      <w:r>
+        <w:rPr>
+          <w:rStyle w:val="Hyperlink"/>
+          <w:rFonts w:ascii="BC Sans" w:hAnsi="BC Sans" w:cs="Calibri"/>
+          <w:color w:val="auto"/>
+          <w:u w:val="none"/>
+        </w:rPr>
+        <w:t xml:space="preserve"> in place for the operation of an industrial camp</w:t>
       </w:r>
       <w:r>
         <w:rPr>
@@ -4081,8 +4251,16 @@
               <w:rPr>
                 <w:rFonts w:ascii="BC Sans" w:hAnsi="BC Sans"/>
               </w:rPr>
-              <w:t>Forest licensee</w:t>
+              <w:t xml:space="preserve">Forest </w:t>
             </w:r>
+            <w:proofErr w:type="gramStart"/>
+            <w:r>
+              <w:rPr>
+                <w:rFonts w:ascii="BC Sans" w:hAnsi="BC Sans"/>
+              </w:rPr>
+              <w:t>licensee</w:t>
+            </w:r>
+            <w:proofErr w:type="gramEnd"/>
           </w:p>
           <w:p>
             <w:pPr>
@@ -4300,8 +4478,16 @@
               <w:rPr>
                 <w:rFonts w:ascii="BC Sans" w:hAnsi="BC Sans"/>
               </w:rPr>
-              <w:t>transmission line</w:t>
+              <w:t xml:space="preserve">transmission </w:t>
             </w:r>
+            <w:proofErr w:type="gramStart"/>
+            <w:r>
+              <w:rPr>
+                <w:rFonts w:ascii="BC Sans" w:hAnsi="BC Sans"/>
+              </w:rPr>
+              <w:t>line</w:t>
+            </w:r>
+            <w:proofErr w:type="gramEnd"/>
             <w:r>
               <w:rPr>
                 <w:rFonts w:ascii="BC Sans" w:hAnsi="BC Sans"/>
@@ -4318,8 +4504,16 @@
               <w:rPr>
                 <w:rFonts w:ascii="BC Sans" w:hAnsi="BC Sans"/>
               </w:rPr>
-              <w:t>or other energy tenure holder</w:t>
+              <w:t xml:space="preserve">or other energy tenure </w:t>
             </w:r>
+            <w:proofErr w:type="gramStart"/>
+            <w:r>
+              <w:rPr>
+                <w:rFonts w:ascii="BC Sans" w:hAnsi="BC Sans"/>
+              </w:rPr>
+              <w:t>holder</w:t>
+            </w:r>
+            <w:proofErr w:type="gramEnd"/>
           </w:p>
           <w:p>
             <w:pPr>
@@ -4345,7 +4539,6 @@
         <w:rPr>
           <w:rFonts w:ascii="BC Sans" w:hAnsi="BC Sans"/>
         </w:rPr>
-        <w:lastRenderedPageBreak/>
         <w:t xml:space="preserve">A variety of </w:t>
       </w:r>
       <w:r>
@@ -4689,7 +4882,23 @@
           <w:rFonts w:ascii="BC Sans" w:eastAsia="BC Sans" w:hAnsi="BC Sans" w:cs="BC Sans"/>
           <w:color w:val="000000" w:themeColor="text1"/>
         </w:rPr>
-        <w:t>, among other legislation, and you are advised to familiarize yourself with the Mines Act and the Code. The Code and its guidance documents are periodically updated. Ensure to check the Code</w:t>
+        <w:t xml:space="preserve">, among other legislation, and you are advised to familiarize yourself with the Mines Act and the Code. The Code and its guidance documents are periodically updated. </w:t>
+      </w:r>
+      <w:proofErr w:type="gramStart"/>
+      <w:r>
+        <w:rPr>
+          <w:rFonts w:ascii="BC Sans" w:eastAsia="BC Sans" w:hAnsi="BC Sans" w:cs="BC Sans"/>
+          <w:color w:val="000000" w:themeColor="text1"/>
+        </w:rPr>
+        <w:t>Ensure</w:t>
+      </w:r>
+      <w:proofErr w:type="gramEnd"/>
+      <w:r>
+        <w:rPr>
+          <w:rFonts w:ascii="BC Sans" w:eastAsia="BC Sans" w:hAnsi="BC Sans" w:cs="BC Sans"/>
+          <w:color w:val="000000" w:themeColor="text1"/>
+        </w:rPr>
+        <w:t xml:space="preserve"> to check the Code</w:t>
       </w:r>
       <w:r>
         <w:rPr>
@@ -4776,13 +4985,29 @@
           <w:rFonts w:ascii="BC Sans" w:hAnsi="BC Sans"/>
           <w:lang w:val="en-CA"/>
         </w:rPr>
-        <w:t xml:space="preserve"> public advertising will be required for this application</w:t>
-      </w:r>
+        <w:t xml:space="preserve"> public advertising will </w:t>
+      </w:r>
+      <w:proofErr w:type="gramStart"/>
       <w:r>
         <w:rPr>
           <w:rFonts w:ascii="BC Sans" w:hAnsi="BC Sans"/>
           <w:lang w:val="en-CA"/>
         </w:rPr>
+        <w:t>be required</w:t>
+      </w:r>
+      <w:proofErr w:type="gramEnd"/>
+      <w:r>
+        <w:rPr>
+          <w:rFonts w:ascii="BC Sans" w:hAnsi="BC Sans"/>
+          <w:lang w:val="en-CA"/>
+        </w:rPr>
+        <w:t xml:space="preserve"> for this application</w:t>
+      </w:r>
+      <w:r>
+        <w:rPr>
+          <w:rFonts w:ascii="BC Sans" w:hAnsi="BC Sans"/>
+          <w:lang w:val="en-CA"/>
+        </w:rPr>
         <w:t xml:space="preserve">. </w:t>
       </w:r>
       <w:r>
@@ -4790,15 +5015,31 @@
           <w:rFonts w:ascii="BC Sans" w:hAnsi="BC Sans"/>
           <w:lang w:val="en-CA"/>
         </w:rPr>
-        <w:t xml:space="preserve">You are required to publish a </w:t>
-      </w:r>
-      <w:r>
-        <w:rPr>
-          <w:rFonts w:ascii="BC Sans" w:hAnsi="BC Sans"/>
-          <w:b/>
-          <w:bCs/>
+        <w:t xml:space="preserve">You </w:t>
+      </w:r>
+      <w:proofErr w:type="gramStart"/>
+      <w:r>
+        <w:rPr>
+          <w:rFonts w:ascii="BC Sans" w:hAnsi="BC Sans"/>
           <w:lang w:val="en-CA"/>
         </w:rPr>
+        <w:t>are required</w:t>
+      </w:r>
+      <w:proofErr w:type="gramEnd"/>
+      <w:r>
+        <w:rPr>
+          <w:rFonts w:ascii="BC Sans" w:hAnsi="BC Sans"/>
+          <w:lang w:val="en-CA"/>
+        </w:rPr>
+        <w:t xml:space="preserve"> to publish a </w:t>
+      </w:r>
+      <w:r>
+        <w:rPr>
+          <w:rFonts w:ascii="BC Sans" w:hAnsi="BC Sans"/>
+          <w:b/>
+          <w:bCs/>
+          <w:lang w:val="en-CA"/>
+        </w:rPr>
         <w:t>Notice of Filing</w:t>
       </w:r>
       <w:r>
@@ -4906,7 +5147,23 @@
           <w:rFonts w:ascii="BC Sans" w:hAnsi="BC Sans"/>
           <w:lang w:val="en-CA"/>
         </w:rPr>
-        <w:t>When these drafts have been approved you may then submit the</w:t>
+        <w:t xml:space="preserve">When these drafts have </w:t>
+      </w:r>
+      <w:proofErr w:type="gramStart"/>
+      <w:r>
+        <w:rPr>
+          <w:rFonts w:ascii="BC Sans" w:hAnsi="BC Sans"/>
+          <w:lang w:val="en-CA"/>
+        </w:rPr>
+        <w:t>been approved</w:t>
+      </w:r>
+      <w:proofErr w:type="gramEnd"/>
+      <w:r>
+        <w:rPr>
+          <w:rFonts w:ascii="BC Sans" w:hAnsi="BC Sans"/>
+          <w:lang w:val="en-CA"/>
+        </w:rPr>
+        <w:t xml:space="preserve"> you may then submit the</w:t>
       </w:r>
       <w:r>
         <w:rPr>
@@ -5634,19 +5891,17 @@
         <w:br/>
         <w:t xml:space="preserve">Inspector </w:t>
       </w:r>
-      <w:proofErr w:type="gramStart"/>
-      <w:r>
-        <w:rPr>
-          <w:rFonts w:ascii="BC Sans" w:hAnsi="BC Sans"/>
-        </w:rPr>
-        <w:t>Of</w:t>
-      </w:r>
-      <w:proofErr w:type="gramEnd"/>
-      <w:r>
-        <w:rPr>
-          <w:rFonts w:ascii="BC Sans" w:hAnsi="BC Sans"/>
-        </w:rPr>
-        <w:t xml:space="preserve"> Mines</w:t>
+      <w:r>
+        <w:rPr>
+          <w:rFonts w:ascii="BC Sans" w:hAnsi="BC Sans"/>
+        </w:rPr>
+        <w:t>o</w:t>
+      </w:r>
+      <w:r>
+        <w:rPr>
+          <w:rFonts w:ascii="BC Sans" w:hAnsi="BC Sans"/>
+        </w:rPr>
+        <w:t>f Mines</w:t>
       </w:r>
       <w:r>
         <w:rPr>
@@ -5818,6 +6073,12 @@
 <file path=word/footer1.xml><?xml version="1.0" encoding="utf-8"?>
 <w:ftr xmlns:wpc="http://schemas.microsoft.com/office/word/2010/wordprocessingCanvas" xmlns:cx="http://schemas.microsoft.com/office/drawing/2014/chartex" xmlns:cx1="http://schemas.microsoft.com/office/drawing/2015/9/8/chartex" xmlns:cx2="http://schemas.microsoft.com/office/drawing/2015/10/21/chartex" xmlns:cx3="http://schemas.microsoft.com/office/drawing/2016/5/9/chartex" xmlns:cx4="http://schemas.microsoft.com/office/drawing/2016/5/10/chartex" xmlns:cx5="http://schemas.microsoft.com/office/drawing/2016/5/11/chartex" xmlns:cx6="http://schemas.microsoft.com/office/drawing/2016/5/12/chartex" xmlns:cx7="http://schemas.microsoft.com/office/drawing/2016/5/13/chartex" xmlns:cx8="http://schemas.microsoft.com/office/drawing/2016/5/14/chartex" xmlns:mc="http://schemas.openxmlformats.org/markup-compatibility/2006" xmlns:aink="http://schemas.microsoft.com/office/drawing/2016/ink" xmlns:am3d="http://schemas.microsoft.com/office/drawing/2017/model3d" xmlns:o="urn:schemas-microsoft-com:office:office" xmlns:oel="http://schemas.microsoft.com/office/2019/extlst" xmlns:r="http://schemas.openxmlformats.org/officeDocument/2006/relationships" xmlns:m="http://schemas.openxmlformats.org/officeDocument/2006/math" xmlns:v="urn:schemas-microsoft-com:vml" xmlns:wp14="http://schemas.microsoft.com/office/word/2010/wordprocessingDrawing" xmlns:wp="http://schemas.openxmlformats.org/drawingml/2006/wordprocessingDrawing" xmlns:w10="urn:schemas-microsoft-com:office:word" xmlns:w="http://schemas.openxmlformats.org/wordprocessingml/2006/main" xmlns:w14="http://schemas.microsoft.com/office/word/2010/wordml" xmlns:w15="http://schemas.microsoft.com/office/word/2012/wordml" xmlns:w16cex="http://schemas.microsoft.com/office/word/2018/wordml/cex" xmlns:w16cid="http://schemas.microsoft.com/office/word/2016/wordml/cid" xmlns:w16="http://schemas.microsoft.com/office/word/2018/wordml" xmlns:w16du="http://schemas.microsoft.com/office/word/2023/wordml/word16du" xmlns:w16sdtdh="http://schemas.microsoft.com/office/word/2020/wordml/sdtdatahash" xmlns:w16sdtfl="http://schemas.microsoft.com/office/word/2024/wordml/sdtformatlock" xmlns:w16se="http://schemas.microsoft.com/office/word/2015/wordml/symex" xmlns:wpg="http://schemas.microsoft.com/office/word/2010/wordprocessingGroup" xmlns:wpi="http://schemas.microsoft.com/office/word/2010/wordprocessingInk" xmlns:wne="http://schemas.microsoft.com/office/word/2006/wordml" xmlns:wps="http://schemas.microsoft.com/office/word/2010/wordprocessingShape" mc:Ignorable="w14 w15 w16se w16cid w16 w16cex w16sdtdh w16sdtfl w16du wp14">
   <w:p>
+    <w:pPr>
+      <w:rPr>
+        <w:sz w:val="16"/>
+        <w:szCs w:val="16"/>
+      </w:rPr>
+    </w:pPr>
     <w:bookmarkStart w:id="7" w:name="OLE_LINK6"/>
     <w:bookmarkStart w:id="8" w:name="OLE_LINK7"/>
     <w:bookmarkStart w:id="9" w:name="_Hlk199502121"/>
@@ -5831,9 +6092,9 @@
       <w:tblLook w:val="0000" w:firstRow="0" w:lastRow="0" w:firstColumn="0" w:lastColumn="0" w:noHBand="0" w:noVBand="0"/>
     </w:tblPr>
     <w:tblGrid>
-      <w:gridCol w:w="3196"/>
-      <w:gridCol w:w="2934"/>
-      <w:gridCol w:w="3230"/>
+      <w:gridCol w:w="3402"/>
+      <w:gridCol w:w="2977"/>
+      <w:gridCol w:w="2981"/>
     </w:tblGrid>
     <w:tr>
       <w:trPr>
@@ -5849,14 +6110,16 @@
             <w:rPr>
               <w:rFonts w:asciiTheme="minorHAnsi" w:hAnsiTheme="minorHAnsi" w:cstheme="minorHAnsi"/>
               <w:b/>
-              <w:sz w:val="20"/>
+              <w:sz w:val="16"/>
+              <w:szCs w:val="16"/>
             </w:rPr>
           </w:pPr>
           <w:r>
             <w:rPr>
               <w:rFonts w:asciiTheme="minorHAnsi" w:hAnsiTheme="minorHAnsi" w:cstheme="minorHAnsi"/>
               <w:b/>
-              <w:sz w:val="20"/>
+              <w:sz w:val="16"/>
+              <w:szCs w:val="16"/>
             </w:rPr>
             <w:t>M</w:t>
           </w:r>
@@ -5864,7 +6127,8 @@
             <w:rPr>
               <w:rFonts w:asciiTheme="minorHAnsi" w:hAnsiTheme="minorHAnsi" w:cstheme="minorHAnsi"/>
               <w:b/>
-              <w:sz w:val="20"/>
+              <w:sz w:val="16"/>
+              <w:szCs w:val="16"/>
             </w:rPr>
             <w:t xml:space="preserve">inistry of </w:t>
           </w:r>
@@ -5872,7 +6136,8 @@
             <w:rPr>
               <w:rFonts w:asciiTheme="minorHAnsi" w:hAnsiTheme="minorHAnsi" w:cstheme="minorHAnsi"/>
               <w:b/>
-              <w:sz w:val="20"/>
+              <w:sz w:val="16"/>
+              <w:szCs w:val="16"/>
             </w:rPr>
             <w:t>Mining and Critical Minerals</w:t>
           </w:r>
@@ -5882,13 +6147,15 @@
             <w:ind w:left="-90"/>
             <w:rPr>
               <w:rFonts w:asciiTheme="minorHAnsi" w:hAnsiTheme="minorHAnsi" w:cstheme="minorBidi"/>
-              <w:sz w:val="20"/>
+              <w:sz w:val="16"/>
+              <w:szCs w:val="16"/>
             </w:rPr>
           </w:pPr>
           <w:r>
             <w:rPr>
               <w:rFonts w:asciiTheme="minorHAnsi" w:hAnsiTheme="minorHAnsi" w:cstheme="minorBidi"/>
-              <w:sz w:val="20"/>
+              <w:sz w:val="16"/>
+              <w:szCs w:val="16"/>
             </w:rPr>
             <w:t>Mine Authorizations and Competitiveness Division,</w:t>
           </w:r>
@@ -5898,13 +6165,15 @@
             <w:ind w:left="-90"/>
             <w:rPr>
               <w:rFonts w:asciiTheme="minorHAnsi" w:hAnsiTheme="minorHAnsi" w:cstheme="minorBidi"/>
-              <w:sz w:val="20"/>
+              <w:sz w:val="16"/>
+              <w:szCs w:val="16"/>
             </w:rPr>
           </w:pPr>
           <w:r>
             <w:rPr>
               <w:rFonts w:asciiTheme="minorHAnsi" w:hAnsiTheme="minorHAnsi" w:cstheme="minorBidi"/>
-              <w:sz w:val="20"/>
+              <w:sz w:val="16"/>
+              <w:szCs w:val="16"/>
             </w:rPr>
             <w:t xml:space="preserve">Regional Operations Branch  </w:t>
           </w:r>
@@ -5914,7 +6183,8 @@
             <w:rPr>
               <w:rFonts w:asciiTheme="minorHAnsi" w:hAnsiTheme="minorHAnsi" w:cstheme="minorHAnsi"/>
               <w:bCs/>
-              <w:sz w:val="20"/>
+              <w:sz w:val="16"/>
+              <w:szCs w:val="16"/>
             </w:rPr>
           </w:pPr>
         </w:p>
@@ -5928,14 +6198,16 @@
             <w:rPr>
               <w:rFonts w:asciiTheme="minorHAnsi" w:hAnsiTheme="minorHAnsi" w:cstheme="minorHAnsi"/>
               <w:b/>
-              <w:sz w:val="20"/>
+              <w:sz w:val="16"/>
+              <w:szCs w:val="16"/>
             </w:rPr>
           </w:pPr>
           <w:r>
             <w:rPr>
               <w:rFonts w:asciiTheme="minorHAnsi" w:hAnsiTheme="minorHAnsi" w:cstheme="minorHAnsi"/>
               <w:b/>
-              <w:sz w:val="20"/>
+              <w:sz w:val="16"/>
+              <w:szCs w:val="16"/>
             </w:rPr>
             <w:t>Contact</w:t>
           </w:r>
@@ -5944,14 +6216,16 @@
           <w:pPr>
             <w:rPr>
               <w:rFonts w:asciiTheme="minorHAnsi" w:hAnsiTheme="minorHAnsi" w:cstheme="minorBidi"/>
-              <w:sz w:val="20"/>
+              <w:sz w:val="16"/>
+              <w:szCs w:val="16"/>
               <w:highlight w:val="yellow"/>
             </w:rPr>
           </w:pPr>
           <w:r>
             <w:rPr>
               <w:rFonts w:asciiTheme="minorHAnsi" w:hAnsiTheme="minorHAnsi" w:cstheme="minorBidi"/>
-              <w:sz w:val="20"/>
+              <w:sz w:val="16"/>
+              <w:szCs w:val="16"/>
             </w:rPr>
             <w:t>{</w:t>
           </w:r>
@@ -5959,7 +6233,8 @@
           <w:r>
             <w:rPr>
               <w:rFonts w:asciiTheme="minorHAnsi" w:hAnsiTheme="minorHAnsi" w:cstheme="minorBidi"/>
-              <w:sz w:val="20"/>
+              <w:sz w:val="16"/>
+              <w:szCs w:val="16"/>
             </w:rPr>
             <w:t>d.rc_office_email</w:t>
           </w:r>
@@ -5967,29 +6242,26 @@
           <w:r>
             <w:rPr>
               <w:rFonts w:asciiTheme="minorHAnsi" w:hAnsiTheme="minorHAnsi" w:cstheme="minorBidi"/>
-              <w:sz w:val="20"/>
+              <w:sz w:val="16"/>
+              <w:szCs w:val="16"/>
             </w:rPr>
             <w:t>}</w:t>
           </w:r>
           <w:r>
             <w:rPr>
               <w:rFonts w:asciiTheme="minorHAnsi" w:hAnsiTheme="minorHAnsi" w:cstheme="minorBidi"/>
-              <w:sz w:val="20"/>
+              <w:sz w:val="16"/>
+              <w:szCs w:val="16"/>
             </w:rPr>
             <w:br/>
-          </w:r>
-          <w:r>
-            <w:rPr>
-              <w:rFonts w:asciiTheme="minorHAnsi" w:hAnsiTheme="minorHAnsi" w:cstheme="minorBidi"/>
-              <w:sz w:val="20"/>
-            </w:rPr>
             <w:t>{</w:t>
           </w:r>
           <w:proofErr w:type="spellStart"/>
           <w:r>
             <w:rPr>
               <w:rFonts w:asciiTheme="minorHAnsi" w:hAnsiTheme="minorHAnsi" w:cstheme="minorBidi"/>
-              <w:sz w:val="20"/>
+              <w:sz w:val="16"/>
+              <w:szCs w:val="16"/>
             </w:rPr>
             <w:t>d.rc_office_phone_number</w:t>
           </w:r>
@@ -5997,7 +6269,8 @@
           <w:r>
             <w:rPr>
               <w:rFonts w:asciiTheme="minorHAnsi" w:hAnsiTheme="minorHAnsi" w:cstheme="minorBidi"/>
-              <w:sz w:val="20"/>
+              <w:sz w:val="16"/>
+              <w:szCs w:val="16"/>
             </w:rPr>
             <w:t>}</w:t>
           </w:r>
@@ -6012,14 +6285,16 @@
             <w:rPr>
               <w:rFonts w:asciiTheme="minorHAnsi" w:hAnsiTheme="minorHAnsi" w:cstheme="minorHAnsi"/>
               <w:b/>
-              <w:sz w:val="20"/>
+              <w:sz w:val="16"/>
+              <w:szCs w:val="16"/>
             </w:rPr>
           </w:pPr>
           <w:r>
             <w:rPr>
               <w:rFonts w:asciiTheme="minorHAnsi" w:hAnsiTheme="minorHAnsi" w:cstheme="minorHAnsi"/>
               <w:b/>
-              <w:sz w:val="20"/>
+              <w:sz w:val="16"/>
+              <w:szCs w:val="16"/>
             </w:rPr>
             <w:t>Mail reclamation security to</w:t>
           </w:r>
@@ -6027,7 +6302,8 @@
             <w:rPr>
               <w:rFonts w:asciiTheme="minorHAnsi" w:hAnsiTheme="minorHAnsi" w:cstheme="minorHAnsi"/>
               <w:b/>
-              <w:sz w:val="20"/>
+              <w:sz w:val="16"/>
+              <w:szCs w:val="16"/>
             </w:rPr>
             <w:t>:</w:t>
           </w:r>
@@ -6035,15 +6311,16 @@
             <w:rPr>
               <w:rFonts w:asciiTheme="minorHAnsi" w:hAnsiTheme="minorHAnsi" w:cstheme="minorHAnsi"/>
               <w:b/>
-              <w:sz w:val="20"/>
+              <w:sz w:val="16"/>
+              <w:szCs w:val="16"/>
             </w:rPr>
             <w:br/>
           </w:r>
           <w:r>
             <w:rPr>
               <w:rFonts w:ascii="Arial" w:hAnsi="Arial" w:cs="Arial"/>
-              <w:sz w:val="18"/>
-              <w:szCs w:val="18"/>
+              <w:sz w:val="16"/>
+              <w:szCs w:val="16"/>
             </w:rPr>
             <w:t>{d.rc_office_mailing_address_line_1}</w:t>
           </w:r>
@@ -6053,14 +6330,16 @@
             <w:rPr>
               <w:rFonts w:asciiTheme="minorHAnsi" w:hAnsiTheme="minorHAnsi" w:cstheme="minorHAnsi"/>
               <w:bCs/>
-              <w:sz w:val="20"/>
+              <w:sz w:val="16"/>
+              <w:szCs w:val="16"/>
             </w:rPr>
           </w:pPr>
           <w:r>
             <w:rPr>
               <w:rFonts w:asciiTheme="minorHAnsi" w:hAnsiTheme="minorHAnsi" w:cstheme="minorHAnsi"/>
               <w:bCs/>
-              <w:sz w:val="20"/>
+              <w:sz w:val="16"/>
+              <w:szCs w:val="16"/>
             </w:rPr>
             <w:t>{d.rc_office_mailing_address_line_2}</w:t>
           </w:r>
@@ -6074,6 +6353,10 @@
   <w:p>
     <w:pPr>
       <w:pStyle w:val="Footer"/>
+      <w:rPr>
+        <w:sz w:val="16"/>
+        <w:szCs w:val="16"/>
+      </w:rPr>
     </w:pPr>
   </w:p>
 </w:ftr>
@@ -6556,7 +6839,7 @@
                   <v:stroke joinstyle="miter"/>
                   <v:path gradientshapeok="t" o:connecttype="rect"/>
                 </v:shapetype>
-                <v:shape id="Text Box 2" o:spid="_x0000_s1026" type="#_x0000_t202" style="position:absolute;left:0;text-align:left;margin-left:-14.45pt;margin-top:-11.65pt;width:123.85pt;height:60.5pt;z-index:251658240;visibility:visible;mso-wrap-style:square;mso-wrap-distance-left:9pt;mso-wrap-distance-top:0;mso-wrap-distance-right:9pt;mso-wrap-distance-bottom:0;mso-position-horizontal:absolute;mso-position-horizontal-relative:text;mso-position-vertical:absolute;mso-position-vertical-relative:text;v-text-anchor:top" o:gfxdata="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" fillcolor="white [3201]" stroked="f" strokeweight=".5pt">
+                <v:shape id="Text Box 2" o:spid="_x0000_s1026" type="#_x0000_t202" style="position:absolute;left:0;text-align:left;margin-left:-14.45pt;margin-top:-11.65pt;width:123.85pt;height:60.5pt;z-index:251658240;visibility:visible;mso-wrap-style:square;mso-wrap-distance-left:9pt;mso-wrap-distance-top:0;mso-wrap-distance-right:9pt;mso-wrap-distance-bottom:0;mso-position-horizontal:absolute;mso-position-horizontal-relative:text;mso-position-vertical:absolute;mso-position-vertical-relative:text;v-text-anchor:top" o:gfxdata="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" fillcolor="white [3201]" stroked="f" strokeweight=".5pt">
                   <v:textbox>
                     <w:txbxContent>
                       <w:p>
@@ -6587,7 +6870,7 @@
                                       <pic:cNvPicPr/>
                                     </pic:nvPicPr>
                                     <pic:blipFill>
-                                      <a:blip r:embed="rId2">
+                                      <a:blip r:embed="rId1">
                                         <a:extLst>
                                           <a:ext uri="{28A0092B-C50C-407E-A947-70E740481C1C}">
                                             <a14:useLocalDpi xmlns:a14="http://schemas.microsoft.com/office/drawing/2010/main" val="0"/>

</xml_diff>

<commit_message>
adding proponent address to CAL letter template
</commit_message>
<xml_diff>
--- a/services/core-api/app/templates/now/Acknowledgment Letter.docx
+++ b/services/core-api/app/templates/now/Acknowledgment Letter.docx
@@ -91,6 +91,50 @@
         </w:rPr>
         <w:t>}</w:t>
       </w:r>
+    </w:p>
+    <w:p>
+      <w:pPr>
+        <w:pStyle w:val="NoSpacing"/>
+        <w:rPr>
+          <w:rFonts w:ascii="BC Sans" w:hAnsi="BC Sans" w:cstheme="minorHAnsi"/>
+        </w:rPr>
+      </w:pPr>
+      <w:r>
+        <w:rPr>
+          <w:rFonts w:ascii="BC Sans" w:hAnsi="BC Sans" w:cstheme="minorHAnsi"/>
+        </w:rPr>
+        <w:t>{</w:t>
+      </w:r>
+      <w:proofErr w:type="spellStart"/>
+      <w:proofErr w:type="gramStart"/>
+      <w:r>
+        <w:rPr>
+          <w:rFonts w:ascii="BC Sans" w:hAnsi="BC Sans" w:cstheme="minorHAnsi"/>
+        </w:rPr>
+        <w:t>d.proponent</w:t>
+      </w:r>
+      <w:proofErr w:type="gramEnd"/>
+      <w:r>
+        <w:rPr>
+          <w:rFonts w:ascii="BC Sans" w:hAnsi="BC Sans" w:cstheme="minorHAnsi"/>
+        </w:rPr>
+        <w:t>_</w:t>
+      </w:r>
+      <w:proofErr w:type="gramStart"/>
+      <w:r>
+        <w:rPr>
+          <w:rFonts w:ascii="BC Sans" w:hAnsi="BC Sans" w:cstheme="minorHAnsi"/>
+        </w:rPr>
+        <w:t>address:convCRLF</w:t>
+      </w:r>
+      <w:proofErr w:type="spellEnd"/>
+      <w:r>
+        <w:rPr>
+          <w:rFonts w:ascii="BC Sans" w:hAnsi="BC Sans" w:cstheme="minorHAnsi"/>
+        </w:rPr>
+        <w:t>()}</w:t>
+      </w:r>
+      <w:proofErr w:type="gramEnd"/>
     </w:p>
     <w:bookmarkEnd w:id="1"/>
     <w:p>
@@ -954,7 +998,7 @@
               </wp:anchor>
             </w:drawing>
           </mc:Choice>
-          <mc:Fallback xmlns:a="http://schemas.openxmlformats.org/drawingml/2006/main" xmlns:arto="http://schemas.microsoft.com/office/word/2006/arto">
+          <mc:Fallback xmlns:arto="http://schemas.microsoft.com/office/word/2006/arto" xmlns:a="http://schemas.openxmlformats.org/drawingml/2006/main">
             <w:pict w14:anchorId="5E9A1C54">
               <v:line id="Straight Connector 1" style="position:absolute;z-index:251659264;visibility:visible;mso-wrap-style:square;mso-width-percent:0;mso-height-percent:0;mso-wrap-distance-left:9pt;mso-wrap-distance-top:0;mso-wrap-distance-right:9pt;mso-wrap-distance-bottom:0;mso-position-horizontal:absolute;mso-position-horizontal-relative:margin;mso-position-vertical:absolute;mso-position-vertical-relative:text;mso-width-percent:0;mso-height-percent:0;mso-width-relative:margin;mso-height-relative:margin" o:spid="_x0000_s1026" strokecolor="black [3040]" from="0,12.55pt" to="472.05pt,13.9pt" w14:anchorId="2E3E2B0A" o:gfxdata="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">
                 <w10:wrap anchorx="margin"/>
@@ -1728,6 +1772,7 @@
           <w:rFonts w:ascii="BC Sans" w:hAnsi="BC Sans"/>
           <w:color w:val="FF0000"/>
         </w:rPr>
+        <w:lastRenderedPageBreak/>
         <w:t>O</w:t>
       </w:r>
       <w:r>
@@ -1823,17 +1868,7 @@
           <w:color w:val="auto"/>
           <w:u w:val="none"/>
         </w:rPr>
-        <w:t xml:space="preserve">Therefore, be advised that </w:t>
-      </w:r>
-      <w:r>
-        <w:rPr>
-          <w:rStyle w:val="Hyperlink"/>
-          <w:rFonts w:ascii="BC Sans" w:hAnsi="BC Sans"/>
-          <w:color w:val="auto"/>
-          <w:u w:val="none"/>
-        </w:rPr>
-        <w:lastRenderedPageBreak/>
-        <w:t xml:space="preserve">it is your responsibility to apply for </w:t>
+        <w:t xml:space="preserve">Therefore, be advised that it is your responsibility to apply for </w:t>
       </w:r>
       <w:r>
         <w:rPr>
@@ -3161,9 +3196,8 @@
           <w:szCs w:val="22"/>
           <w:lang w:val="en-CA"/>
         </w:rPr>
-        <w:t xml:space="preserve">Other legislation may be applicable to your operation and, as the Permittee, you may </w:t>
-      </w:r>
-      <w:proofErr w:type="gramStart"/>
+        <w:t xml:space="preserve">Other legislation may be applicable to your operation and, as the Permittee, you may be required to obtain approvals or permits under that legislation, such as for road use </w:t>
+      </w:r>
       <w:r>
         <w:rPr>
           <w:rFonts w:ascii="BC Sans" w:eastAsia="Calibri" w:hAnsi="BC Sans" w:cs="Arial"/>
@@ -3172,9 +3206,8 @@
           <w:szCs w:val="22"/>
           <w:lang w:val="en-CA"/>
         </w:rPr>
-        <w:t>be required</w:t>
-      </w:r>
-      <w:proofErr w:type="gramEnd"/>
+        <w:t>or operation of a camp</w:t>
+      </w:r>
       <w:r>
         <w:rPr>
           <w:rFonts w:ascii="BC Sans" w:eastAsia="Calibri" w:hAnsi="BC Sans" w:cs="Arial"/>
@@ -3183,7 +3216,7 @@
           <w:szCs w:val="22"/>
           <w:lang w:val="en-CA"/>
         </w:rPr>
-        <w:t xml:space="preserve"> to obtain approvals or permits under that legislation, such as for road use </w:t>
+        <w:t xml:space="preserve">. It is your responsibility to comply with the terms and conditions of all other permits and authorizations which </w:t>
       </w:r>
       <w:r>
         <w:rPr>
@@ -3193,7 +3226,7 @@
           <w:szCs w:val="22"/>
           <w:lang w:val="en-CA"/>
         </w:rPr>
-        <w:t>or operation of a camp</w:t>
+        <w:t>may b</w:t>
       </w:r>
       <w:r>
         <w:rPr>
@@ -3203,7 +3236,7 @@
           <w:szCs w:val="22"/>
           <w:lang w:val="en-CA"/>
         </w:rPr>
-        <w:t xml:space="preserve">. It is your responsibility to comply with the terms and conditions of all other permits and authorizations which </w:t>
+        <w:t xml:space="preserve">e issued </w:t>
       </w:r>
       <w:r>
         <w:rPr>
@@ -3213,7 +3246,7 @@
           <w:szCs w:val="22"/>
           <w:lang w:val="en-CA"/>
         </w:rPr>
-        <w:t>may b</w:t>
+        <w:t xml:space="preserve">to you </w:t>
       </w:r>
       <w:r>
         <w:rPr>
@@ -3223,7 +3256,32 @@
           <w:szCs w:val="22"/>
           <w:lang w:val="en-CA"/>
         </w:rPr>
-        <w:t xml:space="preserve">e issued </w:t>
+        <w:t xml:space="preserve">and all </w:t>
+      </w:r>
+      <w:r>
+        <w:rPr>
+          <w:rFonts w:ascii="BC Sans" w:eastAsia="Calibri" w:hAnsi="BC Sans" w:cs="Arial"/>
+          <w:b/>
+          <w:bCs/>
+          <w:kern w:val="2"/>
+          <w:sz w:val="22"/>
+          <w:szCs w:val="22"/>
+          <w:lang w:val="en-CA"/>
+        </w:rPr>
+        <w:t xml:space="preserve">other applicable </w:t>
+      </w:r>
+      <w:r>
+        <w:rPr>
+          <w:rFonts w:ascii="BC Sans" w:eastAsia="Calibri" w:hAnsi="BC Sans" w:cs="Arial"/>
+          <w:b/>
+          <w:bCs/>
+          <w:kern w:val="2"/>
+          <w:sz w:val="22"/>
+          <w:szCs w:val="22"/>
+          <w:lang w:val="en-CA"/>
+        </w:rPr>
+        <w:lastRenderedPageBreak/>
+        <w:t>legislation</w:t>
       </w:r>
       <w:r>
         <w:rPr>
@@ -3233,7 +3291,7 @@
           <w:szCs w:val="22"/>
           <w:lang w:val="en-CA"/>
         </w:rPr>
-        <w:t xml:space="preserve">to you </w:t>
+        <w:t xml:space="preserve"> including </w:t>
       </w:r>
       <w:r>
         <w:rPr>
@@ -3243,74 +3301,7 @@
           <w:szCs w:val="22"/>
           <w:lang w:val="en-CA"/>
         </w:rPr>
-        <w:t xml:space="preserve">and all </w:t>
-      </w:r>
-      <w:r>
-        <w:rPr>
-          <w:rFonts w:ascii="BC Sans" w:eastAsia="Calibri" w:hAnsi="BC Sans" w:cs="Arial"/>
-          <w:b/>
-          <w:bCs/>
-          <w:kern w:val="2"/>
-          <w:sz w:val="22"/>
-          <w:szCs w:val="22"/>
-          <w:lang w:val="en-CA"/>
-        </w:rPr>
-        <w:t xml:space="preserve">other applicable </w:t>
-      </w:r>
-      <w:r>
-        <w:rPr>
-          <w:rFonts w:ascii="BC Sans" w:eastAsia="Calibri" w:hAnsi="BC Sans" w:cs="Arial"/>
-          <w:b/>
-          <w:bCs/>
-          <w:kern w:val="2"/>
-          <w:sz w:val="22"/>
-          <w:szCs w:val="22"/>
-          <w:lang w:val="en-CA"/>
-        </w:rPr>
-        <w:lastRenderedPageBreak/>
-        <w:t>legislation</w:t>
-      </w:r>
-      <w:r>
-        <w:rPr>
-          <w:rFonts w:ascii="BC Sans" w:eastAsia="Calibri" w:hAnsi="BC Sans" w:cs="Arial"/>
-          <w:kern w:val="2"/>
-          <w:sz w:val="22"/>
-          <w:szCs w:val="22"/>
-          <w:lang w:val="en-CA"/>
-        </w:rPr>
-        <w:t xml:space="preserve"> </w:t>
-      </w:r>
-      <w:proofErr w:type="gramStart"/>
-      <w:r>
-        <w:rPr>
-          <w:rFonts w:ascii="BC Sans" w:eastAsia="Calibri" w:hAnsi="BC Sans" w:cs="Arial"/>
-          <w:kern w:val="2"/>
-          <w:sz w:val="22"/>
-          <w:szCs w:val="22"/>
-          <w:lang w:val="en-CA"/>
-        </w:rPr>
-        <w:t xml:space="preserve">including </w:t>
-      </w:r>
-      <w:r>
-        <w:rPr>
-          <w:rFonts w:ascii="BC Sans" w:eastAsia="Calibri" w:hAnsi="BC Sans" w:cs="Arial"/>
-          <w:kern w:val="2"/>
-          <w:sz w:val="22"/>
-          <w:szCs w:val="22"/>
-          <w:lang w:val="en-CA"/>
-        </w:rPr>
-        <w:t>but not limited to</w:t>
-      </w:r>
-      <w:proofErr w:type="gramEnd"/>
-      <w:r>
-        <w:rPr>
-          <w:rFonts w:ascii="BC Sans" w:eastAsia="Calibri" w:hAnsi="BC Sans" w:cs="Arial"/>
-          <w:kern w:val="2"/>
-          <w:sz w:val="22"/>
-          <w:szCs w:val="22"/>
-          <w:lang w:val="en-CA"/>
-        </w:rPr>
-        <w:t xml:space="preserve"> </w:t>
+        <w:t xml:space="preserve">but not limited to </w:t>
       </w:r>
       <w:r>
         <w:rPr>
@@ -4985,29 +4976,101 @@
           <w:rFonts w:ascii="BC Sans" w:hAnsi="BC Sans"/>
           <w:lang w:val="en-CA"/>
         </w:rPr>
-        <w:t xml:space="preserve"> public advertising will </w:t>
-      </w:r>
-      <w:proofErr w:type="gramStart"/>
+        <w:t xml:space="preserve"> public advertising will be required for this application</w:t>
+      </w:r>
       <w:r>
         <w:rPr>
           <w:rFonts w:ascii="BC Sans" w:hAnsi="BC Sans"/>
           <w:lang w:val="en-CA"/>
         </w:rPr>
-        <w:t>be required</w:t>
-      </w:r>
-      <w:proofErr w:type="gramEnd"/>
+        <w:t xml:space="preserve">. </w:t>
+      </w:r>
       <w:r>
         <w:rPr>
           <w:rFonts w:ascii="BC Sans" w:hAnsi="BC Sans"/>
           <w:lang w:val="en-CA"/>
         </w:rPr>
-        <w:t xml:space="preserve"> for this application</w:t>
-      </w:r>
-      <w:r>
-        <w:rPr>
-          <w:rFonts w:ascii="BC Sans" w:hAnsi="BC Sans"/>
+        <w:t xml:space="preserve">You are required to publish a </w:t>
+      </w:r>
+      <w:r>
+        <w:rPr>
+          <w:rFonts w:ascii="BC Sans" w:hAnsi="BC Sans"/>
+          <w:b/>
+          <w:bCs/>
           <w:lang w:val="en-CA"/>
         </w:rPr>
+        <w:t>Notice of Filing</w:t>
+      </w:r>
+      <w:r>
+        <w:rPr>
+          <w:rFonts w:ascii="BC Sans" w:hAnsi="BC Sans"/>
+          <w:lang w:val="en-CA"/>
+        </w:rPr>
+        <w:t xml:space="preserve"> </w:t>
+      </w:r>
+      <w:r>
+        <w:rPr>
+          <w:rFonts w:ascii="BC Sans" w:hAnsi="BC Sans"/>
+          <w:lang w:val="en-CA"/>
+        </w:rPr>
+        <w:t xml:space="preserve">advertisement </w:t>
+      </w:r>
+      <w:r>
+        <w:rPr>
+          <w:rFonts w:ascii="BC Sans" w:hAnsi="BC Sans"/>
+          <w:lang w:val="en-CA"/>
+        </w:rPr>
+        <w:t>in the BC Gazette and local newspaper (</w:t>
+      </w:r>
+      <w:r>
+        <w:rPr>
+          <w:rFonts w:ascii="BC Sans" w:hAnsi="BC Sans"/>
+          <w:lang w:val="en-CA"/>
+        </w:rPr>
+        <w:t>where</w:t>
+      </w:r>
+      <w:r>
+        <w:rPr>
+          <w:rFonts w:ascii="BC Sans" w:hAnsi="BC Sans"/>
+          <w:lang w:val="en-CA"/>
+        </w:rPr>
+        <w:t xml:space="preserve"> available), and to establish road-side </w:t>
+      </w:r>
+      <w:r>
+        <w:rPr>
+          <w:rFonts w:ascii="BC Sans" w:hAnsi="BC Sans"/>
+          <w:b/>
+          <w:bCs/>
+          <w:lang w:val="en-CA"/>
+        </w:rPr>
+        <w:t xml:space="preserve">signage </w:t>
+      </w:r>
+      <w:r>
+        <w:rPr>
+          <w:rFonts w:ascii="BC Sans" w:hAnsi="BC Sans"/>
+          <w:lang w:val="en-CA"/>
+        </w:rPr>
+        <w:t xml:space="preserve">advertising your Mines Act </w:t>
+      </w:r>
+      <w:r>
+        <w:rPr>
+          <w:rFonts w:ascii="BC Sans" w:hAnsi="BC Sans"/>
+          <w:lang w:val="en-CA"/>
+        </w:rPr>
+        <w:t>p</w:t>
+      </w:r>
+      <w:r>
+        <w:rPr>
+          <w:rFonts w:ascii="BC Sans" w:hAnsi="BC Sans"/>
+          <w:lang w:val="en-CA"/>
+        </w:rPr>
+        <w:t>ermit application</w:t>
+      </w:r>
+      <w:r>
+        <w:rPr>
+          <w:rFonts w:ascii="BC Sans" w:hAnsi="BC Sans"/>
+          <w:lang w:val="en-CA"/>
+        </w:rPr>
         <w:t xml:space="preserve">. </w:t>
       </w:r>
       <w:r>
@@ -5015,155 +5078,35 @@
           <w:rFonts w:ascii="BC Sans" w:hAnsi="BC Sans"/>
           <w:lang w:val="en-CA"/>
         </w:rPr>
-        <w:t xml:space="preserve">You </w:t>
-      </w:r>
-      <w:proofErr w:type="gramStart"/>
+        <w:t>Please forward a draft of the Notice of Filing</w:t>
+      </w:r>
       <w:r>
         <w:rPr>
           <w:rFonts w:ascii="BC Sans" w:hAnsi="BC Sans"/>
           <w:lang w:val="en-CA"/>
         </w:rPr>
-        <w:t>are required</w:t>
-      </w:r>
-      <w:proofErr w:type="gramEnd"/>
+        <w:t xml:space="preserve"> </w:t>
+      </w:r>
       <w:r>
         <w:rPr>
           <w:rFonts w:ascii="BC Sans" w:hAnsi="BC Sans"/>
           <w:lang w:val="en-CA"/>
         </w:rPr>
-        <w:t xml:space="preserve"> to publish a </w:t>
-      </w:r>
-      <w:r>
-        <w:rPr>
-          <w:rFonts w:ascii="BC Sans" w:hAnsi="BC Sans"/>
-          <w:b/>
-          <w:bCs/>
+        <w:t>and a draft road-side signage template to this office for review and approval</w:t>
+      </w:r>
+      <w:r>
+        <w:rPr>
+          <w:rFonts w:ascii="BC Sans" w:hAnsi="BC Sans"/>
           <w:lang w:val="en-CA"/>
         </w:rPr>
-        <w:t>Notice of Filing</w:t>
+        <w:t xml:space="preserve">. </w:t>
       </w:r>
       <w:r>
         <w:rPr>
           <w:rFonts w:ascii="BC Sans" w:hAnsi="BC Sans"/>
           <w:lang w:val="en-CA"/>
         </w:rPr>
-        <w:t xml:space="preserve"> </w:t>
-      </w:r>
-      <w:r>
-        <w:rPr>
-          <w:rFonts w:ascii="BC Sans" w:hAnsi="BC Sans"/>
-          <w:lang w:val="en-CA"/>
-        </w:rPr>
-        <w:t xml:space="preserve">advertisement </w:t>
-      </w:r>
-      <w:r>
-        <w:rPr>
-          <w:rFonts w:ascii="BC Sans" w:hAnsi="BC Sans"/>
-          <w:lang w:val="en-CA"/>
-        </w:rPr>
-        <w:t>in the BC Gazette and local newspaper (</w:t>
-      </w:r>
-      <w:r>
-        <w:rPr>
-          <w:rFonts w:ascii="BC Sans" w:hAnsi="BC Sans"/>
-          <w:lang w:val="en-CA"/>
-        </w:rPr>
-        <w:t>where</w:t>
-      </w:r>
-      <w:r>
-        <w:rPr>
-          <w:rFonts w:ascii="BC Sans" w:hAnsi="BC Sans"/>
-          <w:lang w:val="en-CA"/>
-        </w:rPr>
-        <w:t xml:space="preserve"> available), and to establish road-side </w:t>
-      </w:r>
-      <w:r>
-        <w:rPr>
-          <w:rFonts w:ascii="BC Sans" w:hAnsi="BC Sans"/>
-          <w:b/>
-          <w:bCs/>
-          <w:lang w:val="en-CA"/>
-        </w:rPr>
-        <w:t xml:space="preserve">signage </w:t>
-      </w:r>
-      <w:r>
-        <w:rPr>
-          <w:rFonts w:ascii="BC Sans" w:hAnsi="BC Sans"/>
-          <w:lang w:val="en-CA"/>
-        </w:rPr>
-        <w:t xml:space="preserve">advertising your Mines Act </w:t>
-      </w:r>
-      <w:r>
-        <w:rPr>
-          <w:rFonts w:ascii="BC Sans" w:hAnsi="BC Sans"/>
-          <w:lang w:val="en-CA"/>
-        </w:rPr>
-        <w:t>p</w:t>
-      </w:r>
-      <w:r>
-        <w:rPr>
-          <w:rFonts w:ascii="BC Sans" w:hAnsi="BC Sans"/>
-          <w:lang w:val="en-CA"/>
-        </w:rPr>
-        <w:t>ermit application</w:t>
-      </w:r>
-      <w:r>
-        <w:rPr>
-          <w:rFonts w:ascii="BC Sans" w:hAnsi="BC Sans"/>
-          <w:lang w:val="en-CA"/>
-        </w:rPr>
-        <w:t xml:space="preserve">. </w:t>
-      </w:r>
-      <w:r>
-        <w:rPr>
-          <w:rFonts w:ascii="BC Sans" w:hAnsi="BC Sans"/>
-          <w:lang w:val="en-CA"/>
-        </w:rPr>
-        <w:t>Please forward a draft of the Notice of Filing</w:t>
-      </w:r>
-      <w:r>
-        <w:rPr>
-          <w:rFonts w:ascii="BC Sans" w:hAnsi="BC Sans"/>
-          <w:lang w:val="en-CA"/>
-        </w:rPr>
-        <w:t xml:space="preserve"> </w:t>
-      </w:r>
-      <w:r>
-        <w:rPr>
-          <w:rFonts w:ascii="BC Sans" w:hAnsi="BC Sans"/>
-          <w:lang w:val="en-CA"/>
-        </w:rPr>
-        <w:t>and a draft road-side signage template to this office for review and approval</w:t>
-      </w:r>
-      <w:r>
-        <w:rPr>
-          <w:rFonts w:ascii="BC Sans" w:hAnsi="BC Sans"/>
-          <w:lang w:val="en-CA"/>
-        </w:rPr>
-        <w:t xml:space="preserve">. </w:t>
-      </w:r>
-      <w:r>
-        <w:rPr>
-          <w:rFonts w:ascii="BC Sans" w:hAnsi="BC Sans"/>
-          <w:lang w:val="en-CA"/>
-        </w:rPr>
-        <w:t xml:space="preserve">When these drafts have </w:t>
-      </w:r>
-      <w:proofErr w:type="gramStart"/>
-      <w:r>
-        <w:rPr>
-          <w:rFonts w:ascii="BC Sans" w:hAnsi="BC Sans"/>
-          <w:lang w:val="en-CA"/>
-        </w:rPr>
-        <w:t>been approved</w:t>
-      </w:r>
-      <w:proofErr w:type="gramEnd"/>
-      <w:r>
-        <w:rPr>
-          <w:rFonts w:ascii="BC Sans" w:hAnsi="BC Sans"/>
-          <w:lang w:val="en-CA"/>
-        </w:rPr>
-        <w:t xml:space="preserve"> you may then submit the</w:t>
+        <w:t>When these drafts have been approved you may then submit the</w:t>
       </w:r>
       <w:r>
         <w:rPr>
@@ -6870,7 +6813,7 @@
                                       <pic:cNvPicPr/>
                                     </pic:nvPicPr>
                                     <pic:blipFill>
-                                      <a:blip r:embed="rId1">
+                                      <a:blip r:embed="rId2">
                                         <a:extLst>
                                           <a:ext uri="{28A0092B-C50C-407E-A947-70E740481C1C}">
                                             <a14:useLocalDpi xmlns:a14="http://schemas.microsoft.com/office/drawing/2010/main" val="0"/>

</xml_diff>

<commit_message>
adjustment to address and email in CAL and PE letter template
</commit_message>
<xml_diff>
--- a/services/core-api/app/templates/now/Acknowledgment Letter.docx
+++ b/services/core-api/app/templates/now/Acknowledgment Letter.docx
@@ -25,19 +25,11 @@
         <w:t>{</w:t>
       </w:r>
       <w:proofErr w:type="spellStart"/>
-      <w:proofErr w:type="gramStart"/>
       <w:r>
         <w:rPr>
           <w:rFonts w:ascii="BC Sans" w:hAnsi="BC Sans" w:cstheme="minorHAnsi"/>
         </w:rPr>
-        <w:t>d.letter</w:t>
-      </w:r>
-      <w:proofErr w:type="gramEnd"/>
-      <w:r>
-        <w:rPr>
-          <w:rFonts w:ascii="BC Sans" w:hAnsi="BC Sans" w:cstheme="minorHAnsi"/>
-        </w:rPr>
-        <w:t>_dt</w:t>
+        <w:t>d.letter_dt</w:t>
       </w:r>
       <w:proofErr w:type="spellEnd"/>
       <w:r>
@@ -70,19 +62,11 @@
         <w:t>{</w:t>
       </w:r>
       <w:proofErr w:type="spellStart"/>
-      <w:proofErr w:type="gramStart"/>
       <w:r>
         <w:rPr>
           <w:rFonts w:ascii="BC Sans" w:hAnsi="BC Sans" w:cstheme="minorHAnsi"/>
         </w:rPr>
-        <w:t>d.proponent</w:t>
-      </w:r>
-      <w:proofErr w:type="gramEnd"/>
-      <w:r>
-        <w:rPr>
-          <w:rFonts w:ascii="BC Sans" w:hAnsi="BC Sans" w:cstheme="minorHAnsi"/>
-        </w:rPr>
-        <w:t>_name</w:t>
+        <w:t>d.proponent_name</w:t>
       </w:r>
       <w:proofErr w:type="spellEnd"/>
       <w:r>
@@ -106,35 +90,19 @@
         <w:t>{</w:t>
       </w:r>
       <w:proofErr w:type="spellStart"/>
-      <w:proofErr w:type="gramStart"/>
       <w:r>
         <w:rPr>
           <w:rFonts w:ascii="BC Sans" w:hAnsi="BC Sans" w:cstheme="minorHAnsi"/>
         </w:rPr>
-        <w:t>d.proponent</w:t>
-      </w:r>
-      <w:proofErr w:type="gramEnd"/>
+        <w:t>d.proponent_address:convCRLF</w:t>
+      </w:r>
+      <w:proofErr w:type="spellEnd"/>
       <w:r>
         <w:rPr>
           <w:rFonts w:ascii="BC Sans" w:hAnsi="BC Sans" w:cstheme="minorHAnsi"/>
         </w:rPr>
-        <w:t>_</w:t>
-      </w:r>
-      <w:proofErr w:type="gramStart"/>
-      <w:r>
-        <w:rPr>
-          <w:rFonts w:ascii="BC Sans" w:hAnsi="BC Sans" w:cstheme="minorHAnsi"/>
-        </w:rPr>
-        <w:t>address:convCRLF</w:t>
-      </w:r>
-      <w:proofErr w:type="spellEnd"/>
-      <w:r>
-        <w:rPr>
-          <w:rFonts w:ascii="BC Sans" w:hAnsi="BC Sans" w:cstheme="minorHAnsi"/>
-        </w:rPr>
         <w:t>()}</w:t>
       </w:r>
-      <w:proofErr w:type="gramEnd"/>
     </w:p>
     <w:bookmarkEnd w:id="1"/>
     <w:p>
@@ -159,51 +127,27 @@
         <w:t>{</w:t>
       </w:r>
       <w:proofErr w:type="spellStart"/>
-      <w:proofErr w:type="gramStart"/>
       <w:r>
         <w:rPr>
           <w:rFonts w:ascii="BC Sans" w:hAnsi="BC Sans" w:cstheme="minorHAnsi"/>
         </w:rPr>
-        <w:t>d.emailed</w:t>
-      </w:r>
-      <w:proofErr w:type="gramEnd"/>
+        <w:t>d.emailed_to:ifNEM</w:t>
+      </w:r>
+      <w:proofErr w:type="spellEnd"/>
       <w:r>
         <w:rPr>
           <w:rFonts w:ascii="BC Sans" w:hAnsi="BC Sans" w:cstheme="minorHAnsi"/>
         </w:rPr>
-        <w:t>_</w:t>
-      </w:r>
-      <w:proofErr w:type="gramStart"/>
+        <w:t>():</w:t>
+      </w:r>
+      <w:proofErr w:type="spellStart"/>
       <w:r>
         <w:rPr>
           <w:rFonts w:ascii="BC Sans" w:hAnsi="BC Sans" w:cstheme="minorHAnsi"/>
         </w:rPr>
-        <w:t>to:ifNEM</w:t>
+        <w:t>showBegin</w:t>
       </w:r>
       <w:proofErr w:type="spellEnd"/>
-      <w:proofErr w:type="gramEnd"/>
-      <w:r>
-        <w:rPr>
-          <w:rFonts w:ascii="BC Sans" w:hAnsi="BC Sans" w:cstheme="minorHAnsi"/>
-        </w:rPr>
-        <w:t>(</w:t>
-      </w:r>
-      <w:proofErr w:type="gramStart"/>
-      <w:r>
-        <w:rPr>
-          <w:rFonts w:ascii="BC Sans" w:hAnsi="BC Sans" w:cstheme="minorHAnsi"/>
-        </w:rPr>
-        <w:t>):</w:t>
-      </w:r>
-      <w:proofErr w:type="spellStart"/>
-      <w:r>
-        <w:rPr>
-          <w:rFonts w:ascii="BC Sans" w:hAnsi="BC Sans" w:cstheme="minorHAnsi"/>
-        </w:rPr>
-        <w:t>showBegin</w:t>
-      </w:r>
-      <w:proofErr w:type="spellEnd"/>
-      <w:proofErr w:type="gramEnd"/>
       <w:r>
         <w:rPr>
           <w:rFonts w:ascii="BC Sans" w:hAnsi="BC Sans" w:cstheme="minorHAnsi"/>
@@ -225,19 +169,11 @@
         <w:t>Sent as electronic mail to {</w:t>
       </w:r>
       <w:proofErr w:type="spellStart"/>
-      <w:proofErr w:type="gramStart"/>
       <w:r>
         <w:rPr>
           <w:rFonts w:ascii="BC Sans" w:hAnsi="BC Sans" w:cstheme="minorHAnsi"/>
         </w:rPr>
-        <w:t>d.emailed</w:t>
-      </w:r>
-      <w:proofErr w:type="gramEnd"/>
-      <w:r>
-        <w:rPr>
-          <w:rFonts w:ascii="BC Sans" w:hAnsi="BC Sans" w:cstheme="minorHAnsi"/>
-        </w:rPr>
-        <w:t>_to</w:t>
+        <w:t>d.emailed_to</w:t>
       </w:r>
       <w:proofErr w:type="spellEnd"/>
       <w:r>
@@ -261,29 +197,13 @@
         <w:t>{</w:t>
       </w:r>
       <w:proofErr w:type="spellStart"/>
-      <w:proofErr w:type="gramStart"/>
       <w:r>
         <w:rPr>
           <w:rFonts w:ascii="BC Sans" w:hAnsi="BC Sans" w:cstheme="minorHAnsi"/>
         </w:rPr>
-        <w:t>d.emailed</w:t>
-      </w:r>
-      <w:proofErr w:type="gramEnd"/>
-      <w:r>
-        <w:rPr>
-          <w:rFonts w:ascii="BC Sans" w:hAnsi="BC Sans" w:cstheme="minorHAnsi"/>
-        </w:rPr>
-        <w:t>_</w:t>
-      </w:r>
-      <w:proofErr w:type="gramStart"/>
-      <w:r>
-        <w:rPr>
-          <w:rFonts w:ascii="BC Sans" w:hAnsi="BC Sans" w:cstheme="minorHAnsi"/>
-        </w:rPr>
-        <w:t>to:showEnd</w:t>
+        <w:t>d.emailed_to:showEnd</w:t>
       </w:r>
       <w:proofErr w:type="spellEnd"/>
-      <w:proofErr w:type="gramEnd"/>
       <w:r>
         <w:rPr>
           <w:rFonts w:ascii="BC Sans" w:hAnsi="BC Sans" w:cstheme="minorHAnsi"/>
@@ -310,36 +230,27 @@
         <w:rPr>
           <w:rFonts w:ascii="BC Sans" w:hAnsi="BC Sans"/>
         </w:rPr>
-        <w:t xml:space="preserve"> Copy via electronic mail </w:t>
-      </w:r>
-      <w:r>
-        <w:rPr>
-          <w:rFonts w:ascii="BC Sans" w:hAnsi="BC Sans"/>
-        </w:rPr>
-        <w:t>to</w:t>
-      </w:r>
-      <w:r>
-        <w:rPr>
-          <w:rFonts w:ascii="BC Sans" w:hAnsi="BC Sans"/>
-        </w:rPr>
-        <w:t xml:space="preserve"> {</w:t>
+        <w:t xml:space="preserve"> </w:t>
+      </w:r>
+      <w:r>
+        <w:rPr>
+          <w:rFonts w:ascii="BC Sans" w:hAnsi="BC Sans" w:cstheme="minorHAnsi"/>
+        </w:rPr>
+        <w:t xml:space="preserve">Sent as electronic mail to </w:t>
+      </w:r>
+      <w:r>
+        <w:rPr>
+          <w:rFonts w:ascii="BC Sans" w:hAnsi="BC Sans"/>
+        </w:rPr>
+        <w:t>{</w:t>
       </w:r>
       <w:proofErr w:type="spellStart"/>
-      <w:proofErr w:type="gramStart"/>
       <w:r>
         <w:rPr>
           <w:rFonts w:ascii="BC Sans" w:eastAsia="BC Sans" w:hAnsi="BC Sans" w:cs="BC Sans"/>
           <w:color w:val="000000" w:themeColor="text1"/>
         </w:rPr>
-        <w:t>d.applicant</w:t>
-      </w:r>
-      <w:proofErr w:type="gramEnd"/>
-      <w:r>
-        <w:rPr>
-          <w:rFonts w:ascii="BC Sans" w:eastAsia="BC Sans" w:hAnsi="BC Sans" w:cs="BC Sans"/>
-          <w:color w:val="000000" w:themeColor="text1"/>
-        </w:rPr>
-        <w:t>_email</w:t>
+        <w:t>d.applicant_email</w:t>
       </w:r>
       <w:proofErr w:type="spellEnd"/>
       <w:r>
@@ -374,16 +285,7 @@
           <w:b/>
           <w:bCs/>
         </w:rPr>
-        <w:t>Re</w:t>
-      </w:r>
-      <w:proofErr w:type="gramStart"/>
-      <w:r>
-        <w:rPr>
-          <w:rFonts w:ascii="BC Sans" w:hAnsi="BC Sans"/>
-          <w:b/>
-          <w:bCs/>
-        </w:rPr>
-        <w:t xml:space="preserve">: </w:t>
+        <w:t xml:space="preserve">Re: </w:t>
       </w:r>
       <w:r>
         <w:rPr>
@@ -397,16 +299,7 @@
           <w:b/>
           <w:bCs/>
         </w:rPr>
-        <w:t>Application</w:t>
-      </w:r>
-      <w:proofErr w:type="gramEnd"/>
-      <w:r>
-        <w:rPr>
-          <w:rFonts w:ascii="BC Sans" w:hAnsi="BC Sans"/>
-          <w:b/>
-          <w:bCs/>
-        </w:rPr>
-        <w:t xml:space="preserve"> </w:t>
+        <w:t xml:space="preserve">Application </w:t>
       </w:r>
       <w:r>
         <w:rPr>
@@ -424,7 +317,6 @@
         </w:rPr>
         <w:t xml:space="preserve">a </w:t>
       </w:r>
-      <w:proofErr w:type="gramStart"/>
       <w:r>
         <w:rPr>
           <w:rFonts w:ascii="BC Sans" w:hAnsi="BC Sans"/>
@@ -441,7 +333,6 @@
         </w:rPr>
         <w:t>permit</w:t>
       </w:r>
-      <w:proofErr w:type="gramEnd"/>
     </w:p>
     <w:p>
       <w:pPr>
@@ -475,35 +366,16 @@
           <w:b/>
           <w:bCs/>
         </w:rPr>
-        <w:t>d.application_type_</w:t>
-      </w:r>
-      <w:proofErr w:type="gramStart"/>
-      <w:r>
-        <w:rPr>
-          <w:rFonts w:ascii="BC Sans" w:hAnsi="BC Sans"/>
-          <w:b/>
-          <w:bCs/>
-        </w:rPr>
-        <w:t>code:ifEQ</w:t>
+        <w:t>d.application_type_code:ifEQ</w:t>
       </w:r>
       <w:proofErr w:type="spellEnd"/>
-      <w:proofErr w:type="gramEnd"/>
-      <w:r>
-        <w:rPr>
-          <w:rFonts w:ascii="BC Sans" w:hAnsi="BC Sans"/>
-          <w:b/>
-          <w:bCs/>
-        </w:rPr>
-        <w:t>(NOW</w:t>
-      </w:r>
-      <w:proofErr w:type="gramStart"/>
-      <w:r>
-        <w:rPr>
-          <w:rFonts w:ascii="BC Sans" w:hAnsi="BC Sans"/>
-          <w:b/>
-          <w:bCs/>
-        </w:rPr>
-        <w:t>):</w:t>
+      <w:r>
+        <w:rPr>
+          <w:rFonts w:ascii="BC Sans" w:hAnsi="BC Sans"/>
+          <w:b/>
+          <w:bCs/>
+        </w:rPr>
+        <w:t>(NOW):</w:t>
       </w:r>
       <w:proofErr w:type="spellStart"/>
       <w:r>
@@ -515,7 +387,6 @@
         <w:t>showBegin</w:t>
       </w:r>
       <w:proofErr w:type="spellEnd"/>
-      <w:proofErr w:type="gramEnd"/>
       <w:r>
         <w:rPr>
           <w:rFonts w:ascii="BC Sans" w:hAnsi="BC Sans"/>
@@ -554,43 +425,7 @@
           <w:b/>
           <w:bCs/>
         </w:rPr>
-        <w:t>{d.application_type_</w:t>
-      </w:r>
-      <w:proofErr w:type="gramStart"/>
-      <w:r>
-        <w:rPr>
-          <w:rFonts w:ascii="BC Sans" w:hAnsi="BC Sans"/>
-          <w:b/>
-          <w:bCs/>
-        </w:rPr>
-        <w:t>code:showEnd</w:t>
-      </w:r>
-      <w:proofErr w:type="gramEnd"/>
-      <w:r>
-        <w:rPr>
-          <w:rFonts w:ascii="BC Sans" w:hAnsi="BC Sans"/>
-          <w:b/>
-          <w:bCs/>
-        </w:rPr>
-        <w:t>}{d.application_type_</w:t>
-      </w:r>
-      <w:proofErr w:type="gramStart"/>
-      <w:r>
-        <w:rPr>
-          <w:rFonts w:ascii="BC Sans" w:hAnsi="BC Sans"/>
-          <w:b/>
-          <w:bCs/>
-        </w:rPr>
-        <w:t>code:ifEQ</w:t>
-      </w:r>
-      <w:proofErr w:type="gramEnd"/>
-      <w:r>
-        <w:rPr>
-          <w:rFonts w:ascii="BC Sans" w:hAnsi="BC Sans"/>
-          <w:b/>
-          <w:bCs/>
-        </w:rPr>
-        <w:t>(</w:t>
+        <w:t>{d.application_type_code:showEnd}{d.application_type_code:ifEQ(</w:t>
       </w:r>
       <w:r>
         <w:rPr>
@@ -600,23 +435,13 @@
         </w:rPr>
         <w:t>ADA</w:t>
       </w:r>
-      <w:proofErr w:type="gramStart"/>
-      <w:r>
-        <w:rPr>
-          <w:rFonts w:ascii="BC Sans" w:hAnsi="BC Sans"/>
-          <w:b/>
-          <w:bCs/>
-        </w:rPr>
-        <w:t>):showBegin</w:t>
-      </w:r>
-      <w:proofErr w:type="gramEnd"/>
-      <w:r>
-        <w:rPr>
-          <w:rFonts w:ascii="BC Sans" w:hAnsi="BC Sans"/>
-          <w:b/>
-          <w:bCs/>
-        </w:rPr>
-        <w:t>}Amendment {</w:t>
+      <w:r>
+        <w:rPr>
+          <w:rFonts w:ascii="BC Sans" w:hAnsi="BC Sans"/>
+          <w:b/>
+          <w:bCs/>
+        </w:rPr>
+        <w:t>):showBegin}Amendment {</w:t>
       </w:r>
       <w:proofErr w:type="spellStart"/>
       <w:r>
@@ -637,23 +462,13 @@
         <w:t>} to {</w:t>
       </w:r>
       <w:proofErr w:type="spellStart"/>
-      <w:proofErr w:type="gramStart"/>
-      <w:r>
-        <w:rPr>
-          <w:rFonts w:ascii="BC Sans" w:hAnsi="BC Sans"/>
-          <w:b/>
-          <w:bCs/>
-        </w:rPr>
-        <w:t>d.permit</w:t>
-      </w:r>
-      <w:proofErr w:type="gramEnd"/>
-      <w:r>
-        <w:rPr>
-          <w:rFonts w:ascii="BC Sans" w:hAnsi="BC Sans"/>
-          <w:b/>
-          <w:bCs/>
-        </w:rPr>
-        <w:t>_no</w:t>
+      <w:r>
+        <w:rPr>
+          <w:rFonts w:ascii="BC Sans" w:hAnsi="BC Sans"/>
+          <w:b/>
+          <w:bCs/>
+        </w:rPr>
+        <w:t>d.permit_no</w:t>
       </w:r>
       <w:proofErr w:type="spellEnd"/>
       <w:r>
@@ -691,19 +506,9 @@
           <w:b/>
           <w:bCs/>
         </w:rPr>
-        <w:t>d.application_type_</w:t>
-      </w:r>
-      <w:proofErr w:type="gramStart"/>
-      <w:r>
-        <w:rPr>
-          <w:rFonts w:ascii="BC Sans" w:hAnsi="BC Sans"/>
-          <w:b/>
-          <w:bCs/>
-        </w:rPr>
-        <w:t>code:showEnd</w:t>
+        <w:t>d.application_type_code:showEnd</w:t>
       </w:r>
       <w:proofErr w:type="spellEnd"/>
-      <w:proofErr w:type="gramEnd"/>
       <w:r>
         <w:rPr>
           <w:rFonts w:ascii="BC Sans" w:hAnsi="BC Sans"/>
@@ -724,32 +529,13 @@
         </w:rPr>
       </w:pPr>
       <w:bookmarkStart w:id="4" w:name="OLE_LINK3"/>
-      <w:proofErr w:type="gramStart"/>
-      <w:r>
-        <w:rPr>
-          <w:rFonts w:ascii="BC Sans" w:hAnsi="BC Sans"/>
-          <w:b/>
-          <w:bCs/>
-        </w:rPr>
-        <w:t>Mine</w:t>
-      </w:r>
-      <w:proofErr w:type="gramEnd"/>
-      <w:r>
-        <w:rPr>
-          <w:rFonts w:ascii="BC Sans" w:hAnsi="BC Sans"/>
-          <w:b/>
-          <w:bCs/>
-        </w:rPr>
-        <w:t xml:space="preserve"> </w:t>
-      </w:r>
-      <w:proofErr w:type="gramStart"/>
-      <w:r>
-        <w:rPr>
-          <w:rFonts w:ascii="BC Sans" w:hAnsi="BC Sans"/>
-          <w:b/>
-          <w:bCs/>
-        </w:rPr>
-        <w:t>name:</w:t>
+      <w:r>
+        <w:rPr>
+          <w:rFonts w:ascii="BC Sans" w:hAnsi="BC Sans"/>
+          <w:b/>
+          <w:bCs/>
+        </w:rPr>
+        <w:t>Mine name:</w:t>
       </w:r>
       <w:r>
         <w:rPr>
@@ -766,16 +552,7 @@
           <w:b/>
           <w:bCs/>
         </w:rPr>
-        <w:t>d.mine</w:t>
-      </w:r>
-      <w:proofErr w:type="gramEnd"/>
-      <w:r>
-        <w:rPr>
-          <w:rFonts w:ascii="BC Sans" w:hAnsi="BC Sans"/>
-          <w:b/>
-          <w:bCs/>
-        </w:rPr>
-        <w:t>_name</w:t>
+        <w:t>d.mine_name</w:t>
       </w:r>
       <w:proofErr w:type="spellEnd"/>
       <w:r>
@@ -797,32 +574,13 @@
           <w:bCs/>
         </w:rPr>
       </w:pPr>
-      <w:proofErr w:type="gramStart"/>
-      <w:r>
-        <w:rPr>
-          <w:rFonts w:ascii="BC Sans" w:hAnsi="BC Sans"/>
-          <w:b/>
-          <w:bCs/>
-        </w:rPr>
-        <w:t>Mine</w:t>
-      </w:r>
-      <w:proofErr w:type="gramEnd"/>
-      <w:r>
-        <w:rPr>
-          <w:rFonts w:ascii="BC Sans" w:hAnsi="BC Sans"/>
-          <w:b/>
-          <w:bCs/>
-        </w:rPr>
-        <w:t xml:space="preserve"> </w:t>
-      </w:r>
-      <w:proofErr w:type="gramStart"/>
-      <w:r>
-        <w:rPr>
-          <w:rFonts w:ascii="BC Sans" w:hAnsi="BC Sans"/>
-          <w:b/>
-          <w:bCs/>
-        </w:rPr>
-        <w:t xml:space="preserve">number: </w:t>
+      <w:r>
+        <w:rPr>
+          <w:rFonts w:ascii="BC Sans" w:hAnsi="BC Sans"/>
+          <w:b/>
+          <w:bCs/>
+        </w:rPr>
+        <w:t xml:space="preserve">Mine number: </w:t>
       </w:r>
       <w:r>
         <w:rPr>
@@ -839,16 +597,7 @@
           <w:b/>
           <w:bCs/>
         </w:rPr>
-        <w:t>d.mine</w:t>
-      </w:r>
-      <w:proofErr w:type="gramEnd"/>
-      <w:r>
-        <w:rPr>
-          <w:rFonts w:ascii="BC Sans" w:hAnsi="BC Sans"/>
-          <w:b/>
-          <w:bCs/>
-        </w:rPr>
-        <w:t>_no</w:t>
+        <w:t>d.mine_no</w:t>
       </w:r>
       <w:proofErr w:type="spellEnd"/>
       <w:r>
@@ -877,16 +626,7 @@
           <w:b/>
           <w:bCs/>
         </w:rPr>
-        <w:t xml:space="preserve">Proposed </w:t>
-      </w:r>
-      <w:proofErr w:type="gramStart"/>
-      <w:r>
-        <w:rPr>
-          <w:rFonts w:ascii="BC Sans" w:hAnsi="BC Sans"/>
-          <w:b/>
-          <w:bCs/>
-        </w:rPr>
-        <w:t xml:space="preserve">permittee: </w:t>
+        <w:t xml:space="preserve">Proposed permittee: </w:t>
       </w:r>
       <w:r>
         <w:rPr>
@@ -903,16 +643,7 @@
           <w:b/>
           <w:bCs/>
         </w:rPr>
-        <w:t>d.proponent</w:t>
-      </w:r>
-      <w:proofErr w:type="gramEnd"/>
-      <w:r>
-        <w:rPr>
-          <w:rFonts w:ascii="BC Sans" w:hAnsi="BC Sans"/>
-          <w:b/>
-          <w:bCs/>
-        </w:rPr>
-        <w:t>_name</w:t>
+        <w:t>d.proponent_name</w:t>
       </w:r>
       <w:proofErr w:type="spellEnd"/>
       <w:r>
@@ -998,7 +729,7 @@
               </wp:anchor>
             </w:drawing>
           </mc:Choice>
-          <mc:Fallback xmlns:arto="http://schemas.microsoft.com/office/word/2006/arto" xmlns:a="http://schemas.openxmlformats.org/drawingml/2006/main">
+          <mc:Fallback xmlns:a="http://schemas.openxmlformats.org/drawingml/2006/main" xmlns:arto="http://schemas.microsoft.com/office/word/2006/arto">
             <w:pict w14:anchorId="5E9A1C54">
               <v:line id="Straight Connector 1" style="position:absolute;z-index:251659264;visibility:visible;mso-wrap-style:square;mso-width-percent:0;mso-height-percent:0;mso-wrap-distance-left:9pt;mso-wrap-distance-top:0;mso-wrap-distance-right:9pt;mso-wrap-distance-bottom:0;mso-position-horizontal:absolute;mso-position-horizontal-relative:margin;mso-position-vertical:absolute;mso-position-vertical-relative:text;mso-width-percent:0;mso-height-percent:0;mso-width-relative:margin;mso-height-relative:margin" o:spid="_x0000_s1026" strokecolor="black [3040]" from="0,12.55pt" to="472.05pt,13.9pt" w14:anchorId="2E3E2B0A" o:gfxdata="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">
                 <w10:wrap anchorx="margin"/>
@@ -1222,19 +953,11 @@
         <w:t>{</w:t>
       </w:r>
       <w:proofErr w:type="spellStart"/>
-      <w:proofErr w:type="gramStart"/>
-      <w:r>
-        <w:rPr>
-          <w:rFonts w:ascii="BC Sans" w:hAnsi="BC Sans"/>
-        </w:rPr>
-        <w:t>d.exploration</w:t>
-      </w:r>
-      <w:proofErr w:type="gramEnd"/>
-      <w:r>
-        <w:rPr>
-          <w:rFonts w:ascii="BC Sans" w:hAnsi="BC Sans"/>
-        </w:rPr>
-        <w:t>_type</w:t>
+      <w:r>
+        <w:rPr>
+          <w:rFonts w:ascii="BC Sans" w:hAnsi="BC Sans"/>
+        </w:rPr>
+        <w:t>d.exploration_type</w:t>
       </w:r>
       <w:proofErr w:type="spellEnd"/>
       <w:r>
@@ -1301,21 +1024,7 @@
         <w:rPr>
           <w:rFonts w:ascii="BC Sans" w:hAnsi="BC Sans"/>
         </w:rPr>
-        <w:t xml:space="preserve">conservation, protection, and reclamation of the land, </w:t>
-      </w:r>
-      <w:proofErr w:type="gramStart"/>
-      <w:r>
-        <w:rPr>
-          <w:rFonts w:ascii="BC Sans" w:hAnsi="BC Sans"/>
-        </w:rPr>
-        <w:t>watercourses</w:t>
-      </w:r>
-      <w:proofErr w:type="gramEnd"/>
-      <w:r>
-        <w:rPr>
-          <w:rFonts w:ascii="BC Sans" w:hAnsi="BC Sans"/>
-        </w:rPr>
-        <w:t xml:space="preserve"> and cultural heritage resources affected by the proposed activities</w:t>
+        <w:t>conservation, protection, and reclamation of the land, watercourses and cultural heritage resources affected by the proposed activities</w:t>
       </w:r>
       <w:r>
         <w:rPr>
@@ -1360,14 +1069,7 @@
         <w:rPr>
           <w:rFonts w:ascii="BC Sans" w:hAnsi="BC Sans"/>
         </w:rPr>
-        <w:t xml:space="preserve">Notice of Work </w:t>
-      </w:r>
-      <w:proofErr w:type="gramStart"/>
-      <w:r>
-        <w:rPr>
-          <w:rFonts w:ascii="BC Sans" w:hAnsi="BC Sans"/>
-        </w:rPr>
-        <w:t>number</w:t>
+        <w:t>Notice of Work number</w:t>
       </w:r>
       <w:r>
         <w:rPr>
@@ -1382,7 +1084,6 @@
         <w:t xml:space="preserve"> {</w:t>
       </w:r>
       <w:proofErr w:type="spellStart"/>
-      <w:proofErr w:type="gramEnd"/>
       <w:r>
         <w:rPr>
           <w:rFonts w:ascii="BC Sans" w:hAnsi="BC Sans"/>
@@ -1418,14 +1119,7 @@
         <w:rPr>
           <w:rFonts w:ascii="BC Sans" w:hAnsi="BC Sans"/>
         </w:rPr>
-        <w:t xml:space="preserve"> and </w:t>
-      </w:r>
-      <w:proofErr w:type="gramStart"/>
-      <w:r>
-        <w:rPr>
-          <w:rFonts w:ascii="BC Sans" w:hAnsi="BC Sans"/>
-        </w:rPr>
-        <w:t>accepted</w:t>
+        <w:t xml:space="preserve"> and accepted</w:t>
       </w:r>
       <w:r>
         <w:rPr>
@@ -1446,7 +1140,6 @@
         <w:t>{</w:t>
       </w:r>
       <w:proofErr w:type="spellStart"/>
-      <w:proofErr w:type="gramEnd"/>
       <w:r>
         <w:rPr>
           <w:rFonts w:ascii="BC Sans" w:hAnsi="BC Sans"/>
@@ -1508,7 +1201,13 @@
         <w:rPr>
           <w:rFonts w:ascii="BC Sans" w:hAnsi="BC Sans"/>
         </w:rPr>
-        <w:t>d.application_dt</w:t>
+        <w:t>d.</w:t>
+      </w:r>
+      <w:r>
+        <w:rPr>
+          <w:rFonts w:ascii="BC Sans" w:hAnsi="BC Sans"/>
+        </w:rPr>
+        <w:t>letter_dt</w:t>
       </w:r>
       <w:proofErr w:type="spellEnd"/>
       <w:r>
@@ -1549,29 +1248,21 @@
         <w:rPr>
           <w:rFonts w:ascii="BC Sans" w:hAnsi="BC Sans" w:cstheme="minorHAnsi"/>
         </w:rPr>
-        <w:t xml:space="preserve"> tracking </w:t>
-      </w:r>
-      <w:proofErr w:type="gramStart"/>
+        <w:t xml:space="preserve"> tracking number</w:t>
+      </w:r>
       <w:r>
         <w:rPr>
           <w:rFonts w:ascii="BC Sans" w:hAnsi="BC Sans" w:cstheme="minorHAnsi"/>
         </w:rPr>
-        <w:t>number</w:t>
+        <w:t>:</w:t>
       </w:r>
       <w:r>
         <w:rPr>
           <w:rFonts w:ascii="BC Sans" w:hAnsi="BC Sans" w:cstheme="minorHAnsi"/>
         </w:rPr>
-        <w:t>:</w:t>
-      </w:r>
-      <w:r>
-        <w:rPr>
-          <w:rFonts w:ascii="BC Sans" w:hAnsi="BC Sans" w:cstheme="minorHAnsi"/>
-        </w:rPr>
         <w:t xml:space="preserve"> {</w:t>
       </w:r>
       <w:proofErr w:type="spellStart"/>
-      <w:proofErr w:type="gramEnd"/>
       <w:r>
         <w:rPr>
           <w:rFonts w:ascii="BC Sans" w:hAnsi="BC Sans" w:cstheme="minorHAnsi"/>
@@ -2040,21 +1731,7 @@
         <w:rPr>
           <w:rFonts w:ascii="BC Sans" w:hAnsi="BC Sans"/>
         </w:rPr>
-        <w:t xml:space="preserve">The </w:t>
-      </w:r>
-      <w:proofErr w:type="gramStart"/>
-      <w:r>
-        <w:rPr>
-          <w:rFonts w:ascii="BC Sans" w:hAnsi="BC Sans"/>
-        </w:rPr>
-        <w:t>government agency</w:t>
-      </w:r>
-      <w:proofErr w:type="gramEnd"/>
-      <w:r>
-        <w:rPr>
-          <w:rFonts w:ascii="BC Sans" w:hAnsi="BC Sans"/>
-        </w:rPr>
-        <w:t xml:space="preserve"> referral period is projected to be </w:t>
+        <w:t xml:space="preserve">The government agency referral period is projected to be </w:t>
       </w:r>
       <w:r>
         <w:rPr>
@@ -2458,7 +2135,6 @@
         <w:t xml:space="preserve"> {</w:t>
       </w:r>
       <w:proofErr w:type="spellStart"/>
-      <w:proofErr w:type="gramStart"/>
       <w:r>
         <w:rPr>
           <w:rStyle w:val="Strong"/>
@@ -2466,17 +2142,7 @@
           <w:b w:val="0"/>
           <w:bCs w:val="0"/>
         </w:rPr>
-        <w:t>d.permit</w:t>
-      </w:r>
-      <w:proofErr w:type="gramEnd"/>
-      <w:r>
-        <w:rPr>
-          <w:rStyle w:val="Strong"/>
-          <w:rFonts w:ascii="BC Sans" w:hAnsi="BC Sans"/>
-          <w:b w:val="0"/>
-          <w:bCs w:val="0"/>
-        </w:rPr>
-        <w:t>_no</w:t>
+        <w:t>d.permit_no</w:t>
       </w:r>
       <w:proofErr w:type="spellEnd"/>
       <w:r>
@@ -2615,43 +2281,19 @@
         <w:t>${</w:t>
       </w:r>
       <w:proofErr w:type="spellStart"/>
-      <w:proofErr w:type="gramStart"/>
-      <w:r>
-        <w:rPr>
-          <w:rFonts w:ascii="BC Sans" w:hAnsi="BC Sans"/>
-        </w:rPr>
-        <w:t>d.bond</w:t>
-      </w:r>
-      <w:proofErr w:type="gramEnd"/>
-      <w:r>
-        <w:rPr>
-          <w:rFonts w:ascii="BC Sans" w:hAnsi="BC Sans"/>
-        </w:rPr>
-        <w:t>_inc_</w:t>
-      </w:r>
-      <w:proofErr w:type="gramStart"/>
-      <w:r>
-        <w:rPr>
-          <w:rFonts w:ascii="BC Sans" w:hAnsi="BC Sans"/>
-        </w:rPr>
-        <w:t>amt:formatN</w:t>
+      <w:r>
+        <w:rPr>
+          <w:rFonts w:ascii="BC Sans" w:hAnsi="BC Sans"/>
+        </w:rPr>
+        <w:t>d.bond_inc_amt:formatN</w:t>
       </w:r>
       <w:proofErr w:type="spellEnd"/>
-      <w:proofErr w:type="gramEnd"/>
-      <w:r>
-        <w:rPr>
-          <w:rFonts w:ascii="BC Sans" w:hAnsi="BC Sans"/>
-        </w:rPr>
-        <w:t>(</w:t>
-      </w:r>
-      <w:proofErr w:type="gramStart"/>
-      <w:r>
-        <w:rPr>
-          <w:rFonts w:ascii="BC Sans" w:hAnsi="BC Sans"/>
-        </w:rPr>
-        <w:t>2)}</w:t>
-      </w:r>
-      <w:proofErr w:type="gramEnd"/>
+      <w:r>
+        <w:rPr>
+          <w:rFonts w:ascii="BC Sans" w:hAnsi="BC Sans"/>
+        </w:rPr>
+        <w:t>(2)}</w:t>
+      </w:r>
       <w:r>
         <w:rPr>
           <w:rFonts w:ascii="BC Sans" w:hAnsi="BC Sans"/>
@@ -2981,14 +2623,12 @@
         </w:rPr>
         <w:t xml:space="preserve"> mail </w:t>
       </w:r>
-      <w:proofErr w:type="gramStart"/>
       <w:r>
         <w:rPr>
           <w:rFonts w:ascii="BC Sans" w:hAnsi="BC Sans"/>
         </w:rPr>
         <w:t>all reclamation</w:t>
       </w:r>
-      <w:proofErr w:type="gramEnd"/>
       <w:r>
         <w:rPr>
           <w:rFonts w:ascii="BC Sans" w:hAnsi="BC Sans"/>
@@ -3389,7 +3029,6 @@
         <w:t xml:space="preserve">industrial and </w:t>
       </w:r>
       <w:bookmarkStart w:id="6" w:name="_Int_TdCegxRL"/>
-      <w:proofErr w:type="gramStart"/>
       <w:r>
         <w:rPr>
           <w:rFonts w:ascii="BC Sans" w:hAnsi="BC Sans"/>
@@ -3415,7 +3054,6 @@
         <w:t>risk</w:t>
       </w:r>
       <w:bookmarkEnd w:id="6"/>
-      <w:proofErr w:type="gramEnd"/>
       <w:r>
         <w:rPr>
           <w:rFonts w:ascii="BC Sans" w:hAnsi="BC Sans"/>
@@ -4055,9 +3693,8 @@
           <w:color w:val="auto"/>
           <w:u w:val="none"/>
         </w:rPr>
-        <w:t xml:space="preserve">It is your responsibility to have all necessary </w:t>
-      </w:r>
-      <w:proofErr w:type="gramStart"/>
+        <w:t>It is your responsibility to have all necessary authorizations in place for the operation of an industrial camp</w:t>
+      </w:r>
       <w:r>
         <w:rPr>
           <w:rStyle w:val="Hyperlink"/>
@@ -4065,25 +3702,6 @@
           <w:color w:val="auto"/>
           <w:u w:val="none"/>
         </w:rPr>
-        <w:t>authorizations</w:t>
-      </w:r>
-      <w:proofErr w:type="gramEnd"/>
-      <w:r>
-        <w:rPr>
-          <w:rStyle w:val="Hyperlink"/>
-          <w:rFonts w:ascii="BC Sans" w:hAnsi="BC Sans" w:cs="Calibri"/>
-          <w:color w:val="auto"/>
-          <w:u w:val="none"/>
-        </w:rPr>
-        <w:t xml:space="preserve"> in place for the operation of an industrial camp</w:t>
-      </w:r>
-      <w:r>
-        <w:rPr>
-          <w:rStyle w:val="Hyperlink"/>
-          <w:rFonts w:ascii="BC Sans" w:hAnsi="BC Sans" w:cs="Calibri"/>
-          <w:color w:val="auto"/>
-          <w:u w:val="none"/>
-        </w:rPr>
         <w:t>.</w:t>
       </w:r>
     </w:p>
@@ -4168,19 +3786,11 @@
         </w:rPr>
         <w:t xml:space="preserve">are imperative </w:t>
       </w:r>
-      <w:proofErr w:type="gramStart"/>
-      <w:r>
-        <w:rPr>
-          <w:rFonts w:ascii="BC Sans" w:hAnsi="BC Sans"/>
-        </w:rPr>
-        <w:t>in order to</w:t>
-      </w:r>
-      <w:proofErr w:type="gramEnd"/>
-      <w:r>
-        <w:rPr>
-          <w:rFonts w:ascii="BC Sans" w:hAnsi="BC Sans"/>
-        </w:rPr>
-        <w:t xml:space="preserve"> </w:t>
+      <w:r>
+        <w:rPr>
+          <w:rFonts w:ascii="BC Sans" w:hAnsi="BC Sans"/>
+        </w:rPr>
+        <w:t xml:space="preserve">in order to </w:t>
       </w:r>
       <w:r>
         <w:rPr>
@@ -4242,16 +3852,8 @@
               <w:rPr>
                 <w:rFonts w:ascii="BC Sans" w:hAnsi="BC Sans"/>
               </w:rPr>
-              <w:t xml:space="preserve">Forest </w:t>
+              <w:t>Forest licensee</w:t>
             </w:r>
-            <w:proofErr w:type="gramStart"/>
-            <w:r>
-              <w:rPr>
-                <w:rFonts w:ascii="BC Sans" w:hAnsi="BC Sans"/>
-              </w:rPr>
-              <w:t>licensee</w:t>
-            </w:r>
-            <w:proofErr w:type="gramEnd"/>
           </w:p>
           <w:p>
             <w:pPr>
@@ -4469,16 +4071,8 @@
               <w:rPr>
                 <w:rFonts w:ascii="BC Sans" w:hAnsi="BC Sans"/>
               </w:rPr>
-              <w:t xml:space="preserve">transmission </w:t>
+              <w:t>transmission line</w:t>
             </w:r>
-            <w:proofErr w:type="gramStart"/>
-            <w:r>
-              <w:rPr>
-                <w:rFonts w:ascii="BC Sans" w:hAnsi="BC Sans"/>
-              </w:rPr>
-              <w:t>line</w:t>
-            </w:r>
-            <w:proofErr w:type="gramEnd"/>
             <w:r>
               <w:rPr>
                 <w:rFonts w:ascii="BC Sans" w:hAnsi="BC Sans"/>
@@ -4495,16 +4089,8 @@
               <w:rPr>
                 <w:rFonts w:ascii="BC Sans" w:hAnsi="BC Sans"/>
               </w:rPr>
-              <w:t xml:space="preserve">or other energy tenure </w:t>
+              <w:t>or other energy tenure holder</w:t>
             </w:r>
-            <w:proofErr w:type="gramStart"/>
-            <w:r>
-              <w:rPr>
-                <w:rFonts w:ascii="BC Sans" w:hAnsi="BC Sans"/>
-              </w:rPr>
-              <w:t>holder</w:t>
-            </w:r>
-            <w:proofErr w:type="gramEnd"/>
           </w:p>
           <w:p>
             <w:pPr>
@@ -4873,23 +4459,7 @@
           <w:rFonts w:ascii="BC Sans" w:eastAsia="BC Sans" w:hAnsi="BC Sans" w:cs="BC Sans"/>
           <w:color w:val="000000" w:themeColor="text1"/>
         </w:rPr>
-        <w:t xml:space="preserve">, among other legislation, and you are advised to familiarize yourself with the Mines Act and the Code. The Code and its guidance documents are periodically updated. </w:t>
-      </w:r>
-      <w:proofErr w:type="gramStart"/>
-      <w:r>
-        <w:rPr>
-          <w:rFonts w:ascii="BC Sans" w:eastAsia="BC Sans" w:hAnsi="BC Sans" w:cs="BC Sans"/>
-          <w:color w:val="000000" w:themeColor="text1"/>
-        </w:rPr>
-        <w:t>Ensure</w:t>
-      </w:r>
-      <w:proofErr w:type="gramEnd"/>
-      <w:r>
-        <w:rPr>
-          <w:rFonts w:ascii="BC Sans" w:eastAsia="BC Sans" w:hAnsi="BC Sans" w:cs="BC Sans"/>
-          <w:color w:val="000000" w:themeColor="text1"/>
-        </w:rPr>
-        <w:t xml:space="preserve"> to check the Code</w:t>
+        <w:t>, among other legislation, and you are advised to familiarize yourself with the Mines Act and the Code. The Code and its guidance documents are periodically updated. Ensure to check the Code</w:t>
       </w:r>
       <w:r>
         <w:rPr>
@@ -5762,19 +5332,11 @@
         <w:t>{</w:t>
       </w:r>
       <w:proofErr w:type="spellStart"/>
-      <w:proofErr w:type="gramStart"/>
       <w:r>
         <w:rPr>
           <w:rFonts w:ascii="BC Sans" w:hAnsi="BC Sans" w:cstheme="minorHAnsi"/>
         </w:rPr>
-        <w:t>d.images</w:t>
-      </w:r>
-      <w:proofErr w:type="gramEnd"/>
-      <w:r>
-        <w:rPr>
-          <w:rFonts w:ascii="BC Sans" w:hAnsi="BC Sans" w:cstheme="minorHAnsi"/>
-        </w:rPr>
-        <w:t>.issuing_inspector_signature</w:t>
+        <w:t>d.images.issuing_inspector_signature</w:t>
       </w:r>
       <w:proofErr w:type="spellEnd"/>
       <w:r>
@@ -5806,19 +5368,11 @@
         <w:t>{</w:t>
       </w:r>
       <w:proofErr w:type="spellStart"/>
-      <w:proofErr w:type="gramStart"/>
-      <w:r>
-        <w:rPr>
-          <w:rFonts w:ascii="BC Sans" w:hAnsi="BC Sans"/>
-        </w:rPr>
-        <w:t>d.issuing</w:t>
-      </w:r>
-      <w:proofErr w:type="gramEnd"/>
-      <w:r>
-        <w:rPr>
-          <w:rFonts w:ascii="BC Sans" w:hAnsi="BC Sans"/>
-        </w:rPr>
-        <w:t>_inspector_name</w:t>
+      <w:r>
+        <w:rPr>
+          <w:rFonts w:ascii="BC Sans" w:hAnsi="BC Sans"/>
+        </w:rPr>
+        <w:t>d.issuing_inspector_name</w:t>
       </w:r>
       <w:proofErr w:type="spellEnd"/>
       <w:r>

</xml_diff>

<commit_message>
slight change to CAL and PE template
</commit_message>
<xml_diff>
--- a/services/core-api/app/templates/now/Acknowledgment Letter.docx
+++ b/services/core-api/app/templates/now/Acknowledgment Letter.docx
@@ -25,11 +25,19 @@
         <w:t>{</w:t>
       </w:r>
       <w:proofErr w:type="spellStart"/>
+      <w:proofErr w:type="gramStart"/>
       <w:r>
         <w:rPr>
           <w:rFonts w:ascii="BC Sans" w:hAnsi="BC Sans" w:cstheme="minorHAnsi"/>
         </w:rPr>
-        <w:t>d.letter_dt</w:t>
+        <w:t>d.letter</w:t>
+      </w:r>
+      <w:proofErr w:type="gramEnd"/>
+      <w:r>
+        <w:rPr>
+          <w:rFonts w:ascii="BC Sans" w:hAnsi="BC Sans" w:cstheme="minorHAnsi"/>
+        </w:rPr>
+        <w:t>_dt</w:t>
       </w:r>
       <w:proofErr w:type="spellEnd"/>
       <w:r>
@@ -62,11 +70,19 @@
         <w:t>{</w:t>
       </w:r>
       <w:proofErr w:type="spellStart"/>
+      <w:proofErr w:type="gramStart"/>
       <w:r>
         <w:rPr>
           <w:rFonts w:ascii="BC Sans" w:hAnsi="BC Sans" w:cstheme="minorHAnsi"/>
         </w:rPr>
-        <w:t>d.proponent_name</w:t>
+        <w:t>d.proponent</w:t>
+      </w:r>
+      <w:proofErr w:type="gramEnd"/>
+      <w:r>
+        <w:rPr>
+          <w:rFonts w:ascii="BC Sans" w:hAnsi="BC Sans" w:cstheme="minorHAnsi"/>
+        </w:rPr>
+        <w:t>_name</w:t>
       </w:r>
       <w:proofErr w:type="spellEnd"/>
       <w:r>
@@ -90,11 +106,26 @@
         <w:t>{</w:t>
       </w:r>
       <w:proofErr w:type="spellStart"/>
+      <w:proofErr w:type="gramStart"/>
       <w:r>
         <w:rPr>
           <w:rFonts w:ascii="BC Sans" w:hAnsi="BC Sans" w:cstheme="minorHAnsi"/>
         </w:rPr>
-        <w:t>d.proponent_address:convCRLF</w:t>
+        <w:t>d.proponent</w:t>
+      </w:r>
+      <w:proofErr w:type="gramEnd"/>
+      <w:r>
+        <w:rPr>
+          <w:rFonts w:ascii="BC Sans" w:hAnsi="BC Sans" w:cstheme="minorHAnsi"/>
+        </w:rPr>
+        <w:t>_</w:t>
+      </w:r>
+      <w:proofErr w:type="gramStart"/>
+      <w:r>
+        <w:rPr>
+          <w:rFonts w:ascii="BC Sans" w:hAnsi="BC Sans" w:cstheme="minorHAnsi"/>
+        </w:rPr>
+        <w:t>address:convCRLF</w:t>
       </w:r>
       <w:proofErr w:type="spellEnd"/>
       <w:r>
@@ -103,6 +134,7 @@
         </w:rPr>
         <w:t>()}</w:t>
       </w:r>
+      <w:proofErr w:type="gramEnd"/>
     </w:p>
     <w:bookmarkEnd w:id="1"/>
     <w:p>
@@ -127,18 +159,41 @@
         <w:t>{</w:t>
       </w:r>
       <w:proofErr w:type="spellStart"/>
+      <w:proofErr w:type="gramStart"/>
       <w:r>
         <w:rPr>
           <w:rFonts w:ascii="BC Sans" w:hAnsi="BC Sans" w:cstheme="minorHAnsi"/>
         </w:rPr>
-        <w:t>d.emailed_to:ifNEM</w:t>
+        <w:t>d.emailed</w:t>
+      </w:r>
+      <w:proofErr w:type="gramEnd"/>
+      <w:r>
+        <w:rPr>
+          <w:rFonts w:ascii="BC Sans" w:hAnsi="BC Sans" w:cstheme="minorHAnsi"/>
+        </w:rPr>
+        <w:t>_</w:t>
+      </w:r>
+      <w:proofErr w:type="gramStart"/>
+      <w:r>
+        <w:rPr>
+          <w:rFonts w:ascii="BC Sans" w:hAnsi="BC Sans" w:cstheme="minorHAnsi"/>
+        </w:rPr>
+        <w:t>to:ifNEM</w:t>
       </w:r>
       <w:proofErr w:type="spellEnd"/>
+      <w:proofErr w:type="gramEnd"/>
       <w:r>
         <w:rPr>
           <w:rFonts w:ascii="BC Sans" w:hAnsi="BC Sans" w:cstheme="minorHAnsi"/>
         </w:rPr>
-        <w:t>():</w:t>
+        <w:t>(</w:t>
+      </w:r>
+      <w:proofErr w:type="gramStart"/>
+      <w:r>
+        <w:rPr>
+          <w:rFonts w:ascii="BC Sans" w:hAnsi="BC Sans" w:cstheme="minorHAnsi"/>
+        </w:rPr>
+        <w:t>):</w:t>
       </w:r>
       <w:proofErr w:type="spellStart"/>
       <w:r>
@@ -148,6 +203,7 @@
         <w:t>showBegin</w:t>
       </w:r>
       <w:proofErr w:type="spellEnd"/>
+      <w:proofErr w:type="gramEnd"/>
       <w:r>
         <w:rPr>
           <w:rFonts w:ascii="BC Sans" w:hAnsi="BC Sans" w:cstheme="minorHAnsi"/>
@@ -169,11 +225,19 @@
         <w:t>Sent as electronic mail to {</w:t>
       </w:r>
       <w:proofErr w:type="spellStart"/>
+      <w:proofErr w:type="gramStart"/>
       <w:r>
         <w:rPr>
           <w:rFonts w:ascii="BC Sans" w:hAnsi="BC Sans" w:cstheme="minorHAnsi"/>
         </w:rPr>
-        <w:t>d.emailed_to</w:t>
+        <w:t>d.emailed</w:t>
+      </w:r>
+      <w:proofErr w:type="gramEnd"/>
+      <w:r>
+        <w:rPr>
+          <w:rFonts w:ascii="BC Sans" w:hAnsi="BC Sans" w:cstheme="minorHAnsi"/>
+        </w:rPr>
+        <w:t>_to</w:t>
       </w:r>
       <w:proofErr w:type="spellEnd"/>
       <w:r>
@@ -197,13 +261,29 @@
         <w:t>{</w:t>
       </w:r>
       <w:proofErr w:type="spellStart"/>
+      <w:proofErr w:type="gramStart"/>
       <w:r>
         <w:rPr>
           <w:rFonts w:ascii="BC Sans" w:hAnsi="BC Sans" w:cstheme="minorHAnsi"/>
         </w:rPr>
-        <w:t>d.emailed_to:showEnd</w:t>
+        <w:t>d.emailed</w:t>
+      </w:r>
+      <w:proofErr w:type="gramEnd"/>
+      <w:r>
+        <w:rPr>
+          <w:rFonts w:ascii="BC Sans" w:hAnsi="BC Sans" w:cstheme="minorHAnsi"/>
+        </w:rPr>
+        <w:t>_</w:t>
+      </w:r>
+      <w:proofErr w:type="gramStart"/>
+      <w:r>
+        <w:rPr>
+          <w:rFonts w:ascii="BC Sans" w:hAnsi="BC Sans" w:cstheme="minorHAnsi"/>
+        </w:rPr>
+        <w:t>to:showEnd</w:t>
       </w:r>
       <w:proofErr w:type="spellEnd"/>
+      <w:proofErr w:type="gramEnd"/>
       <w:r>
         <w:rPr>
           <w:rFonts w:ascii="BC Sans" w:hAnsi="BC Sans" w:cstheme="minorHAnsi"/>
@@ -221,19 +301,6 @@
       <w:bookmarkStart w:id="2" w:name="OLE_LINK2"/>
       <w:r>
         <w:rPr>
-          <w:rFonts w:ascii="BC Sans" w:hAnsi="BC Sans"/>
-          <w:color w:val="FF0000"/>
-        </w:rPr>
-        <w:t>OPTIONAL</w:t>
-      </w:r>
-      <w:r>
-        <w:rPr>
-          <w:rFonts w:ascii="BC Sans" w:hAnsi="BC Sans"/>
-        </w:rPr>
-        <w:t xml:space="preserve"> </w:t>
-      </w:r>
-      <w:r>
-        <w:rPr>
           <w:rFonts w:ascii="BC Sans" w:hAnsi="BC Sans" w:cstheme="minorHAnsi"/>
         </w:rPr>
         <w:t xml:space="preserve">Sent as electronic mail to </w:t>
@@ -245,12 +312,21 @@
         <w:t>{</w:t>
       </w:r>
       <w:proofErr w:type="spellStart"/>
+      <w:proofErr w:type="gramStart"/>
       <w:r>
         <w:rPr>
           <w:rFonts w:ascii="BC Sans" w:eastAsia="BC Sans" w:hAnsi="BC Sans" w:cs="BC Sans"/>
           <w:color w:val="000000" w:themeColor="text1"/>
         </w:rPr>
-        <w:t>d.applicant_email</w:t>
+        <w:t>d.applicant</w:t>
+      </w:r>
+      <w:proofErr w:type="gramEnd"/>
+      <w:r>
+        <w:rPr>
+          <w:rFonts w:ascii="BC Sans" w:eastAsia="BC Sans" w:hAnsi="BC Sans" w:cs="BC Sans"/>
+          <w:color w:val="000000" w:themeColor="text1"/>
+        </w:rPr>
+        <w:t>_email</w:t>
       </w:r>
       <w:proofErr w:type="spellEnd"/>
       <w:r>
@@ -285,7 +361,16 @@
           <w:b/>
           <w:bCs/>
         </w:rPr>
-        <w:t xml:space="preserve">Re: </w:t>
+        <w:t>Re</w:t>
+      </w:r>
+      <w:proofErr w:type="gramStart"/>
+      <w:r>
+        <w:rPr>
+          <w:rFonts w:ascii="BC Sans" w:hAnsi="BC Sans"/>
+          <w:b/>
+          <w:bCs/>
+        </w:rPr>
+        <w:t xml:space="preserve">: </w:t>
       </w:r>
       <w:r>
         <w:rPr>
@@ -299,7 +384,16 @@
           <w:b/>
           <w:bCs/>
         </w:rPr>
-        <w:t xml:space="preserve">Application </w:t>
+        <w:t>Application</w:t>
+      </w:r>
+      <w:proofErr w:type="gramEnd"/>
+      <w:r>
+        <w:rPr>
+          <w:rFonts w:ascii="BC Sans" w:hAnsi="BC Sans"/>
+          <w:b/>
+          <w:bCs/>
+        </w:rPr>
+        <w:t xml:space="preserve"> </w:t>
       </w:r>
       <w:r>
         <w:rPr>
@@ -317,6 +411,7 @@
         </w:rPr>
         <w:t xml:space="preserve">a </w:t>
       </w:r>
+      <w:proofErr w:type="gramStart"/>
       <w:r>
         <w:rPr>
           <w:rFonts w:ascii="BC Sans" w:hAnsi="BC Sans"/>
@@ -333,6 +428,7 @@
         </w:rPr>
         <w:t>permit</w:t>
       </w:r>
+      <w:proofErr w:type="gramEnd"/>
     </w:p>
     <w:p>
       <w:pPr>
@@ -366,16 +462,35 @@
           <w:b/>
           <w:bCs/>
         </w:rPr>
-        <w:t>d.application_type_code:ifEQ</w:t>
+        <w:t>d.application_type_</w:t>
+      </w:r>
+      <w:proofErr w:type="gramStart"/>
+      <w:r>
+        <w:rPr>
+          <w:rFonts w:ascii="BC Sans" w:hAnsi="BC Sans"/>
+          <w:b/>
+          <w:bCs/>
+        </w:rPr>
+        <w:t>code:ifEQ</w:t>
       </w:r>
       <w:proofErr w:type="spellEnd"/>
-      <w:r>
-        <w:rPr>
-          <w:rFonts w:ascii="BC Sans" w:hAnsi="BC Sans"/>
-          <w:b/>
-          <w:bCs/>
-        </w:rPr>
-        <w:t>(NOW):</w:t>
+      <w:proofErr w:type="gramEnd"/>
+      <w:r>
+        <w:rPr>
+          <w:rFonts w:ascii="BC Sans" w:hAnsi="BC Sans"/>
+          <w:b/>
+          <w:bCs/>
+        </w:rPr>
+        <w:t>(NOW</w:t>
+      </w:r>
+      <w:proofErr w:type="gramStart"/>
+      <w:r>
+        <w:rPr>
+          <w:rFonts w:ascii="BC Sans" w:hAnsi="BC Sans"/>
+          <w:b/>
+          <w:bCs/>
+        </w:rPr>
+        <w:t>):</w:t>
       </w:r>
       <w:proofErr w:type="spellStart"/>
       <w:r>
@@ -387,6 +502,7 @@
         <w:t>showBegin</w:t>
       </w:r>
       <w:proofErr w:type="spellEnd"/>
+      <w:proofErr w:type="gramEnd"/>
       <w:r>
         <w:rPr>
           <w:rFonts w:ascii="BC Sans" w:hAnsi="BC Sans"/>
@@ -425,7 +541,43 @@
           <w:b/>
           <w:bCs/>
         </w:rPr>
-        <w:t>{d.application_type_code:showEnd}{d.application_type_code:ifEQ(</w:t>
+        <w:t>{d.application_type_</w:t>
+      </w:r>
+      <w:proofErr w:type="gramStart"/>
+      <w:r>
+        <w:rPr>
+          <w:rFonts w:ascii="BC Sans" w:hAnsi="BC Sans"/>
+          <w:b/>
+          <w:bCs/>
+        </w:rPr>
+        <w:t>code:showEnd</w:t>
+      </w:r>
+      <w:proofErr w:type="gramEnd"/>
+      <w:r>
+        <w:rPr>
+          <w:rFonts w:ascii="BC Sans" w:hAnsi="BC Sans"/>
+          <w:b/>
+          <w:bCs/>
+        </w:rPr>
+        <w:t>}{d.application_type_</w:t>
+      </w:r>
+      <w:proofErr w:type="gramStart"/>
+      <w:r>
+        <w:rPr>
+          <w:rFonts w:ascii="BC Sans" w:hAnsi="BC Sans"/>
+          <w:b/>
+          <w:bCs/>
+        </w:rPr>
+        <w:t>code:ifEQ</w:t>
+      </w:r>
+      <w:proofErr w:type="gramEnd"/>
+      <w:r>
+        <w:rPr>
+          <w:rFonts w:ascii="BC Sans" w:hAnsi="BC Sans"/>
+          <w:b/>
+          <w:bCs/>
+        </w:rPr>
+        <w:t>(</w:t>
       </w:r>
       <w:r>
         <w:rPr>
@@ -435,13 +587,23 @@
         </w:rPr>
         <w:t>ADA</w:t>
       </w:r>
-      <w:r>
-        <w:rPr>
-          <w:rFonts w:ascii="BC Sans" w:hAnsi="BC Sans"/>
-          <w:b/>
-          <w:bCs/>
-        </w:rPr>
-        <w:t>):showBegin}Amendment {</w:t>
+      <w:proofErr w:type="gramStart"/>
+      <w:r>
+        <w:rPr>
+          <w:rFonts w:ascii="BC Sans" w:hAnsi="BC Sans"/>
+          <w:b/>
+          <w:bCs/>
+        </w:rPr>
+        <w:t>):showBegin</w:t>
+      </w:r>
+      <w:proofErr w:type="gramEnd"/>
+      <w:r>
+        <w:rPr>
+          <w:rFonts w:ascii="BC Sans" w:hAnsi="BC Sans"/>
+          <w:b/>
+          <w:bCs/>
+        </w:rPr>
+        <w:t>}Amendment {</w:t>
       </w:r>
       <w:proofErr w:type="spellStart"/>
       <w:r>
@@ -462,13 +624,23 @@
         <w:t>} to {</w:t>
       </w:r>
       <w:proofErr w:type="spellStart"/>
-      <w:r>
-        <w:rPr>
-          <w:rFonts w:ascii="BC Sans" w:hAnsi="BC Sans"/>
-          <w:b/>
-          <w:bCs/>
-        </w:rPr>
-        <w:t>d.permit_no</w:t>
+      <w:proofErr w:type="gramStart"/>
+      <w:r>
+        <w:rPr>
+          <w:rFonts w:ascii="BC Sans" w:hAnsi="BC Sans"/>
+          <w:b/>
+          <w:bCs/>
+        </w:rPr>
+        <w:t>d.permit</w:t>
+      </w:r>
+      <w:proofErr w:type="gramEnd"/>
+      <w:r>
+        <w:rPr>
+          <w:rFonts w:ascii="BC Sans" w:hAnsi="BC Sans"/>
+          <w:b/>
+          <w:bCs/>
+        </w:rPr>
+        <w:t>_no</w:t>
       </w:r>
       <w:proofErr w:type="spellEnd"/>
       <w:r>
@@ -506,9 +678,19 @@
           <w:b/>
           <w:bCs/>
         </w:rPr>
-        <w:t>d.application_type_code:showEnd</w:t>
+        <w:t>d.application_type_</w:t>
+      </w:r>
+      <w:proofErr w:type="gramStart"/>
+      <w:r>
+        <w:rPr>
+          <w:rFonts w:ascii="BC Sans" w:hAnsi="BC Sans"/>
+          <w:b/>
+          <w:bCs/>
+        </w:rPr>
+        <w:t>code:showEnd</w:t>
       </w:r>
       <w:proofErr w:type="spellEnd"/>
+      <w:proofErr w:type="gramEnd"/>
       <w:r>
         <w:rPr>
           <w:rFonts w:ascii="BC Sans" w:hAnsi="BC Sans"/>
@@ -529,13 +711,32 @@
         </w:rPr>
       </w:pPr>
       <w:bookmarkStart w:id="4" w:name="OLE_LINK3"/>
-      <w:r>
-        <w:rPr>
-          <w:rFonts w:ascii="BC Sans" w:hAnsi="BC Sans"/>
-          <w:b/>
-          <w:bCs/>
-        </w:rPr>
-        <w:t>Mine name:</w:t>
+      <w:proofErr w:type="gramStart"/>
+      <w:r>
+        <w:rPr>
+          <w:rFonts w:ascii="BC Sans" w:hAnsi="BC Sans"/>
+          <w:b/>
+          <w:bCs/>
+        </w:rPr>
+        <w:t>Mine</w:t>
+      </w:r>
+      <w:proofErr w:type="gramEnd"/>
+      <w:r>
+        <w:rPr>
+          <w:rFonts w:ascii="BC Sans" w:hAnsi="BC Sans"/>
+          <w:b/>
+          <w:bCs/>
+        </w:rPr>
+        <w:t xml:space="preserve"> </w:t>
+      </w:r>
+      <w:proofErr w:type="gramStart"/>
+      <w:r>
+        <w:rPr>
+          <w:rFonts w:ascii="BC Sans" w:hAnsi="BC Sans"/>
+          <w:b/>
+          <w:bCs/>
+        </w:rPr>
+        <w:t>name:</w:t>
       </w:r>
       <w:r>
         <w:rPr>
@@ -552,7 +753,16 @@
           <w:b/>
           <w:bCs/>
         </w:rPr>
-        <w:t>d.mine_name</w:t>
+        <w:t>d.mine</w:t>
+      </w:r>
+      <w:proofErr w:type="gramEnd"/>
+      <w:r>
+        <w:rPr>
+          <w:rFonts w:ascii="BC Sans" w:hAnsi="BC Sans"/>
+          <w:b/>
+          <w:bCs/>
+        </w:rPr>
+        <w:t>_name</w:t>
       </w:r>
       <w:proofErr w:type="spellEnd"/>
       <w:r>
@@ -574,13 +784,32 @@
           <w:bCs/>
         </w:rPr>
       </w:pPr>
-      <w:r>
-        <w:rPr>
-          <w:rFonts w:ascii="BC Sans" w:hAnsi="BC Sans"/>
-          <w:b/>
-          <w:bCs/>
-        </w:rPr>
-        <w:t xml:space="preserve">Mine number: </w:t>
+      <w:proofErr w:type="gramStart"/>
+      <w:r>
+        <w:rPr>
+          <w:rFonts w:ascii="BC Sans" w:hAnsi="BC Sans"/>
+          <w:b/>
+          <w:bCs/>
+        </w:rPr>
+        <w:t>Mine</w:t>
+      </w:r>
+      <w:proofErr w:type="gramEnd"/>
+      <w:r>
+        <w:rPr>
+          <w:rFonts w:ascii="BC Sans" w:hAnsi="BC Sans"/>
+          <w:b/>
+          <w:bCs/>
+        </w:rPr>
+        <w:t xml:space="preserve"> </w:t>
+      </w:r>
+      <w:proofErr w:type="gramStart"/>
+      <w:r>
+        <w:rPr>
+          <w:rFonts w:ascii="BC Sans" w:hAnsi="BC Sans"/>
+          <w:b/>
+          <w:bCs/>
+        </w:rPr>
+        <w:t xml:space="preserve">number: </w:t>
       </w:r>
       <w:r>
         <w:rPr>
@@ -597,7 +826,16 @@
           <w:b/>
           <w:bCs/>
         </w:rPr>
-        <w:t>d.mine_no</w:t>
+        <w:t>d.mine</w:t>
+      </w:r>
+      <w:proofErr w:type="gramEnd"/>
+      <w:r>
+        <w:rPr>
+          <w:rFonts w:ascii="BC Sans" w:hAnsi="BC Sans"/>
+          <w:b/>
+          <w:bCs/>
+        </w:rPr>
+        <w:t>_no</w:t>
       </w:r>
       <w:proofErr w:type="spellEnd"/>
       <w:r>
@@ -626,7 +864,16 @@
           <w:b/>
           <w:bCs/>
         </w:rPr>
-        <w:t xml:space="preserve">Proposed permittee: </w:t>
+        <w:t xml:space="preserve">Proposed </w:t>
+      </w:r>
+      <w:proofErr w:type="gramStart"/>
+      <w:r>
+        <w:rPr>
+          <w:rFonts w:ascii="BC Sans" w:hAnsi="BC Sans"/>
+          <w:b/>
+          <w:bCs/>
+        </w:rPr>
+        <w:t xml:space="preserve">permittee: </w:t>
       </w:r>
       <w:r>
         <w:rPr>
@@ -643,7 +890,16 @@
           <w:b/>
           <w:bCs/>
         </w:rPr>
-        <w:t>d.proponent_name</w:t>
+        <w:t>d.proponent</w:t>
+      </w:r>
+      <w:proofErr w:type="gramEnd"/>
+      <w:r>
+        <w:rPr>
+          <w:rFonts w:ascii="BC Sans" w:hAnsi="BC Sans"/>
+          <w:b/>
+          <w:bCs/>
+        </w:rPr>
+        <w:t>_name</w:t>
       </w:r>
       <w:proofErr w:type="spellEnd"/>
       <w:r>
@@ -953,11 +1209,19 @@
         <w:t>{</w:t>
       </w:r>
       <w:proofErr w:type="spellStart"/>
-      <w:r>
-        <w:rPr>
-          <w:rFonts w:ascii="BC Sans" w:hAnsi="BC Sans"/>
-        </w:rPr>
-        <w:t>d.exploration_type</w:t>
+      <w:proofErr w:type="gramStart"/>
+      <w:r>
+        <w:rPr>
+          <w:rFonts w:ascii="BC Sans" w:hAnsi="BC Sans"/>
+        </w:rPr>
+        <w:t>d.exploration</w:t>
+      </w:r>
+      <w:proofErr w:type="gramEnd"/>
+      <w:r>
+        <w:rPr>
+          <w:rFonts w:ascii="BC Sans" w:hAnsi="BC Sans"/>
+        </w:rPr>
+        <w:t>_type</w:t>
       </w:r>
       <w:proofErr w:type="spellEnd"/>
       <w:r>
@@ -1024,7 +1288,21 @@
         <w:rPr>
           <w:rFonts w:ascii="BC Sans" w:hAnsi="BC Sans"/>
         </w:rPr>
-        <w:t>conservation, protection, and reclamation of the land, watercourses and cultural heritage resources affected by the proposed activities</w:t>
+        <w:t xml:space="preserve">conservation, protection, and reclamation of the land, </w:t>
+      </w:r>
+      <w:proofErr w:type="gramStart"/>
+      <w:r>
+        <w:rPr>
+          <w:rFonts w:ascii="BC Sans" w:hAnsi="BC Sans"/>
+        </w:rPr>
+        <w:t>watercourses</w:t>
+      </w:r>
+      <w:proofErr w:type="gramEnd"/>
+      <w:r>
+        <w:rPr>
+          <w:rFonts w:ascii="BC Sans" w:hAnsi="BC Sans"/>
+        </w:rPr>
+        <w:t xml:space="preserve"> and cultural heritage resources affected by the proposed activities</w:t>
       </w:r>
       <w:r>
         <w:rPr>
@@ -1069,7 +1347,14 @@
         <w:rPr>
           <w:rFonts w:ascii="BC Sans" w:hAnsi="BC Sans"/>
         </w:rPr>
-        <w:t>Notice of Work number</w:t>
+        <w:t xml:space="preserve">Notice of Work </w:t>
+      </w:r>
+      <w:proofErr w:type="gramStart"/>
+      <w:r>
+        <w:rPr>
+          <w:rFonts w:ascii="BC Sans" w:hAnsi="BC Sans"/>
+        </w:rPr>
+        <w:t>number</w:t>
       </w:r>
       <w:r>
         <w:rPr>
@@ -1084,6 +1369,7 @@
         <w:t xml:space="preserve"> {</w:t>
       </w:r>
       <w:proofErr w:type="spellStart"/>
+      <w:proofErr w:type="gramEnd"/>
       <w:r>
         <w:rPr>
           <w:rFonts w:ascii="BC Sans" w:hAnsi="BC Sans"/>
@@ -1119,7 +1405,14 @@
         <w:rPr>
           <w:rFonts w:ascii="BC Sans" w:hAnsi="BC Sans"/>
         </w:rPr>
-        <w:t xml:space="preserve"> and accepted</w:t>
+        <w:t xml:space="preserve"> and </w:t>
+      </w:r>
+      <w:proofErr w:type="gramStart"/>
+      <w:r>
+        <w:rPr>
+          <w:rFonts w:ascii="BC Sans" w:hAnsi="BC Sans"/>
+        </w:rPr>
+        <w:t>accepted</w:t>
       </w:r>
       <w:r>
         <w:rPr>
@@ -1140,6 +1433,7 @@
         <w:t>{</w:t>
       </w:r>
       <w:proofErr w:type="spellStart"/>
+      <w:proofErr w:type="gramEnd"/>
       <w:r>
         <w:rPr>
           <w:rFonts w:ascii="BC Sans" w:hAnsi="BC Sans"/>
@@ -1197,6 +1491,7 @@
         <w:t>{</w:t>
       </w:r>
       <w:proofErr w:type="spellStart"/>
+      <w:proofErr w:type="gramStart"/>
       <w:r>
         <w:rPr>
           <w:rFonts w:ascii="BC Sans" w:hAnsi="BC Sans"/>
@@ -1207,7 +1502,14 @@
         <w:rPr>
           <w:rFonts w:ascii="BC Sans" w:hAnsi="BC Sans"/>
         </w:rPr>
-        <w:t>letter_dt</w:t>
+        <w:t>letter</w:t>
+      </w:r>
+      <w:proofErr w:type="gramEnd"/>
+      <w:r>
+        <w:rPr>
+          <w:rFonts w:ascii="BC Sans" w:hAnsi="BC Sans"/>
+        </w:rPr>
+        <w:t>_dt</w:t>
       </w:r>
       <w:proofErr w:type="spellEnd"/>
       <w:r>
@@ -1248,12 +1550,19 @@
         <w:rPr>
           <w:rFonts w:ascii="BC Sans" w:hAnsi="BC Sans" w:cstheme="minorHAnsi"/>
         </w:rPr>
-        <w:t xml:space="preserve"> tracking number</w:t>
-      </w:r>
+        <w:t xml:space="preserve"> tracking </w:t>
+      </w:r>
+      <w:proofErr w:type="gramStart"/>
       <w:r>
         <w:rPr>
           <w:rFonts w:ascii="BC Sans" w:hAnsi="BC Sans" w:cstheme="minorHAnsi"/>
         </w:rPr>
+        <w:t>number</w:t>
+      </w:r>
+      <w:r>
+        <w:rPr>
+          <w:rFonts w:ascii="BC Sans" w:hAnsi="BC Sans" w:cstheme="minorHAnsi"/>
+        </w:rPr>
         <w:t>:</w:t>
       </w:r>
       <w:r>
@@ -1263,6 +1572,7 @@
         <w:t xml:space="preserve"> {</w:t>
       </w:r>
       <w:proofErr w:type="spellStart"/>
+      <w:proofErr w:type="gramEnd"/>
       <w:r>
         <w:rPr>
           <w:rFonts w:ascii="BC Sans" w:hAnsi="BC Sans" w:cstheme="minorHAnsi"/>
@@ -1731,7 +2041,21 @@
         <w:rPr>
           <w:rFonts w:ascii="BC Sans" w:hAnsi="BC Sans"/>
         </w:rPr>
-        <w:t xml:space="preserve">The government agency referral period is projected to be </w:t>
+        <w:t xml:space="preserve">The </w:t>
+      </w:r>
+      <w:proofErr w:type="gramStart"/>
+      <w:r>
+        <w:rPr>
+          <w:rFonts w:ascii="BC Sans" w:hAnsi="BC Sans"/>
+        </w:rPr>
+        <w:t>government agency</w:t>
+      </w:r>
+      <w:proofErr w:type="gramEnd"/>
+      <w:r>
+        <w:rPr>
+          <w:rFonts w:ascii="BC Sans" w:hAnsi="BC Sans"/>
+        </w:rPr>
+        <w:t xml:space="preserve"> referral period is projected to be </w:t>
       </w:r>
       <w:r>
         <w:rPr>
@@ -2135,6 +2459,7 @@
         <w:t xml:space="preserve"> {</w:t>
       </w:r>
       <w:proofErr w:type="spellStart"/>
+      <w:proofErr w:type="gramStart"/>
       <w:r>
         <w:rPr>
           <w:rStyle w:val="Strong"/>
@@ -2142,7 +2467,17 @@
           <w:b w:val="0"/>
           <w:bCs w:val="0"/>
         </w:rPr>
-        <w:t>d.permit_no</w:t>
+        <w:t>d.permit</w:t>
+      </w:r>
+      <w:proofErr w:type="gramEnd"/>
+      <w:r>
+        <w:rPr>
+          <w:rStyle w:val="Strong"/>
+          <w:rFonts w:ascii="BC Sans" w:hAnsi="BC Sans"/>
+          <w:b w:val="0"/>
+          <w:bCs w:val="0"/>
+        </w:rPr>
+        <w:t>_no</w:t>
       </w:r>
       <w:proofErr w:type="spellEnd"/>
       <w:r>
@@ -2281,19 +2616,43 @@
         <w:t>${</w:t>
       </w:r>
       <w:proofErr w:type="spellStart"/>
-      <w:r>
-        <w:rPr>
-          <w:rFonts w:ascii="BC Sans" w:hAnsi="BC Sans"/>
-        </w:rPr>
-        <w:t>d.bond_inc_amt:formatN</w:t>
+      <w:proofErr w:type="gramStart"/>
+      <w:r>
+        <w:rPr>
+          <w:rFonts w:ascii="BC Sans" w:hAnsi="BC Sans"/>
+        </w:rPr>
+        <w:t>d.bond</w:t>
+      </w:r>
+      <w:proofErr w:type="gramEnd"/>
+      <w:r>
+        <w:rPr>
+          <w:rFonts w:ascii="BC Sans" w:hAnsi="BC Sans"/>
+        </w:rPr>
+        <w:t>_inc_</w:t>
+      </w:r>
+      <w:proofErr w:type="gramStart"/>
+      <w:r>
+        <w:rPr>
+          <w:rFonts w:ascii="BC Sans" w:hAnsi="BC Sans"/>
+        </w:rPr>
+        <w:t>amt:formatN</w:t>
       </w:r>
       <w:proofErr w:type="spellEnd"/>
-      <w:r>
-        <w:rPr>
-          <w:rFonts w:ascii="BC Sans" w:hAnsi="BC Sans"/>
-        </w:rPr>
-        <w:t>(2)}</w:t>
-      </w:r>
+      <w:proofErr w:type="gramEnd"/>
+      <w:r>
+        <w:rPr>
+          <w:rFonts w:ascii="BC Sans" w:hAnsi="BC Sans"/>
+        </w:rPr>
+        <w:t>(</w:t>
+      </w:r>
+      <w:proofErr w:type="gramStart"/>
+      <w:r>
+        <w:rPr>
+          <w:rFonts w:ascii="BC Sans" w:hAnsi="BC Sans"/>
+        </w:rPr>
+        <w:t>2)}</w:t>
+      </w:r>
+      <w:proofErr w:type="gramEnd"/>
       <w:r>
         <w:rPr>
           <w:rFonts w:ascii="BC Sans" w:hAnsi="BC Sans"/>
@@ -2623,12 +2982,14 @@
         </w:rPr>
         <w:t xml:space="preserve"> mail </w:t>
       </w:r>
+      <w:proofErr w:type="gramStart"/>
       <w:r>
         <w:rPr>
           <w:rFonts w:ascii="BC Sans" w:hAnsi="BC Sans"/>
         </w:rPr>
         <w:t>all reclamation</w:t>
       </w:r>
+      <w:proofErr w:type="gramEnd"/>
       <w:r>
         <w:rPr>
           <w:rFonts w:ascii="BC Sans" w:hAnsi="BC Sans"/>
@@ -3029,6 +3390,7 @@
         <w:t xml:space="preserve">industrial and </w:t>
       </w:r>
       <w:bookmarkStart w:id="6" w:name="_Int_TdCegxRL"/>
+      <w:proofErr w:type="gramStart"/>
       <w:r>
         <w:rPr>
           <w:rFonts w:ascii="BC Sans" w:hAnsi="BC Sans"/>
@@ -3054,6 +3416,7 @@
         <w:t>risk</w:t>
       </w:r>
       <w:bookmarkEnd w:id="6"/>
+      <w:proofErr w:type="gramEnd"/>
       <w:r>
         <w:rPr>
           <w:rFonts w:ascii="BC Sans" w:hAnsi="BC Sans"/>
@@ -3693,8 +4056,9 @@
           <w:color w:val="auto"/>
           <w:u w:val="none"/>
         </w:rPr>
-        <w:t>It is your responsibility to have all necessary authorizations in place for the operation of an industrial camp</w:t>
-      </w:r>
+        <w:t xml:space="preserve">It is your responsibility to have all necessary </w:t>
+      </w:r>
+      <w:proofErr w:type="gramStart"/>
       <w:r>
         <w:rPr>
           <w:rStyle w:val="Hyperlink"/>
@@ -3702,6 +4066,25 @@
           <w:color w:val="auto"/>
           <w:u w:val="none"/>
         </w:rPr>
+        <w:t>authorizations</w:t>
+      </w:r>
+      <w:proofErr w:type="gramEnd"/>
+      <w:r>
+        <w:rPr>
+          <w:rStyle w:val="Hyperlink"/>
+          <w:rFonts w:ascii="BC Sans" w:hAnsi="BC Sans" w:cs="Calibri"/>
+          <w:color w:val="auto"/>
+          <w:u w:val="none"/>
+        </w:rPr>
+        <w:t xml:space="preserve"> in place for the operation of an industrial camp</w:t>
+      </w:r>
+      <w:r>
+        <w:rPr>
+          <w:rStyle w:val="Hyperlink"/>
+          <w:rFonts w:ascii="BC Sans" w:hAnsi="BC Sans" w:cs="Calibri"/>
+          <w:color w:val="auto"/>
+          <w:u w:val="none"/>
+        </w:rPr>
         <w:t>.</w:t>
       </w:r>
     </w:p>
@@ -3786,11 +4169,19 @@
         </w:rPr>
         <w:t xml:space="preserve">are imperative </w:t>
       </w:r>
-      <w:r>
-        <w:rPr>
-          <w:rFonts w:ascii="BC Sans" w:hAnsi="BC Sans"/>
-        </w:rPr>
-        <w:t xml:space="preserve">in order to </w:t>
+      <w:proofErr w:type="gramStart"/>
+      <w:r>
+        <w:rPr>
+          <w:rFonts w:ascii="BC Sans" w:hAnsi="BC Sans"/>
+        </w:rPr>
+        <w:t>in order to</w:t>
+      </w:r>
+      <w:proofErr w:type="gramEnd"/>
+      <w:r>
+        <w:rPr>
+          <w:rFonts w:ascii="BC Sans" w:hAnsi="BC Sans"/>
+        </w:rPr>
+        <w:t xml:space="preserve"> </w:t>
       </w:r>
       <w:r>
         <w:rPr>
@@ -3852,8 +4243,16 @@
               <w:rPr>
                 <w:rFonts w:ascii="BC Sans" w:hAnsi="BC Sans"/>
               </w:rPr>
-              <w:t>Forest licensee</w:t>
+              <w:t xml:space="preserve">Forest </w:t>
             </w:r>
+            <w:proofErr w:type="gramStart"/>
+            <w:r>
+              <w:rPr>
+                <w:rFonts w:ascii="BC Sans" w:hAnsi="BC Sans"/>
+              </w:rPr>
+              <w:t>licensee</w:t>
+            </w:r>
+            <w:proofErr w:type="gramEnd"/>
           </w:p>
           <w:p>
             <w:pPr>
@@ -4071,8 +4470,16 @@
               <w:rPr>
                 <w:rFonts w:ascii="BC Sans" w:hAnsi="BC Sans"/>
               </w:rPr>
-              <w:t>transmission line</w:t>
+              <w:t xml:space="preserve">transmission </w:t>
             </w:r>
+            <w:proofErr w:type="gramStart"/>
+            <w:r>
+              <w:rPr>
+                <w:rFonts w:ascii="BC Sans" w:hAnsi="BC Sans"/>
+              </w:rPr>
+              <w:t>line</w:t>
+            </w:r>
+            <w:proofErr w:type="gramEnd"/>
             <w:r>
               <w:rPr>
                 <w:rFonts w:ascii="BC Sans" w:hAnsi="BC Sans"/>
@@ -4089,8 +4496,16 @@
               <w:rPr>
                 <w:rFonts w:ascii="BC Sans" w:hAnsi="BC Sans"/>
               </w:rPr>
-              <w:t>or other energy tenure holder</w:t>
+              <w:t xml:space="preserve">or other energy tenure </w:t>
             </w:r>
+            <w:proofErr w:type="gramStart"/>
+            <w:r>
+              <w:rPr>
+                <w:rFonts w:ascii="BC Sans" w:hAnsi="BC Sans"/>
+              </w:rPr>
+              <w:t>holder</w:t>
+            </w:r>
+            <w:proofErr w:type="gramEnd"/>
           </w:p>
           <w:p>
             <w:pPr>
@@ -4459,7 +4874,23 @@
           <w:rFonts w:ascii="BC Sans" w:eastAsia="BC Sans" w:hAnsi="BC Sans" w:cs="BC Sans"/>
           <w:color w:val="000000" w:themeColor="text1"/>
         </w:rPr>
-        <w:t>, among other legislation, and you are advised to familiarize yourself with the Mines Act and the Code. The Code and its guidance documents are periodically updated. Ensure to check the Code</w:t>
+        <w:t xml:space="preserve">, among other legislation, and you are advised to familiarize yourself with the Mines Act and the Code. The Code and its guidance documents are periodically updated. </w:t>
+      </w:r>
+      <w:proofErr w:type="gramStart"/>
+      <w:r>
+        <w:rPr>
+          <w:rFonts w:ascii="BC Sans" w:eastAsia="BC Sans" w:hAnsi="BC Sans" w:cs="BC Sans"/>
+          <w:color w:val="000000" w:themeColor="text1"/>
+        </w:rPr>
+        <w:t>Ensure</w:t>
+      </w:r>
+      <w:proofErr w:type="gramEnd"/>
+      <w:r>
+        <w:rPr>
+          <w:rFonts w:ascii="BC Sans" w:eastAsia="BC Sans" w:hAnsi="BC Sans" w:cs="BC Sans"/>
+          <w:color w:val="000000" w:themeColor="text1"/>
+        </w:rPr>
+        <w:t xml:space="preserve"> to check the Code</w:t>
       </w:r>
       <w:r>
         <w:rPr>
@@ -5332,11 +5763,19 @@
         <w:t>{</w:t>
       </w:r>
       <w:proofErr w:type="spellStart"/>
+      <w:proofErr w:type="gramStart"/>
       <w:r>
         <w:rPr>
           <w:rFonts w:ascii="BC Sans" w:hAnsi="BC Sans" w:cstheme="minorHAnsi"/>
         </w:rPr>
-        <w:t>d.images.issuing_inspector_signature</w:t>
+        <w:t>d.images</w:t>
+      </w:r>
+      <w:proofErr w:type="gramEnd"/>
+      <w:r>
+        <w:rPr>
+          <w:rFonts w:ascii="BC Sans" w:hAnsi="BC Sans" w:cstheme="minorHAnsi"/>
+        </w:rPr>
+        <w:t>.issuing_inspector_signature</w:t>
       </w:r>
       <w:proofErr w:type="spellEnd"/>
       <w:r>
@@ -5368,11 +5807,19 @@
         <w:t>{</w:t>
       </w:r>
       <w:proofErr w:type="spellStart"/>
-      <w:r>
-        <w:rPr>
-          <w:rFonts w:ascii="BC Sans" w:hAnsi="BC Sans"/>
-        </w:rPr>
-        <w:t>d.issuing_inspector_name</w:t>
+      <w:proofErr w:type="gramStart"/>
+      <w:r>
+        <w:rPr>
+          <w:rFonts w:ascii="BC Sans" w:hAnsi="BC Sans"/>
+        </w:rPr>
+        <w:t>d.issuing</w:t>
+      </w:r>
+      <w:proofErr w:type="gramEnd"/>
+      <w:r>
+        <w:rPr>
+          <w:rFonts w:ascii="BC Sans" w:hAnsi="BC Sans"/>
+        </w:rPr>
+        <w:t>_inspector_name</w:t>
       </w:r>
       <w:proofErr w:type="spellEnd"/>
       <w:r>

</xml_diff>

<commit_message>
[MDS-6572] Adding proponent address to CAL letter template (#3587)
* updated yarn.lock to fix unit tests failing in pipeline

* adding proponent address to CAL letter template

* adjustment to address and email in CAL and PE letter template

* slight change to CAL and PE template
</commit_message>
<xml_diff>
--- a/services/core-api/app/templates/now/Acknowledgment Letter.docx
+++ b/services/core-api/app/templates/now/Acknowledgment Letter.docx
@@ -92,6 +92,50 @@
         <w:t>}</w:t>
       </w:r>
     </w:p>
+    <w:p>
+      <w:pPr>
+        <w:pStyle w:val="NoSpacing"/>
+        <w:rPr>
+          <w:rFonts w:ascii="BC Sans" w:hAnsi="BC Sans" w:cstheme="minorHAnsi"/>
+        </w:rPr>
+      </w:pPr>
+      <w:r>
+        <w:rPr>
+          <w:rFonts w:ascii="BC Sans" w:hAnsi="BC Sans" w:cstheme="minorHAnsi"/>
+        </w:rPr>
+        <w:t>{</w:t>
+      </w:r>
+      <w:proofErr w:type="spellStart"/>
+      <w:proofErr w:type="gramStart"/>
+      <w:r>
+        <w:rPr>
+          <w:rFonts w:ascii="BC Sans" w:hAnsi="BC Sans" w:cstheme="minorHAnsi"/>
+        </w:rPr>
+        <w:t>d.proponent</w:t>
+      </w:r>
+      <w:proofErr w:type="gramEnd"/>
+      <w:r>
+        <w:rPr>
+          <w:rFonts w:ascii="BC Sans" w:hAnsi="BC Sans" w:cstheme="minorHAnsi"/>
+        </w:rPr>
+        <w:t>_</w:t>
+      </w:r>
+      <w:proofErr w:type="gramStart"/>
+      <w:r>
+        <w:rPr>
+          <w:rFonts w:ascii="BC Sans" w:hAnsi="BC Sans" w:cstheme="minorHAnsi"/>
+        </w:rPr>
+        <w:t>address:convCRLF</w:t>
+      </w:r>
+      <w:proofErr w:type="spellEnd"/>
+      <w:r>
+        <w:rPr>
+          <w:rFonts w:ascii="BC Sans" w:hAnsi="BC Sans" w:cstheme="minorHAnsi"/>
+        </w:rPr>
+        <w:t>()}</w:t>
+      </w:r>
+      <w:proofErr w:type="gramEnd"/>
+    </w:p>
     <w:bookmarkEnd w:id="1"/>
     <w:p>
       <w:pPr>
@@ -257,28 +301,15 @@
       <w:bookmarkStart w:id="2" w:name="OLE_LINK2"/>
       <w:r>
         <w:rPr>
-          <w:rFonts w:ascii="BC Sans" w:hAnsi="BC Sans"/>
-          <w:color w:val="FF0000"/>
-        </w:rPr>
-        <w:t>OPTIONAL</w:t>
-      </w:r>
-      <w:r>
-        <w:rPr>
-          <w:rFonts w:ascii="BC Sans" w:hAnsi="BC Sans"/>
-        </w:rPr>
-        <w:t xml:space="preserve"> Copy via electronic mail </w:t>
-      </w:r>
-      <w:r>
-        <w:rPr>
-          <w:rFonts w:ascii="BC Sans" w:hAnsi="BC Sans"/>
-        </w:rPr>
-        <w:t>to</w:t>
-      </w:r>
-      <w:r>
-        <w:rPr>
-          <w:rFonts w:ascii="BC Sans" w:hAnsi="BC Sans"/>
-        </w:rPr>
-        <w:t xml:space="preserve"> {</w:t>
+          <w:rFonts w:ascii="BC Sans" w:hAnsi="BC Sans" w:cstheme="minorHAnsi"/>
+        </w:rPr>
+        <w:t xml:space="preserve">Sent as electronic mail to </w:t>
+      </w:r>
+      <w:r>
+        <w:rPr>
+          <w:rFonts w:ascii="BC Sans" w:hAnsi="BC Sans"/>
+        </w:rPr>
+        <w:t>{</w:t>
       </w:r>
       <w:proofErr w:type="spellStart"/>
       <w:proofErr w:type="gramStart"/>
@@ -1460,11 +1491,25 @@
         <w:t>{</w:t>
       </w:r>
       <w:proofErr w:type="spellStart"/>
-      <w:r>
-        <w:rPr>
-          <w:rFonts w:ascii="BC Sans" w:hAnsi="BC Sans"/>
-        </w:rPr>
-        <w:t>d.application_dt</w:t>
+      <w:proofErr w:type="gramStart"/>
+      <w:r>
+        <w:rPr>
+          <w:rFonts w:ascii="BC Sans" w:hAnsi="BC Sans"/>
+        </w:rPr>
+        <w:t>d.</w:t>
+      </w:r>
+      <w:r>
+        <w:rPr>
+          <w:rFonts w:ascii="BC Sans" w:hAnsi="BC Sans"/>
+        </w:rPr>
+        <w:t>letter</w:t>
+      </w:r>
+      <w:proofErr w:type="gramEnd"/>
+      <w:r>
+        <w:rPr>
+          <w:rFonts w:ascii="BC Sans" w:hAnsi="BC Sans"/>
+        </w:rPr>
+        <w:t>_dt</w:t>
       </w:r>
       <w:proofErr w:type="spellEnd"/>
       <w:r>
@@ -1728,6 +1773,7 @@
           <w:rFonts w:ascii="BC Sans" w:hAnsi="BC Sans"/>
           <w:color w:val="FF0000"/>
         </w:rPr>
+        <w:lastRenderedPageBreak/>
         <w:t>O</w:t>
       </w:r>
       <w:r>
@@ -1823,17 +1869,7 @@
           <w:color w:val="auto"/>
           <w:u w:val="none"/>
         </w:rPr>
-        <w:t xml:space="preserve">Therefore, be advised that </w:t>
-      </w:r>
-      <w:r>
-        <w:rPr>
-          <w:rStyle w:val="Hyperlink"/>
-          <w:rFonts w:ascii="BC Sans" w:hAnsi="BC Sans"/>
-          <w:color w:val="auto"/>
-          <w:u w:val="none"/>
-        </w:rPr>
-        <w:lastRenderedPageBreak/>
-        <w:t xml:space="preserve">it is your responsibility to apply for </w:t>
+        <w:t xml:space="preserve">Therefore, be advised that it is your responsibility to apply for </w:t>
       </w:r>
       <w:r>
         <w:rPr>
@@ -3161,9 +3197,8 @@
           <w:szCs w:val="22"/>
           <w:lang w:val="en-CA"/>
         </w:rPr>
-        <w:t xml:space="preserve">Other legislation may be applicable to your operation and, as the Permittee, you may </w:t>
-      </w:r>
-      <w:proofErr w:type="gramStart"/>
+        <w:t xml:space="preserve">Other legislation may be applicable to your operation and, as the Permittee, you may be required to obtain approvals or permits under that legislation, such as for road use </w:t>
+      </w:r>
       <w:r>
         <w:rPr>
           <w:rFonts w:ascii="BC Sans" w:eastAsia="Calibri" w:hAnsi="BC Sans" w:cs="Arial"/>
@@ -3172,9 +3207,8 @@
           <w:szCs w:val="22"/>
           <w:lang w:val="en-CA"/>
         </w:rPr>
-        <w:t>be required</w:t>
-      </w:r>
-      <w:proofErr w:type="gramEnd"/>
+        <w:t>or operation of a camp</w:t>
+      </w:r>
       <w:r>
         <w:rPr>
           <w:rFonts w:ascii="BC Sans" w:eastAsia="Calibri" w:hAnsi="BC Sans" w:cs="Arial"/>
@@ -3183,7 +3217,7 @@
           <w:szCs w:val="22"/>
           <w:lang w:val="en-CA"/>
         </w:rPr>
-        <w:t xml:space="preserve"> to obtain approvals or permits under that legislation, such as for road use </w:t>
+        <w:t xml:space="preserve">. It is your responsibility to comply with the terms and conditions of all other permits and authorizations which </w:t>
       </w:r>
       <w:r>
         <w:rPr>
@@ -3193,7 +3227,7 @@
           <w:szCs w:val="22"/>
           <w:lang w:val="en-CA"/>
         </w:rPr>
-        <w:t>or operation of a camp</w:t>
+        <w:t>may b</w:t>
       </w:r>
       <w:r>
         <w:rPr>
@@ -3203,7 +3237,7 @@
           <w:szCs w:val="22"/>
           <w:lang w:val="en-CA"/>
         </w:rPr>
-        <w:t xml:space="preserve">. It is your responsibility to comply with the terms and conditions of all other permits and authorizations which </w:t>
+        <w:t xml:space="preserve">e issued </w:t>
       </w:r>
       <w:r>
         <w:rPr>
@@ -3213,7 +3247,7 @@
           <w:szCs w:val="22"/>
           <w:lang w:val="en-CA"/>
         </w:rPr>
-        <w:t>may b</w:t>
+        <w:t xml:space="preserve">to you </w:t>
       </w:r>
       <w:r>
         <w:rPr>
@@ -3223,7 +3257,32 @@
           <w:szCs w:val="22"/>
           <w:lang w:val="en-CA"/>
         </w:rPr>
-        <w:t xml:space="preserve">e issued </w:t>
+        <w:t xml:space="preserve">and all </w:t>
+      </w:r>
+      <w:r>
+        <w:rPr>
+          <w:rFonts w:ascii="BC Sans" w:eastAsia="Calibri" w:hAnsi="BC Sans" w:cs="Arial"/>
+          <w:b/>
+          <w:bCs/>
+          <w:kern w:val="2"/>
+          <w:sz w:val="22"/>
+          <w:szCs w:val="22"/>
+          <w:lang w:val="en-CA"/>
+        </w:rPr>
+        <w:t xml:space="preserve">other applicable </w:t>
+      </w:r>
+      <w:r>
+        <w:rPr>
+          <w:rFonts w:ascii="BC Sans" w:eastAsia="Calibri" w:hAnsi="BC Sans" w:cs="Arial"/>
+          <w:b/>
+          <w:bCs/>
+          <w:kern w:val="2"/>
+          <w:sz w:val="22"/>
+          <w:szCs w:val="22"/>
+          <w:lang w:val="en-CA"/>
+        </w:rPr>
+        <w:lastRenderedPageBreak/>
+        <w:t>legislation</w:t>
       </w:r>
       <w:r>
         <w:rPr>
@@ -3233,7 +3292,7 @@
           <w:szCs w:val="22"/>
           <w:lang w:val="en-CA"/>
         </w:rPr>
-        <w:t xml:space="preserve">to you </w:t>
+        <w:t xml:space="preserve"> including </w:t>
       </w:r>
       <w:r>
         <w:rPr>
@@ -3243,74 +3302,7 @@
           <w:szCs w:val="22"/>
           <w:lang w:val="en-CA"/>
         </w:rPr>
-        <w:t xml:space="preserve">and all </w:t>
-      </w:r>
-      <w:r>
-        <w:rPr>
-          <w:rFonts w:ascii="BC Sans" w:eastAsia="Calibri" w:hAnsi="BC Sans" w:cs="Arial"/>
-          <w:b/>
-          <w:bCs/>
-          <w:kern w:val="2"/>
-          <w:sz w:val="22"/>
-          <w:szCs w:val="22"/>
-          <w:lang w:val="en-CA"/>
-        </w:rPr>
-        <w:t xml:space="preserve">other applicable </w:t>
-      </w:r>
-      <w:r>
-        <w:rPr>
-          <w:rFonts w:ascii="BC Sans" w:eastAsia="Calibri" w:hAnsi="BC Sans" w:cs="Arial"/>
-          <w:b/>
-          <w:bCs/>
-          <w:kern w:val="2"/>
-          <w:sz w:val="22"/>
-          <w:szCs w:val="22"/>
-          <w:lang w:val="en-CA"/>
-        </w:rPr>
-        <w:lastRenderedPageBreak/>
-        <w:t>legislation</w:t>
-      </w:r>
-      <w:r>
-        <w:rPr>
-          <w:rFonts w:ascii="BC Sans" w:eastAsia="Calibri" w:hAnsi="BC Sans" w:cs="Arial"/>
-          <w:kern w:val="2"/>
-          <w:sz w:val="22"/>
-          <w:szCs w:val="22"/>
-          <w:lang w:val="en-CA"/>
-        </w:rPr>
-        <w:t xml:space="preserve"> </w:t>
-      </w:r>
-      <w:proofErr w:type="gramStart"/>
-      <w:r>
-        <w:rPr>
-          <w:rFonts w:ascii="BC Sans" w:eastAsia="Calibri" w:hAnsi="BC Sans" w:cs="Arial"/>
-          <w:kern w:val="2"/>
-          <w:sz w:val="22"/>
-          <w:szCs w:val="22"/>
-          <w:lang w:val="en-CA"/>
-        </w:rPr>
-        <w:t xml:space="preserve">including </w:t>
-      </w:r>
-      <w:r>
-        <w:rPr>
-          <w:rFonts w:ascii="BC Sans" w:eastAsia="Calibri" w:hAnsi="BC Sans" w:cs="Arial"/>
-          <w:kern w:val="2"/>
-          <w:sz w:val="22"/>
-          <w:szCs w:val="22"/>
-          <w:lang w:val="en-CA"/>
-        </w:rPr>
-        <w:t>but not limited to</w:t>
-      </w:r>
-      <w:proofErr w:type="gramEnd"/>
-      <w:r>
-        <w:rPr>
-          <w:rFonts w:ascii="BC Sans" w:eastAsia="Calibri" w:hAnsi="BC Sans" w:cs="Arial"/>
-          <w:kern w:val="2"/>
-          <w:sz w:val="22"/>
-          <w:szCs w:val="22"/>
-          <w:lang w:val="en-CA"/>
-        </w:rPr>
-        <w:t xml:space="preserve"> </w:t>
+        <w:t xml:space="preserve">but not limited to </w:t>
       </w:r>
       <w:r>
         <w:rPr>
@@ -4985,29 +4977,101 @@
           <w:rFonts w:ascii="BC Sans" w:hAnsi="BC Sans"/>
           <w:lang w:val="en-CA"/>
         </w:rPr>
-        <w:t xml:space="preserve"> public advertising will </w:t>
-      </w:r>
-      <w:proofErr w:type="gramStart"/>
+        <w:t xml:space="preserve"> public advertising will be required for this application</w:t>
+      </w:r>
       <w:r>
         <w:rPr>
           <w:rFonts w:ascii="BC Sans" w:hAnsi="BC Sans"/>
           <w:lang w:val="en-CA"/>
         </w:rPr>
-        <w:t>be required</w:t>
-      </w:r>
-      <w:proofErr w:type="gramEnd"/>
+        <w:t xml:space="preserve">. </w:t>
+      </w:r>
       <w:r>
         <w:rPr>
           <w:rFonts w:ascii="BC Sans" w:hAnsi="BC Sans"/>
           <w:lang w:val="en-CA"/>
         </w:rPr>
-        <w:t xml:space="preserve"> for this application</w:t>
-      </w:r>
-      <w:r>
-        <w:rPr>
-          <w:rFonts w:ascii="BC Sans" w:hAnsi="BC Sans"/>
+        <w:t xml:space="preserve">You are required to publish a </w:t>
+      </w:r>
+      <w:r>
+        <w:rPr>
+          <w:rFonts w:ascii="BC Sans" w:hAnsi="BC Sans"/>
+          <w:b/>
+          <w:bCs/>
           <w:lang w:val="en-CA"/>
         </w:rPr>
+        <w:t>Notice of Filing</w:t>
+      </w:r>
+      <w:r>
+        <w:rPr>
+          <w:rFonts w:ascii="BC Sans" w:hAnsi="BC Sans"/>
+          <w:lang w:val="en-CA"/>
+        </w:rPr>
+        <w:t xml:space="preserve"> </w:t>
+      </w:r>
+      <w:r>
+        <w:rPr>
+          <w:rFonts w:ascii="BC Sans" w:hAnsi="BC Sans"/>
+          <w:lang w:val="en-CA"/>
+        </w:rPr>
+        <w:t xml:space="preserve">advertisement </w:t>
+      </w:r>
+      <w:r>
+        <w:rPr>
+          <w:rFonts w:ascii="BC Sans" w:hAnsi="BC Sans"/>
+          <w:lang w:val="en-CA"/>
+        </w:rPr>
+        <w:t>in the BC Gazette and local newspaper (</w:t>
+      </w:r>
+      <w:r>
+        <w:rPr>
+          <w:rFonts w:ascii="BC Sans" w:hAnsi="BC Sans"/>
+          <w:lang w:val="en-CA"/>
+        </w:rPr>
+        <w:t>where</w:t>
+      </w:r>
+      <w:r>
+        <w:rPr>
+          <w:rFonts w:ascii="BC Sans" w:hAnsi="BC Sans"/>
+          <w:lang w:val="en-CA"/>
+        </w:rPr>
+        <w:t xml:space="preserve"> available), and to establish road-side </w:t>
+      </w:r>
+      <w:r>
+        <w:rPr>
+          <w:rFonts w:ascii="BC Sans" w:hAnsi="BC Sans"/>
+          <w:b/>
+          <w:bCs/>
+          <w:lang w:val="en-CA"/>
+        </w:rPr>
+        <w:t xml:space="preserve">signage </w:t>
+      </w:r>
+      <w:r>
+        <w:rPr>
+          <w:rFonts w:ascii="BC Sans" w:hAnsi="BC Sans"/>
+          <w:lang w:val="en-CA"/>
+        </w:rPr>
+        <w:t xml:space="preserve">advertising your Mines Act </w:t>
+      </w:r>
+      <w:r>
+        <w:rPr>
+          <w:rFonts w:ascii="BC Sans" w:hAnsi="BC Sans"/>
+          <w:lang w:val="en-CA"/>
+        </w:rPr>
+        <w:t>p</w:t>
+      </w:r>
+      <w:r>
+        <w:rPr>
+          <w:rFonts w:ascii="BC Sans" w:hAnsi="BC Sans"/>
+          <w:lang w:val="en-CA"/>
+        </w:rPr>
+        <w:t>ermit application</w:t>
+      </w:r>
+      <w:r>
+        <w:rPr>
+          <w:rFonts w:ascii="BC Sans" w:hAnsi="BC Sans"/>
+          <w:lang w:val="en-CA"/>
+        </w:rPr>
         <w:t xml:space="preserve">. </w:t>
       </w:r>
       <w:r>
@@ -5015,155 +5079,35 @@
           <w:rFonts w:ascii="BC Sans" w:hAnsi="BC Sans"/>
           <w:lang w:val="en-CA"/>
         </w:rPr>
-        <w:t xml:space="preserve">You </w:t>
-      </w:r>
-      <w:proofErr w:type="gramStart"/>
+        <w:t>Please forward a draft of the Notice of Filing</w:t>
+      </w:r>
       <w:r>
         <w:rPr>
           <w:rFonts w:ascii="BC Sans" w:hAnsi="BC Sans"/>
           <w:lang w:val="en-CA"/>
         </w:rPr>
-        <w:t>are required</w:t>
-      </w:r>
-      <w:proofErr w:type="gramEnd"/>
+        <w:t xml:space="preserve"> </w:t>
+      </w:r>
       <w:r>
         <w:rPr>
           <w:rFonts w:ascii="BC Sans" w:hAnsi="BC Sans"/>
           <w:lang w:val="en-CA"/>
         </w:rPr>
-        <w:t xml:space="preserve"> to publish a </w:t>
-      </w:r>
-      <w:r>
-        <w:rPr>
-          <w:rFonts w:ascii="BC Sans" w:hAnsi="BC Sans"/>
-          <w:b/>
-          <w:bCs/>
+        <w:t>and a draft road-side signage template to this office for review and approval</w:t>
+      </w:r>
+      <w:r>
+        <w:rPr>
+          <w:rFonts w:ascii="BC Sans" w:hAnsi="BC Sans"/>
           <w:lang w:val="en-CA"/>
         </w:rPr>
-        <w:t>Notice of Filing</w:t>
+        <w:t xml:space="preserve">. </w:t>
       </w:r>
       <w:r>
         <w:rPr>
           <w:rFonts w:ascii="BC Sans" w:hAnsi="BC Sans"/>
           <w:lang w:val="en-CA"/>
         </w:rPr>
-        <w:t xml:space="preserve"> </w:t>
-      </w:r>
-      <w:r>
-        <w:rPr>
-          <w:rFonts w:ascii="BC Sans" w:hAnsi="BC Sans"/>
-          <w:lang w:val="en-CA"/>
-        </w:rPr>
-        <w:t xml:space="preserve">advertisement </w:t>
-      </w:r>
-      <w:r>
-        <w:rPr>
-          <w:rFonts w:ascii="BC Sans" w:hAnsi="BC Sans"/>
-          <w:lang w:val="en-CA"/>
-        </w:rPr>
-        <w:t>in the BC Gazette and local newspaper (</w:t>
-      </w:r>
-      <w:r>
-        <w:rPr>
-          <w:rFonts w:ascii="BC Sans" w:hAnsi="BC Sans"/>
-          <w:lang w:val="en-CA"/>
-        </w:rPr>
-        <w:t>where</w:t>
-      </w:r>
-      <w:r>
-        <w:rPr>
-          <w:rFonts w:ascii="BC Sans" w:hAnsi="BC Sans"/>
-          <w:lang w:val="en-CA"/>
-        </w:rPr>
-        <w:t xml:space="preserve"> available), and to establish road-side </w:t>
-      </w:r>
-      <w:r>
-        <w:rPr>
-          <w:rFonts w:ascii="BC Sans" w:hAnsi="BC Sans"/>
-          <w:b/>
-          <w:bCs/>
-          <w:lang w:val="en-CA"/>
-        </w:rPr>
-        <w:t xml:space="preserve">signage </w:t>
-      </w:r>
-      <w:r>
-        <w:rPr>
-          <w:rFonts w:ascii="BC Sans" w:hAnsi="BC Sans"/>
-          <w:lang w:val="en-CA"/>
-        </w:rPr>
-        <w:t xml:space="preserve">advertising your Mines Act </w:t>
-      </w:r>
-      <w:r>
-        <w:rPr>
-          <w:rFonts w:ascii="BC Sans" w:hAnsi="BC Sans"/>
-          <w:lang w:val="en-CA"/>
-        </w:rPr>
-        <w:t>p</w:t>
-      </w:r>
-      <w:r>
-        <w:rPr>
-          <w:rFonts w:ascii="BC Sans" w:hAnsi="BC Sans"/>
-          <w:lang w:val="en-CA"/>
-        </w:rPr>
-        <w:t>ermit application</w:t>
-      </w:r>
-      <w:r>
-        <w:rPr>
-          <w:rFonts w:ascii="BC Sans" w:hAnsi="BC Sans"/>
-          <w:lang w:val="en-CA"/>
-        </w:rPr>
-        <w:t xml:space="preserve">. </w:t>
-      </w:r>
-      <w:r>
-        <w:rPr>
-          <w:rFonts w:ascii="BC Sans" w:hAnsi="BC Sans"/>
-          <w:lang w:val="en-CA"/>
-        </w:rPr>
-        <w:t>Please forward a draft of the Notice of Filing</w:t>
-      </w:r>
-      <w:r>
-        <w:rPr>
-          <w:rFonts w:ascii="BC Sans" w:hAnsi="BC Sans"/>
-          <w:lang w:val="en-CA"/>
-        </w:rPr>
-        <w:t xml:space="preserve"> </w:t>
-      </w:r>
-      <w:r>
-        <w:rPr>
-          <w:rFonts w:ascii="BC Sans" w:hAnsi="BC Sans"/>
-          <w:lang w:val="en-CA"/>
-        </w:rPr>
-        <w:t>and a draft road-side signage template to this office for review and approval</w:t>
-      </w:r>
-      <w:r>
-        <w:rPr>
-          <w:rFonts w:ascii="BC Sans" w:hAnsi="BC Sans"/>
-          <w:lang w:val="en-CA"/>
-        </w:rPr>
-        <w:t xml:space="preserve">. </w:t>
-      </w:r>
-      <w:r>
-        <w:rPr>
-          <w:rFonts w:ascii="BC Sans" w:hAnsi="BC Sans"/>
-          <w:lang w:val="en-CA"/>
-        </w:rPr>
-        <w:t xml:space="preserve">When these drafts have </w:t>
-      </w:r>
-      <w:proofErr w:type="gramStart"/>
-      <w:r>
-        <w:rPr>
-          <w:rFonts w:ascii="BC Sans" w:hAnsi="BC Sans"/>
-          <w:lang w:val="en-CA"/>
-        </w:rPr>
-        <w:t>been approved</w:t>
-      </w:r>
-      <w:proofErr w:type="gramEnd"/>
-      <w:r>
-        <w:rPr>
-          <w:rFonts w:ascii="BC Sans" w:hAnsi="BC Sans"/>
-          <w:lang w:val="en-CA"/>
-        </w:rPr>
-        <w:t xml:space="preserve"> you may then submit the</w:t>
+        <w:t>When these drafts have been approved you may then submit the</w:t>
       </w:r>
       <w:r>
         <w:rPr>
@@ -6870,7 +6814,7 @@
                                       <pic:cNvPicPr/>
                                     </pic:nvPicPr>
                                     <pic:blipFill>
-                                      <a:blip r:embed="rId1">
+                                      <a:blip r:embed="rId2">
                                         <a:extLst>
                                           <a:ext uri="{28A0092B-C50C-407E-A947-70E740481C1C}">
                                             <a14:useLocalDpi xmlns:a14="http://schemas.microsoft.com/office/drawing/2010/main" val="0"/>

</xml_diff>

<commit_message>
Adjusted formatting for dates on letter templates and formatted some additional dates.  Updated logic and json for those new dates.  Updated template text/styling.
</commit_message>
<xml_diff>
--- a/services/core-api/app/templates/now/Acknowledgment Letter.docx
+++ b/services/core-api/app/templates/now/Acknowledgment Letter.docx
@@ -128,13 +128,13 @@
         <w:t>address:convCRLF</w:t>
       </w:r>
       <w:proofErr w:type="spellEnd"/>
+      <w:proofErr w:type="gramEnd"/>
       <w:r>
         <w:rPr>
           <w:rFonts w:ascii="BC Sans" w:hAnsi="BC Sans" w:cstheme="minorHAnsi"/>
         </w:rPr>
         <w:t>()}</w:t>
       </w:r>
-      <w:proofErr w:type="gramEnd"/>
     </w:p>
     <w:bookmarkEnd w:id="1"/>
     <w:p>
@@ -164,21 +164,36 @@
         <w:rPr>
           <w:rFonts w:ascii="BC Sans" w:hAnsi="BC Sans" w:cstheme="minorHAnsi"/>
         </w:rPr>
-        <w:t>d.emailed</w:t>
+        <w:t>d.</w:t>
+      </w:r>
+      <w:r>
+        <w:rPr>
+          <w:rFonts w:ascii="BC Sans" w:eastAsia="BC Sans" w:hAnsi="BC Sans" w:cs="BC Sans"/>
+          <w:color w:val="000000" w:themeColor="text1"/>
+        </w:rPr>
+        <w:t>applicant</w:t>
       </w:r>
       <w:proofErr w:type="gramEnd"/>
       <w:r>
         <w:rPr>
+          <w:rFonts w:ascii="BC Sans" w:eastAsia="BC Sans" w:hAnsi="BC Sans" w:cs="BC Sans"/>
+          <w:color w:val="000000" w:themeColor="text1"/>
+        </w:rPr>
+        <w:t>_</w:t>
+      </w:r>
+      <w:proofErr w:type="gramStart"/>
+      <w:r>
+        <w:rPr>
+          <w:rFonts w:ascii="BC Sans" w:eastAsia="BC Sans" w:hAnsi="BC Sans" w:cs="BC Sans"/>
+          <w:color w:val="000000" w:themeColor="text1"/>
+        </w:rPr>
+        <w:t>email</w:t>
+      </w:r>
+      <w:r>
+        <w:rPr>
           <w:rFonts w:ascii="BC Sans" w:hAnsi="BC Sans" w:cstheme="minorHAnsi"/>
         </w:rPr>
-        <w:t>_</w:t>
-      </w:r>
-      <w:proofErr w:type="gramStart"/>
-      <w:r>
-        <w:rPr>
-          <w:rFonts w:ascii="BC Sans" w:hAnsi="BC Sans" w:cstheme="minorHAnsi"/>
-        </w:rPr>
-        <w:t>to:ifNEM</w:t>
+        <w:t>:ifNEM</w:t>
       </w:r>
       <w:proofErr w:type="spellEnd"/>
       <w:proofErr w:type="gramEnd"/>
@@ -215,119 +230,48 @@
       <w:pPr>
         <w:pStyle w:val="NoSpacing"/>
         <w:rPr>
+          <w:rFonts w:ascii="BC Sans" w:hAnsi="BC Sans"/>
+        </w:rPr>
+      </w:pPr>
+      <w:bookmarkStart w:id="2" w:name="OLE_LINK2"/>
+      <w:r>
+        <w:rPr>
           <w:rFonts w:ascii="BC Sans" w:hAnsi="BC Sans" w:cstheme="minorHAnsi"/>
         </w:rPr>
-      </w:pPr>
-      <w:r>
-        <w:rPr>
-          <w:rFonts w:ascii="BC Sans" w:hAnsi="BC Sans" w:cstheme="minorHAnsi"/>
-        </w:rPr>
-        <w:t>Sent as electronic mail to {</w:t>
+        <w:t xml:space="preserve">Sent as electronic mail to </w:t>
+      </w:r>
+      <w:r>
+        <w:rPr>
+          <w:rFonts w:ascii="BC Sans" w:hAnsi="BC Sans"/>
+        </w:rPr>
+        <w:t>{</w:t>
       </w:r>
       <w:proofErr w:type="spellStart"/>
       <w:proofErr w:type="gramStart"/>
       <w:r>
         <w:rPr>
-          <w:rFonts w:ascii="BC Sans" w:hAnsi="BC Sans" w:cstheme="minorHAnsi"/>
-        </w:rPr>
-        <w:t>d.emailed</w:t>
-      </w:r>
-      <w:proofErr w:type="gramEnd"/>
-      <w:r>
-        <w:rPr>
-          <w:rFonts w:ascii="BC Sans" w:hAnsi="BC Sans" w:cstheme="minorHAnsi"/>
-        </w:rPr>
-        <w:t>_to</w:t>
-      </w:r>
-      <w:proofErr w:type="spellEnd"/>
-      <w:r>
-        <w:rPr>
-          <w:rFonts w:ascii="BC Sans" w:hAnsi="BC Sans" w:cstheme="minorHAnsi"/>
-        </w:rPr>
-        <w:t>}</w:t>
-      </w:r>
-    </w:p>
-    <w:p>
-      <w:pPr>
-        <w:pStyle w:val="NoSpacing"/>
-        <w:rPr>
-          <w:rFonts w:ascii="BC Sans" w:hAnsi="BC Sans" w:cstheme="minorHAnsi"/>
-        </w:rPr>
-      </w:pPr>
-      <w:r>
-        <w:rPr>
-          <w:rFonts w:ascii="BC Sans" w:hAnsi="BC Sans" w:cstheme="minorHAnsi"/>
-        </w:rPr>
-        <w:t>{</w:t>
-      </w:r>
-      <w:proofErr w:type="spellStart"/>
-      <w:proofErr w:type="gramStart"/>
-      <w:r>
-        <w:rPr>
-          <w:rFonts w:ascii="BC Sans" w:hAnsi="BC Sans" w:cstheme="minorHAnsi"/>
-        </w:rPr>
-        <w:t>d.emailed</w:t>
-      </w:r>
-      <w:proofErr w:type="gramEnd"/>
-      <w:r>
-        <w:rPr>
-          <w:rFonts w:ascii="BC Sans" w:hAnsi="BC Sans" w:cstheme="minorHAnsi"/>
-        </w:rPr>
-        <w:t>_</w:t>
-      </w:r>
-      <w:proofErr w:type="gramStart"/>
-      <w:r>
-        <w:rPr>
-          <w:rFonts w:ascii="BC Sans" w:hAnsi="BC Sans" w:cstheme="minorHAnsi"/>
-        </w:rPr>
-        <w:t>to:showEnd</w:t>
-      </w:r>
-      <w:proofErr w:type="spellEnd"/>
-      <w:proofErr w:type="gramEnd"/>
-      <w:r>
-        <w:rPr>
-          <w:rFonts w:ascii="BC Sans" w:hAnsi="BC Sans" w:cstheme="minorHAnsi"/>
-        </w:rPr>
-        <w:t>}</w:t>
-      </w:r>
-    </w:p>
-    <w:p>
-      <w:pPr>
-        <w:pStyle w:val="NoSpacing"/>
-        <w:rPr>
-          <w:rFonts w:ascii="BC Sans" w:hAnsi="BC Sans"/>
-        </w:rPr>
-      </w:pPr>
-      <w:bookmarkStart w:id="2" w:name="OLE_LINK2"/>
-      <w:r>
-        <w:rPr>
-          <w:rFonts w:ascii="BC Sans" w:hAnsi="BC Sans" w:cstheme="minorHAnsi"/>
-        </w:rPr>
-        <w:t xml:space="preserve">Sent as electronic mail to </w:t>
-      </w:r>
-      <w:r>
-        <w:rPr>
-          <w:rFonts w:ascii="BC Sans" w:hAnsi="BC Sans"/>
-        </w:rPr>
-        <w:t>{</w:t>
-      </w:r>
-      <w:proofErr w:type="spellStart"/>
-      <w:proofErr w:type="gramStart"/>
-      <w:r>
-        <w:rPr>
           <w:rFonts w:ascii="BC Sans" w:eastAsia="BC Sans" w:hAnsi="BC Sans" w:cs="BC Sans"/>
           <w:color w:val="000000" w:themeColor="text1"/>
         </w:rPr>
-        <w:t>d.applicant</w:t>
-      </w:r>
-      <w:proofErr w:type="gramEnd"/>
+        <w:t>d.</w:t>
+      </w:r>
+      <w:bookmarkStart w:id="3" w:name="OLE_LINK5"/>
       <w:r>
         <w:rPr>
           <w:rFonts w:ascii="BC Sans" w:eastAsia="BC Sans" w:hAnsi="BC Sans" w:cs="BC Sans"/>
           <w:color w:val="000000" w:themeColor="text1"/>
         </w:rPr>
+        <w:t>applicant</w:t>
+      </w:r>
+      <w:proofErr w:type="gramEnd"/>
+      <w:r>
+        <w:rPr>
+          <w:rFonts w:ascii="BC Sans" w:eastAsia="BC Sans" w:hAnsi="BC Sans" w:cs="BC Sans"/>
+          <w:color w:val="000000" w:themeColor="text1"/>
+        </w:rPr>
         <w:t>_email</w:t>
       </w:r>
+      <w:bookmarkEnd w:id="3"/>
       <w:proofErr w:type="spellEnd"/>
       <w:r>
         <w:rPr>
@@ -344,91 +288,62 @@
           <w:rFonts w:ascii="BC Sans" w:hAnsi="BC Sans" w:cstheme="minorHAnsi"/>
         </w:rPr>
       </w:pPr>
+      <w:r>
+        <w:rPr>
+          <w:rFonts w:ascii="BC Sans" w:hAnsi="BC Sans" w:cstheme="minorHAnsi"/>
+        </w:rPr>
+        <w:t>{</w:t>
+      </w:r>
+      <w:proofErr w:type="spellStart"/>
+      <w:proofErr w:type="gramStart"/>
+      <w:r>
+        <w:rPr>
+          <w:rFonts w:ascii="BC Sans" w:hAnsi="BC Sans" w:cstheme="minorHAnsi"/>
+        </w:rPr>
+        <w:t>d.</w:t>
+      </w:r>
+      <w:r>
+        <w:rPr>
+          <w:rFonts w:ascii="BC Sans" w:hAnsi="BC Sans" w:cstheme="minorHAnsi"/>
+        </w:rPr>
+        <w:t>applicant</w:t>
+      </w:r>
+      <w:proofErr w:type="gramEnd"/>
+      <w:r>
+        <w:rPr>
+          <w:rFonts w:ascii="BC Sans" w:hAnsi="BC Sans" w:cstheme="minorHAnsi"/>
+        </w:rPr>
+        <w:t>_</w:t>
+      </w:r>
+      <w:proofErr w:type="gramStart"/>
+      <w:r>
+        <w:rPr>
+          <w:rFonts w:ascii="BC Sans" w:hAnsi="BC Sans" w:cstheme="minorHAnsi"/>
+        </w:rPr>
+        <w:t>email</w:t>
+      </w:r>
+      <w:r>
+        <w:rPr>
+          <w:rFonts w:ascii="BC Sans" w:hAnsi="BC Sans" w:cstheme="minorHAnsi"/>
+        </w:rPr>
+        <w:t>:showEnd</w:t>
+      </w:r>
+      <w:proofErr w:type="spellEnd"/>
+      <w:proofErr w:type="gramEnd"/>
+      <w:r>
+        <w:rPr>
+          <w:rFonts w:ascii="BC Sans" w:hAnsi="BC Sans" w:cstheme="minorHAnsi"/>
+        </w:rPr>
+        <w:t>}</w:t>
+      </w:r>
     </w:p>
     <w:p>
       <w:pPr>
         <w:pStyle w:val="NoSpacing"/>
         <w:rPr>
-          <w:rFonts w:ascii="BC Sans" w:hAnsi="BC Sans"/>
-          <w:b/>
-          <w:bCs/>
-        </w:rPr>
-      </w:pPr>
-      <w:bookmarkStart w:id="3" w:name="OLE_LINK4"/>
-      <w:r>
-        <w:rPr>
-          <w:rFonts w:ascii="BC Sans" w:hAnsi="BC Sans"/>
-          <w:b/>
-          <w:bCs/>
-        </w:rPr>
-        <w:t>Re</w:t>
-      </w:r>
-      <w:proofErr w:type="gramStart"/>
-      <w:r>
-        <w:rPr>
-          <w:rFonts w:ascii="BC Sans" w:hAnsi="BC Sans"/>
-          <w:b/>
-          <w:bCs/>
-        </w:rPr>
-        <w:t xml:space="preserve">: </w:t>
-      </w:r>
-      <w:r>
-        <w:rPr>
-          <w:rFonts w:ascii="BC Sans" w:hAnsi="BC Sans"/>
-        </w:rPr>
-        <w:tab/>
-      </w:r>
-      <w:r>
-        <w:rPr>
-          <w:rFonts w:ascii="BC Sans" w:hAnsi="BC Sans"/>
-          <w:b/>
-          <w:bCs/>
-        </w:rPr>
-        <w:t>Application</w:t>
-      </w:r>
-      <w:proofErr w:type="gramEnd"/>
-      <w:r>
-        <w:rPr>
-          <w:rFonts w:ascii="BC Sans" w:hAnsi="BC Sans"/>
-          <w:b/>
-          <w:bCs/>
-        </w:rPr>
-        <w:t xml:space="preserve"> </w:t>
-      </w:r>
-      <w:r>
-        <w:rPr>
-          <w:rFonts w:ascii="BC Sans" w:hAnsi="BC Sans"/>
-          <w:b/>
-          <w:bCs/>
-        </w:rPr>
-        <w:t xml:space="preserve">for </w:t>
-      </w:r>
-      <w:r>
-        <w:rPr>
-          <w:rFonts w:ascii="BC Sans" w:hAnsi="BC Sans"/>
-          <w:b/>
-          <w:bCs/>
-        </w:rPr>
-        <w:t xml:space="preserve">a </w:t>
-      </w:r>
-      <w:proofErr w:type="gramStart"/>
-      <w:r>
-        <w:rPr>
-          <w:rFonts w:ascii="BC Sans" w:hAnsi="BC Sans"/>
-          <w:b/>
-          <w:bCs/>
-        </w:rPr>
-        <w:t xml:space="preserve">Mines Act </w:t>
-      </w:r>
-      <w:r>
-        <w:rPr>
-          <w:rFonts w:ascii="BC Sans" w:hAnsi="BC Sans"/>
-          <w:b/>
-          <w:bCs/>
-        </w:rPr>
-        <w:t>permit</w:t>
-      </w:r>
-      <w:proofErr w:type="gramEnd"/>
+          <w:rFonts w:ascii="BC Sans" w:hAnsi="BC Sans" w:cstheme="minorHAnsi"/>
+        </w:rPr>
+      </w:pPr>
     </w:p>
     <w:p>
       <w:pPr>
@@ -439,11 +354,18 @@
           <w:bCs/>
         </w:rPr>
       </w:pPr>
-      <w:r>
-        <w:rPr>
-          <w:rFonts w:ascii="BC Sans" w:hAnsi="BC Sans"/>
-          <w:b/>
-          <w:bCs/>
+      <w:bookmarkStart w:id="4" w:name="OLE_LINK4"/>
+      <w:r>
+        <w:rPr>
+          <w:rFonts w:ascii="BC Sans" w:hAnsi="BC Sans"/>
+          <w:b/>
+          <w:bCs/>
+        </w:rPr>
+        <w:t xml:space="preserve">Re: </w:t>
+      </w:r>
+      <w:r>
+        <w:rPr>
+          <w:rFonts w:ascii="BC Sans" w:hAnsi="BC Sans"/>
         </w:rPr>
         <w:tab/>
       </w:r>
@@ -453,175 +375,77 @@
           <w:b/>
           <w:bCs/>
         </w:rPr>
-        <w:t>{</w:t>
-      </w:r>
-      <w:proofErr w:type="spellStart"/>
-      <w:r>
-        <w:rPr>
-          <w:rFonts w:ascii="BC Sans" w:hAnsi="BC Sans"/>
-          <w:b/>
-          <w:bCs/>
-        </w:rPr>
-        <w:t>d.application_type_</w:t>
-      </w:r>
-      <w:proofErr w:type="gramStart"/>
-      <w:r>
-        <w:rPr>
-          <w:rFonts w:ascii="BC Sans" w:hAnsi="BC Sans"/>
-          <w:b/>
-          <w:bCs/>
-        </w:rPr>
-        <w:t>code:ifEQ</w:t>
-      </w:r>
-      <w:proofErr w:type="spellEnd"/>
-      <w:proofErr w:type="gramEnd"/>
-      <w:r>
-        <w:rPr>
-          <w:rFonts w:ascii="BC Sans" w:hAnsi="BC Sans"/>
-          <w:b/>
-          <w:bCs/>
-        </w:rPr>
-        <w:t>(NOW</w:t>
-      </w:r>
-      <w:proofErr w:type="gramStart"/>
-      <w:r>
-        <w:rPr>
-          <w:rFonts w:ascii="BC Sans" w:hAnsi="BC Sans"/>
-          <w:b/>
-          <w:bCs/>
-        </w:rPr>
-        <w:t>):</w:t>
-      </w:r>
-      <w:proofErr w:type="spellStart"/>
-      <w:r>
-        <w:rPr>
-          <w:rFonts w:ascii="BC Sans" w:hAnsi="BC Sans"/>
-          <w:b/>
-          <w:bCs/>
-        </w:rPr>
-        <w:t>showBegin</w:t>
-      </w:r>
-      <w:proofErr w:type="spellEnd"/>
-      <w:proofErr w:type="gramEnd"/>
-      <w:r>
-        <w:rPr>
-          <w:rFonts w:ascii="BC Sans" w:hAnsi="BC Sans"/>
-          <w:b/>
-          <w:bCs/>
-        </w:rPr>
-        <w:t xml:space="preserve">}New </w:t>
-      </w:r>
-      <w:r>
-        <w:rPr>
-          <w:rFonts w:ascii="BC Sans" w:hAnsi="BC Sans"/>
-          <w:b/>
-          <w:bCs/>
-        </w:rPr>
-        <w:t>p</w:t>
-      </w:r>
-      <w:r>
-        <w:rPr>
-          <w:rFonts w:ascii="BC Sans" w:hAnsi="BC Sans"/>
-          <w:b/>
-          <w:bCs/>
-        </w:rPr>
-        <w:t>ermit</w:t>
-      </w:r>
-      <w:r>
-        <w:rPr>
-          <w:rFonts w:ascii="BC Sans" w:hAnsi="BC Sans"/>
-          <w:b/>
-          <w:bCs/>
-        </w:rPr>
-        <w:t xml:space="preserve"> </w:t>
-      </w:r>
-      <w:r>
-        <w:rPr>
-          <w:rFonts w:ascii="BC Sans" w:hAnsi="BC Sans"/>
-          <w:b/>
-          <w:bCs/>
-        </w:rPr>
-        <w:t>{d.application_type_</w:t>
-      </w:r>
-      <w:proofErr w:type="gramStart"/>
-      <w:r>
-        <w:rPr>
-          <w:rFonts w:ascii="BC Sans" w:hAnsi="BC Sans"/>
-          <w:b/>
-          <w:bCs/>
-        </w:rPr>
-        <w:t>code:showEnd</w:t>
-      </w:r>
-      <w:proofErr w:type="gramEnd"/>
-      <w:r>
-        <w:rPr>
-          <w:rFonts w:ascii="BC Sans" w:hAnsi="BC Sans"/>
-          <w:b/>
-          <w:bCs/>
-        </w:rPr>
-        <w:t>}{d.application_type_</w:t>
-      </w:r>
-      <w:proofErr w:type="gramStart"/>
-      <w:r>
-        <w:rPr>
-          <w:rFonts w:ascii="BC Sans" w:hAnsi="BC Sans"/>
-          <w:b/>
-          <w:bCs/>
-        </w:rPr>
-        <w:t>code:ifEQ</w:t>
-      </w:r>
-      <w:proofErr w:type="gramEnd"/>
-      <w:r>
-        <w:rPr>
-          <w:rFonts w:ascii="BC Sans" w:hAnsi="BC Sans"/>
-          <w:b/>
-          <w:bCs/>
-        </w:rPr>
-        <w:t>(</w:t>
-      </w:r>
-      <w:r>
-        <w:rPr>
-          <w:rFonts w:ascii="BC Sans" w:hAnsi="BC Sans"/>
-          <w:b/>
-          <w:bCs/>
-        </w:rPr>
-        <w:t>ADA</w:t>
-      </w:r>
-      <w:proofErr w:type="gramStart"/>
-      <w:r>
-        <w:rPr>
-          <w:rFonts w:ascii="BC Sans" w:hAnsi="BC Sans"/>
-          <w:b/>
-          <w:bCs/>
-        </w:rPr>
-        <w:t>):showBegin</w:t>
-      </w:r>
-      <w:proofErr w:type="gramEnd"/>
-      <w:r>
-        <w:rPr>
-          <w:rFonts w:ascii="BC Sans" w:hAnsi="BC Sans"/>
-          <w:b/>
-          <w:bCs/>
-        </w:rPr>
-        <w:t>}Amendment {</w:t>
-      </w:r>
-      <w:proofErr w:type="spellStart"/>
-      <w:r>
-        <w:rPr>
-          <w:rFonts w:ascii="BC Sans" w:hAnsi="BC Sans"/>
-          <w:b/>
-          <w:bCs/>
-        </w:rPr>
-        <w:t>d.application_type_code</w:t>
-      </w:r>
-      <w:proofErr w:type="spellEnd"/>
-      <w:r>
-        <w:rPr>
-          <w:rFonts w:ascii="BC Sans" w:hAnsi="BC Sans"/>
-          <w:b/>
-          <w:bCs/>
-        </w:rPr>
-        <w:t>} to {</w:t>
+        <w:t xml:space="preserve">Application </w:t>
+      </w:r>
+      <w:r>
+        <w:rPr>
+          <w:rFonts w:ascii="BC Sans" w:hAnsi="BC Sans"/>
+          <w:b/>
+          <w:bCs/>
+        </w:rPr>
+        <w:t xml:space="preserve">for </w:t>
+      </w:r>
+      <w:r>
+        <w:rPr>
+          <w:rFonts w:ascii="BC Sans" w:hAnsi="BC Sans"/>
+          <w:b/>
+          <w:bCs/>
+        </w:rPr>
+        <w:t xml:space="preserve">a </w:t>
+      </w:r>
+      <w:r>
+        <w:rPr>
+          <w:rFonts w:ascii="BC Sans" w:hAnsi="BC Sans"/>
+          <w:b/>
+          <w:bCs/>
+        </w:rPr>
+        <w:t xml:space="preserve">Mines Act </w:t>
+      </w:r>
+      <w:r>
+        <w:rPr>
+          <w:rFonts w:ascii="BC Sans" w:hAnsi="BC Sans"/>
+          <w:b/>
+          <w:bCs/>
+        </w:rPr>
+        <w:t>permit</w:t>
+      </w:r>
+    </w:p>
+    <w:p>
+      <w:pPr>
+        <w:pStyle w:val="NoSpacing"/>
+        <w:rPr>
+          <w:rFonts w:ascii="BC Sans" w:hAnsi="BC Sans"/>
+          <w:b/>
+          <w:bCs/>
+          <w:color w:val="000000" w:themeColor="text1"/>
+        </w:rPr>
+      </w:pPr>
+      <w:r>
+        <w:rPr>
+          <w:rFonts w:ascii="BC Sans" w:hAnsi="BC Sans"/>
+          <w:b/>
+          <w:bCs/>
+        </w:rPr>
+        <w:tab/>
+        <w:t xml:space="preserve">New Permit </w:t>
+      </w:r>
+      <w:r>
+        <w:rPr>
+          <w:rFonts w:ascii="BC Sans" w:hAnsi="BC Sans"/>
+          <w:b/>
+          <w:bCs/>
+          <w:color w:val="EE0000"/>
+        </w:rPr>
+        <w:t xml:space="preserve">OR </w:t>
+      </w:r>
+      <w:r>
+        <w:rPr>
+          <w:rFonts w:ascii="BC Sans" w:hAnsi="BC Sans"/>
+          <w:b/>
+          <w:bCs/>
+          <w:color w:val="000000" w:themeColor="text1"/>
+        </w:rPr>
+        <w:t>Amendment to {</w:t>
       </w:r>
       <w:proofErr w:type="spellStart"/>
       <w:proofErr w:type="gramStart"/>
@@ -630,6 +454,7 @@
           <w:rFonts w:ascii="BC Sans" w:hAnsi="BC Sans"/>
           <w:b/>
           <w:bCs/>
+          <w:color w:val="000000" w:themeColor="text1"/>
         </w:rPr>
         <w:t>d.permit</w:t>
       </w:r>
@@ -639,6 +464,7 @@
           <w:rFonts w:ascii="BC Sans" w:hAnsi="BC Sans"/>
           <w:b/>
           <w:bCs/>
+          <w:color w:val="000000" w:themeColor="text1"/>
         </w:rPr>
         <w:t>_no</w:t>
       </w:r>
@@ -648,6 +474,7 @@
           <w:rFonts w:ascii="BC Sans" w:hAnsi="BC Sans"/>
           <w:b/>
           <w:bCs/>
+          <w:color w:val="000000" w:themeColor="text1"/>
         </w:rPr>
         <w:t>}</w:t>
       </w:r>
@@ -660,26 +487,36 @@
           <w:rFonts w:ascii="BC Sans" w:hAnsi="BC Sans"/>
           <w:b/>
           <w:bCs/>
-          <w:u w:val="single"/>
-        </w:rPr>
-      </w:pPr>
-      <w:r>
-        <w:rPr>
-          <w:rFonts w:ascii="BC Sans" w:hAnsi="BC Sans"/>
-          <w:b/>
-          <w:bCs/>
-        </w:rPr>
-        <w:t>{</w:t>
+        </w:rPr>
+      </w:pPr>
+      <w:bookmarkStart w:id="5" w:name="OLE_LINK3"/>
+      <w:proofErr w:type="gramStart"/>
+      <w:r>
+        <w:rPr>
+          <w:rFonts w:ascii="BC Sans" w:hAnsi="BC Sans"/>
+          <w:b/>
+          <w:bCs/>
+        </w:rPr>
+        <w:t>Mine</w:t>
+      </w:r>
+      <w:proofErr w:type="gramEnd"/>
+      <w:r>
+        <w:rPr>
+          <w:rFonts w:ascii="BC Sans" w:hAnsi="BC Sans"/>
+          <w:b/>
+          <w:bCs/>
+        </w:rPr>
+        <w:t xml:space="preserve"> name:</w:t>
+      </w:r>
+      <w:r>
+        <w:rPr>
+          <w:rFonts w:ascii="BC Sans" w:hAnsi="BC Sans"/>
+          <w:b/>
+          <w:bCs/>
+        </w:rPr>
+        <w:t xml:space="preserve"> {</w:t>
       </w:r>
       <w:proofErr w:type="spellStart"/>
-      <w:r>
-        <w:rPr>
-          <w:rFonts w:ascii="BC Sans" w:hAnsi="BC Sans"/>
-          <w:b/>
-          <w:bCs/>
-        </w:rPr>
-        <w:t>d.application_type_</w:t>
-      </w:r>
       <w:proofErr w:type="gramStart"/>
       <w:r>
         <w:rPr>
@@ -687,10 +524,18 @@
           <w:b/>
           <w:bCs/>
         </w:rPr>
-        <w:t>code:showEnd</w:t>
+        <w:t>d.mine</w:t>
+      </w:r>
+      <w:proofErr w:type="gramEnd"/>
+      <w:r>
+        <w:rPr>
+          <w:rFonts w:ascii="BC Sans" w:hAnsi="BC Sans"/>
+          <w:b/>
+          <w:bCs/>
+        </w:rPr>
+        <w:t>_name</w:t>
       </w:r>
       <w:proofErr w:type="spellEnd"/>
-      <w:proofErr w:type="gramEnd"/>
       <w:r>
         <w:rPr>
           <w:rFonts w:ascii="BC Sans" w:hAnsi="BC Sans"/>
@@ -710,7 +555,6 @@
           <w:bCs/>
         </w:rPr>
       </w:pPr>
-      <w:bookmarkStart w:id="4" w:name="OLE_LINK3"/>
       <w:proofErr w:type="gramStart"/>
       <w:r>
         <w:rPr>
@@ -727,8 +571,17 @@
           <w:b/>
           <w:bCs/>
         </w:rPr>
-        <w:t xml:space="preserve"> </w:t>
-      </w:r>
+        <w:t xml:space="preserve"> number: </w:t>
+      </w:r>
+      <w:r>
+        <w:rPr>
+          <w:rFonts w:ascii="BC Sans" w:hAnsi="BC Sans"/>
+          <w:b/>
+          <w:bCs/>
+        </w:rPr>
+        <w:t>{</w:t>
+      </w:r>
+      <w:proofErr w:type="spellStart"/>
       <w:proofErr w:type="gramStart"/>
       <w:r>
         <w:rPr>
@@ -736,23 +589,6 @@
           <w:b/>
           <w:bCs/>
         </w:rPr>
-        <w:t>name:</w:t>
-      </w:r>
-      <w:r>
-        <w:rPr>
-          <w:rFonts w:ascii="BC Sans" w:hAnsi="BC Sans"/>
-          <w:b/>
-          <w:bCs/>
-        </w:rPr>
-        <w:t xml:space="preserve"> {</w:t>
-      </w:r>
-      <w:proofErr w:type="spellStart"/>
-      <w:r>
-        <w:rPr>
-          <w:rFonts w:ascii="BC Sans" w:hAnsi="BC Sans"/>
-          <w:b/>
-          <w:bCs/>
-        </w:rPr>
         <w:t>d.mine</w:t>
       </w:r>
       <w:proofErr w:type="gramEnd"/>
@@ -762,7 +598,7 @@
           <w:b/>
           <w:bCs/>
         </w:rPr>
-        <w:t>_name</w:t>
+        <w:t>_no</w:t>
       </w:r>
       <w:proofErr w:type="spellEnd"/>
       <w:r>
@@ -774,6 +610,7 @@
         <w:t>}</w:t>
       </w:r>
     </w:p>
+    <w:bookmarkEnd w:id="5"/>
     <w:p>
       <w:pPr>
         <w:pStyle w:val="NoSpacing"/>
@@ -784,6 +621,23 @@
           <w:bCs/>
         </w:rPr>
       </w:pPr>
+      <w:r>
+        <w:rPr>
+          <w:rFonts w:ascii="BC Sans" w:hAnsi="BC Sans"/>
+          <w:b/>
+          <w:bCs/>
+        </w:rPr>
+        <w:t xml:space="preserve">Proposed permittee: </w:t>
+      </w:r>
+      <w:r>
+        <w:rPr>
+          <w:rFonts w:ascii="BC Sans" w:hAnsi="BC Sans"/>
+          <w:b/>
+          <w:bCs/>
+        </w:rPr>
+        <w:t>{</w:t>
+      </w:r>
+      <w:proofErr w:type="spellStart"/>
       <w:proofErr w:type="gramStart"/>
       <w:r>
         <w:rPr>
@@ -791,7 +645,7 @@
           <w:b/>
           <w:bCs/>
         </w:rPr>
-        <w:t>Mine</w:t>
+        <w:t>d.proponent</w:t>
       </w:r>
       <w:proofErr w:type="gramEnd"/>
       <w:r>
@@ -800,42 +654,7 @@
           <w:b/>
           <w:bCs/>
         </w:rPr>
-        <w:t xml:space="preserve"> </w:t>
-      </w:r>
-      <w:proofErr w:type="gramStart"/>
-      <w:r>
-        <w:rPr>
-          <w:rFonts w:ascii="BC Sans" w:hAnsi="BC Sans"/>
-          <w:b/>
-          <w:bCs/>
-        </w:rPr>
-        <w:t xml:space="preserve">number: </w:t>
-      </w:r>
-      <w:r>
-        <w:rPr>
-          <w:rFonts w:ascii="BC Sans" w:hAnsi="BC Sans"/>
-          <w:b/>
-          <w:bCs/>
-        </w:rPr>
-        <w:t>{</w:t>
-      </w:r>
-      <w:proofErr w:type="spellStart"/>
-      <w:r>
-        <w:rPr>
-          <w:rFonts w:ascii="BC Sans" w:hAnsi="BC Sans"/>
-          <w:b/>
-          <w:bCs/>
-        </w:rPr>
-        <w:t>d.mine</w:t>
-      </w:r>
-      <w:proofErr w:type="gramEnd"/>
-      <w:r>
-        <w:rPr>
-          <w:rFonts w:ascii="BC Sans" w:hAnsi="BC Sans"/>
-          <w:b/>
-          <w:bCs/>
-        </w:rPr>
-        <w:t>_no</w:t>
+        <w:t>_name</w:t>
       </w:r>
       <w:proofErr w:type="spellEnd"/>
       <w:r>
@@ -848,70 +667,6 @@
       </w:r>
     </w:p>
     <w:bookmarkEnd w:id="4"/>
-    <w:p>
-      <w:pPr>
-        <w:pStyle w:val="NoSpacing"/>
-        <w:ind w:firstLine="720"/>
-        <w:rPr>
-          <w:rFonts w:ascii="BC Sans" w:hAnsi="BC Sans"/>
-          <w:b/>
-          <w:bCs/>
-        </w:rPr>
-      </w:pPr>
-      <w:r>
-        <w:rPr>
-          <w:rFonts w:ascii="BC Sans" w:hAnsi="BC Sans"/>
-          <w:b/>
-          <w:bCs/>
-        </w:rPr>
-        <w:t xml:space="preserve">Proposed </w:t>
-      </w:r>
-      <w:proofErr w:type="gramStart"/>
-      <w:r>
-        <w:rPr>
-          <w:rFonts w:ascii="BC Sans" w:hAnsi="BC Sans"/>
-          <w:b/>
-          <w:bCs/>
-        </w:rPr>
-        <w:t xml:space="preserve">permittee: </w:t>
-      </w:r>
-      <w:r>
-        <w:rPr>
-          <w:rFonts w:ascii="BC Sans" w:hAnsi="BC Sans"/>
-          <w:b/>
-          <w:bCs/>
-        </w:rPr>
-        <w:t>{</w:t>
-      </w:r>
-      <w:proofErr w:type="spellStart"/>
-      <w:r>
-        <w:rPr>
-          <w:rFonts w:ascii="BC Sans" w:hAnsi="BC Sans"/>
-          <w:b/>
-          <w:bCs/>
-        </w:rPr>
-        <w:t>d.proponent</w:t>
-      </w:r>
-      <w:proofErr w:type="gramEnd"/>
-      <w:r>
-        <w:rPr>
-          <w:rFonts w:ascii="BC Sans" w:hAnsi="BC Sans"/>
-          <w:b/>
-          <w:bCs/>
-        </w:rPr>
-        <w:t>_name</w:t>
-      </w:r>
-      <w:proofErr w:type="spellEnd"/>
-      <w:r>
-        <w:rPr>
-          <w:rFonts w:ascii="BC Sans" w:hAnsi="BC Sans"/>
-          <w:b/>
-          <w:bCs/>
-        </w:rPr>
-        <w:t>}</w:t>
-      </w:r>
-    </w:p>
-    <w:bookmarkEnd w:id="3"/>
     <w:p>
       <w:pPr>
         <w:pStyle w:val="NoSpacing"/>
@@ -1110,6 +865,9 @@
         </w:r>
       </w:hyperlink>
       <w:r>
+        <w:rPr>
+          <w:rFonts w:ascii="BC Sans" w:hAnsi="BC Sans"/>
+        </w:rPr>
         <w:t xml:space="preserve">. </w:t>
       </w:r>
     </w:p>
@@ -1152,19 +910,7 @@
         <w:rPr>
           <w:rFonts w:ascii="BC Sans" w:hAnsi="BC Sans"/>
         </w:rPr>
-        <w:t xml:space="preserve"> </w:t>
-      </w:r>
-      <w:r>
-        <w:rPr>
-          <w:rFonts w:ascii="BC Sans" w:hAnsi="BC Sans"/>
-        </w:rPr>
-        <w:t>section 10(1)</w:t>
-      </w:r>
-      <w:r>
-        <w:rPr>
-          <w:rFonts w:ascii="BC Sans" w:hAnsi="BC Sans"/>
-        </w:rPr>
-        <w:t xml:space="preserve"> of the Mines Act</w:t>
+        <w:t xml:space="preserve"> section 10(1) of the Mines Act</w:t>
       </w:r>
       <w:r>
         <w:rPr>
@@ -1288,21 +1034,7 @@
         <w:rPr>
           <w:rFonts w:ascii="BC Sans" w:hAnsi="BC Sans"/>
         </w:rPr>
-        <w:t xml:space="preserve">conservation, protection, and reclamation of the land, </w:t>
-      </w:r>
-      <w:proofErr w:type="gramStart"/>
-      <w:r>
-        <w:rPr>
-          <w:rFonts w:ascii="BC Sans" w:hAnsi="BC Sans"/>
-        </w:rPr>
-        <w:t>watercourses</w:t>
-      </w:r>
-      <w:proofErr w:type="gramEnd"/>
-      <w:r>
-        <w:rPr>
-          <w:rFonts w:ascii="BC Sans" w:hAnsi="BC Sans"/>
-        </w:rPr>
-        <w:t xml:space="preserve"> and cultural heritage resources affected by the proposed activities</w:t>
+        <w:t>conservation, protection, and reclamation of the land, watercourses and cultural heritage resources affected by the proposed activities</w:t>
       </w:r>
       <w:r>
         <w:rPr>
@@ -1347,14 +1079,7 @@
         <w:rPr>
           <w:rFonts w:ascii="BC Sans" w:hAnsi="BC Sans"/>
         </w:rPr>
-        <w:t xml:space="preserve">Notice of Work </w:t>
-      </w:r>
-      <w:proofErr w:type="gramStart"/>
-      <w:r>
-        <w:rPr>
-          <w:rFonts w:ascii="BC Sans" w:hAnsi="BC Sans"/>
-        </w:rPr>
-        <w:t>number</w:t>
+        <w:t>Notice of Work number</w:t>
       </w:r>
       <w:r>
         <w:rPr>
@@ -1369,7 +1094,6 @@
         <w:t xml:space="preserve"> {</w:t>
       </w:r>
       <w:proofErr w:type="spellStart"/>
-      <w:proofErr w:type="gramEnd"/>
       <w:r>
         <w:rPr>
           <w:rFonts w:ascii="BC Sans" w:hAnsi="BC Sans"/>
@@ -1405,14 +1129,7 @@
         <w:rPr>
           <w:rFonts w:ascii="BC Sans" w:hAnsi="BC Sans"/>
         </w:rPr>
-        <w:t xml:space="preserve"> and </w:t>
-      </w:r>
-      <w:proofErr w:type="gramStart"/>
-      <w:r>
-        <w:rPr>
-          <w:rFonts w:ascii="BC Sans" w:hAnsi="BC Sans"/>
-        </w:rPr>
-        <w:t>accepted</w:t>
+        <w:t xml:space="preserve"> and accepted</w:t>
       </w:r>
       <w:r>
         <w:rPr>
@@ -1433,7 +1150,6 @@
         <w:t>{</w:t>
       </w:r>
       <w:proofErr w:type="spellStart"/>
-      <w:proofErr w:type="gramEnd"/>
       <w:r>
         <w:rPr>
           <w:rFonts w:ascii="BC Sans" w:hAnsi="BC Sans"/>
@@ -1550,29 +1266,21 @@
         <w:rPr>
           <w:rFonts w:ascii="BC Sans" w:hAnsi="BC Sans" w:cstheme="minorHAnsi"/>
         </w:rPr>
-        <w:t xml:space="preserve"> tracking </w:t>
-      </w:r>
-      <w:proofErr w:type="gramStart"/>
+        <w:t xml:space="preserve"> tracking number</w:t>
+      </w:r>
       <w:r>
         <w:rPr>
           <w:rFonts w:ascii="BC Sans" w:hAnsi="BC Sans" w:cstheme="minorHAnsi"/>
         </w:rPr>
-        <w:t>number</w:t>
+        <w:t>:</w:t>
       </w:r>
       <w:r>
         <w:rPr>
           <w:rFonts w:ascii="BC Sans" w:hAnsi="BC Sans" w:cstheme="minorHAnsi"/>
         </w:rPr>
-        <w:t>:</w:t>
-      </w:r>
-      <w:r>
-        <w:rPr>
-          <w:rFonts w:ascii="BC Sans" w:hAnsi="BC Sans" w:cstheme="minorHAnsi"/>
-        </w:rPr>
         <w:t xml:space="preserve"> {</w:t>
       </w:r>
       <w:proofErr w:type="spellStart"/>
-      <w:proofErr w:type="gramEnd"/>
       <w:r>
         <w:rPr>
           <w:rFonts w:ascii="BC Sans" w:hAnsi="BC Sans" w:cstheme="minorHAnsi"/>
@@ -1773,7 +1481,6 @@
           <w:rFonts w:ascii="BC Sans" w:hAnsi="BC Sans"/>
           <w:color w:val="FF0000"/>
         </w:rPr>
-        <w:lastRenderedPageBreak/>
         <w:t>O</w:t>
       </w:r>
       <w:r>
@@ -2041,21 +1748,7 @@
         <w:rPr>
           <w:rFonts w:ascii="BC Sans" w:hAnsi="BC Sans"/>
         </w:rPr>
-        <w:t xml:space="preserve">The </w:t>
-      </w:r>
-      <w:proofErr w:type="gramStart"/>
-      <w:r>
-        <w:rPr>
-          <w:rFonts w:ascii="BC Sans" w:hAnsi="BC Sans"/>
-        </w:rPr>
-        <w:t>government agency</w:t>
-      </w:r>
-      <w:proofErr w:type="gramEnd"/>
-      <w:r>
-        <w:rPr>
-          <w:rFonts w:ascii="BC Sans" w:hAnsi="BC Sans"/>
-        </w:rPr>
-        <w:t xml:space="preserve"> referral period is projected to be </w:t>
+        <w:t xml:space="preserve">The government agency referral period is projected to be </w:t>
       </w:r>
       <w:r>
         <w:rPr>
@@ -2447,8 +2140,10 @@
           <w:b w:val="0"/>
           <w:bCs w:val="0"/>
         </w:rPr>
-        <w:t>This will bring the total amount held under</w:t>
-      </w:r>
+        <w:t>This will bring the total amount held under {</w:t>
+      </w:r>
+      <w:proofErr w:type="spellStart"/>
+      <w:proofErr w:type="gramStart"/>
       <w:r>
         <w:rPr>
           <w:rStyle w:val="Strong"/>
@@ -2456,10 +2151,9 @@
           <w:b w:val="0"/>
           <w:bCs w:val="0"/>
         </w:rPr>
-        <w:t xml:space="preserve"> {</w:t>
-      </w:r>
-      <w:proofErr w:type="spellStart"/>
-      <w:proofErr w:type="gramStart"/>
+        <w:t>d.permit</w:t>
+      </w:r>
+      <w:proofErr w:type="gramEnd"/>
       <w:r>
         <w:rPr>
           <w:rStyle w:val="Strong"/>
@@ -2467,9 +2161,9 @@
           <w:b w:val="0"/>
           <w:bCs w:val="0"/>
         </w:rPr>
-        <w:t>d.permit</w:t>
-      </w:r>
-      <w:proofErr w:type="gramEnd"/>
+        <w:t>_no</w:t>
+      </w:r>
+      <w:proofErr w:type="spellEnd"/>
       <w:r>
         <w:rPr>
           <w:rStyle w:val="Strong"/>
@@ -2477,26 +2171,7 @@
           <w:b w:val="0"/>
           <w:bCs w:val="0"/>
         </w:rPr>
-        <w:t>_no</w:t>
-      </w:r>
-      <w:proofErr w:type="spellEnd"/>
-      <w:r>
-        <w:rPr>
-          <w:rStyle w:val="Strong"/>
-          <w:rFonts w:ascii="BC Sans" w:hAnsi="BC Sans"/>
-          <w:b w:val="0"/>
-          <w:bCs w:val="0"/>
-        </w:rPr>
-        <w:t xml:space="preserve">} </w:t>
-      </w:r>
-      <w:r>
-        <w:rPr>
-          <w:rStyle w:val="Strong"/>
-          <w:rFonts w:ascii="BC Sans" w:hAnsi="BC Sans"/>
-          <w:b w:val="0"/>
-          <w:bCs w:val="0"/>
-        </w:rPr>
-        <w:t>to</w:t>
+        <w:t>} to</w:t>
       </w:r>
       <w:r>
         <w:rPr>
@@ -2506,7 +2181,7 @@
           <w:bCs w:val="0"/>
           <w:color w:val="FF0000"/>
         </w:rPr>
-        <w:t xml:space="preserve"> (enter total security </w:t>
+        <w:t xml:space="preserve"> (enter total security to be held)</w:t>
       </w:r>
       <w:r>
         <w:rPr>
@@ -2514,222 +2189,191 @@
           <w:rFonts w:ascii="BC Sans" w:hAnsi="BC Sans"/>
           <w:b w:val="0"/>
           <w:bCs w:val="0"/>
-          <w:color w:val="FF0000"/>
-        </w:rPr>
-        <w:t xml:space="preserve">to be </w:t>
-      </w:r>
-      <w:r>
+        </w:rPr>
+        <w:t>.</w:t>
+      </w:r>
+      <w:r>
+        <w:rPr>
+          <w:rFonts w:ascii="BC Sans" w:hAnsi="BC Sans"/>
+        </w:rPr>
+        <w:t xml:space="preserve"> </w:t>
+      </w:r>
+      <w:r>
+        <w:rPr>
+          <w:rFonts w:ascii="BC Sans" w:hAnsi="BC Sans"/>
+        </w:rPr>
+        <w:t>I</w:t>
+      </w:r>
+      <w:r>
+        <w:rPr>
+          <w:rFonts w:ascii="BC Sans" w:hAnsi="BC Sans"/>
+        </w:rPr>
+        <w:t>n accordance with</w:t>
+      </w:r>
+      <w:r>
+        <w:rPr>
+          <w:rFonts w:ascii="BC Sans" w:hAnsi="BC Sans"/>
+        </w:rPr>
+        <w:t xml:space="preserve"> </w:t>
+      </w:r>
+      <w:r>
+        <w:rPr>
+          <w:rFonts w:ascii="BC Sans" w:hAnsi="BC Sans"/>
+        </w:rPr>
+        <w:t xml:space="preserve">the </w:t>
+      </w:r>
+      <w:r>
+        <w:rPr>
+          <w:rFonts w:ascii="BC Sans" w:hAnsi="BC Sans"/>
+        </w:rPr>
+        <w:t xml:space="preserve">Mines Act, </w:t>
+      </w:r>
+      <w:r>
+        <w:rPr>
+          <w:rFonts w:ascii="BC Sans" w:hAnsi="BC Sans"/>
+        </w:rPr>
+        <w:t xml:space="preserve">it has been assessed </w:t>
+      </w:r>
+      <w:r>
+        <w:rPr>
+          <w:rFonts w:ascii="BC Sans" w:hAnsi="BC Sans"/>
+        </w:rPr>
+        <w:t>that you are required to</w:t>
+      </w:r>
+      <w:r>
+        <w:rPr>
+          <w:rFonts w:ascii="BC Sans" w:hAnsi="BC Sans"/>
+        </w:rPr>
+        <w:t xml:space="preserve"> post </w:t>
+      </w:r>
+      <w:r>
+        <w:rPr>
+          <w:rFonts w:ascii="BC Sans" w:hAnsi="BC Sans"/>
+        </w:rPr>
+        <w:t>financial</w:t>
+      </w:r>
+      <w:r>
+        <w:rPr>
+          <w:rFonts w:ascii="BC Sans" w:hAnsi="BC Sans"/>
+        </w:rPr>
+        <w:t xml:space="preserve"> security in the amount of</w:t>
+      </w:r>
+      <w:r>
+        <w:rPr>
+          <w:rFonts w:ascii="BC Sans" w:hAnsi="BC Sans"/>
+        </w:rPr>
+        <w:t xml:space="preserve"> ${</w:t>
+      </w:r>
+      <w:proofErr w:type="spellStart"/>
+      <w:proofErr w:type="gramStart"/>
+      <w:r>
+        <w:rPr>
+          <w:rFonts w:ascii="BC Sans" w:hAnsi="BC Sans"/>
+        </w:rPr>
+        <w:t>d.bond</w:t>
+      </w:r>
+      <w:proofErr w:type="gramEnd"/>
+      <w:r>
+        <w:rPr>
+          <w:rFonts w:ascii="BC Sans" w:hAnsi="BC Sans"/>
+        </w:rPr>
+        <w:t>_inc_</w:t>
+      </w:r>
+      <w:proofErr w:type="gramStart"/>
+      <w:r>
+        <w:rPr>
+          <w:rFonts w:ascii="BC Sans" w:hAnsi="BC Sans"/>
+        </w:rPr>
+        <w:t>amt:formatN</w:t>
+      </w:r>
+      <w:proofErr w:type="spellEnd"/>
+      <w:proofErr w:type="gramEnd"/>
+      <w:r>
+        <w:rPr>
+          <w:rFonts w:ascii="BC Sans" w:hAnsi="BC Sans"/>
+        </w:rPr>
+        <w:t>(2)}.</w:t>
+      </w:r>
+    </w:p>
+    <w:p>
+      <w:pPr>
+        <w:pStyle w:val="NoSpacing"/>
+        <w:jc w:val="both"/>
         <w:rPr>
           <w:rStyle w:val="Strong"/>
           <w:rFonts w:ascii="BC Sans" w:hAnsi="BC Sans"/>
           <w:b w:val="0"/>
           <w:bCs w:val="0"/>
-          <w:color w:val="FF0000"/>
-        </w:rPr>
-        <w:t>held)</w:t>
-      </w:r>
-      <w:r>
-        <w:rPr>
-          <w:rStyle w:val="Strong"/>
-          <w:rFonts w:ascii="BC Sans" w:hAnsi="BC Sans"/>
-          <w:b w:val="0"/>
-          <w:bCs w:val="0"/>
-        </w:rPr>
-        <w:t>.</w:t>
-      </w:r>
-      <w:r>
-        <w:rPr>
-          <w:rFonts w:ascii="BC Sans" w:hAnsi="BC Sans"/>
-        </w:rPr>
-        <w:t xml:space="preserve"> </w:t>
-      </w:r>
-      <w:r>
-        <w:rPr>
-          <w:rFonts w:ascii="BC Sans" w:hAnsi="BC Sans"/>
-        </w:rPr>
-        <w:t>I</w:t>
-      </w:r>
-      <w:r>
-        <w:rPr>
-          <w:rFonts w:ascii="BC Sans" w:hAnsi="BC Sans"/>
-        </w:rPr>
-        <w:t>n accordance with</w:t>
-      </w:r>
-      <w:r>
-        <w:rPr>
-          <w:rFonts w:ascii="BC Sans" w:hAnsi="BC Sans"/>
-        </w:rPr>
-        <w:t xml:space="preserve"> </w:t>
-      </w:r>
-      <w:r>
-        <w:rPr>
-          <w:rFonts w:ascii="BC Sans" w:hAnsi="BC Sans"/>
-        </w:rPr>
-        <w:t xml:space="preserve">the </w:t>
-      </w:r>
-      <w:r>
-        <w:rPr>
-          <w:rFonts w:ascii="BC Sans" w:hAnsi="BC Sans"/>
-        </w:rPr>
-        <w:t xml:space="preserve">Mines Act, </w:t>
-      </w:r>
-      <w:r>
-        <w:rPr>
-          <w:rFonts w:ascii="BC Sans" w:hAnsi="BC Sans"/>
-        </w:rPr>
-        <w:t xml:space="preserve">it has been assessed </w:t>
-      </w:r>
-      <w:r>
-        <w:rPr>
-          <w:rFonts w:ascii="BC Sans" w:hAnsi="BC Sans"/>
-        </w:rPr>
-        <w:t>that you are required to</w:t>
-      </w:r>
-      <w:r>
-        <w:rPr>
-          <w:rFonts w:ascii="BC Sans" w:hAnsi="BC Sans"/>
-        </w:rPr>
-        <w:t xml:space="preserve"> post </w:t>
-      </w:r>
-      <w:r>
-        <w:rPr>
-          <w:rFonts w:ascii="BC Sans" w:hAnsi="BC Sans"/>
-        </w:rPr>
-        <w:t>financial</w:t>
-      </w:r>
-      <w:r>
-        <w:rPr>
-          <w:rFonts w:ascii="BC Sans" w:hAnsi="BC Sans"/>
-        </w:rPr>
-        <w:t xml:space="preserve"> security in the amount of</w:t>
-      </w:r>
-      <w:r>
-        <w:rPr>
-          <w:rFonts w:ascii="BC Sans" w:hAnsi="BC Sans"/>
-        </w:rPr>
-        <w:t xml:space="preserve"> </w:t>
-      </w:r>
-      <w:r>
-        <w:rPr>
-          <w:rFonts w:ascii="BC Sans" w:hAnsi="BC Sans"/>
-        </w:rPr>
-        <w:t>${</w:t>
-      </w:r>
-      <w:proofErr w:type="spellStart"/>
-      <w:proofErr w:type="gramStart"/>
-      <w:r>
-        <w:rPr>
-          <w:rFonts w:ascii="BC Sans" w:hAnsi="BC Sans"/>
-        </w:rPr>
-        <w:t>d.bond</w:t>
-      </w:r>
-      <w:proofErr w:type="gramEnd"/>
-      <w:r>
-        <w:rPr>
-          <w:rFonts w:ascii="BC Sans" w:hAnsi="BC Sans"/>
-        </w:rPr>
-        <w:t>_inc_</w:t>
-      </w:r>
-      <w:proofErr w:type="gramStart"/>
-      <w:r>
-        <w:rPr>
-          <w:rFonts w:ascii="BC Sans" w:hAnsi="BC Sans"/>
-        </w:rPr>
-        <w:t>amt:formatN</w:t>
-      </w:r>
-      <w:proofErr w:type="spellEnd"/>
-      <w:proofErr w:type="gramEnd"/>
-      <w:r>
-        <w:rPr>
-          <w:rFonts w:ascii="BC Sans" w:hAnsi="BC Sans"/>
-        </w:rPr>
-        <w:t>(</w:t>
-      </w:r>
-      <w:proofErr w:type="gramStart"/>
-      <w:r>
-        <w:rPr>
-          <w:rFonts w:ascii="BC Sans" w:hAnsi="BC Sans"/>
-        </w:rPr>
-        <w:t>2)}</w:t>
-      </w:r>
-      <w:proofErr w:type="gramEnd"/>
-      <w:r>
-        <w:rPr>
-          <w:rFonts w:ascii="BC Sans" w:hAnsi="BC Sans"/>
-        </w:rPr>
-        <w:t>.</w:t>
-      </w:r>
+        </w:rPr>
+      </w:pPr>
     </w:p>
     <w:p>
       <w:pPr>
         <w:pStyle w:val="NoSpacing"/>
         <w:jc w:val="both"/>
         <w:rPr>
-          <w:rStyle w:val="Strong"/>
-          <w:rFonts w:ascii="BC Sans" w:hAnsi="BC Sans"/>
-          <w:b w:val="0"/>
-          <w:bCs w:val="0"/>
-        </w:rPr>
-      </w:pPr>
+          <w:rFonts w:ascii="BC Sans" w:hAnsi="BC Sans" w:cs="Calibri"/>
+          <w:color w:val="000000" w:themeColor="text1"/>
+        </w:rPr>
+      </w:pPr>
+      <w:r>
+        <w:rPr>
+          <w:rFonts w:ascii="BC Sans" w:hAnsi="BC Sans"/>
+          <w:color w:val="FF0000"/>
+        </w:rPr>
+        <w:t xml:space="preserve">OPTIONAL </w:t>
+      </w:r>
+      <w:r>
+        <w:rPr>
+          <w:rFonts w:ascii="BC Sans" w:hAnsi="BC Sans" w:cs="Calibri"/>
+          <w:color w:val="000000" w:themeColor="text1"/>
+        </w:rPr>
+        <w:t xml:space="preserve">The </w:t>
+      </w:r>
+      <w:r>
+        <w:rPr>
+          <w:rFonts w:ascii="BC Sans" w:hAnsi="BC Sans" w:cs="Calibri"/>
+          <w:color w:val="000000" w:themeColor="text1"/>
+        </w:rPr>
+        <w:t xml:space="preserve">reclamation security </w:t>
+      </w:r>
+      <w:r>
+        <w:rPr>
+          <w:rFonts w:ascii="BC Sans" w:hAnsi="BC Sans" w:cs="Calibri"/>
+          <w:color w:val="000000" w:themeColor="text1"/>
+        </w:rPr>
+        <w:t>calculation</w:t>
+      </w:r>
+      <w:r>
+        <w:rPr>
+          <w:rFonts w:ascii="BC Sans" w:hAnsi="BC Sans" w:cs="Calibri"/>
+          <w:color w:val="000000" w:themeColor="text1"/>
+        </w:rPr>
+        <w:t xml:space="preserve"> </w:t>
+      </w:r>
+      <w:r>
+        <w:rPr>
+          <w:rFonts w:ascii="BC Sans" w:hAnsi="BC Sans" w:cs="Calibri"/>
+          <w:color w:val="000000" w:themeColor="text1"/>
+        </w:rPr>
+        <w:t xml:space="preserve">for </w:t>
+      </w:r>
+      <w:r>
+        <w:rPr>
+          <w:rFonts w:ascii="BC Sans" w:hAnsi="BC Sans" w:cs="Calibri"/>
+          <w:color w:val="000000" w:themeColor="text1"/>
+        </w:rPr>
+        <w:t>this application is included with this correspondence.</w:t>
+      </w:r>
     </w:p>
     <w:p>
       <w:pPr>
         <w:pStyle w:val="NoSpacing"/>
         <w:jc w:val="both"/>
         <w:rPr>
-          <w:rFonts w:ascii="BC Sans" w:hAnsi="BC Sans" w:cs="Calibri"/>
-          <w:color w:val="000000" w:themeColor="text1"/>
-        </w:rPr>
-      </w:pPr>
-      <w:r>
-        <w:rPr>
-          <w:rFonts w:ascii="BC Sans" w:hAnsi="BC Sans"/>
-          <w:color w:val="FF0000"/>
-        </w:rPr>
-        <w:t xml:space="preserve">OPTIONAL </w:t>
-      </w:r>
-      <w:r>
-        <w:rPr>
-          <w:rFonts w:ascii="BC Sans" w:hAnsi="BC Sans" w:cs="Calibri"/>
-          <w:color w:val="000000" w:themeColor="text1"/>
-        </w:rPr>
-        <w:t xml:space="preserve">The </w:t>
-      </w:r>
-      <w:r>
-        <w:rPr>
-          <w:rFonts w:ascii="BC Sans" w:hAnsi="BC Sans" w:cs="Calibri"/>
-          <w:color w:val="000000" w:themeColor="text1"/>
-        </w:rPr>
-        <w:t xml:space="preserve">reclamation security </w:t>
-      </w:r>
-      <w:r>
-        <w:rPr>
-          <w:rFonts w:ascii="BC Sans" w:hAnsi="BC Sans" w:cs="Calibri"/>
-          <w:color w:val="000000" w:themeColor="text1"/>
-        </w:rPr>
-        <w:t>calculation</w:t>
-      </w:r>
-      <w:r>
-        <w:rPr>
-          <w:rFonts w:ascii="BC Sans" w:hAnsi="BC Sans" w:cs="Calibri"/>
-          <w:color w:val="000000" w:themeColor="text1"/>
-        </w:rPr>
-        <w:t xml:space="preserve"> </w:t>
-      </w:r>
-      <w:r>
-        <w:rPr>
-          <w:rFonts w:ascii="BC Sans" w:hAnsi="BC Sans" w:cs="Calibri"/>
-          <w:color w:val="000000" w:themeColor="text1"/>
-        </w:rPr>
-        <w:t xml:space="preserve">for </w:t>
-      </w:r>
-      <w:r>
-        <w:rPr>
-          <w:rFonts w:ascii="BC Sans" w:hAnsi="BC Sans" w:cs="Calibri"/>
-          <w:color w:val="000000" w:themeColor="text1"/>
-        </w:rPr>
-        <w:t>this application is included with this correspondence.</w:t>
-      </w:r>
+          <w:rFonts w:ascii="BC Sans" w:hAnsi="BC Sans"/>
+        </w:rPr>
+      </w:pPr>
     </w:p>
     <w:p>
       <w:pPr>
@@ -2737,8 +2381,205 @@
         <w:jc w:val="both"/>
         <w:rPr>
           <w:rFonts w:ascii="BC Sans" w:hAnsi="BC Sans"/>
-        </w:rPr>
-      </w:pPr>
+          <w:lang w:val="en-CA"/>
+        </w:rPr>
+      </w:pPr>
+      <w:r>
+        <w:rPr>
+          <w:rFonts w:ascii="BC Sans" w:hAnsi="BC Sans"/>
+        </w:rPr>
+        <w:t xml:space="preserve">To avoid delays, </w:t>
+      </w:r>
+      <w:r>
+        <w:rPr>
+          <w:rFonts w:ascii="BC Sans" w:hAnsi="BC Sans"/>
+        </w:rPr>
+        <w:t xml:space="preserve">please </w:t>
+      </w:r>
+      <w:r>
+        <w:rPr>
+          <w:rFonts w:ascii="BC Sans" w:hAnsi="BC Sans"/>
+        </w:rPr>
+        <w:t xml:space="preserve">arrange </w:t>
+      </w:r>
+      <w:r>
+        <w:rPr>
+          <w:rFonts w:ascii="BC Sans" w:hAnsi="BC Sans"/>
+        </w:rPr>
+        <w:t xml:space="preserve">for </w:t>
+      </w:r>
+      <w:r>
+        <w:rPr>
+          <w:rFonts w:ascii="BC Sans" w:hAnsi="BC Sans"/>
+        </w:rPr>
+        <w:t xml:space="preserve">your security </w:t>
+      </w:r>
+      <w:r>
+        <w:rPr>
+          <w:rFonts w:ascii="BC Sans" w:hAnsi="BC Sans"/>
+        </w:rPr>
+        <w:t>deposit</w:t>
+      </w:r>
+      <w:r>
+        <w:rPr>
+          <w:rFonts w:ascii="BC Sans" w:hAnsi="BC Sans"/>
+        </w:rPr>
+        <w:t xml:space="preserve"> to be provided at this time</w:t>
+      </w:r>
+      <w:r>
+        <w:rPr>
+          <w:rFonts w:ascii="BC Sans" w:hAnsi="BC Sans"/>
+        </w:rPr>
+        <w:t xml:space="preserve">. </w:t>
+      </w:r>
+      <w:r>
+        <w:rPr>
+          <w:rFonts w:ascii="BC Sans" w:hAnsi="BC Sans"/>
+        </w:rPr>
+        <w:t>Acceptable types of reclamation security</w:t>
+      </w:r>
+      <w:r>
+        <w:rPr>
+          <w:rFonts w:ascii="BC Sans" w:hAnsi="BC Sans"/>
+        </w:rPr>
+        <w:t xml:space="preserve"> a</w:t>
+      </w:r>
+      <w:r>
+        <w:rPr>
+          <w:rFonts w:ascii="BC Sans" w:hAnsi="BC Sans"/>
+        </w:rPr>
+        <w:t>re</w:t>
+      </w:r>
+      <w:r>
+        <w:rPr>
+          <w:rFonts w:ascii="BC Sans" w:hAnsi="BC Sans"/>
+        </w:rPr>
+        <w:t xml:space="preserve"> described </w:t>
+      </w:r>
+      <w:r>
+        <w:rPr>
+          <w:rFonts w:ascii="BC Sans" w:hAnsi="BC Sans"/>
+        </w:rPr>
+        <w:t>i</w:t>
+      </w:r>
+      <w:r>
+        <w:rPr>
+          <w:rFonts w:ascii="BC Sans" w:hAnsi="BC Sans"/>
+        </w:rPr>
+        <w:t xml:space="preserve">n </w:t>
+      </w:r>
+      <w:r>
+        <w:rPr>
+          <w:rFonts w:ascii="BC Sans" w:hAnsi="BC Sans"/>
+        </w:rPr>
+        <w:t xml:space="preserve">the </w:t>
+      </w:r>
+      <w:r>
+        <w:rPr>
+          <w:rFonts w:ascii="BC Sans" w:hAnsi="BC Sans"/>
+          <w:b/>
+          <w:bCs/>
+        </w:rPr>
+        <w:t xml:space="preserve">Reclamation </w:t>
+      </w:r>
+      <w:r>
+        <w:rPr>
+          <w:rFonts w:ascii="BC Sans" w:hAnsi="BC Sans"/>
+          <w:b/>
+          <w:bCs/>
+        </w:rPr>
+        <w:t>s</w:t>
+      </w:r>
+      <w:r>
+        <w:rPr>
+          <w:rFonts w:ascii="BC Sans" w:hAnsi="BC Sans"/>
+          <w:b/>
+          <w:bCs/>
+        </w:rPr>
+        <w:t>ecurity</w:t>
+      </w:r>
+      <w:r>
+        <w:rPr>
+          <w:rFonts w:ascii="BC Sans" w:hAnsi="BC Sans"/>
+        </w:rPr>
+        <w:t xml:space="preserve"> </w:t>
+      </w:r>
+      <w:r>
+        <w:rPr>
+          <w:rFonts w:ascii="BC Sans" w:hAnsi="BC Sans"/>
+          <w:b/>
+          <w:bCs/>
+        </w:rPr>
+        <w:t xml:space="preserve">for </w:t>
+      </w:r>
+      <w:r>
+        <w:rPr>
+          <w:rFonts w:ascii="BC Sans" w:hAnsi="BC Sans"/>
+          <w:b/>
+          <w:bCs/>
+        </w:rPr>
+        <w:t>m</w:t>
+      </w:r>
+      <w:r>
+        <w:rPr>
+          <w:rFonts w:ascii="BC Sans" w:hAnsi="BC Sans"/>
+          <w:b/>
+          <w:bCs/>
+        </w:rPr>
+        <w:t>ines in B</w:t>
+      </w:r>
+      <w:r>
+        <w:rPr>
+          <w:rFonts w:ascii="BC Sans" w:hAnsi="BC Sans"/>
+          <w:b/>
+          <w:bCs/>
+        </w:rPr>
+        <w:t>ritish Columbia</w:t>
+      </w:r>
+      <w:r>
+        <w:rPr>
+          <w:rFonts w:ascii="BC Sans" w:hAnsi="BC Sans"/>
+        </w:rPr>
+        <w:t xml:space="preserve"> s</w:t>
+      </w:r>
+      <w:r>
+        <w:rPr>
+          <w:rFonts w:ascii="BC Sans" w:hAnsi="BC Sans"/>
+        </w:rPr>
+        <w:t>ection of our website</w:t>
+      </w:r>
+      <w:r>
+        <w:rPr>
+          <w:rFonts w:ascii="BC Sans" w:hAnsi="BC Sans"/>
+        </w:rPr>
+        <w:t xml:space="preserve">. </w:t>
+      </w:r>
+      <w:r>
+        <w:rPr>
+          <w:rFonts w:ascii="BC Sans" w:hAnsi="BC Sans"/>
+        </w:rPr>
+        <w:t>A</w:t>
+      </w:r>
+      <w:r>
+        <w:rPr>
+          <w:rFonts w:ascii="BC Sans" w:hAnsi="BC Sans"/>
+        </w:rPr>
+        <w:t xml:space="preserve">dditional </w:t>
+      </w:r>
+      <w:r>
+        <w:rPr>
+          <w:rFonts w:ascii="BC Sans" w:hAnsi="BC Sans"/>
+          <w:lang w:val="en-CA"/>
+        </w:rPr>
+        <w:t>information on how reclamation security is calculated</w:t>
+      </w:r>
+      <w:r>
+        <w:rPr>
+          <w:rFonts w:ascii="BC Sans" w:hAnsi="BC Sans"/>
+          <w:lang w:val="en-CA"/>
+        </w:rPr>
+        <w:t xml:space="preserve"> can also be found there.</w:t>
+      </w:r>
     </w:p>
     <w:p>
       <w:pPr>
@@ -2749,208 +2590,6 @@
           <w:lang w:val="en-CA"/>
         </w:rPr>
       </w:pPr>
-      <w:r>
-        <w:rPr>
-          <w:rFonts w:ascii="BC Sans" w:hAnsi="BC Sans"/>
-        </w:rPr>
-        <w:t xml:space="preserve">To avoid delays, </w:t>
-      </w:r>
-      <w:r>
-        <w:rPr>
-          <w:rFonts w:ascii="BC Sans" w:hAnsi="BC Sans"/>
-        </w:rPr>
-        <w:t xml:space="preserve">please </w:t>
-      </w:r>
-      <w:r>
-        <w:rPr>
-          <w:rFonts w:ascii="BC Sans" w:hAnsi="BC Sans"/>
-        </w:rPr>
-        <w:t xml:space="preserve">arrange </w:t>
-      </w:r>
-      <w:r>
-        <w:rPr>
-          <w:rFonts w:ascii="BC Sans" w:hAnsi="BC Sans"/>
-        </w:rPr>
-        <w:t xml:space="preserve">for </w:t>
-      </w:r>
-      <w:r>
-        <w:rPr>
-          <w:rFonts w:ascii="BC Sans" w:hAnsi="BC Sans"/>
-        </w:rPr>
-        <w:t xml:space="preserve">your security </w:t>
-      </w:r>
-      <w:r>
-        <w:rPr>
-          <w:rFonts w:ascii="BC Sans" w:hAnsi="BC Sans"/>
-        </w:rPr>
-        <w:t>deposit</w:t>
-      </w:r>
-      <w:r>
-        <w:rPr>
-          <w:rFonts w:ascii="BC Sans" w:hAnsi="BC Sans"/>
-        </w:rPr>
-        <w:t xml:space="preserve"> to be provided at this time</w:t>
-      </w:r>
-      <w:r>
-        <w:rPr>
-          <w:rFonts w:ascii="BC Sans" w:hAnsi="BC Sans"/>
-        </w:rPr>
-        <w:t xml:space="preserve">. </w:t>
-      </w:r>
-      <w:r>
-        <w:rPr>
-          <w:rFonts w:ascii="BC Sans" w:hAnsi="BC Sans"/>
-        </w:rPr>
-        <w:t>Acceptable types of reclamation security</w:t>
-      </w:r>
-      <w:r>
-        <w:rPr>
-          <w:rFonts w:ascii="BC Sans" w:hAnsi="BC Sans"/>
-        </w:rPr>
-        <w:t xml:space="preserve"> a</w:t>
-      </w:r>
-      <w:r>
-        <w:rPr>
-          <w:rFonts w:ascii="BC Sans" w:hAnsi="BC Sans"/>
-        </w:rPr>
-        <w:t>re</w:t>
-      </w:r>
-      <w:r>
-        <w:rPr>
-          <w:rFonts w:ascii="BC Sans" w:hAnsi="BC Sans"/>
-        </w:rPr>
-        <w:t xml:space="preserve"> described </w:t>
-      </w:r>
-      <w:r>
-        <w:rPr>
-          <w:rFonts w:ascii="BC Sans" w:hAnsi="BC Sans"/>
-        </w:rPr>
-        <w:t>i</w:t>
-      </w:r>
-      <w:r>
-        <w:rPr>
-          <w:rFonts w:ascii="BC Sans" w:hAnsi="BC Sans"/>
-        </w:rPr>
-        <w:t xml:space="preserve">n </w:t>
-      </w:r>
-      <w:r>
-        <w:rPr>
-          <w:rFonts w:ascii="BC Sans" w:hAnsi="BC Sans"/>
-        </w:rPr>
-        <w:t xml:space="preserve">the </w:t>
-      </w:r>
-      <w:r>
-        <w:rPr>
-          <w:rFonts w:ascii="BC Sans" w:hAnsi="BC Sans"/>
-          <w:b/>
-          <w:bCs/>
-        </w:rPr>
-        <w:t xml:space="preserve">Reclamation </w:t>
-      </w:r>
-      <w:r>
-        <w:rPr>
-          <w:rFonts w:ascii="BC Sans" w:hAnsi="BC Sans"/>
-          <w:b/>
-          <w:bCs/>
-        </w:rPr>
-        <w:t>s</w:t>
-      </w:r>
-      <w:r>
-        <w:rPr>
-          <w:rFonts w:ascii="BC Sans" w:hAnsi="BC Sans"/>
-          <w:b/>
-          <w:bCs/>
-        </w:rPr>
-        <w:t>ecurity</w:t>
-      </w:r>
-      <w:r>
-        <w:rPr>
-          <w:rFonts w:ascii="BC Sans" w:hAnsi="BC Sans"/>
-        </w:rPr>
-        <w:t xml:space="preserve"> </w:t>
-      </w:r>
-      <w:r>
-        <w:rPr>
-          <w:rFonts w:ascii="BC Sans" w:hAnsi="BC Sans"/>
-          <w:b/>
-          <w:bCs/>
-        </w:rPr>
-        <w:t xml:space="preserve">for </w:t>
-      </w:r>
-      <w:r>
-        <w:rPr>
-          <w:rFonts w:ascii="BC Sans" w:hAnsi="BC Sans"/>
-          <w:b/>
-          <w:bCs/>
-        </w:rPr>
-        <w:t>m</w:t>
-      </w:r>
-      <w:r>
-        <w:rPr>
-          <w:rFonts w:ascii="BC Sans" w:hAnsi="BC Sans"/>
-          <w:b/>
-          <w:bCs/>
-        </w:rPr>
-        <w:t>ines in B</w:t>
-      </w:r>
-      <w:r>
-        <w:rPr>
-          <w:rFonts w:ascii="BC Sans" w:hAnsi="BC Sans"/>
-          <w:b/>
-          <w:bCs/>
-        </w:rPr>
-        <w:t>ritish Columbia</w:t>
-      </w:r>
-      <w:r>
-        <w:rPr>
-          <w:rFonts w:ascii="BC Sans" w:hAnsi="BC Sans"/>
-        </w:rPr>
-        <w:t xml:space="preserve"> </w:t>
-      </w:r>
-      <w:r>
-        <w:rPr>
-          <w:rFonts w:ascii="BC Sans" w:hAnsi="BC Sans"/>
-        </w:rPr>
-        <w:t>s</w:t>
-      </w:r>
-      <w:r>
-        <w:rPr>
-          <w:rFonts w:ascii="BC Sans" w:hAnsi="BC Sans"/>
-        </w:rPr>
-        <w:t>ection of our website</w:t>
-      </w:r>
-      <w:r>
-        <w:rPr>
-          <w:rFonts w:ascii="BC Sans" w:hAnsi="BC Sans"/>
-        </w:rPr>
-        <w:t xml:space="preserve">. </w:t>
-      </w:r>
-      <w:r>
-        <w:rPr>
-          <w:rFonts w:ascii="BC Sans" w:hAnsi="BC Sans"/>
-        </w:rPr>
-        <w:t>A</w:t>
-      </w:r>
-      <w:r>
-        <w:rPr>
-          <w:rFonts w:ascii="BC Sans" w:hAnsi="BC Sans"/>
-        </w:rPr>
-        <w:t xml:space="preserve">dditional </w:t>
-      </w:r>
-      <w:r>
-        <w:rPr>
-          <w:rFonts w:ascii="BC Sans" w:hAnsi="BC Sans"/>
-          <w:lang w:val="en-CA"/>
-        </w:rPr>
-        <w:t>information on how reclamation security is calculated</w:t>
-      </w:r>
-      <w:r>
-        <w:rPr>
-          <w:rFonts w:ascii="BC Sans" w:hAnsi="BC Sans"/>
-          <w:lang w:val="en-CA"/>
-        </w:rPr>
-        <w:t xml:space="preserve"> can also be found there.</w:t>
-      </w:r>
     </w:p>
     <w:p>
       <w:pPr>
@@ -2958,16 +2597,6 @@
         <w:jc w:val="both"/>
         <w:rPr>
           <w:rFonts w:ascii="BC Sans" w:hAnsi="BC Sans"/>
-          <w:lang w:val="en-CA"/>
-        </w:rPr>
-      </w:pPr>
-    </w:p>
-    <w:p>
-      <w:pPr>
-        <w:pStyle w:val="NoSpacing"/>
-        <w:jc w:val="both"/>
-        <w:rPr>
-          <w:rFonts w:ascii="BC Sans" w:hAnsi="BC Sans"/>
         </w:rPr>
       </w:pPr>
       <w:r>
@@ -2982,14 +2611,12 @@
         </w:rPr>
         <w:t xml:space="preserve"> mail </w:t>
       </w:r>
-      <w:proofErr w:type="gramStart"/>
       <w:r>
         <w:rPr>
           <w:rFonts w:ascii="BC Sans" w:hAnsi="BC Sans"/>
         </w:rPr>
         <w:t>all reclamation</w:t>
       </w:r>
-      <w:proofErr w:type="gramEnd"/>
       <w:r>
         <w:rPr>
           <w:rFonts w:ascii="BC Sans" w:hAnsi="BC Sans"/>
@@ -3269,20 +2896,7 @@
           <w:szCs w:val="22"/>
           <w:lang w:val="en-CA"/>
         </w:rPr>
-        <w:t xml:space="preserve">other applicable </w:t>
-      </w:r>
-      <w:r>
-        <w:rPr>
-          <w:rFonts w:ascii="BC Sans" w:eastAsia="Calibri" w:hAnsi="BC Sans" w:cs="Arial"/>
-          <w:b/>
-          <w:bCs/>
-          <w:kern w:val="2"/>
-          <w:sz w:val="22"/>
-          <w:szCs w:val="22"/>
-          <w:lang w:val="en-CA"/>
-        </w:rPr>
-        <w:lastRenderedPageBreak/>
-        <w:t>legislation</w:t>
+        <w:t>other applicable legislation</w:t>
       </w:r>
       <w:r>
         <w:rPr>
@@ -3349,12 +2963,13 @@
           <w:rFonts w:ascii="BC Sans" w:hAnsi="BC Sans"/>
         </w:rPr>
       </w:pPr>
-      <w:bookmarkStart w:id="5" w:name="_Hlk152249434"/>
+      <w:bookmarkStart w:id="6" w:name="_Hlk152249434"/>
       <w:r>
         <w:rPr>
           <w:rFonts w:ascii="BC Sans" w:hAnsi="BC Sans"/>
           <w:color w:val="FF0000"/>
         </w:rPr>
+        <w:lastRenderedPageBreak/>
         <w:t>OPTIONAL</w:t>
       </w:r>
       <w:r>
@@ -3389,7 +3004,7 @@
         </w:rPr>
         <w:t xml:space="preserve">industrial and </w:t>
       </w:r>
-      <w:bookmarkStart w:id="6" w:name="_Int_TdCegxRL"/>
+      <w:bookmarkStart w:id="7" w:name="_Int_TdCegxRL"/>
       <w:proofErr w:type="gramStart"/>
       <w:r>
         <w:rPr>
@@ -3415,7 +3030,7 @@
         </w:rPr>
         <w:t>risk</w:t>
       </w:r>
-      <w:bookmarkEnd w:id="6"/>
+      <w:bookmarkEnd w:id="7"/>
       <w:proofErr w:type="gramEnd"/>
       <w:r>
         <w:rPr>
@@ -4056,9 +3671,8 @@
           <w:color w:val="auto"/>
           <w:u w:val="none"/>
         </w:rPr>
-        <w:t xml:space="preserve">It is your responsibility to have all necessary </w:t>
-      </w:r>
-      <w:proofErr w:type="gramStart"/>
+        <w:t>It is your responsibility to have all necessary authorizations in place for the operation of an industrial camp</w:t>
+      </w:r>
       <w:r>
         <w:rPr>
           <w:rStyle w:val="Hyperlink"/>
@@ -4066,29 +3680,10 @@
           <w:color w:val="auto"/>
           <w:u w:val="none"/>
         </w:rPr>
-        <w:t>authorizations</w:t>
-      </w:r>
-      <w:proofErr w:type="gramEnd"/>
-      <w:r>
-        <w:rPr>
-          <w:rStyle w:val="Hyperlink"/>
-          <w:rFonts w:ascii="BC Sans" w:hAnsi="BC Sans" w:cs="Calibri"/>
-          <w:color w:val="auto"/>
-          <w:u w:val="none"/>
-        </w:rPr>
-        <w:t xml:space="preserve"> in place for the operation of an industrial camp</w:t>
-      </w:r>
-      <w:r>
-        <w:rPr>
-          <w:rStyle w:val="Hyperlink"/>
-          <w:rFonts w:ascii="BC Sans" w:hAnsi="BC Sans" w:cs="Calibri"/>
-          <w:color w:val="auto"/>
-          <w:u w:val="none"/>
-        </w:rPr>
         <w:t>.</w:t>
       </w:r>
     </w:p>
-    <w:bookmarkEnd w:id="5"/>
+    <w:bookmarkEnd w:id="6"/>
     <w:p>
       <w:pPr>
         <w:pStyle w:val="NoSpacing"/>
@@ -4243,16 +3838,8 @@
               <w:rPr>
                 <w:rFonts w:ascii="BC Sans" w:hAnsi="BC Sans"/>
               </w:rPr>
-              <w:t xml:space="preserve">Forest </w:t>
+              <w:t>Forest licensee</w:t>
             </w:r>
-            <w:proofErr w:type="gramStart"/>
-            <w:r>
-              <w:rPr>
-                <w:rFonts w:ascii="BC Sans" w:hAnsi="BC Sans"/>
-              </w:rPr>
-              <w:t>licensee</w:t>
-            </w:r>
-            <w:proofErr w:type="gramEnd"/>
           </w:p>
           <w:p>
             <w:pPr>
@@ -4470,16 +4057,8 @@
               <w:rPr>
                 <w:rFonts w:ascii="BC Sans" w:hAnsi="BC Sans"/>
               </w:rPr>
-              <w:t xml:space="preserve">transmission </w:t>
+              <w:t>transmission line</w:t>
             </w:r>
-            <w:proofErr w:type="gramStart"/>
-            <w:r>
-              <w:rPr>
-                <w:rFonts w:ascii="BC Sans" w:hAnsi="BC Sans"/>
-              </w:rPr>
-              <w:t>line</w:t>
-            </w:r>
-            <w:proofErr w:type="gramEnd"/>
             <w:r>
               <w:rPr>
                 <w:rFonts w:ascii="BC Sans" w:hAnsi="BC Sans"/>
@@ -4496,16 +4075,8 @@
               <w:rPr>
                 <w:rFonts w:ascii="BC Sans" w:hAnsi="BC Sans"/>
               </w:rPr>
-              <w:t xml:space="preserve">or other energy tenure </w:t>
+              <w:t>or other energy tenure holder</w:t>
             </w:r>
-            <w:proofErr w:type="gramStart"/>
-            <w:r>
-              <w:rPr>
-                <w:rFonts w:ascii="BC Sans" w:hAnsi="BC Sans"/>
-              </w:rPr>
-              <w:t>holder</w:t>
-            </w:r>
-            <w:proofErr w:type="gramEnd"/>
           </w:p>
           <w:p>
             <w:pPr>
@@ -4570,6 +4141,7 @@
           <w:rFonts w:ascii="BC Sans" w:hAnsi="BC Sans"/>
           <w:color w:val="FF0000"/>
         </w:rPr>
+        <w:lastRenderedPageBreak/>
         <w:t>OPTIONAL</w:t>
       </w:r>
       <w:r>
@@ -4650,13 +4222,87 @@
         <w:rPr>
           <w:rFonts w:ascii="BC Sans" w:hAnsi="BC Sans"/>
         </w:rPr>
+        <w:t xml:space="preserve"> with </w:t>
+      </w:r>
+      <w:r>
+        <w:rPr>
+          <w:rFonts w:ascii="BC Sans" w:hAnsi="BC Sans"/>
+          <w:color w:val="FF0000"/>
+        </w:rPr>
+        <w:t>(</w:t>
+      </w:r>
+      <w:r>
+        <w:rPr>
+          <w:rFonts w:ascii="BC Sans" w:hAnsi="BC Sans"/>
+          <w:color w:val="FF0000"/>
+        </w:rPr>
+        <w:t xml:space="preserve">GUIDE OUTFITTER </w:t>
+      </w:r>
+      <w:r>
+        <w:rPr>
+          <w:rFonts w:ascii="BC Sans" w:hAnsi="BC Sans"/>
+          <w:color w:val="FF0000"/>
+        </w:rPr>
+        <w:t>GUIDE_</w:t>
+      </w:r>
+      <w:r>
+        <w:rPr>
+          <w:rFonts w:ascii="BC Sans" w:hAnsi="BC Sans"/>
+          <w:color w:val="FF0000"/>
+        </w:rPr>
+        <w:t>FULL</w:t>
+      </w:r>
+      <w:r>
+        <w:rPr>
+          <w:rFonts w:ascii="BC Sans" w:hAnsi="BC Sans"/>
+          <w:color w:val="FF0000"/>
+        </w:rPr>
+        <w:t>_</w:t>
+      </w:r>
+      <w:r>
+        <w:rPr>
+          <w:rFonts w:ascii="BC Sans" w:hAnsi="BC Sans"/>
+          <w:color w:val="FF0000"/>
+        </w:rPr>
+        <w:t>NAME</w:t>
+      </w:r>
+      <w:r>
+        <w:rPr>
+          <w:rFonts w:ascii="BC Sans" w:hAnsi="BC Sans"/>
+          <w:color w:val="FF0000"/>
+        </w:rPr>
+        <w:t>)</w:t>
+      </w:r>
+      <w:r>
+        <w:rPr>
+          <w:rFonts w:ascii="BC Sans" w:hAnsi="BC Sans"/>
+          <w:color w:val="FF0000"/>
+        </w:rPr>
         <w:t xml:space="preserve"> </w:t>
       </w:r>
       <w:r>
         <w:rPr>
           <w:rFonts w:ascii="BC Sans" w:hAnsi="BC Sans"/>
         </w:rPr>
-        <w:t xml:space="preserve">with </w:t>
+        <w:t>guide outfitter</w:t>
+      </w:r>
+      <w:r>
+        <w:rPr>
+          <w:rFonts w:ascii="BC Sans" w:hAnsi="BC Sans"/>
+        </w:rPr>
+        <w:t xml:space="preserve"> </w:t>
+      </w:r>
+      <w:r>
+        <w:rPr>
+          <w:rFonts w:ascii="BC Sans" w:hAnsi="BC Sans"/>
+        </w:rPr>
+        <w:t>certificate holder</w:t>
+      </w:r>
+      <w:r>
+        <w:rPr>
+          <w:rFonts w:ascii="BC Sans" w:hAnsi="BC Sans"/>
+        </w:rPr>
+        <w:t xml:space="preserve"> </w:t>
       </w:r>
       <w:r>
         <w:rPr>
@@ -4670,35 +4316,35 @@
           <w:rFonts w:ascii="BC Sans" w:hAnsi="BC Sans"/>
           <w:color w:val="FF0000"/>
         </w:rPr>
-        <w:t xml:space="preserve">GUIDE OUTFITTER </w:t>
+        <w:t>GU</w:t>
       </w:r>
       <w:r>
         <w:rPr>
           <w:rFonts w:ascii="BC Sans" w:hAnsi="BC Sans"/>
           <w:color w:val="FF0000"/>
         </w:rPr>
-        <w:t>GUIDE_</w:t>
+        <w:t>I</w:t>
       </w:r>
       <w:r>
         <w:rPr>
           <w:rFonts w:ascii="BC Sans" w:hAnsi="BC Sans"/>
           <w:color w:val="FF0000"/>
         </w:rPr>
-        <w:t>FULL</w:t>
+        <w:t>DE OUTFITTER CERTIF</w:t>
       </w:r>
       <w:r>
         <w:rPr>
           <w:rFonts w:ascii="BC Sans" w:hAnsi="BC Sans"/>
           <w:color w:val="FF0000"/>
         </w:rPr>
-        <w:t>_</w:t>
+        <w:t>I</w:t>
       </w:r>
       <w:r>
         <w:rPr>
           <w:rFonts w:ascii="BC Sans" w:hAnsi="BC Sans"/>
           <w:color w:val="FF0000"/>
         </w:rPr>
-        <w:t>NAME</w:t>
+        <w:t>CATE NUMBER</w:t>
       </w:r>
       <w:r>
         <w:rPr>
@@ -4710,7 +4356,12 @@
       <w:r>
         <w:rPr>
           <w:rFonts w:ascii="BC Sans" w:hAnsi="BC Sans"/>
-          <w:color w:val="FF0000"/>
+        </w:rPr>
+        <w:t>.</w:t>
+      </w:r>
+      <w:r>
+        <w:rPr>
+          <w:rFonts w:ascii="BC Sans" w:hAnsi="BC Sans"/>
         </w:rPr>
         <w:t xml:space="preserve"> </w:t>
       </w:r>
@@ -4718,98 +4369,7 @@
         <w:rPr>
           <w:rFonts w:ascii="BC Sans" w:hAnsi="BC Sans"/>
         </w:rPr>
-        <w:t>guide outfitter</w:t>
-      </w:r>
-      <w:r>
-        <w:rPr>
-          <w:rFonts w:ascii="BC Sans" w:hAnsi="BC Sans"/>
-        </w:rPr>
-        <w:t xml:space="preserve"> </w:t>
-      </w:r>
-      <w:r>
-        <w:rPr>
-          <w:rFonts w:ascii="BC Sans" w:hAnsi="BC Sans"/>
-        </w:rPr>
-        <w:t>certificate holder</w:t>
-      </w:r>
-      <w:r>
-        <w:rPr>
-          <w:rFonts w:ascii="BC Sans" w:hAnsi="BC Sans"/>
-        </w:rPr>
-        <w:t xml:space="preserve"> </w:t>
-      </w:r>
-      <w:r>
-        <w:rPr>
-          <w:rFonts w:ascii="BC Sans" w:hAnsi="BC Sans"/>
-          <w:color w:val="FF0000"/>
-        </w:rPr>
-        <w:t>(</w:t>
-      </w:r>
-      <w:r>
-        <w:rPr>
-          <w:rFonts w:ascii="BC Sans" w:hAnsi="BC Sans"/>
-          <w:color w:val="FF0000"/>
-        </w:rPr>
-        <w:t>GU</w:t>
-      </w:r>
-      <w:r>
-        <w:rPr>
-          <w:rFonts w:ascii="BC Sans" w:hAnsi="BC Sans"/>
-          <w:color w:val="FF0000"/>
-        </w:rPr>
-        <w:t>I</w:t>
-      </w:r>
-      <w:r>
-        <w:rPr>
-          <w:rFonts w:ascii="BC Sans" w:hAnsi="BC Sans"/>
-          <w:color w:val="FF0000"/>
-        </w:rPr>
-        <w:t>DE OUTFITTER CERTIF</w:t>
-      </w:r>
-      <w:r>
-        <w:rPr>
-          <w:rFonts w:ascii="BC Sans" w:hAnsi="BC Sans"/>
-          <w:color w:val="FF0000"/>
-        </w:rPr>
-        <w:t>I</w:t>
-      </w:r>
-      <w:r>
-        <w:rPr>
-          <w:rFonts w:ascii="BC Sans" w:hAnsi="BC Sans"/>
-          <w:color w:val="FF0000"/>
-        </w:rPr>
-        <w:t>CATE NUMBER</w:t>
-      </w:r>
-      <w:r>
-        <w:rPr>
-          <w:rFonts w:ascii="BC Sans" w:hAnsi="BC Sans"/>
-          <w:color w:val="FF0000"/>
-        </w:rPr>
-        <w:t>)</w:t>
-      </w:r>
-      <w:r>
-        <w:rPr>
-          <w:rFonts w:ascii="BC Sans" w:hAnsi="BC Sans"/>
-        </w:rPr>
-        <w:t>.</w:t>
-      </w:r>
-      <w:r>
-        <w:rPr>
-          <w:rFonts w:ascii="BC Sans" w:hAnsi="BC Sans"/>
-        </w:rPr>
-        <w:t xml:space="preserve"> </w:t>
-      </w:r>
-      <w:r>
-        <w:rPr>
-          <w:rFonts w:ascii="BC Sans" w:hAnsi="BC Sans"/>
-        </w:rPr>
-        <w:t>As</w:t>
-      </w:r>
-      <w:r>
-        <w:rPr>
-          <w:rFonts w:ascii="BC Sans" w:hAnsi="BC Sans"/>
-        </w:rPr>
-        <w:t xml:space="preserve"> noted above, it is your responsibility to </w:t>
+        <w:t xml:space="preserve">As noted above, it is your responsibility to </w:t>
       </w:r>
       <w:r>
         <w:rPr>
@@ -4874,23 +4434,7 @@
           <w:rFonts w:ascii="BC Sans" w:eastAsia="BC Sans" w:hAnsi="BC Sans" w:cs="BC Sans"/>
           <w:color w:val="000000" w:themeColor="text1"/>
         </w:rPr>
-        <w:t xml:space="preserve">, among other legislation, and you are advised to familiarize yourself with the Mines Act and the Code. The Code and its guidance documents are periodically updated. </w:t>
-      </w:r>
-      <w:proofErr w:type="gramStart"/>
-      <w:r>
-        <w:rPr>
-          <w:rFonts w:ascii="BC Sans" w:eastAsia="BC Sans" w:hAnsi="BC Sans" w:cs="BC Sans"/>
-          <w:color w:val="000000" w:themeColor="text1"/>
-        </w:rPr>
-        <w:t>Ensure</w:t>
-      </w:r>
-      <w:proofErr w:type="gramEnd"/>
-      <w:r>
-        <w:rPr>
-          <w:rFonts w:ascii="BC Sans" w:eastAsia="BC Sans" w:hAnsi="BC Sans" w:cs="BC Sans"/>
-          <w:color w:val="000000" w:themeColor="text1"/>
-        </w:rPr>
-        <w:t xml:space="preserve"> to check the Code</w:t>
+        <w:t>, among other legislation, and you are advised to familiarize yourself with the Mines Act and the Code. The Code and its guidance documents are periodically updated. Ensure to check the Code</w:t>
       </w:r>
       <w:r>
         <w:rPr>
@@ -5755,11 +5299,6 @@
           <w:rFonts w:ascii="BC Sans" w:hAnsi="BC Sans" w:cstheme="minorHAnsi"/>
         </w:rPr>
         <w:br/>
-      </w:r>
-      <w:r>
-        <w:rPr>
-          <w:rFonts w:ascii="BC Sans" w:hAnsi="BC Sans" w:cstheme="minorHAnsi"/>
-        </w:rPr>
         <w:t>{</w:t>
       </w:r>
       <w:proofErr w:type="spellStart"/>
@@ -6019,13 +5558,14 @@
   <w:p>
     <w:pPr>
       <w:rPr>
+        <w:rFonts w:asciiTheme="minorHAnsi" w:hAnsiTheme="minorHAnsi" w:cstheme="minorHAnsi"/>
         <w:sz w:val="16"/>
         <w:szCs w:val="16"/>
       </w:rPr>
     </w:pPr>
-    <w:bookmarkStart w:id="7" w:name="OLE_LINK6"/>
-    <w:bookmarkStart w:id="8" w:name="OLE_LINK7"/>
-    <w:bookmarkStart w:id="9" w:name="_Hlk199502121"/>
+    <w:bookmarkStart w:id="8" w:name="OLE_LINK6"/>
+    <w:bookmarkStart w:id="9" w:name="OLE_LINK7"/>
+    <w:bookmarkStart w:id="10" w:name="_Hlk199502121"/>
   </w:p>
   <w:tbl>
     <w:tblPr>
@@ -6090,14 +5630,14 @@
           <w:pPr>
             <w:ind w:left="-90"/>
             <w:rPr>
-              <w:rFonts w:asciiTheme="minorHAnsi" w:hAnsiTheme="minorHAnsi" w:cstheme="minorBidi"/>
+              <w:rFonts w:asciiTheme="minorHAnsi" w:hAnsiTheme="minorHAnsi" w:cstheme="minorHAnsi"/>
               <w:sz w:val="16"/>
               <w:szCs w:val="16"/>
             </w:rPr>
           </w:pPr>
           <w:r>
             <w:rPr>
-              <w:rFonts w:asciiTheme="minorHAnsi" w:hAnsiTheme="minorHAnsi" w:cstheme="minorBidi"/>
+              <w:rFonts w:asciiTheme="minorHAnsi" w:hAnsiTheme="minorHAnsi" w:cstheme="minorHAnsi"/>
               <w:sz w:val="16"/>
               <w:szCs w:val="16"/>
             </w:rPr>
@@ -6108,14 +5648,14 @@
           <w:pPr>
             <w:ind w:left="-90"/>
             <w:rPr>
-              <w:rFonts w:asciiTheme="minorHAnsi" w:hAnsiTheme="minorHAnsi" w:cstheme="minorBidi"/>
+              <w:rFonts w:asciiTheme="minorHAnsi" w:hAnsiTheme="minorHAnsi" w:cstheme="minorHAnsi"/>
               <w:sz w:val="16"/>
               <w:szCs w:val="16"/>
             </w:rPr>
           </w:pPr>
           <w:r>
             <w:rPr>
-              <w:rFonts w:asciiTheme="minorHAnsi" w:hAnsiTheme="minorHAnsi" w:cstheme="minorBidi"/>
+              <w:rFonts w:asciiTheme="minorHAnsi" w:hAnsiTheme="minorHAnsi" w:cstheme="minorHAnsi"/>
               <w:sz w:val="16"/>
               <w:szCs w:val="16"/>
             </w:rPr>
@@ -6159,7 +5699,7 @@
         <w:p>
           <w:pPr>
             <w:rPr>
-              <w:rFonts w:asciiTheme="minorHAnsi" w:hAnsiTheme="minorHAnsi" w:cstheme="minorBidi"/>
+              <w:rFonts w:asciiTheme="minorHAnsi" w:hAnsiTheme="minorHAnsi" w:cstheme="minorHAnsi"/>
               <w:sz w:val="16"/>
               <w:szCs w:val="16"/>
               <w:highlight w:val="yellow"/>
@@ -6167,7 +5707,7 @@
           </w:pPr>
           <w:r>
             <w:rPr>
-              <w:rFonts w:asciiTheme="minorHAnsi" w:hAnsiTheme="minorHAnsi" w:cstheme="minorBidi"/>
+              <w:rFonts w:asciiTheme="minorHAnsi" w:hAnsiTheme="minorHAnsi" w:cstheme="minorHAnsi"/>
               <w:sz w:val="16"/>
               <w:szCs w:val="16"/>
             </w:rPr>
@@ -6176,7 +5716,7 @@
           <w:proofErr w:type="spellStart"/>
           <w:r>
             <w:rPr>
-              <w:rFonts w:asciiTheme="minorHAnsi" w:hAnsiTheme="minorHAnsi" w:cstheme="minorBidi"/>
+              <w:rFonts w:asciiTheme="minorHAnsi" w:hAnsiTheme="minorHAnsi" w:cstheme="minorHAnsi"/>
               <w:sz w:val="16"/>
               <w:szCs w:val="16"/>
             </w:rPr>
@@ -6185,7 +5725,7 @@
           <w:proofErr w:type="spellEnd"/>
           <w:r>
             <w:rPr>
-              <w:rFonts w:asciiTheme="minorHAnsi" w:hAnsiTheme="minorHAnsi" w:cstheme="minorBidi"/>
+              <w:rFonts w:asciiTheme="minorHAnsi" w:hAnsiTheme="minorHAnsi" w:cstheme="minorHAnsi"/>
               <w:sz w:val="16"/>
               <w:szCs w:val="16"/>
             </w:rPr>
@@ -6193,7 +5733,7 @@
           </w:r>
           <w:r>
             <w:rPr>
-              <w:rFonts w:asciiTheme="minorHAnsi" w:hAnsiTheme="minorHAnsi" w:cstheme="minorBidi"/>
+              <w:rFonts w:asciiTheme="minorHAnsi" w:hAnsiTheme="minorHAnsi" w:cstheme="minorHAnsi"/>
               <w:sz w:val="16"/>
               <w:szCs w:val="16"/>
             </w:rPr>
@@ -6203,7 +5743,7 @@
           <w:proofErr w:type="spellStart"/>
           <w:r>
             <w:rPr>
-              <w:rFonts w:asciiTheme="minorHAnsi" w:hAnsiTheme="minorHAnsi" w:cstheme="minorBidi"/>
+              <w:rFonts w:asciiTheme="minorHAnsi" w:hAnsiTheme="minorHAnsi" w:cstheme="minorHAnsi"/>
               <w:sz w:val="16"/>
               <w:szCs w:val="16"/>
             </w:rPr>
@@ -6212,7 +5752,7 @@
           <w:proofErr w:type="spellEnd"/>
           <w:r>
             <w:rPr>
-              <w:rFonts w:asciiTheme="minorHAnsi" w:hAnsiTheme="minorHAnsi" w:cstheme="minorBidi"/>
+              <w:rFonts w:asciiTheme="minorHAnsi" w:hAnsiTheme="minorHAnsi" w:cstheme="minorHAnsi"/>
               <w:sz w:val="16"/>
               <w:szCs w:val="16"/>
             </w:rPr>
@@ -6228,7 +5768,6 @@
           <w:pPr>
             <w:rPr>
               <w:rFonts w:asciiTheme="minorHAnsi" w:hAnsiTheme="minorHAnsi" w:cstheme="minorHAnsi"/>
-              <w:b/>
               <w:sz w:val="16"/>
               <w:szCs w:val="16"/>
             </w:rPr>
@@ -6262,11 +5801,63 @@
           </w:r>
           <w:r>
             <w:rPr>
-              <w:rFonts w:ascii="Arial" w:hAnsi="Arial" w:cs="Arial"/>
+              <w:rFonts w:asciiTheme="minorHAnsi" w:hAnsiTheme="minorHAnsi" w:cstheme="minorHAnsi"/>
               <w:sz w:val="16"/>
               <w:szCs w:val="16"/>
             </w:rPr>
-            <w:t>{d.rc_office_mailing_address_line_1}</w:t>
+            <w:t>Ministry of MCM</w:t>
+          </w:r>
+        </w:p>
+        <w:p>
+          <w:pPr>
+            <w:rPr>
+              <w:rFonts w:asciiTheme="minorHAnsi" w:hAnsiTheme="minorHAnsi" w:cstheme="minorHAnsi"/>
+              <w:sz w:val="16"/>
+              <w:szCs w:val="16"/>
+            </w:rPr>
+          </w:pPr>
+          <w:r>
+            <w:rPr>
+              <w:rFonts w:asciiTheme="minorHAnsi" w:hAnsiTheme="minorHAnsi" w:cstheme="minorHAnsi"/>
+              <w:sz w:val="16"/>
+              <w:szCs w:val="16"/>
+            </w:rPr>
+            <w:t>1810 Blanshard St.</w:t>
+          </w:r>
+        </w:p>
+        <w:p>
+          <w:pPr>
+            <w:rPr>
+              <w:rFonts w:asciiTheme="minorHAnsi" w:hAnsiTheme="minorHAnsi" w:cstheme="minorHAnsi"/>
+              <w:sz w:val="16"/>
+              <w:szCs w:val="16"/>
+            </w:rPr>
+          </w:pPr>
+          <w:r>
+            <w:rPr>
+              <w:rFonts w:asciiTheme="minorHAnsi" w:hAnsiTheme="minorHAnsi" w:cstheme="minorHAnsi"/>
+              <w:sz w:val="16"/>
+              <w:szCs w:val="16"/>
+            </w:rPr>
+            <w:t xml:space="preserve">PO Box 9320 </w:t>
+          </w:r>
+          <w:proofErr w:type="spellStart"/>
+          <w:r>
+            <w:rPr>
+              <w:rFonts w:asciiTheme="minorHAnsi" w:hAnsiTheme="minorHAnsi" w:cstheme="minorHAnsi"/>
+              <w:sz w:val="16"/>
+              <w:szCs w:val="16"/>
+            </w:rPr>
+            <w:t>Stn</w:t>
+          </w:r>
+          <w:proofErr w:type="spellEnd"/>
+          <w:r>
+            <w:rPr>
+              <w:rFonts w:asciiTheme="minorHAnsi" w:hAnsiTheme="minorHAnsi" w:cstheme="minorHAnsi"/>
+              <w:sz w:val="16"/>
+              <w:szCs w:val="16"/>
+            </w:rPr>
+            <w:t xml:space="preserve"> Prov Govt</w:t>
           </w:r>
         </w:p>
         <w:p>
@@ -6281,23 +5872,23 @@
           <w:r>
             <w:rPr>
               <w:rFonts w:asciiTheme="minorHAnsi" w:hAnsiTheme="minorHAnsi" w:cstheme="minorHAnsi"/>
-              <w:bCs/>
               <w:sz w:val="16"/>
               <w:szCs w:val="16"/>
             </w:rPr>
-            <w:t>{d.rc_office_mailing_address_line_2}</w:t>
+            <w:t>Victoria, BC, V8W 9N3 ATTN: Reclamation Security</w:t>
           </w:r>
         </w:p>
       </w:tc>
     </w:tr>
-    <w:bookmarkEnd w:id="7"/>
     <w:bookmarkEnd w:id="8"/>
     <w:bookmarkEnd w:id="9"/>
+    <w:bookmarkEnd w:id="10"/>
   </w:tbl>
   <w:p>
     <w:pPr>
       <w:pStyle w:val="Footer"/>
       <w:rPr>
+        <w:rFonts w:asciiTheme="minorHAnsi" w:hAnsiTheme="minorHAnsi" w:cstheme="minorHAnsi"/>
         <w:sz w:val="16"/>
         <w:szCs w:val="16"/>
       </w:rPr>
@@ -6661,13 +6252,13 @@
           </w:tabs>
           <w:ind w:left="832" w:firstLine="7088"/>
           <w:rPr>
-            <w:rFonts w:asciiTheme="minorHAnsi" w:hAnsiTheme="minorHAnsi" w:cstheme="minorHAnsi"/>
+            <w:rFonts w:ascii="BC Sans" w:hAnsi="BC Sans" w:cstheme="minorHAnsi"/>
             <w:szCs w:val="24"/>
           </w:rPr>
         </w:pPr>
         <w:r>
           <w:rPr>
-            <w:rFonts w:asciiTheme="minorHAnsi" w:hAnsiTheme="minorHAnsi" w:cstheme="minorHAnsi"/>
+            <w:rFonts w:ascii="BC Sans" w:hAnsi="BC Sans" w:cstheme="minorHAnsi"/>
             <w:noProof/>
             <w:szCs w:val="24"/>
           </w:rPr>
@@ -6783,7 +6374,7 @@
                   <v:stroke joinstyle="miter"/>
                   <v:path gradientshapeok="t" o:connecttype="rect"/>
                 </v:shapetype>
-                <v:shape id="Text Box 2" o:spid="_x0000_s1026" type="#_x0000_t202" style="position:absolute;left:0;text-align:left;margin-left:-14.45pt;margin-top:-11.65pt;width:123.85pt;height:60.5pt;z-index:251658240;visibility:visible;mso-wrap-style:square;mso-wrap-distance-left:9pt;mso-wrap-distance-top:0;mso-wrap-distance-right:9pt;mso-wrap-distance-bottom:0;mso-position-horizontal:absolute;mso-position-horizontal-relative:text;mso-position-vertical:absolute;mso-position-vertical-relative:text;v-text-anchor:top" o:gfxdata="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" fillcolor="white [3201]" stroked="f" strokeweight=".5pt">
+                <v:shape id="Text Box 2" o:spid="_x0000_s1026" type="#_x0000_t202" style="position:absolute;left:0;text-align:left;margin-left:-14.45pt;margin-top:-11.65pt;width:123.85pt;height:60.5pt;z-index:251658240;visibility:visible;mso-wrap-style:square;mso-wrap-distance-left:9pt;mso-wrap-distance-top:0;mso-wrap-distance-right:9pt;mso-wrap-distance-bottom:0;mso-position-horizontal:absolute;mso-position-horizontal-relative:text;mso-position-vertical:absolute;mso-position-vertical-relative:text;v-text-anchor:top" o:gfxdata="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" fillcolor="white [3201]" stroked="f" strokeweight=".5pt">
                   <v:textbox>
                     <w:txbxContent>
                       <w:p>
@@ -6850,14 +6441,14 @@
         </w:r>
         <w:r>
           <w:rPr>
-            <w:rFonts w:asciiTheme="minorHAnsi" w:hAnsiTheme="minorHAnsi" w:cstheme="minorHAnsi"/>
+            <w:rFonts w:ascii="BC Sans" w:hAnsi="BC Sans" w:cstheme="minorHAnsi"/>
             <w:szCs w:val="24"/>
           </w:rPr>
           <w:t xml:space="preserve">Page </w:t>
         </w:r>
         <w:r>
           <w:rPr>
-            <w:rFonts w:asciiTheme="minorHAnsi" w:hAnsiTheme="minorHAnsi" w:cstheme="minorHAnsi"/>
+            <w:rFonts w:ascii="BC Sans" w:hAnsi="BC Sans" w:cstheme="minorHAnsi"/>
             <w:b/>
             <w:bCs/>
             <w:szCs w:val="24"/>
@@ -6866,7 +6457,7 @@
         </w:r>
         <w:r>
           <w:rPr>
-            <w:rFonts w:asciiTheme="minorHAnsi" w:hAnsiTheme="minorHAnsi" w:cstheme="minorHAnsi"/>
+            <w:rFonts w:ascii="BC Sans" w:hAnsi="BC Sans" w:cstheme="minorHAnsi"/>
             <w:b/>
             <w:bCs/>
             <w:szCs w:val="24"/>
@@ -6875,7 +6466,7 @@
         </w:r>
         <w:r>
           <w:rPr>
-            <w:rFonts w:asciiTheme="minorHAnsi" w:hAnsiTheme="minorHAnsi" w:cstheme="minorHAnsi"/>
+            <w:rFonts w:ascii="BC Sans" w:hAnsi="BC Sans" w:cstheme="minorHAnsi"/>
             <w:b/>
             <w:bCs/>
             <w:szCs w:val="24"/>
@@ -6884,7 +6475,7 @@
         </w:r>
         <w:r>
           <w:rPr>
-            <w:rFonts w:asciiTheme="minorHAnsi" w:hAnsiTheme="minorHAnsi" w:cstheme="minorHAnsi"/>
+            <w:rFonts w:ascii="BC Sans" w:hAnsi="BC Sans" w:cstheme="minorHAnsi"/>
             <w:b/>
             <w:bCs/>
             <w:szCs w:val="24"/>
@@ -6893,7 +6484,7 @@
         </w:r>
         <w:r>
           <w:rPr>
-            <w:rFonts w:asciiTheme="minorHAnsi" w:hAnsiTheme="minorHAnsi" w:cstheme="minorHAnsi"/>
+            <w:rFonts w:ascii="BC Sans" w:hAnsi="BC Sans" w:cstheme="minorHAnsi"/>
             <w:b/>
             <w:bCs/>
             <w:szCs w:val="24"/>
@@ -6902,14 +6493,14 @@
         </w:r>
         <w:r>
           <w:rPr>
-            <w:rFonts w:asciiTheme="minorHAnsi" w:hAnsiTheme="minorHAnsi" w:cstheme="minorHAnsi"/>
+            <w:rFonts w:ascii="BC Sans" w:hAnsi="BC Sans" w:cstheme="minorHAnsi"/>
             <w:szCs w:val="24"/>
           </w:rPr>
           <w:t xml:space="preserve"> of </w:t>
         </w:r>
         <w:r>
           <w:rPr>
-            <w:rFonts w:asciiTheme="minorHAnsi" w:hAnsiTheme="minorHAnsi" w:cstheme="minorHAnsi"/>
+            <w:rFonts w:ascii="BC Sans" w:hAnsi="BC Sans" w:cstheme="minorHAnsi"/>
             <w:b/>
             <w:bCs/>
             <w:szCs w:val="24"/>
@@ -6918,7 +6509,7 @@
         </w:r>
         <w:r>
           <w:rPr>
-            <w:rFonts w:asciiTheme="minorHAnsi" w:hAnsiTheme="minorHAnsi" w:cstheme="minorHAnsi"/>
+            <w:rFonts w:ascii="BC Sans" w:hAnsi="BC Sans" w:cstheme="minorHAnsi"/>
             <w:b/>
             <w:bCs/>
             <w:szCs w:val="24"/>
@@ -6927,7 +6518,7 @@
         </w:r>
         <w:r>
           <w:rPr>
-            <w:rFonts w:asciiTheme="minorHAnsi" w:hAnsiTheme="minorHAnsi" w:cstheme="minorHAnsi"/>
+            <w:rFonts w:ascii="BC Sans" w:hAnsi="BC Sans" w:cstheme="minorHAnsi"/>
             <w:b/>
             <w:bCs/>
             <w:szCs w:val="24"/>
@@ -6936,7 +6527,7 @@
         </w:r>
         <w:r>
           <w:rPr>
-            <w:rFonts w:asciiTheme="minorHAnsi" w:hAnsiTheme="minorHAnsi" w:cstheme="minorHAnsi"/>
+            <w:rFonts w:ascii="BC Sans" w:hAnsi="BC Sans" w:cstheme="minorHAnsi"/>
             <w:b/>
             <w:bCs/>
             <w:szCs w:val="24"/>
@@ -6945,7 +6536,7 @@
         </w:r>
         <w:r>
           <w:rPr>
-            <w:rFonts w:asciiTheme="minorHAnsi" w:hAnsiTheme="minorHAnsi" w:cstheme="minorHAnsi"/>
+            <w:rFonts w:ascii="BC Sans" w:hAnsi="BC Sans" w:cstheme="minorHAnsi"/>
             <w:b/>
             <w:bCs/>
             <w:szCs w:val="24"/>

</xml_diff>

<commit_message>
[MDS-6602] - Letter template updates (#3609)
Adjusted formatting for dates on letter templates and formatted some additional dates.  Updated logic and json for those new dates.  Updated template text/styling.
</commit_message>
<xml_diff>
--- a/services/core-api/app/templates/now/Acknowledgment Letter.docx
+++ b/services/core-api/app/templates/now/Acknowledgment Letter.docx
@@ -128,13 +128,13 @@
         <w:t>address:convCRLF</w:t>
       </w:r>
       <w:proofErr w:type="spellEnd"/>
+      <w:proofErr w:type="gramEnd"/>
       <w:r>
         <w:rPr>
           <w:rFonts w:ascii="BC Sans" w:hAnsi="BC Sans" w:cstheme="minorHAnsi"/>
         </w:rPr>
         <w:t>()}</w:t>
       </w:r>
-      <w:proofErr w:type="gramEnd"/>
     </w:p>
     <w:bookmarkEnd w:id="1"/>
     <w:p>
@@ -164,21 +164,36 @@
         <w:rPr>
           <w:rFonts w:ascii="BC Sans" w:hAnsi="BC Sans" w:cstheme="minorHAnsi"/>
         </w:rPr>
-        <w:t>d.emailed</w:t>
+        <w:t>d.</w:t>
+      </w:r>
+      <w:r>
+        <w:rPr>
+          <w:rFonts w:ascii="BC Sans" w:eastAsia="BC Sans" w:hAnsi="BC Sans" w:cs="BC Sans"/>
+          <w:color w:val="000000" w:themeColor="text1"/>
+        </w:rPr>
+        <w:t>applicant</w:t>
       </w:r>
       <w:proofErr w:type="gramEnd"/>
       <w:r>
         <w:rPr>
+          <w:rFonts w:ascii="BC Sans" w:eastAsia="BC Sans" w:hAnsi="BC Sans" w:cs="BC Sans"/>
+          <w:color w:val="000000" w:themeColor="text1"/>
+        </w:rPr>
+        <w:t>_</w:t>
+      </w:r>
+      <w:proofErr w:type="gramStart"/>
+      <w:r>
+        <w:rPr>
+          <w:rFonts w:ascii="BC Sans" w:eastAsia="BC Sans" w:hAnsi="BC Sans" w:cs="BC Sans"/>
+          <w:color w:val="000000" w:themeColor="text1"/>
+        </w:rPr>
+        <w:t>email</w:t>
+      </w:r>
+      <w:r>
+        <w:rPr>
           <w:rFonts w:ascii="BC Sans" w:hAnsi="BC Sans" w:cstheme="minorHAnsi"/>
         </w:rPr>
-        <w:t>_</w:t>
-      </w:r>
-      <w:proofErr w:type="gramStart"/>
-      <w:r>
-        <w:rPr>
-          <w:rFonts w:ascii="BC Sans" w:hAnsi="BC Sans" w:cstheme="minorHAnsi"/>
-        </w:rPr>
-        <w:t>to:ifNEM</w:t>
+        <w:t>:ifNEM</w:t>
       </w:r>
       <w:proofErr w:type="spellEnd"/>
       <w:proofErr w:type="gramEnd"/>
@@ -215,119 +230,48 @@
       <w:pPr>
         <w:pStyle w:val="NoSpacing"/>
         <w:rPr>
+          <w:rFonts w:ascii="BC Sans" w:hAnsi="BC Sans"/>
+        </w:rPr>
+      </w:pPr>
+      <w:bookmarkStart w:id="2" w:name="OLE_LINK2"/>
+      <w:r>
+        <w:rPr>
           <w:rFonts w:ascii="BC Sans" w:hAnsi="BC Sans" w:cstheme="minorHAnsi"/>
         </w:rPr>
-      </w:pPr>
-      <w:r>
-        <w:rPr>
-          <w:rFonts w:ascii="BC Sans" w:hAnsi="BC Sans" w:cstheme="minorHAnsi"/>
-        </w:rPr>
-        <w:t>Sent as electronic mail to {</w:t>
+        <w:t xml:space="preserve">Sent as electronic mail to </w:t>
+      </w:r>
+      <w:r>
+        <w:rPr>
+          <w:rFonts w:ascii="BC Sans" w:hAnsi="BC Sans"/>
+        </w:rPr>
+        <w:t>{</w:t>
       </w:r>
       <w:proofErr w:type="spellStart"/>
       <w:proofErr w:type="gramStart"/>
       <w:r>
         <w:rPr>
-          <w:rFonts w:ascii="BC Sans" w:hAnsi="BC Sans" w:cstheme="minorHAnsi"/>
-        </w:rPr>
-        <w:t>d.emailed</w:t>
-      </w:r>
-      <w:proofErr w:type="gramEnd"/>
-      <w:r>
-        <w:rPr>
-          <w:rFonts w:ascii="BC Sans" w:hAnsi="BC Sans" w:cstheme="minorHAnsi"/>
-        </w:rPr>
-        <w:t>_to</w:t>
-      </w:r>
-      <w:proofErr w:type="spellEnd"/>
-      <w:r>
-        <w:rPr>
-          <w:rFonts w:ascii="BC Sans" w:hAnsi="BC Sans" w:cstheme="minorHAnsi"/>
-        </w:rPr>
-        <w:t>}</w:t>
-      </w:r>
-    </w:p>
-    <w:p>
-      <w:pPr>
-        <w:pStyle w:val="NoSpacing"/>
-        <w:rPr>
-          <w:rFonts w:ascii="BC Sans" w:hAnsi="BC Sans" w:cstheme="minorHAnsi"/>
-        </w:rPr>
-      </w:pPr>
-      <w:r>
-        <w:rPr>
-          <w:rFonts w:ascii="BC Sans" w:hAnsi="BC Sans" w:cstheme="minorHAnsi"/>
-        </w:rPr>
-        <w:t>{</w:t>
-      </w:r>
-      <w:proofErr w:type="spellStart"/>
-      <w:proofErr w:type="gramStart"/>
-      <w:r>
-        <w:rPr>
-          <w:rFonts w:ascii="BC Sans" w:hAnsi="BC Sans" w:cstheme="minorHAnsi"/>
-        </w:rPr>
-        <w:t>d.emailed</w:t>
-      </w:r>
-      <w:proofErr w:type="gramEnd"/>
-      <w:r>
-        <w:rPr>
-          <w:rFonts w:ascii="BC Sans" w:hAnsi="BC Sans" w:cstheme="minorHAnsi"/>
-        </w:rPr>
-        <w:t>_</w:t>
-      </w:r>
-      <w:proofErr w:type="gramStart"/>
-      <w:r>
-        <w:rPr>
-          <w:rFonts w:ascii="BC Sans" w:hAnsi="BC Sans" w:cstheme="minorHAnsi"/>
-        </w:rPr>
-        <w:t>to:showEnd</w:t>
-      </w:r>
-      <w:proofErr w:type="spellEnd"/>
-      <w:proofErr w:type="gramEnd"/>
-      <w:r>
-        <w:rPr>
-          <w:rFonts w:ascii="BC Sans" w:hAnsi="BC Sans" w:cstheme="minorHAnsi"/>
-        </w:rPr>
-        <w:t>}</w:t>
-      </w:r>
-    </w:p>
-    <w:p>
-      <w:pPr>
-        <w:pStyle w:val="NoSpacing"/>
-        <w:rPr>
-          <w:rFonts w:ascii="BC Sans" w:hAnsi="BC Sans"/>
-        </w:rPr>
-      </w:pPr>
-      <w:bookmarkStart w:id="2" w:name="OLE_LINK2"/>
-      <w:r>
-        <w:rPr>
-          <w:rFonts w:ascii="BC Sans" w:hAnsi="BC Sans" w:cstheme="minorHAnsi"/>
-        </w:rPr>
-        <w:t xml:space="preserve">Sent as electronic mail to </w:t>
-      </w:r>
-      <w:r>
-        <w:rPr>
-          <w:rFonts w:ascii="BC Sans" w:hAnsi="BC Sans"/>
-        </w:rPr>
-        <w:t>{</w:t>
-      </w:r>
-      <w:proofErr w:type="spellStart"/>
-      <w:proofErr w:type="gramStart"/>
-      <w:r>
-        <w:rPr>
           <w:rFonts w:ascii="BC Sans" w:eastAsia="BC Sans" w:hAnsi="BC Sans" w:cs="BC Sans"/>
           <w:color w:val="000000" w:themeColor="text1"/>
         </w:rPr>
-        <w:t>d.applicant</w:t>
-      </w:r>
-      <w:proofErr w:type="gramEnd"/>
+        <w:t>d.</w:t>
+      </w:r>
+      <w:bookmarkStart w:id="3" w:name="OLE_LINK5"/>
       <w:r>
         <w:rPr>
           <w:rFonts w:ascii="BC Sans" w:eastAsia="BC Sans" w:hAnsi="BC Sans" w:cs="BC Sans"/>
           <w:color w:val="000000" w:themeColor="text1"/>
         </w:rPr>
+        <w:t>applicant</w:t>
+      </w:r>
+      <w:proofErr w:type="gramEnd"/>
+      <w:r>
+        <w:rPr>
+          <w:rFonts w:ascii="BC Sans" w:eastAsia="BC Sans" w:hAnsi="BC Sans" w:cs="BC Sans"/>
+          <w:color w:val="000000" w:themeColor="text1"/>
+        </w:rPr>
         <w:t>_email</w:t>
       </w:r>
+      <w:bookmarkEnd w:id="3"/>
       <w:proofErr w:type="spellEnd"/>
       <w:r>
         <w:rPr>
@@ -344,91 +288,62 @@
           <w:rFonts w:ascii="BC Sans" w:hAnsi="BC Sans" w:cstheme="minorHAnsi"/>
         </w:rPr>
       </w:pPr>
+      <w:r>
+        <w:rPr>
+          <w:rFonts w:ascii="BC Sans" w:hAnsi="BC Sans" w:cstheme="minorHAnsi"/>
+        </w:rPr>
+        <w:t>{</w:t>
+      </w:r>
+      <w:proofErr w:type="spellStart"/>
+      <w:proofErr w:type="gramStart"/>
+      <w:r>
+        <w:rPr>
+          <w:rFonts w:ascii="BC Sans" w:hAnsi="BC Sans" w:cstheme="minorHAnsi"/>
+        </w:rPr>
+        <w:t>d.</w:t>
+      </w:r>
+      <w:r>
+        <w:rPr>
+          <w:rFonts w:ascii="BC Sans" w:hAnsi="BC Sans" w:cstheme="minorHAnsi"/>
+        </w:rPr>
+        <w:t>applicant</w:t>
+      </w:r>
+      <w:proofErr w:type="gramEnd"/>
+      <w:r>
+        <w:rPr>
+          <w:rFonts w:ascii="BC Sans" w:hAnsi="BC Sans" w:cstheme="minorHAnsi"/>
+        </w:rPr>
+        <w:t>_</w:t>
+      </w:r>
+      <w:proofErr w:type="gramStart"/>
+      <w:r>
+        <w:rPr>
+          <w:rFonts w:ascii="BC Sans" w:hAnsi="BC Sans" w:cstheme="minorHAnsi"/>
+        </w:rPr>
+        <w:t>email</w:t>
+      </w:r>
+      <w:r>
+        <w:rPr>
+          <w:rFonts w:ascii="BC Sans" w:hAnsi="BC Sans" w:cstheme="minorHAnsi"/>
+        </w:rPr>
+        <w:t>:showEnd</w:t>
+      </w:r>
+      <w:proofErr w:type="spellEnd"/>
+      <w:proofErr w:type="gramEnd"/>
+      <w:r>
+        <w:rPr>
+          <w:rFonts w:ascii="BC Sans" w:hAnsi="BC Sans" w:cstheme="minorHAnsi"/>
+        </w:rPr>
+        <w:t>}</w:t>
+      </w:r>
     </w:p>
     <w:p>
       <w:pPr>
         <w:pStyle w:val="NoSpacing"/>
         <w:rPr>
-          <w:rFonts w:ascii="BC Sans" w:hAnsi="BC Sans"/>
-          <w:b/>
-          <w:bCs/>
-        </w:rPr>
-      </w:pPr>
-      <w:bookmarkStart w:id="3" w:name="OLE_LINK4"/>
-      <w:r>
-        <w:rPr>
-          <w:rFonts w:ascii="BC Sans" w:hAnsi="BC Sans"/>
-          <w:b/>
-          <w:bCs/>
-        </w:rPr>
-        <w:t>Re</w:t>
-      </w:r>
-      <w:proofErr w:type="gramStart"/>
-      <w:r>
-        <w:rPr>
-          <w:rFonts w:ascii="BC Sans" w:hAnsi="BC Sans"/>
-          <w:b/>
-          <w:bCs/>
-        </w:rPr>
-        <w:t xml:space="preserve">: </w:t>
-      </w:r>
-      <w:r>
-        <w:rPr>
-          <w:rFonts w:ascii="BC Sans" w:hAnsi="BC Sans"/>
-        </w:rPr>
-        <w:tab/>
-      </w:r>
-      <w:r>
-        <w:rPr>
-          <w:rFonts w:ascii="BC Sans" w:hAnsi="BC Sans"/>
-          <w:b/>
-          <w:bCs/>
-        </w:rPr>
-        <w:t>Application</w:t>
-      </w:r>
-      <w:proofErr w:type="gramEnd"/>
-      <w:r>
-        <w:rPr>
-          <w:rFonts w:ascii="BC Sans" w:hAnsi="BC Sans"/>
-          <w:b/>
-          <w:bCs/>
-        </w:rPr>
-        <w:t xml:space="preserve"> </w:t>
-      </w:r>
-      <w:r>
-        <w:rPr>
-          <w:rFonts w:ascii="BC Sans" w:hAnsi="BC Sans"/>
-          <w:b/>
-          <w:bCs/>
-        </w:rPr>
-        <w:t xml:space="preserve">for </w:t>
-      </w:r>
-      <w:r>
-        <w:rPr>
-          <w:rFonts w:ascii="BC Sans" w:hAnsi="BC Sans"/>
-          <w:b/>
-          <w:bCs/>
-        </w:rPr>
-        <w:t xml:space="preserve">a </w:t>
-      </w:r>
-      <w:proofErr w:type="gramStart"/>
-      <w:r>
-        <w:rPr>
-          <w:rFonts w:ascii="BC Sans" w:hAnsi="BC Sans"/>
-          <w:b/>
-          <w:bCs/>
-        </w:rPr>
-        <w:t xml:space="preserve">Mines Act </w:t>
-      </w:r>
-      <w:r>
-        <w:rPr>
-          <w:rFonts w:ascii="BC Sans" w:hAnsi="BC Sans"/>
-          <w:b/>
-          <w:bCs/>
-        </w:rPr>
-        <w:t>permit</w:t>
-      </w:r>
-      <w:proofErr w:type="gramEnd"/>
+          <w:rFonts w:ascii="BC Sans" w:hAnsi="BC Sans" w:cstheme="minorHAnsi"/>
+        </w:rPr>
+      </w:pPr>
     </w:p>
     <w:p>
       <w:pPr>
@@ -439,11 +354,18 @@
           <w:bCs/>
         </w:rPr>
       </w:pPr>
-      <w:r>
-        <w:rPr>
-          <w:rFonts w:ascii="BC Sans" w:hAnsi="BC Sans"/>
-          <w:b/>
-          <w:bCs/>
+      <w:bookmarkStart w:id="4" w:name="OLE_LINK4"/>
+      <w:r>
+        <w:rPr>
+          <w:rFonts w:ascii="BC Sans" w:hAnsi="BC Sans"/>
+          <w:b/>
+          <w:bCs/>
+        </w:rPr>
+        <w:t xml:space="preserve">Re: </w:t>
+      </w:r>
+      <w:r>
+        <w:rPr>
+          <w:rFonts w:ascii="BC Sans" w:hAnsi="BC Sans"/>
         </w:rPr>
         <w:tab/>
       </w:r>
@@ -453,175 +375,77 @@
           <w:b/>
           <w:bCs/>
         </w:rPr>
-        <w:t>{</w:t>
-      </w:r>
-      <w:proofErr w:type="spellStart"/>
-      <w:r>
-        <w:rPr>
-          <w:rFonts w:ascii="BC Sans" w:hAnsi="BC Sans"/>
-          <w:b/>
-          <w:bCs/>
-        </w:rPr>
-        <w:t>d.application_type_</w:t>
-      </w:r>
-      <w:proofErr w:type="gramStart"/>
-      <w:r>
-        <w:rPr>
-          <w:rFonts w:ascii="BC Sans" w:hAnsi="BC Sans"/>
-          <w:b/>
-          <w:bCs/>
-        </w:rPr>
-        <w:t>code:ifEQ</w:t>
-      </w:r>
-      <w:proofErr w:type="spellEnd"/>
-      <w:proofErr w:type="gramEnd"/>
-      <w:r>
-        <w:rPr>
-          <w:rFonts w:ascii="BC Sans" w:hAnsi="BC Sans"/>
-          <w:b/>
-          <w:bCs/>
-        </w:rPr>
-        <w:t>(NOW</w:t>
-      </w:r>
-      <w:proofErr w:type="gramStart"/>
-      <w:r>
-        <w:rPr>
-          <w:rFonts w:ascii="BC Sans" w:hAnsi="BC Sans"/>
-          <w:b/>
-          <w:bCs/>
-        </w:rPr>
-        <w:t>):</w:t>
-      </w:r>
-      <w:proofErr w:type="spellStart"/>
-      <w:r>
-        <w:rPr>
-          <w:rFonts w:ascii="BC Sans" w:hAnsi="BC Sans"/>
-          <w:b/>
-          <w:bCs/>
-        </w:rPr>
-        <w:t>showBegin</w:t>
-      </w:r>
-      <w:proofErr w:type="spellEnd"/>
-      <w:proofErr w:type="gramEnd"/>
-      <w:r>
-        <w:rPr>
-          <w:rFonts w:ascii="BC Sans" w:hAnsi="BC Sans"/>
-          <w:b/>
-          <w:bCs/>
-        </w:rPr>
-        <w:t xml:space="preserve">}New </w:t>
-      </w:r>
-      <w:r>
-        <w:rPr>
-          <w:rFonts w:ascii="BC Sans" w:hAnsi="BC Sans"/>
-          <w:b/>
-          <w:bCs/>
-        </w:rPr>
-        <w:t>p</w:t>
-      </w:r>
-      <w:r>
-        <w:rPr>
-          <w:rFonts w:ascii="BC Sans" w:hAnsi="BC Sans"/>
-          <w:b/>
-          <w:bCs/>
-        </w:rPr>
-        <w:t>ermit</w:t>
-      </w:r>
-      <w:r>
-        <w:rPr>
-          <w:rFonts w:ascii="BC Sans" w:hAnsi="BC Sans"/>
-          <w:b/>
-          <w:bCs/>
-        </w:rPr>
-        <w:t xml:space="preserve"> </w:t>
-      </w:r>
-      <w:r>
-        <w:rPr>
-          <w:rFonts w:ascii="BC Sans" w:hAnsi="BC Sans"/>
-          <w:b/>
-          <w:bCs/>
-        </w:rPr>
-        <w:t>{d.application_type_</w:t>
-      </w:r>
-      <w:proofErr w:type="gramStart"/>
-      <w:r>
-        <w:rPr>
-          <w:rFonts w:ascii="BC Sans" w:hAnsi="BC Sans"/>
-          <w:b/>
-          <w:bCs/>
-        </w:rPr>
-        <w:t>code:showEnd</w:t>
-      </w:r>
-      <w:proofErr w:type="gramEnd"/>
-      <w:r>
-        <w:rPr>
-          <w:rFonts w:ascii="BC Sans" w:hAnsi="BC Sans"/>
-          <w:b/>
-          <w:bCs/>
-        </w:rPr>
-        <w:t>}{d.application_type_</w:t>
-      </w:r>
-      <w:proofErr w:type="gramStart"/>
-      <w:r>
-        <w:rPr>
-          <w:rFonts w:ascii="BC Sans" w:hAnsi="BC Sans"/>
-          <w:b/>
-          <w:bCs/>
-        </w:rPr>
-        <w:t>code:ifEQ</w:t>
-      </w:r>
-      <w:proofErr w:type="gramEnd"/>
-      <w:r>
-        <w:rPr>
-          <w:rFonts w:ascii="BC Sans" w:hAnsi="BC Sans"/>
-          <w:b/>
-          <w:bCs/>
-        </w:rPr>
-        <w:t>(</w:t>
-      </w:r>
-      <w:r>
-        <w:rPr>
-          <w:rFonts w:ascii="BC Sans" w:hAnsi="BC Sans"/>
-          <w:b/>
-          <w:bCs/>
-        </w:rPr>
-        <w:t>ADA</w:t>
-      </w:r>
-      <w:proofErr w:type="gramStart"/>
-      <w:r>
-        <w:rPr>
-          <w:rFonts w:ascii="BC Sans" w:hAnsi="BC Sans"/>
-          <w:b/>
-          <w:bCs/>
-        </w:rPr>
-        <w:t>):showBegin</w:t>
-      </w:r>
-      <w:proofErr w:type="gramEnd"/>
-      <w:r>
-        <w:rPr>
-          <w:rFonts w:ascii="BC Sans" w:hAnsi="BC Sans"/>
-          <w:b/>
-          <w:bCs/>
-        </w:rPr>
-        <w:t>}Amendment {</w:t>
-      </w:r>
-      <w:proofErr w:type="spellStart"/>
-      <w:r>
-        <w:rPr>
-          <w:rFonts w:ascii="BC Sans" w:hAnsi="BC Sans"/>
-          <w:b/>
-          <w:bCs/>
-        </w:rPr>
-        <w:t>d.application_type_code</w:t>
-      </w:r>
-      <w:proofErr w:type="spellEnd"/>
-      <w:r>
-        <w:rPr>
-          <w:rFonts w:ascii="BC Sans" w:hAnsi="BC Sans"/>
-          <w:b/>
-          <w:bCs/>
-        </w:rPr>
-        <w:t>} to {</w:t>
+        <w:t xml:space="preserve">Application </w:t>
+      </w:r>
+      <w:r>
+        <w:rPr>
+          <w:rFonts w:ascii="BC Sans" w:hAnsi="BC Sans"/>
+          <w:b/>
+          <w:bCs/>
+        </w:rPr>
+        <w:t xml:space="preserve">for </w:t>
+      </w:r>
+      <w:r>
+        <w:rPr>
+          <w:rFonts w:ascii="BC Sans" w:hAnsi="BC Sans"/>
+          <w:b/>
+          <w:bCs/>
+        </w:rPr>
+        <w:t xml:space="preserve">a </w:t>
+      </w:r>
+      <w:r>
+        <w:rPr>
+          <w:rFonts w:ascii="BC Sans" w:hAnsi="BC Sans"/>
+          <w:b/>
+          <w:bCs/>
+        </w:rPr>
+        <w:t xml:space="preserve">Mines Act </w:t>
+      </w:r>
+      <w:r>
+        <w:rPr>
+          <w:rFonts w:ascii="BC Sans" w:hAnsi="BC Sans"/>
+          <w:b/>
+          <w:bCs/>
+        </w:rPr>
+        <w:t>permit</w:t>
+      </w:r>
+    </w:p>
+    <w:p>
+      <w:pPr>
+        <w:pStyle w:val="NoSpacing"/>
+        <w:rPr>
+          <w:rFonts w:ascii="BC Sans" w:hAnsi="BC Sans"/>
+          <w:b/>
+          <w:bCs/>
+          <w:color w:val="000000" w:themeColor="text1"/>
+        </w:rPr>
+      </w:pPr>
+      <w:r>
+        <w:rPr>
+          <w:rFonts w:ascii="BC Sans" w:hAnsi="BC Sans"/>
+          <w:b/>
+          <w:bCs/>
+        </w:rPr>
+        <w:tab/>
+        <w:t xml:space="preserve">New Permit </w:t>
+      </w:r>
+      <w:r>
+        <w:rPr>
+          <w:rFonts w:ascii="BC Sans" w:hAnsi="BC Sans"/>
+          <w:b/>
+          <w:bCs/>
+          <w:color w:val="EE0000"/>
+        </w:rPr>
+        <w:t xml:space="preserve">OR </w:t>
+      </w:r>
+      <w:r>
+        <w:rPr>
+          <w:rFonts w:ascii="BC Sans" w:hAnsi="BC Sans"/>
+          <w:b/>
+          <w:bCs/>
+          <w:color w:val="000000" w:themeColor="text1"/>
+        </w:rPr>
+        <w:t>Amendment to {</w:t>
       </w:r>
       <w:proofErr w:type="spellStart"/>
       <w:proofErr w:type="gramStart"/>
@@ -630,6 +454,7 @@
           <w:rFonts w:ascii="BC Sans" w:hAnsi="BC Sans"/>
           <w:b/>
           <w:bCs/>
+          <w:color w:val="000000" w:themeColor="text1"/>
         </w:rPr>
         <w:t>d.permit</w:t>
       </w:r>
@@ -639,6 +464,7 @@
           <w:rFonts w:ascii="BC Sans" w:hAnsi="BC Sans"/>
           <w:b/>
           <w:bCs/>
+          <w:color w:val="000000" w:themeColor="text1"/>
         </w:rPr>
         <w:t>_no</w:t>
       </w:r>
@@ -648,6 +474,7 @@
           <w:rFonts w:ascii="BC Sans" w:hAnsi="BC Sans"/>
           <w:b/>
           <w:bCs/>
+          <w:color w:val="000000" w:themeColor="text1"/>
         </w:rPr>
         <w:t>}</w:t>
       </w:r>
@@ -660,26 +487,36 @@
           <w:rFonts w:ascii="BC Sans" w:hAnsi="BC Sans"/>
           <w:b/>
           <w:bCs/>
-          <w:u w:val="single"/>
-        </w:rPr>
-      </w:pPr>
-      <w:r>
-        <w:rPr>
-          <w:rFonts w:ascii="BC Sans" w:hAnsi="BC Sans"/>
-          <w:b/>
-          <w:bCs/>
-        </w:rPr>
-        <w:t>{</w:t>
+        </w:rPr>
+      </w:pPr>
+      <w:bookmarkStart w:id="5" w:name="OLE_LINK3"/>
+      <w:proofErr w:type="gramStart"/>
+      <w:r>
+        <w:rPr>
+          <w:rFonts w:ascii="BC Sans" w:hAnsi="BC Sans"/>
+          <w:b/>
+          <w:bCs/>
+        </w:rPr>
+        <w:t>Mine</w:t>
+      </w:r>
+      <w:proofErr w:type="gramEnd"/>
+      <w:r>
+        <w:rPr>
+          <w:rFonts w:ascii="BC Sans" w:hAnsi="BC Sans"/>
+          <w:b/>
+          <w:bCs/>
+        </w:rPr>
+        <w:t xml:space="preserve"> name:</w:t>
+      </w:r>
+      <w:r>
+        <w:rPr>
+          <w:rFonts w:ascii="BC Sans" w:hAnsi="BC Sans"/>
+          <w:b/>
+          <w:bCs/>
+        </w:rPr>
+        <w:t xml:space="preserve"> {</w:t>
       </w:r>
       <w:proofErr w:type="spellStart"/>
-      <w:r>
-        <w:rPr>
-          <w:rFonts w:ascii="BC Sans" w:hAnsi="BC Sans"/>
-          <w:b/>
-          <w:bCs/>
-        </w:rPr>
-        <w:t>d.application_type_</w:t>
-      </w:r>
       <w:proofErr w:type="gramStart"/>
       <w:r>
         <w:rPr>
@@ -687,10 +524,18 @@
           <w:b/>
           <w:bCs/>
         </w:rPr>
-        <w:t>code:showEnd</w:t>
+        <w:t>d.mine</w:t>
+      </w:r>
+      <w:proofErr w:type="gramEnd"/>
+      <w:r>
+        <w:rPr>
+          <w:rFonts w:ascii="BC Sans" w:hAnsi="BC Sans"/>
+          <w:b/>
+          <w:bCs/>
+        </w:rPr>
+        <w:t>_name</w:t>
       </w:r>
       <w:proofErr w:type="spellEnd"/>
-      <w:proofErr w:type="gramEnd"/>
       <w:r>
         <w:rPr>
           <w:rFonts w:ascii="BC Sans" w:hAnsi="BC Sans"/>
@@ -710,7 +555,6 @@
           <w:bCs/>
         </w:rPr>
       </w:pPr>
-      <w:bookmarkStart w:id="4" w:name="OLE_LINK3"/>
       <w:proofErr w:type="gramStart"/>
       <w:r>
         <w:rPr>
@@ -727,8 +571,17 @@
           <w:b/>
           <w:bCs/>
         </w:rPr>
-        <w:t xml:space="preserve"> </w:t>
-      </w:r>
+        <w:t xml:space="preserve"> number: </w:t>
+      </w:r>
+      <w:r>
+        <w:rPr>
+          <w:rFonts w:ascii="BC Sans" w:hAnsi="BC Sans"/>
+          <w:b/>
+          <w:bCs/>
+        </w:rPr>
+        <w:t>{</w:t>
+      </w:r>
+      <w:proofErr w:type="spellStart"/>
       <w:proofErr w:type="gramStart"/>
       <w:r>
         <w:rPr>
@@ -736,23 +589,6 @@
           <w:b/>
           <w:bCs/>
         </w:rPr>
-        <w:t>name:</w:t>
-      </w:r>
-      <w:r>
-        <w:rPr>
-          <w:rFonts w:ascii="BC Sans" w:hAnsi="BC Sans"/>
-          <w:b/>
-          <w:bCs/>
-        </w:rPr>
-        <w:t xml:space="preserve"> {</w:t>
-      </w:r>
-      <w:proofErr w:type="spellStart"/>
-      <w:r>
-        <w:rPr>
-          <w:rFonts w:ascii="BC Sans" w:hAnsi="BC Sans"/>
-          <w:b/>
-          <w:bCs/>
-        </w:rPr>
         <w:t>d.mine</w:t>
       </w:r>
       <w:proofErr w:type="gramEnd"/>
@@ -762,7 +598,7 @@
           <w:b/>
           <w:bCs/>
         </w:rPr>
-        <w:t>_name</w:t>
+        <w:t>_no</w:t>
       </w:r>
       <w:proofErr w:type="spellEnd"/>
       <w:r>
@@ -774,6 +610,7 @@
         <w:t>}</w:t>
       </w:r>
     </w:p>
+    <w:bookmarkEnd w:id="5"/>
     <w:p>
       <w:pPr>
         <w:pStyle w:val="NoSpacing"/>
@@ -784,6 +621,23 @@
           <w:bCs/>
         </w:rPr>
       </w:pPr>
+      <w:r>
+        <w:rPr>
+          <w:rFonts w:ascii="BC Sans" w:hAnsi="BC Sans"/>
+          <w:b/>
+          <w:bCs/>
+        </w:rPr>
+        <w:t xml:space="preserve">Proposed permittee: </w:t>
+      </w:r>
+      <w:r>
+        <w:rPr>
+          <w:rFonts w:ascii="BC Sans" w:hAnsi="BC Sans"/>
+          <w:b/>
+          <w:bCs/>
+        </w:rPr>
+        <w:t>{</w:t>
+      </w:r>
+      <w:proofErr w:type="spellStart"/>
       <w:proofErr w:type="gramStart"/>
       <w:r>
         <w:rPr>
@@ -791,7 +645,7 @@
           <w:b/>
           <w:bCs/>
         </w:rPr>
-        <w:t>Mine</w:t>
+        <w:t>d.proponent</w:t>
       </w:r>
       <w:proofErr w:type="gramEnd"/>
       <w:r>
@@ -800,42 +654,7 @@
           <w:b/>
           <w:bCs/>
         </w:rPr>
-        <w:t xml:space="preserve"> </w:t>
-      </w:r>
-      <w:proofErr w:type="gramStart"/>
-      <w:r>
-        <w:rPr>
-          <w:rFonts w:ascii="BC Sans" w:hAnsi="BC Sans"/>
-          <w:b/>
-          <w:bCs/>
-        </w:rPr>
-        <w:t xml:space="preserve">number: </w:t>
-      </w:r>
-      <w:r>
-        <w:rPr>
-          <w:rFonts w:ascii="BC Sans" w:hAnsi="BC Sans"/>
-          <w:b/>
-          <w:bCs/>
-        </w:rPr>
-        <w:t>{</w:t>
-      </w:r>
-      <w:proofErr w:type="spellStart"/>
-      <w:r>
-        <w:rPr>
-          <w:rFonts w:ascii="BC Sans" w:hAnsi="BC Sans"/>
-          <w:b/>
-          <w:bCs/>
-        </w:rPr>
-        <w:t>d.mine</w:t>
-      </w:r>
-      <w:proofErr w:type="gramEnd"/>
-      <w:r>
-        <w:rPr>
-          <w:rFonts w:ascii="BC Sans" w:hAnsi="BC Sans"/>
-          <w:b/>
-          <w:bCs/>
-        </w:rPr>
-        <w:t>_no</w:t>
+        <w:t>_name</w:t>
       </w:r>
       <w:proofErr w:type="spellEnd"/>
       <w:r>
@@ -848,70 +667,6 @@
       </w:r>
     </w:p>
     <w:bookmarkEnd w:id="4"/>
-    <w:p>
-      <w:pPr>
-        <w:pStyle w:val="NoSpacing"/>
-        <w:ind w:firstLine="720"/>
-        <w:rPr>
-          <w:rFonts w:ascii="BC Sans" w:hAnsi="BC Sans"/>
-          <w:b/>
-          <w:bCs/>
-        </w:rPr>
-      </w:pPr>
-      <w:r>
-        <w:rPr>
-          <w:rFonts w:ascii="BC Sans" w:hAnsi="BC Sans"/>
-          <w:b/>
-          <w:bCs/>
-        </w:rPr>
-        <w:t xml:space="preserve">Proposed </w:t>
-      </w:r>
-      <w:proofErr w:type="gramStart"/>
-      <w:r>
-        <w:rPr>
-          <w:rFonts w:ascii="BC Sans" w:hAnsi="BC Sans"/>
-          <w:b/>
-          <w:bCs/>
-        </w:rPr>
-        <w:t xml:space="preserve">permittee: </w:t>
-      </w:r>
-      <w:r>
-        <w:rPr>
-          <w:rFonts w:ascii="BC Sans" w:hAnsi="BC Sans"/>
-          <w:b/>
-          <w:bCs/>
-        </w:rPr>
-        <w:t>{</w:t>
-      </w:r>
-      <w:proofErr w:type="spellStart"/>
-      <w:r>
-        <w:rPr>
-          <w:rFonts w:ascii="BC Sans" w:hAnsi="BC Sans"/>
-          <w:b/>
-          <w:bCs/>
-        </w:rPr>
-        <w:t>d.proponent</w:t>
-      </w:r>
-      <w:proofErr w:type="gramEnd"/>
-      <w:r>
-        <w:rPr>
-          <w:rFonts w:ascii="BC Sans" w:hAnsi="BC Sans"/>
-          <w:b/>
-          <w:bCs/>
-        </w:rPr>
-        <w:t>_name</w:t>
-      </w:r>
-      <w:proofErr w:type="spellEnd"/>
-      <w:r>
-        <w:rPr>
-          <w:rFonts w:ascii="BC Sans" w:hAnsi="BC Sans"/>
-          <w:b/>
-          <w:bCs/>
-        </w:rPr>
-        <w:t>}</w:t>
-      </w:r>
-    </w:p>
-    <w:bookmarkEnd w:id="3"/>
     <w:p>
       <w:pPr>
         <w:pStyle w:val="NoSpacing"/>
@@ -1110,6 +865,9 @@
         </w:r>
       </w:hyperlink>
       <w:r>
+        <w:rPr>
+          <w:rFonts w:ascii="BC Sans" w:hAnsi="BC Sans"/>
+        </w:rPr>
         <w:t xml:space="preserve">. </w:t>
       </w:r>
     </w:p>
@@ -1152,19 +910,7 @@
         <w:rPr>
           <w:rFonts w:ascii="BC Sans" w:hAnsi="BC Sans"/>
         </w:rPr>
-        <w:t xml:space="preserve"> </w:t>
-      </w:r>
-      <w:r>
-        <w:rPr>
-          <w:rFonts w:ascii="BC Sans" w:hAnsi="BC Sans"/>
-        </w:rPr>
-        <w:t>section 10(1)</w:t>
-      </w:r>
-      <w:r>
-        <w:rPr>
-          <w:rFonts w:ascii="BC Sans" w:hAnsi="BC Sans"/>
-        </w:rPr>
-        <w:t xml:space="preserve"> of the Mines Act</w:t>
+        <w:t xml:space="preserve"> section 10(1) of the Mines Act</w:t>
       </w:r>
       <w:r>
         <w:rPr>
@@ -1288,21 +1034,7 @@
         <w:rPr>
           <w:rFonts w:ascii="BC Sans" w:hAnsi="BC Sans"/>
         </w:rPr>
-        <w:t xml:space="preserve">conservation, protection, and reclamation of the land, </w:t>
-      </w:r>
-      <w:proofErr w:type="gramStart"/>
-      <w:r>
-        <w:rPr>
-          <w:rFonts w:ascii="BC Sans" w:hAnsi="BC Sans"/>
-        </w:rPr>
-        <w:t>watercourses</w:t>
-      </w:r>
-      <w:proofErr w:type="gramEnd"/>
-      <w:r>
-        <w:rPr>
-          <w:rFonts w:ascii="BC Sans" w:hAnsi="BC Sans"/>
-        </w:rPr>
-        <w:t xml:space="preserve"> and cultural heritage resources affected by the proposed activities</w:t>
+        <w:t>conservation, protection, and reclamation of the land, watercourses and cultural heritage resources affected by the proposed activities</w:t>
       </w:r>
       <w:r>
         <w:rPr>
@@ -1347,14 +1079,7 @@
         <w:rPr>
           <w:rFonts w:ascii="BC Sans" w:hAnsi="BC Sans"/>
         </w:rPr>
-        <w:t xml:space="preserve">Notice of Work </w:t>
-      </w:r>
-      <w:proofErr w:type="gramStart"/>
-      <w:r>
-        <w:rPr>
-          <w:rFonts w:ascii="BC Sans" w:hAnsi="BC Sans"/>
-        </w:rPr>
-        <w:t>number</w:t>
+        <w:t>Notice of Work number</w:t>
       </w:r>
       <w:r>
         <w:rPr>
@@ -1369,7 +1094,6 @@
         <w:t xml:space="preserve"> {</w:t>
       </w:r>
       <w:proofErr w:type="spellStart"/>
-      <w:proofErr w:type="gramEnd"/>
       <w:r>
         <w:rPr>
           <w:rFonts w:ascii="BC Sans" w:hAnsi="BC Sans"/>
@@ -1405,14 +1129,7 @@
         <w:rPr>
           <w:rFonts w:ascii="BC Sans" w:hAnsi="BC Sans"/>
         </w:rPr>
-        <w:t xml:space="preserve"> and </w:t>
-      </w:r>
-      <w:proofErr w:type="gramStart"/>
-      <w:r>
-        <w:rPr>
-          <w:rFonts w:ascii="BC Sans" w:hAnsi="BC Sans"/>
-        </w:rPr>
-        <w:t>accepted</w:t>
+        <w:t xml:space="preserve"> and accepted</w:t>
       </w:r>
       <w:r>
         <w:rPr>
@@ -1433,7 +1150,6 @@
         <w:t>{</w:t>
       </w:r>
       <w:proofErr w:type="spellStart"/>
-      <w:proofErr w:type="gramEnd"/>
       <w:r>
         <w:rPr>
           <w:rFonts w:ascii="BC Sans" w:hAnsi="BC Sans"/>
@@ -1550,29 +1266,21 @@
         <w:rPr>
           <w:rFonts w:ascii="BC Sans" w:hAnsi="BC Sans" w:cstheme="minorHAnsi"/>
         </w:rPr>
-        <w:t xml:space="preserve"> tracking </w:t>
-      </w:r>
-      <w:proofErr w:type="gramStart"/>
+        <w:t xml:space="preserve"> tracking number</w:t>
+      </w:r>
       <w:r>
         <w:rPr>
           <w:rFonts w:ascii="BC Sans" w:hAnsi="BC Sans" w:cstheme="minorHAnsi"/>
         </w:rPr>
-        <w:t>number</w:t>
+        <w:t>:</w:t>
       </w:r>
       <w:r>
         <w:rPr>
           <w:rFonts w:ascii="BC Sans" w:hAnsi="BC Sans" w:cstheme="minorHAnsi"/>
         </w:rPr>
-        <w:t>:</w:t>
-      </w:r>
-      <w:r>
-        <w:rPr>
-          <w:rFonts w:ascii="BC Sans" w:hAnsi="BC Sans" w:cstheme="minorHAnsi"/>
-        </w:rPr>
         <w:t xml:space="preserve"> {</w:t>
       </w:r>
       <w:proofErr w:type="spellStart"/>
-      <w:proofErr w:type="gramEnd"/>
       <w:r>
         <w:rPr>
           <w:rFonts w:ascii="BC Sans" w:hAnsi="BC Sans" w:cstheme="minorHAnsi"/>
@@ -1773,7 +1481,6 @@
           <w:rFonts w:ascii="BC Sans" w:hAnsi="BC Sans"/>
           <w:color w:val="FF0000"/>
         </w:rPr>
-        <w:lastRenderedPageBreak/>
         <w:t>O</w:t>
       </w:r>
       <w:r>
@@ -2041,21 +1748,7 @@
         <w:rPr>
           <w:rFonts w:ascii="BC Sans" w:hAnsi="BC Sans"/>
         </w:rPr>
-        <w:t xml:space="preserve">The </w:t>
-      </w:r>
-      <w:proofErr w:type="gramStart"/>
-      <w:r>
-        <w:rPr>
-          <w:rFonts w:ascii="BC Sans" w:hAnsi="BC Sans"/>
-        </w:rPr>
-        <w:t>government agency</w:t>
-      </w:r>
-      <w:proofErr w:type="gramEnd"/>
-      <w:r>
-        <w:rPr>
-          <w:rFonts w:ascii="BC Sans" w:hAnsi="BC Sans"/>
-        </w:rPr>
-        <w:t xml:space="preserve"> referral period is projected to be </w:t>
+        <w:t xml:space="preserve">The government agency referral period is projected to be </w:t>
       </w:r>
       <w:r>
         <w:rPr>
@@ -2447,8 +2140,10 @@
           <w:b w:val="0"/>
           <w:bCs w:val="0"/>
         </w:rPr>
-        <w:t>This will bring the total amount held under</w:t>
-      </w:r>
+        <w:t>This will bring the total amount held under {</w:t>
+      </w:r>
+      <w:proofErr w:type="spellStart"/>
+      <w:proofErr w:type="gramStart"/>
       <w:r>
         <w:rPr>
           <w:rStyle w:val="Strong"/>
@@ -2456,10 +2151,9 @@
           <w:b w:val="0"/>
           <w:bCs w:val="0"/>
         </w:rPr>
-        <w:t xml:space="preserve"> {</w:t>
-      </w:r>
-      <w:proofErr w:type="spellStart"/>
-      <w:proofErr w:type="gramStart"/>
+        <w:t>d.permit</w:t>
+      </w:r>
+      <w:proofErr w:type="gramEnd"/>
       <w:r>
         <w:rPr>
           <w:rStyle w:val="Strong"/>
@@ -2467,9 +2161,9 @@
           <w:b w:val="0"/>
           <w:bCs w:val="0"/>
         </w:rPr>
-        <w:t>d.permit</w:t>
-      </w:r>
-      <w:proofErr w:type="gramEnd"/>
+        <w:t>_no</w:t>
+      </w:r>
+      <w:proofErr w:type="spellEnd"/>
       <w:r>
         <w:rPr>
           <w:rStyle w:val="Strong"/>
@@ -2477,26 +2171,7 @@
           <w:b w:val="0"/>
           <w:bCs w:val="0"/>
         </w:rPr>
-        <w:t>_no</w:t>
-      </w:r>
-      <w:proofErr w:type="spellEnd"/>
-      <w:r>
-        <w:rPr>
-          <w:rStyle w:val="Strong"/>
-          <w:rFonts w:ascii="BC Sans" w:hAnsi="BC Sans"/>
-          <w:b w:val="0"/>
-          <w:bCs w:val="0"/>
-        </w:rPr>
-        <w:t xml:space="preserve">} </w:t>
-      </w:r>
-      <w:r>
-        <w:rPr>
-          <w:rStyle w:val="Strong"/>
-          <w:rFonts w:ascii="BC Sans" w:hAnsi="BC Sans"/>
-          <w:b w:val="0"/>
-          <w:bCs w:val="0"/>
-        </w:rPr>
-        <w:t>to</w:t>
+        <w:t>} to</w:t>
       </w:r>
       <w:r>
         <w:rPr>
@@ -2506,7 +2181,7 @@
           <w:bCs w:val="0"/>
           <w:color w:val="FF0000"/>
         </w:rPr>
-        <w:t xml:space="preserve"> (enter total security </w:t>
+        <w:t xml:space="preserve"> (enter total security to be held)</w:t>
       </w:r>
       <w:r>
         <w:rPr>
@@ -2514,222 +2189,191 @@
           <w:rFonts w:ascii="BC Sans" w:hAnsi="BC Sans"/>
           <w:b w:val="0"/>
           <w:bCs w:val="0"/>
-          <w:color w:val="FF0000"/>
-        </w:rPr>
-        <w:t xml:space="preserve">to be </w:t>
-      </w:r>
-      <w:r>
+        </w:rPr>
+        <w:t>.</w:t>
+      </w:r>
+      <w:r>
+        <w:rPr>
+          <w:rFonts w:ascii="BC Sans" w:hAnsi="BC Sans"/>
+        </w:rPr>
+        <w:t xml:space="preserve"> </w:t>
+      </w:r>
+      <w:r>
+        <w:rPr>
+          <w:rFonts w:ascii="BC Sans" w:hAnsi="BC Sans"/>
+        </w:rPr>
+        <w:t>I</w:t>
+      </w:r>
+      <w:r>
+        <w:rPr>
+          <w:rFonts w:ascii="BC Sans" w:hAnsi="BC Sans"/>
+        </w:rPr>
+        <w:t>n accordance with</w:t>
+      </w:r>
+      <w:r>
+        <w:rPr>
+          <w:rFonts w:ascii="BC Sans" w:hAnsi="BC Sans"/>
+        </w:rPr>
+        <w:t xml:space="preserve"> </w:t>
+      </w:r>
+      <w:r>
+        <w:rPr>
+          <w:rFonts w:ascii="BC Sans" w:hAnsi="BC Sans"/>
+        </w:rPr>
+        <w:t xml:space="preserve">the </w:t>
+      </w:r>
+      <w:r>
+        <w:rPr>
+          <w:rFonts w:ascii="BC Sans" w:hAnsi="BC Sans"/>
+        </w:rPr>
+        <w:t xml:space="preserve">Mines Act, </w:t>
+      </w:r>
+      <w:r>
+        <w:rPr>
+          <w:rFonts w:ascii="BC Sans" w:hAnsi="BC Sans"/>
+        </w:rPr>
+        <w:t xml:space="preserve">it has been assessed </w:t>
+      </w:r>
+      <w:r>
+        <w:rPr>
+          <w:rFonts w:ascii="BC Sans" w:hAnsi="BC Sans"/>
+        </w:rPr>
+        <w:t>that you are required to</w:t>
+      </w:r>
+      <w:r>
+        <w:rPr>
+          <w:rFonts w:ascii="BC Sans" w:hAnsi="BC Sans"/>
+        </w:rPr>
+        <w:t xml:space="preserve"> post </w:t>
+      </w:r>
+      <w:r>
+        <w:rPr>
+          <w:rFonts w:ascii="BC Sans" w:hAnsi="BC Sans"/>
+        </w:rPr>
+        <w:t>financial</w:t>
+      </w:r>
+      <w:r>
+        <w:rPr>
+          <w:rFonts w:ascii="BC Sans" w:hAnsi="BC Sans"/>
+        </w:rPr>
+        <w:t xml:space="preserve"> security in the amount of</w:t>
+      </w:r>
+      <w:r>
+        <w:rPr>
+          <w:rFonts w:ascii="BC Sans" w:hAnsi="BC Sans"/>
+        </w:rPr>
+        <w:t xml:space="preserve"> ${</w:t>
+      </w:r>
+      <w:proofErr w:type="spellStart"/>
+      <w:proofErr w:type="gramStart"/>
+      <w:r>
+        <w:rPr>
+          <w:rFonts w:ascii="BC Sans" w:hAnsi="BC Sans"/>
+        </w:rPr>
+        <w:t>d.bond</w:t>
+      </w:r>
+      <w:proofErr w:type="gramEnd"/>
+      <w:r>
+        <w:rPr>
+          <w:rFonts w:ascii="BC Sans" w:hAnsi="BC Sans"/>
+        </w:rPr>
+        <w:t>_inc_</w:t>
+      </w:r>
+      <w:proofErr w:type="gramStart"/>
+      <w:r>
+        <w:rPr>
+          <w:rFonts w:ascii="BC Sans" w:hAnsi="BC Sans"/>
+        </w:rPr>
+        <w:t>amt:formatN</w:t>
+      </w:r>
+      <w:proofErr w:type="spellEnd"/>
+      <w:proofErr w:type="gramEnd"/>
+      <w:r>
+        <w:rPr>
+          <w:rFonts w:ascii="BC Sans" w:hAnsi="BC Sans"/>
+        </w:rPr>
+        <w:t>(2)}.</w:t>
+      </w:r>
+    </w:p>
+    <w:p>
+      <w:pPr>
+        <w:pStyle w:val="NoSpacing"/>
+        <w:jc w:val="both"/>
         <w:rPr>
           <w:rStyle w:val="Strong"/>
           <w:rFonts w:ascii="BC Sans" w:hAnsi="BC Sans"/>
           <w:b w:val="0"/>
           <w:bCs w:val="0"/>
-          <w:color w:val="FF0000"/>
-        </w:rPr>
-        <w:t>held)</w:t>
-      </w:r>
-      <w:r>
-        <w:rPr>
-          <w:rStyle w:val="Strong"/>
-          <w:rFonts w:ascii="BC Sans" w:hAnsi="BC Sans"/>
-          <w:b w:val="0"/>
-          <w:bCs w:val="0"/>
-        </w:rPr>
-        <w:t>.</w:t>
-      </w:r>
-      <w:r>
-        <w:rPr>
-          <w:rFonts w:ascii="BC Sans" w:hAnsi="BC Sans"/>
-        </w:rPr>
-        <w:t xml:space="preserve"> </w:t>
-      </w:r>
-      <w:r>
-        <w:rPr>
-          <w:rFonts w:ascii="BC Sans" w:hAnsi="BC Sans"/>
-        </w:rPr>
-        <w:t>I</w:t>
-      </w:r>
-      <w:r>
-        <w:rPr>
-          <w:rFonts w:ascii="BC Sans" w:hAnsi="BC Sans"/>
-        </w:rPr>
-        <w:t>n accordance with</w:t>
-      </w:r>
-      <w:r>
-        <w:rPr>
-          <w:rFonts w:ascii="BC Sans" w:hAnsi="BC Sans"/>
-        </w:rPr>
-        <w:t xml:space="preserve"> </w:t>
-      </w:r>
-      <w:r>
-        <w:rPr>
-          <w:rFonts w:ascii="BC Sans" w:hAnsi="BC Sans"/>
-        </w:rPr>
-        <w:t xml:space="preserve">the </w:t>
-      </w:r>
-      <w:r>
-        <w:rPr>
-          <w:rFonts w:ascii="BC Sans" w:hAnsi="BC Sans"/>
-        </w:rPr>
-        <w:t xml:space="preserve">Mines Act, </w:t>
-      </w:r>
-      <w:r>
-        <w:rPr>
-          <w:rFonts w:ascii="BC Sans" w:hAnsi="BC Sans"/>
-        </w:rPr>
-        <w:t xml:space="preserve">it has been assessed </w:t>
-      </w:r>
-      <w:r>
-        <w:rPr>
-          <w:rFonts w:ascii="BC Sans" w:hAnsi="BC Sans"/>
-        </w:rPr>
-        <w:t>that you are required to</w:t>
-      </w:r>
-      <w:r>
-        <w:rPr>
-          <w:rFonts w:ascii="BC Sans" w:hAnsi="BC Sans"/>
-        </w:rPr>
-        <w:t xml:space="preserve"> post </w:t>
-      </w:r>
-      <w:r>
-        <w:rPr>
-          <w:rFonts w:ascii="BC Sans" w:hAnsi="BC Sans"/>
-        </w:rPr>
-        <w:t>financial</w:t>
-      </w:r>
-      <w:r>
-        <w:rPr>
-          <w:rFonts w:ascii="BC Sans" w:hAnsi="BC Sans"/>
-        </w:rPr>
-        <w:t xml:space="preserve"> security in the amount of</w:t>
-      </w:r>
-      <w:r>
-        <w:rPr>
-          <w:rFonts w:ascii="BC Sans" w:hAnsi="BC Sans"/>
-        </w:rPr>
-        <w:t xml:space="preserve"> </w:t>
-      </w:r>
-      <w:r>
-        <w:rPr>
-          <w:rFonts w:ascii="BC Sans" w:hAnsi="BC Sans"/>
-        </w:rPr>
-        <w:t>${</w:t>
-      </w:r>
-      <w:proofErr w:type="spellStart"/>
-      <w:proofErr w:type="gramStart"/>
-      <w:r>
-        <w:rPr>
-          <w:rFonts w:ascii="BC Sans" w:hAnsi="BC Sans"/>
-        </w:rPr>
-        <w:t>d.bond</w:t>
-      </w:r>
-      <w:proofErr w:type="gramEnd"/>
-      <w:r>
-        <w:rPr>
-          <w:rFonts w:ascii="BC Sans" w:hAnsi="BC Sans"/>
-        </w:rPr>
-        <w:t>_inc_</w:t>
-      </w:r>
-      <w:proofErr w:type="gramStart"/>
-      <w:r>
-        <w:rPr>
-          <w:rFonts w:ascii="BC Sans" w:hAnsi="BC Sans"/>
-        </w:rPr>
-        <w:t>amt:formatN</w:t>
-      </w:r>
-      <w:proofErr w:type="spellEnd"/>
-      <w:proofErr w:type="gramEnd"/>
-      <w:r>
-        <w:rPr>
-          <w:rFonts w:ascii="BC Sans" w:hAnsi="BC Sans"/>
-        </w:rPr>
-        <w:t>(</w:t>
-      </w:r>
-      <w:proofErr w:type="gramStart"/>
-      <w:r>
-        <w:rPr>
-          <w:rFonts w:ascii="BC Sans" w:hAnsi="BC Sans"/>
-        </w:rPr>
-        <w:t>2)}</w:t>
-      </w:r>
-      <w:proofErr w:type="gramEnd"/>
-      <w:r>
-        <w:rPr>
-          <w:rFonts w:ascii="BC Sans" w:hAnsi="BC Sans"/>
-        </w:rPr>
-        <w:t>.</w:t>
-      </w:r>
+        </w:rPr>
+      </w:pPr>
     </w:p>
     <w:p>
       <w:pPr>
         <w:pStyle w:val="NoSpacing"/>
         <w:jc w:val="both"/>
         <w:rPr>
-          <w:rStyle w:val="Strong"/>
-          <w:rFonts w:ascii="BC Sans" w:hAnsi="BC Sans"/>
-          <w:b w:val="0"/>
-          <w:bCs w:val="0"/>
-        </w:rPr>
-      </w:pPr>
+          <w:rFonts w:ascii="BC Sans" w:hAnsi="BC Sans" w:cs="Calibri"/>
+          <w:color w:val="000000" w:themeColor="text1"/>
+        </w:rPr>
+      </w:pPr>
+      <w:r>
+        <w:rPr>
+          <w:rFonts w:ascii="BC Sans" w:hAnsi="BC Sans"/>
+          <w:color w:val="FF0000"/>
+        </w:rPr>
+        <w:t xml:space="preserve">OPTIONAL </w:t>
+      </w:r>
+      <w:r>
+        <w:rPr>
+          <w:rFonts w:ascii="BC Sans" w:hAnsi="BC Sans" w:cs="Calibri"/>
+          <w:color w:val="000000" w:themeColor="text1"/>
+        </w:rPr>
+        <w:t xml:space="preserve">The </w:t>
+      </w:r>
+      <w:r>
+        <w:rPr>
+          <w:rFonts w:ascii="BC Sans" w:hAnsi="BC Sans" w:cs="Calibri"/>
+          <w:color w:val="000000" w:themeColor="text1"/>
+        </w:rPr>
+        <w:t xml:space="preserve">reclamation security </w:t>
+      </w:r>
+      <w:r>
+        <w:rPr>
+          <w:rFonts w:ascii="BC Sans" w:hAnsi="BC Sans" w:cs="Calibri"/>
+          <w:color w:val="000000" w:themeColor="text1"/>
+        </w:rPr>
+        <w:t>calculation</w:t>
+      </w:r>
+      <w:r>
+        <w:rPr>
+          <w:rFonts w:ascii="BC Sans" w:hAnsi="BC Sans" w:cs="Calibri"/>
+          <w:color w:val="000000" w:themeColor="text1"/>
+        </w:rPr>
+        <w:t xml:space="preserve"> </w:t>
+      </w:r>
+      <w:r>
+        <w:rPr>
+          <w:rFonts w:ascii="BC Sans" w:hAnsi="BC Sans" w:cs="Calibri"/>
+          <w:color w:val="000000" w:themeColor="text1"/>
+        </w:rPr>
+        <w:t xml:space="preserve">for </w:t>
+      </w:r>
+      <w:r>
+        <w:rPr>
+          <w:rFonts w:ascii="BC Sans" w:hAnsi="BC Sans" w:cs="Calibri"/>
+          <w:color w:val="000000" w:themeColor="text1"/>
+        </w:rPr>
+        <w:t>this application is included with this correspondence.</w:t>
+      </w:r>
     </w:p>
     <w:p>
       <w:pPr>
         <w:pStyle w:val="NoSpacing"/>
         <w:jc w:val="both"/>
         <w:rPr>
-          <w:rFonts w:ascii="BC Sans" w:hAnsi="BC Sans" w:cs="Calibri"/>
-          <w:color w:val="000000" w:themeColor="text1"/>
-        </w:rPr>
-      </w:pPr>
-      <w:r>
-        <w:rPr>
-          <w:rFonts w:ascii="BC Sans" w:hAnsi="BC Sans"/>
-          <w:color w:val="FF0000"/>
-        </w:rPr>
-        <w:t xml:space="preserve">OPTIONAL </w:t>
-      </w:r>
-      <w:r>
-        <w:rPr>
-          <w:rFonts w:ascii="BC Sans" w:hAnsi="BC Sans" w:cs="Calibri"/>
-          <w:color w:val="000000" w:themeColor="text1"/>
-        </w:rPr>
-        <w:t xml:space="preserve">The </w:t>
-      </w:r>
-      <w:r>
-        <w:rPr>
-          <w:rFonts w:ascii="BC Sans" w:hAnsi="BC Sans" w:cs="Calibri"/>
-          <w:color w:val="000000" w:themeColor="text1"/>
-        </w:rPr>
-        <w:t xml:space="preserve">reclamation security </w:t>
-      </w:r>
-      <w:r>
-        <w:rPr>
-          <w:rFonts w:ascii="BC Sans" w:hAnsi="BC Sans" w:cs="Calibri"/>
-          <w:color w:val="000000" w:themeColor="text1"/>
-        </w:rPr>
-        <w:t>calculation</w:t>
-      </w:r>
-      <w:r>
-        <w:rPr>
-          <w:rFonts w:ascii="BC Sans" w:hAnsi="BC Sans" w:cs="Calibri"/>
-          <w:color w:val="000000" w:themeColor="text1"/>
-        </w:rPr>
-        <w:t xml:space="preserve"> </w:t>
-      </w:r>
-      <w:r>
-        <w:rPr>
-          <w:rFonts w:ascii="BC Sans" w:hAnsi="BC Sans" w:cs="Calibri"/>
-          <w:color w:val="000000" w:themeColor="text1"/>
-        </w:rPr>
-        <w:t xml:space="preserve">for </w:t>
-      </w:r>
-      <w:r>
-        <w:rPr>
-          <w:rFonts w:ascii="BC Sans" w:hAnsi="BC Sans" w:cs="Calibri"/>
-          <w:color w:val="000000" w:themeColor="text1"/>
-        </w:rPr>
-        <w:t>this application is included with this correspondence.</w:t>
-      </w:r>
+          <w:rFonts w:ascii="BC Sans" w:hAnsi="BC Sans"/>
+        </w:rPr>
+      </w:pPr>
     </w:p>
     <w:p>
       <w:pPr>
@@ -2737,8 +2381,205 @@
         <w:jc w:val="both"/>
         <w:rPr>
           <w:rFonts w:ascii="BC Sans" w:hAnsi="BC Sans"/>
-        </w:rPr>
-      </w:pPr>
+          <w:lang w:val="en-CA"/>
+        </w:rPr>
+      </w:pPr>
+      <w:r>
+        <w:rPr>
+          <w:rFonts w:ascii="BC Sans" w:hAnsi="BC Sans"/>
+        </w:rPr>
+        <w:t xml:space="preserve">To avoid delays, </w:t>
+      </w:r>
+      <w:r>
+        <w:rPr>
+          <w:rFonts w:ascii="BC Sans" w:hAnsi="BC Sans"/>
+        </w:rPr>
+        <w:t xml:space="preserve">please </w:t>
+      </w:r>
+      <w:r>
+        <w:rPr>
+          <w:rFonts w:ascii="BC Sans" w:hAnsi="BC Sans"/>
+        </w:rPr>
+        <w:t xml:space="preserve">arrange </w:t>
+      </w:r>
+      <w:r>
+        <w:rPr>
+          <w:rFonts w:ascii="BC Sans" w:hAnsi="BC Sans"/>
+        </w:rPr>
+        <w:t xml:space="preserve">for </w:t>
+      </w:r>
+      <w:r>
+        <w:rPr>
+          <w:rFonts w:ascii="BC Sans" w:hAnsi="BC Sans"/>
+        </w:rPr>
+        <w:t xml:space="preserve">your security </w:t>
+      </w:r>
+      <w:r>
+        <w:rPr>
+          <w:rFonts w:ascii="BC Sans" w:hAnsi="BC Sans"/>
+        </w:rPr>
+        <w:t>deposit</w:t>
+      </w:r>
+      <w:r>
+        <w:rPr>
+          <w:rFonts w:ascii="BC Sans" w:hAnsi="BC Sans"/>
+        </w:rPr>
+        <w:t xml:space="preserve"> to be provided at this time</w:t>
+      </w:r>
+      <w:r>
+        <w:rPr>
+          <w:rFonts w:ascii="BC Sans" w:hAnsi="BC Sans"/>
+        </w:rPr>
+        <w:t xml:space="preserve">. </w:t>
+      </w:r>
+      <w:r>
+        <w:rPr>
+          <w:rFonts w:ascii="BC Sans" w:hAnsi="BC Sans"/>
+        </w:rPr>
+        <w:t>Acceptable types of reclamation security</w:t>
+      </w:r>
+      <w:r>
+        <w:rPr>
+          <w:rFonts w:ascii="BC Sans" w:hAnsi="BC Sans"/>
+        </w:rPr>
+        <w:t xml:space="preserve"> a</w:t>
+      </w:r>
+      <w:r>
+        <w:rPr>
+          <w:rFonts w:ascii="BC Sans" w:hAnsi="BC Sans"/>
+        </w:rPr>
+        <w:t>re</w:t>
+      </w:r>
+      <w:r>
+        <w:rPr>
+          <w:rFonts w:ascii="BC Sans" w:hAnsi="BC Sans"/>
+        </w:rPr>
+        <w:t xml:space="preserve"> described </w:t>
+      </w:r>
+      <w:r>
+        <w:rPr>
+          <w:rFonts w:ascii="BC Sans" w:hAnsi="BC Sans"/>
+        </w:rPr>
+        <w:t>i</w:t>
+      </w:r>
+      <w:r>
+        <w:rPr>
+          <w:rFonts w:ascii="BC Sans" w:hAnsi="BC Sans"/>
+        </w:rPr>
+        <w:t xml:space="preserve">n </w:t>
+      </w:r>
+      <w:r>
+        <w:rPr>
+          <w:rFonts w:ascii="BC Sans" w:hAnsi="BC Sans"/>
+        </w:rPr>
+        <w:t xml:space="preserve">the </w:t>
+      </w:r>
+      <w:r>
+        <w:rPr>
+          <w:rFonts w:ascii="BC Sans" w:hAnsi="BC Sans"/>
+          <w:b/>
+          <w:bCs/>
+        </w:rPr>
+        <w:t xml:space="preserve">Reclamation </w:t>
+      </w:r>
+      <w:r>
+        <w:rPr>
+          <w:rFonts w:ascii="BC Sans" w:hAnsi="BC Sans"/>
+          <w:b/>
+          <w:bCs/>
+        </w:rPr>
+        <w:t>s</w:t>
+      </w:r>
+      <w:r>
+        <w:rPr>
+          <w:rFonts w:ascii="BC Sans" w:hAnsi="BC Sans"/>
+          <w:b/>
+          <w:bCs/>
+        </w:rPr>
+        <w:t>ecurity</w:t>
+      </w:r>
+      <w:r>
+        <w:rPr>
+          <w:rFonts w:ascii="BC Sans" w:hAnsi="BC Sans"/>
+        </w:rPr>
+        <w:t xml:space="preserve"> </w:t>
+      </w:r>
+      <w:r>
+        <w:rPr>
+          <w:rFonts w:ascii="BC Sans" w:hAnsi="BC Sans"/>
+          <w:b/>
+          <w:bCs/>
+        </w:rPr>
+        <w:t xml:space="preserve">for </w:t>
+      </w:r>
+      <w:r>
+        <w:rPr>
+          <w:rFonts w:ascii="BC Sans" w:hAnsi="BC Sans"/>
+          <w:b/>
+          <w:bCs/>
+        </w:rPr>
+        <w:t>m</w:t>
+      </w:r>
+      <w:r>
+        <w:rPr>
+          <w:rFonts w:ascii="BC Sans" w:hAnsi="BC Sans"/>
+          <w:b/>
+          <w:bCs/>
+        </w:rPr>
+        <w:t>ines in B</w:t>
+      </w:r>
+      <w:r>
+        <w:rPr>
+          <w:rFonts w:ascii="BC Sans" w:hAnsi="BC Sans"/>
+          <w:b/>
+          <w:bCs/>
+        </w:rPr>
+        <w:t>ritish Columbia</w:t>
+      </w:r>
+      <w:r>
+        <w:rPr>
+          <w:rFonts w:ascii="BC Sans" w:hAnsi="BC Sans"/>
+        </w:rPr>
+        <w:t xml:space="preserve"> s</w:t>
+      </w:r>
+      <w:r>
+        <w:rPr>
+          <w:rFonts w:ascii="BC Sans" w:hAnsi="BC Sans"/>
+        </w:rPr>
+        <w:t>ection of our website</w:t>
+      </w:r>
+      <w:r>
+        <w:rPr>
+          <w:rFonts w:ascii="BC Sans" w:hAnsi="BC Sans"/>
+        </w:rPr>
+        <w:t xml:space="preserve">. </w:t>
+      </w:r>
+      <w:r>
+        <w:rPr>
+          <w:rFonts w:ascii="BC Sans" w:hAnsi="BC Sans"/>
+        </w:rPr>
+        <w:t>A</w:t>
+      </w:r>
+      <w:r>
+        <w:rPr>
+          <w:rFonts w:ascii="BC Sans" w:hAnsi="BC Sans"/>
+        </w:rPr>
+        <w:t xml:space="preserve">dditional </w:t>
+      </w:r>
+      <w:r>
+        <w:rPr>
+          <w:rFonts w:ascii="BC Sans" w:hAnsi="BC Sans"/>
+          <w:lang w:val="en-CA"/>
+        </w:rPr>
+        <w:t>information on how reclamation security is calculated</w:t>
+      </w:r>
+      <w:r>
+        <w:rPr>
+          <w:rFonts w:ascii="BC Sans" w:hAnsi="BC Sans"/>
+          <w:lang w:val="en-CA"/>
+        </w:rPr>
+        <w:t xml:space="preserve"> can also be found there.</w:t>
+      </w:r>
     </w:p>
     <w:p>
       <w:pPr>
@@ -2749,208 +2590,6 @@
           <w:lang w:val="en-CA"/>
         </w:rPr>
       </w:pPr>
-      <w:r>
-        <w:rPr>
-          <w:rFonts w:ascii="BC Sans" w:hAnsi="BC Sans"/>
-        </w:rPr>
-        <w:t xml:space="preserve">To avoid delays, </w:t>
-      </w:r>
-      <w:r>
-        <w:rPr>
-          <w:rFonts w:ascii="BC Sans" w:hAnsi="BC Sans"/>
-        </w:rPr>
-        <w:t xml:space="preserve">please </w:t>
-      </w:r>
-      <w:r>
-        <w:rPr>
-          <w:rFonts w:ascii="BC Sans" w:hAnsi="BC Sans"/>
-        </w:rPr>
-        <w:t xml:space="preserve">arrange </w:t>
-      </w:r>
-      <w:r>
-        <w:rPr>
-          <w:rFonts w:ascii="BC Sans" w:hAnsi="BC Sans"/>
-        </w:rPr>
-        <w:t xml:space="preserve">for </w:t>
-      </w:r>
-      <w:r>
-        <w:rPr>
-          <w:rFonts w:ascii="BC Sans" w:hAnsi="BC Sans"/>
-        </w:rPr>
-        <w:t xml:space="preserve">your security </w:t>
-      </w:r>
-      <w:r>
-        <w:rPr>
-          <w:rFonts w:ascii="BC Sans" w:hAnsi="BC Sans"/>
-        </w:rPr>
-        <w:t>deposit</w:t>
-      </w:r>
-      <w:r>
-        <w:rPr>
-          <w:rFonts w:ascii="BC Sans" w:hAnsi="BC Sans"/>
-        </w:rPr>
-        <w:t xml:space="preserve"> to be provided at this time</w:t>
-      </w:r>
-      <w:r>
-        <w:rPr>
-          <w:rFonts w:ascii="BC Sans" w:hAnsi="BC Sans"/>
-        </w:rPr>
-        <w:t xml:space="preserve">. </w:t>
-      </w:r>
-      <w:r>
-        <w:rPr>
-          <w:rFonts w:ascii="BC Sans" w:hAnsi="BC Sans"/>
-        </w:rPr>
-        <w:t>Acceptable types of reclamation security</w:t>
-      </w:r>
-      <w:r>
-        <w:rPr>
-          <w:rFonts w:ascii="BC Sans" w:hAnsi="BC Sans"/>
-        </w:rPr>
-        <w:t xml:space="preserve"> a</w:t>
-      </w:r>
-      <w:r>
-        <w:rPr>
-          <w:rFonts w:ascii="BC Sans" w:hAnsi="BC Sans"/>
-        </w:rPr>
-        <w:t>re</w:t>
-      </w:r>
-      <w:r>
-        <w:rPr>
-          <w:rFonts w:ascii="BC Sans" w:hAnsi="BC Sans"/>
-        </w:rPr>
-        <w:t xml:space="preserve"> described </w:t>
-      </w:r>
-      <w:r>
-        <w:rPr>
-          <w:rFonts w:ascii="BC Sans" w:hAnsi="BC Sans"/>
-        </w:rPr>
-        <w:t>i</w:t>
-      </w:r>
-      <w:r>
-        <w:rPr>
-          <w:rFonts w:ascii="BC Sans" w:hAnsi="BC Sans"/>
-        </w:rPr>
-        <w:t xml:space="preserve">n </w:t>
-      </w:r>
-      <w:r>
-        <w:rPr>
-          <w:rFonts w:ascii="BC Sans" w:hAnsi="BC Sans"/>
-        </w:rPr>
-        <w:t xml:space="preserve">the </w:t>
-      </w:r>
-      <w:r>
-        <w:rPr>
-          <w:rFonts w:ascii="BC Sans" w:hAnsi="BC Sans"/>
-          <w:b/>
-          <w:bCs/>
-        </w:rPr>
-        <w:t xml:space="preserve">Reclamation </w:t>
-      </w:r>
-      <w:r>
-        <w:rPr>
-          <w:rFonts w:ascii="BC Sans" w:hAnsi="BC Sans"/>
-          <w:b/>
-          <w:bCs/>
-        </w:rPr>
-        <w:t>s</w:t>
-      </w:r>
-      <w:r>
-        <w:rPr>
-          <w:rFonts w:ascii="BC Sans" w:hAnsi="BC Sans"/>
-          <w:b/>
-          <w:bCs/>
-        </w:rPr>
-        <w:t>ecurity</w:t>
-      </w:r>
-      <w:r>
-        <w:rPr>
-          <w:rFonts w:ascii="BC Sans" w:hAnsi="BC Sans"/>
-        </w:rPr>
-        <w:t xml:space="preserve"> </w:t>
-      </w:r>
-      <w:r>
-        <w:rPr>
-          <w:rFonts w:ascii="BC Sans" w:hAnsi="BC Sans"/>
-          <w:b/>
-          <w:bCs/>
-        </w:rPr>
-        <w:t xml:space="preserve">for </w:t>
-      </w:r>
-      <w:r>
-        <w:rPr>
-          <w:rFonts w:ascii="BC Sans" w:hAnsi="BC Sans"/>
-          <w:b/>
-          <w:bCs/>
-        </w:rPr>
-        <w:t>m</w:t>
-      </w:r>
-      <w:r>
-        <w:rPr>
-          <w:rFonts w:ascii="BC Sans" w:hAnsi="BC Sans"/>
-          <w:b/>
-          <w:bCs/>
-        </w:rPr>
-        <w:t>ines in B</w:t>
-      </w:r>
-      <w:r>
-        <w:rPr>
-          <w:rFonts w:ascii="BC Sans" w:hAnsi="BC Sans"/>
-          <w:b/>
-          <w:bCs/>
-        </w:rPr>
-        <w:t>ritish Columbia</w:t>
-      </w:r>
-      <w:r>
-        <w:rPr>
-          <w:rFonts w:ascii="BC Sans" w:hAnsi="BC Sans"/>
-        </w:rPr>
-        <w:t xml:space="preserve"> </w:t>
-      </w:r>
-      <w:r>
-        <w:rPr>
-          <w:rFonts w:ascii="BC Sans" w:hAnsi="BC Sans"/>
-        </w:rPr>
-        <w:t>s</w:t>
-      </w:r>
-      <w:r>
-        <w:rPr>
-          <w:rFonts w:ascii="BC Sans" w:hAnsi="BC Sans"/>
-        </w:rPr>
-        <w:t>ection of our website</w:t>
-      </w:r>
-      <w:r>
-        <w:rPr>
-          <w:rFonts w:ascii="BC Sans" w:hAnsi="BC Sans"/>
-        </w:rPr>
-        <w:t xml:space="preserve">. </w:t>
-      </w:r>
-      <w:r>
-        <w:rPr>
-          <w:rFonts w:ascii="BC Sans" w:hAnsi="BC Sans"/>
-        </w:rPr>
-        <w:t>A</w:t>
-      </w:r>
-      <w:r>
-        <w:rPr>
-          <w:rFonts w:ascii="BC Sans" w:hAnsi="BC Sans"/>
-        </w:rPr>
-        <w:t xml:space="preserve">dditional </w:t>
-      </w:r>
-      <w:r>
-        <w:rPr>
-          <w:rFonts w:ascii="BC Sans" w:hAnsi="BC Sans"/>
-          <w:lang w:val="en-CA"/>
-        </w:rPr>
-        <w:t>information on how reclamation security is calculated</w:t>
-      </w:r>
-      <w:r>
-        <w:rPr>
-          <w:rFonts w:ascii="BC Sans" w:hAnsi="BC Sans"/>
-          <w:lang w:val="en-CA"/>
-        </w:rPr>
-        <w:t xml:space="preserve"> can also be found there.</w:t>
-      </w:r>
     </w:p>
     <w:p>
       <w:pPr>
@@ -2958,16 +2597,6 @@
         <w:jc w:val="both"/>
         <w:rPr>
           <w:rFonts w:ascii="BC Sans" w:hAnsi="BC Sans"/>
-          <w:lang w:val="en-CA"/>
-        </w:rPr>
-      </w:pPr>
-    </w:p>
-    <w:p>
-      <w:pPr>
-        <w:pStyle w:val="NoSpacing"/>
-        <w:jc w:val="both"/>
-        <w:rPr>
-          <w:rFonts w:ascii="BC Sans" w:hAnsi="BC Sans"/>
         </w:rPr>
       </w:pPr>
       <w:r>
@@ -2982,14 +2611,12 @@
         </w:rPr>
         <w:t xml:space="preserve"> mail </w:t>
       </w:r>
-      <w:proofErr w:type="gramStart"/>
       <w:r>
         <w:rPr>
           <w:rFonts w:ascii="BC Sans" w:hAnsi="BC Sans"/>
         </w:rPr>
         <w:t>all reclamation</w:t>
       </w:r>
-      <w:proofErr w:type="gramEnd"/>
       <w:r>
         <w:rPr>
           <w:rFonts w:ascii="BC Sans" w:hAnsi="BC Sans"/>
@@ -3269,20 +2896,7 @@
           <w:szCs w:val="22"/>
           <w:lang w:val="en-CA"/>
         </w:rPr>
-        <w:t xml:space="preserve">other applicable </w:t>
-      </w:r>
-      <w:r>
-        <w:rPr>
-          <w:rFonts w:ascii="BC Sans" w:eastAsia="Calibri" w:hAnsi="BC Sans" w:cs="Arial"/>
-          <w:b/>
-          <w:bCs/>
-          <w:kern w:val="2"/>
-          <w:sz w:val="22"/>
-          <w:szCs w:val="22"/>
-          <w:lang w:val="en-CA"/>
-        </w:rPr>
-        <w:lastRenderedPageBreak/>
-        <w:t>legislation</w:t>
+        <w:t>other applicable legislation</w:t>
       </w:r>
       <w:r>
         <w:rPr>
@@ -3349,12 +2963,13 @@
           <w:rFonts w:ascii="BC Sans" w:hAnsi="BC Sans"/>
         </w:rPr>
       </w:pPr>
-      <w:bookmarkStart w:id="5" w:name="_Hlk152249434"/>
+      <w:bookmarkStart w:id="6" w:name="_Hlk152249434"/>
       <w:r>
         <w:rPr>
           <w:rFonts w:ascii="BC Sans" w:hAnsi="BC Sans"/>
           <w:color w:val="FF0000"/>
         </w:rPr>
+        <w:lastRenderedPageBreak/>
         <w:t>OPTIONAL</w:t>
       </w:r>
       <w:r>
@@ -3389,7 +3004,7 @@
         </w:rPr>
         <w:t xml:space="preserve">industrial and </w:t>
       </w:r>
-      <w:bookmarkStart w:id="6" w:name="_Int_TdCegxRL"/>
+      <w:bookmarkStart w:id="7" w:name="_Int_TdCegxRL"/>
       <w:proofErr w:type="gramStart"/>
       <w:r>
         <w:rPr>
@@ -3415,7 +3030,7 @@
         </w:rPr>
         <w:t>risk</w:t>
       </w:r>
-      <w:bookmarkEnd w:id="6"/>
+      <w:bookmarkEnd w:id="7"/>
       <w:proofErr w:type="gramEnd"/>
       <w:r>
         <w:rPr>
@@ -4056,9 +3671,8 @@
           <w:color w:val="auto"/>
           <w:u w:val="none"/>
         </w:rPr>
-        <w:t xml:space="preserve">It is your responsibility to have all necessary </w:t>
-      </w:r>
-      <w:proofErr w:type="gramStart"/>
+        <w:t>It is your responsibility to have all necessary authorizations in place for the operation of an industrial camp</w:t>
+      </w:r>
       <w:r>
         <w:rPr>
           <w:rStyle w:val="Hyperlink"/>
@@ -4066,29 +3680,10 @@
           <w:color w:val="auto"/>
           <w:u w:val="none"/>
         </w:rPr>
-        <w:t>authorizations</w:t>
-      </w:r>
-      <w:proofErr w:type="gramEnd"/>
-      <w:r>
-        <w:rPr>
-          <w:rStyle w:val="Hyperlink"/>
-          <w:rFonts w:ascii="BC Sans" w:hAnsi="BC Sans" w:cs="Calibri"/>
-          <w:color w:val="auto"/>
-          <w:u w:val="none"/>
-        </w:rPr>
-        <w:t xml:space="preserve"> in place for the operation of an industrial camp</w:t>
-      </w:r>
-      <w:r>
-        <w:rPr>
-          <w:rStyle w:val="Hyperlink"/>
-          <w:rFonts w:ascii="BC Sans" w:hAnsi="BC Sans" w:cs="Calibri"/>
-          <w:color w:val="auto"/>
-          <w:u w:val="none"/>
-        </w:rPr>
         <w:t>.</w:t>
       </w:r>
     </w:p>
-    <w:bookmarkEnd w:id="5"/>
+    <w:bookmarkEnd w:id="6"/>
     <w:p>
       <w:pPr>
         <w:pStyle w:val="NoSpacing"/>
@@ -4243,16 +3838,8 @@
               <w:rPr>
                 <w:rFonts w:ascii="BC Sans" w:hAnsi="BC Sans"/>
               </w:rPr>
-              <w:t xml:space="preserve">Forest </w:t>
+              <w:t>Forest licensee</w:t>
             </w:r>
-            <w:proofErr w:type="gramStart"/>
-            <w:r>
-              <w:rPr>
-                <w:rFonts w:ascii="BC Sans" w:hAnsi="BC Sans"/>
-              </w:rPr>
-              <w:t>licensee</w:t>
-            </w:r>
-            <w:proofErr w:type="gramEnd"/>
           </w:p>
           <w:p>
             <w:pPr>
@@ -4470,16 +4057,8 @@
               <w:rPr>
                 <w:rFonts w:ascii="BC Sans" w:hAnsi="BC Sans"/>
               </w:rPr>
-              <w:t xml:space="preserve">transmission </w:t>
+              <w:t>transmission line</w:t>
             </w:r>
-            <w:proofErr w:type="gramStart"/>
-            <w:r>
-              <w:rPr>
-                <w:rFonts w:ascii="BC Sans" w:hAnsi="BC Sans"/>
-              </w:rPr>
-              <w:t>line</w:t>
-            </w:r>
-            <w:proofErr w:type="gramEnd"/>
             <w:r>
               <w:rPr>
                 <w:rFonts w:ascii="BC Sans" w:hAnsi="BC Sans"/>
@@ -4496,16 +4075,8 @@
               <w:rPr>
                 <w:rFonts w:ascii="BC Sans" w:hAnsi="BC Sans"/>
               </w:rPr>
-              <w:t xml:space="preserve">or other energy tenure </w:t>
+              <w:t>or other energy tenure holder</w:t>
             </w:r>
-            <w:proofErr w:type="gramStart"/>
-            <w:r>
-              <w:rPr>
-                <w:rFonts w:ascii="BC Sans" w:hAnsi="BC Sans"/>
-              </w:rPr>
-              <w:t>holder</w:t>
-            </w:r>
-            <w:proofErr w:type="gramEnd"/>
           </w:p>
           <w:p>
             <w:pPr>
@@ -4570,6 +4141,7 @@
           <w:rFonts w:ascii="BC Sans" w:hAnsi="BC Sans"/>
           <w:color w:val="FF0000"/>
         </w:rPr>
+        <w:lastRenderedPageBreak/>
         <w:t>OPTIONAL</w:t>
       </w:r>
       <w:r>
@@ -4650,13 +4222,87 @@
         <w:rPr>
           <w:rFonts w:ascii="BC Sans" w:hAnsi="BC Sans"/>
         </w:rPr>
+        <w:t xml:space="preserve"> with </w:t>
+      </w:r>
+      <w:r>
+        <w:rPr>
+          <w:rFonts w:ascii="BC Sans" w:hAnsi="BC Sans"/>
+          <w:color w:val="FF0000"/>
+        </w:rPr>
+        <w:t>(</w:t>
+      </w:r>
+      <w:r>
+        <w:rPr>
+          <w:rFonts w:ascii="BC Sans" w:hAnsi="BC Sans"/>
+          <w:color w:val="FF0000"/>
+        </w:rPr>
+        <w:t xml:space="preserve">GUIDE OUTFITTER </w:t>
+      </w:r>
+      <w:r>
+        <w:rPr>
+          <w:rFonts w:ascii="BC Sans" w:hAnsi="BC Sans"/>
+          <w:color w:val="FF0000"/>
+        </w:rPr>
+        <w:t>GUIDE_</w:t>
+      </w:r>
+      <w:r>
+        <w:rPr>
+          <w:rFonts w:ascii="BC Sans" w:hAnsi="BC Sans"/>
+          <w:color w:val="FF0000"/>
+        </w:rPr>
+        <w:t>FULL</w:t>
+      </w:r>
+      <w:r>
+        <w:rPr>
+          <w:rFonts w:ascii="BC Sans" w:hAnsi="BC Sans"/>
+          <w:color w:val="FF0000"/>
+        </w:rPr>
+        <w:t>_</w:t>
+      </w:r>
+      <w:r>
+        <w:rPr>
+          <w:rFonts w:ascii="BC Sans" w:hAnsi="BC Sans"/>
+          <w:color w:val="FF0000"/>
+        </w:rPr>
+        <w:t>NAME</w:t>
+      </w:r>
+      <w:r>
+        <w:rPr>
+          <w:rFonts w:ascii="BC Sans" w:hAnsi="BC Sans"/>
+          <w:color w:val="FF0000"/>
+        </w:rPr>
+        <w:t>)</w:t>
+      </w:r>
+      <w:r>
+        <w:rPr>
+          <w:rFonts w:ascii="BC Sans" w:hAnsi="BC Sans"/>
+          <w:color w:val="FF0000"/>
+        </w:rPr>
         <w:t xml:space="preserve"> </w:t>
       </w:r>
       <w:r>
         <w:rPr>
           <w:rFonts w:ascii="BC Sans" w:hAnsi="BC Sans"/>
         </w:rPr>
-        <w:t xml:space="preserve">with </w:t>
+        <w:t>guide outfitter</w:t>
+      </w:r>
+      <w:r>
+        <w:rPr>
+          <w:rFonts w:ascii="BC Sans" w:hAnsi="BC Sans"/>
+        </w:rPr>
+        <w:t xml:space="preserve"> </w:t>
+      </w:r>
+      <w:r>
+        <w:rPr>
+          <w:rFonts w:ascii="BC Sans" w:hAnsi="BC Sans"/>
+        </w:rPr>
+        <w:t>certificate holder</w:t>
+      </w:r>
+      <w:r>
+        <w:rPr>
+          <w:rFonts w:ascii="BC Sans" w:hAnsi="BC Sans"/>
+        </w:rPr>
+        <w:t xml:space="preserve"> </w:t>
       </w:r>
       <w:r>
         <w:rPr>
@@ -4670,35 +4316,35 @@
           <w:rFonts w:ascii="BC Sans" w:hAnsi="BC Sans"/>
           <w:color w:val="FF0000"/>
         </w:rPr>
-        <w:t xml:space="preserve">GUIDE OUTFITTER </w:t>
+        <w:t>GU</w:t>
       </w:r>
       <w:r>
         <w:rPr>
           <w:rFonts w:ascii="BC Sans" w:hAnsi="BC Sans"/>
           <w:color w:val="FF0000"/>
         </w:rPr>
-        <w:t>GUIDE_</w:t>
+        <w:t>I</w:t>
       </w:r>
       <w:r>
         <w:rPr>
           <w:rFonts w:ascii="BC Sans" w:hAnsi="BC Sans"/>
           <w:color w:val="FF0000"/>
         </w:rPr>
-        <w:t>FULL</w:t>
+        <w:t>DE OUTFITTER CERTIF</w:t>
       </w:r>
       <w:r>
         <w:rPr>
           <w:rFonts w:ascii="BC Sans" w:hAnsi="BC Sans"/>
           <w:color w:val="FF0000"/>
         </w:rPr>
-        <w:t>_</w:t>
+        <w:t>I</w:t>
       </w:r>
       <w:r>
         <w:rPr>
           <w:rFonts w:ascii="BC Sans" w:hAnsi="BC Sans"/>
           <w:color w:val="FF0000"/>
         </w:rPr>
-        <w:t>NAME</w:t>
+        <w:t>CATE NUMBER</w:t>
       </w:r>
       <w:r>
         <w:rPr>
@@ -4710,7 +4356,12 @@
       <w:r>
         <w:rPr>
           <w:rFonts w:ascii="BC Sans" w:hAnsi="BC Sans"/>
-          <w:color w:val="FF0000"/>
+        </w:rPr>
+        <w:t>.</w:t>
+      </w:r>
+      <w:r>
+        <w:rPr>
+          <w:rFonts w:ascii="BC Sans" w:hAnsi="BC Sans"/>
         </w:rPr>
         <w:t xml:space="preserve"> </w:t>
       </w:r>
@@ -4718,98 +4369,7 @@
         <w:rPr>
           <w:rFonts w:ascii="BC Sans" w:hAnsi="BC Sans"/>
         </w:rPr>
-        <w:t>guide outfitter</w:t>
-      </w:r>
-      <w:r>
-        <w:rPr>
-          <w:rFonts w:ascii="BC Sans" w:hAnsi="BC Sans"/>
-        </w:rPr>
-        <w:t xml:space="preserve"> </w:t>
-      </w:r>
-      <w:r>
-        <w:rPr>
-          <w:rFonts w:ascii="BC Sans" w:hAnsi="BC Sans"/>
-        </w:rPr>
-        <w:t>certificate holder</w:t>
-      </w:r>
-      <w:r>
-        <w:rPr>
-          <w:rFonts w:ascii="BC Sans" w:hAnsi="BC Sans"/>
-        </w:rPr>
-        <w:t xml:space="preserve"> </w:t>
-      </w:r>
-      <w:r>
-        <w:rPr>
-          <w:rFonts w:ascii="BC Sans" w:hAnsi="BC Sans"/>
-          <w:color w:val="FF0000"/>
-        </w:rPr>
-        <w:t>(</w:t>
-      </w:r>
-      <w:r>
-        <w:rPr>
-          <w:rFonts w:ascii="BC Sans" w:hAnsi="BC Sans"/>
-          <w:color w:val="FF0000"/>
-        </w:rPr>
-        <w:t>GU</w:t>
-      </w:r>
-      <w:r>
-        <w:rPr>
-          <w:rFonts w:ascii="BC Sans" w:hAnsi="BC Sans"/>
-          <w:color w:val="FF0000"/>
-        </w:rPr>
-        <w:t>I</w:t>
-      </w:r>
-      <w:r>
-        <w:rPr>
-          <w:rFonts w:ascii="BC Sans" w:hAnsi="BC Sans"/>
-          <w:color w:val="FF0000"/>
-        </w:rPr>
-        <w:t>DE OUTFITTER CERTIF</w:t>
-      </w:r>
-      <w:r>
-        <w:rPr>
-          <w:rFonts w:ascii="BC Sans" w:hAnsi="BC Sans"/>
-          <w:color w:val="FF0000"/>
-        </w:rPr>
-        <w:t>I</w:t>
-      </w:r>
-      <w:r>
-        <w:rPr>
-          <w:rFonts w:ascii="BC Sans" w:hAnsi="BC Sans"/>
-          <w:color w:val="FF0000"/>
-        </w:rPr>
-        <w:t>CATE NUMBER</w:t>
-      </w:r>
-      <w:r>
-        <w:rPr>
-          <w:rFonts w:ascii="BC Sans" w:hAnsi="BC Sans"/>
-          <w:color w:val="FF0000"/>
-        </w:rPr>
-        <w:t>)</w:t>
-      </w:r>
-      <w:r>
-        <w:rPr>
-          <w:rFonts w:ascii="BC Sans" w:hAnsi="BC Sans"/>
-        </w:rPr>
-        <w:t>.</w:t>
-      </w:r>
-      <w:r>
-        <w:rPr>
-          <w:rFonts w:ascii="BC Sans" w:hAnsi="BC Sans"/>
-        </w:rPr>
-        <w:t xml:space="preserve"> </w:t>
-      </w:r>
-      <w:r>
-        <w:rPr>
-          <w:rFonts w:ascii="BC Sans" w:hAnsi="BC Sans"/>
-        </w:rPr>
-        <w:t>As</w:t>
-      </w:r>
-      <w:r>
-        <w:rPr>
-          <w:rFonts w:ascii="BC Sans" w:hAnsi="BC Sans"/>
-        </w:rPr>
-        <w:t xml:space="preserve"> noted above, it is your responsibility to </w:t>
+        <w:t xml:space="preserve">As noted above, it is your responsibility to </w:t>
       </w:r>
       <w:r>
         <w:rPr>
@@ -4874,23 +4434,7 @@
           <w:rFonts w:ascii="BC Sans" w:eastAsia="BC Sans" w:hAnsi="BC Sans" w:cs="BC Sans"/>
           <w:color w:val="000000" w:themeColor="text1"/>
         </w:rPr>
-        <w:t xml:space="preserve">, among other legislation, and you are advised to familiarize yourself with the Mines Act and the Code. The Code and its guidance documents are periodically updated. </w:t>
-      </w:r>
-      <w:proofErr w:type="gramStart"/>
-      <w:r>
-        <w:rPr>
-          <w:rFonts w:ascii="BC Sans" w:eastAsia="BC Sans" w:hAnsi="BC Sans" w:cs="BC Sans"/>
-          <w:color w:val="000000" w:themeColor="text1"/>
-        </w:rPr>
-        <w:t>Ensure</w:t>
-      </w:r>
-      <w:proofErr w:type="gramEnd"/>
-      <w:r>
-        <w:rPr>
-          <w:rFonts w:ascii="BC Sans" w:eastAsia="BC Sans" w:hAnsi="BC Sans" w:cs="BC Sans"/>
-          <w:color w:val="000000" w:themeColor="text1"/>
-        </w:rPr>
-        <w:t xml:space="preserve"> to check the Code</w:t>
+        <w:t>, among other legislation, and you are advised to familiarize yourself with the Mines Act and the Code. The Code and its guidance documents are periodically updated. Ensure to check the Code</w:t>
       </w:r>
       <w:r>
         <w:rPr>
@@ -5755,11 +5299,6 @@
           <w:rFonts w:ascii="BC Sans" w:hAnsi="BC Sans" w:cstheme="minorHAnsi"/>
         </w:rPr>
         <w:br/>
-      </w:r>
-      <w:r>
-        <w:rPr>
-          <w:rFonts w:ascii="BC Sans" w:hAnsi="BC Sans" w:cstheme="minorHAnsi"/>
-        </w:rPr>
         <w:t>{</w:t>
       </w:r>
       <w:proofErr w:type="spellStart"/>
@@ -6019,13 +5558,14 @@
   <w:p>
     <w:pPr>
       <w:rPr>
+        <w:rFonts w:asciiTheme="minorHAnsi" w:hAnsiTheme="minorHAnsi" w:cstheme="minorHAnsi"/>
         <w:sz w:val="16"/>
         <w:szCs w:val="16"/>
       </w:rPr>
     </w:pPr>
-    <w:bookmarkStart w:id="7" w:name="OLE_LINK6"/>
-    <w:bookmarkStart w:id="8" w:name="OLE_LINK7"/>
-    <w:bookmarkStart w:id="9" w:name="_Hlk199502121"/>
+    <w:bookmarkStart w:id="8" w:name="OLE_LINK6"/>
+    <w:bookmarkStart w:id="9" w:name="OLE_LINK7"/>
+    <w:bookmarkStart w:id="10" w:name="_Hlk199502121"/>
   </w:p>
   <w:tbl>
     <w:tblPr>
@@ -6090,14 +5630,14 @@
           <w:pPr>
             <w:ind w:left="-90"/>
             <w:rPr>
-              <w:rFonts w:asciiTheme="minorHAnsi" w:hAnsiTheme="minorHAnsi" w:cstheme="minorBidi"/>
+              <w:rFonts w:asciiTheme="minorHAnsi" w:hAnsiTheme="minorHAnsi" w:cstheme="minorHAnsi"/>
               <w:sz w:val="16"/>
               <w:szCs w:val="16"/>
             </w:rPr>
           </w:pPr>
           <w:r>
             <w:rPr>
-              <w:rFonts w:asciiTheme="minorHAnsi" w:hAnsiTheme="minorHAnsi" w:cstheme="minorBidi"/>
+              <w:rFonts w:asciiTheme="minorHAnsi" w:hAnsiTheme="minorHAnsi" w:cstheme="minorHAnsi"/>
               <w:sz w:val="16"/>
               <w:szCs w:val="16"/>
             </w:rPr>
@@ -6108,14 +5648,14 @@
           <w:pPr>
             <w:ind w:left="-90"/>
             <w:rPr>
-              <w:rFonts w:asciiTheme="minorHAnsi" w:hAnsiTheme="minorHAnsi" w:cstheme="minorBidi"/>
+              <w:rFonts w:asciiTheme="minorHAnsi" w:hAnsiTheme="minorHAnsi" w:cstheme="minorHAnsi"/>
               <w:sz w:val="16"/>
               <w:szCs w:val="16"/>
             </w:rPr>
           </w:pPr>
           <w:r>
             <w:rPr>
-              <w:rFonts w:asciiTheme="minorHAnsi" w:hAnsiTheme="minorHAnsi" w:cstheme="minorBidi"/>
+              <w:rFonts w:asciiTheme="minorHAnsi" w:hAnsiTheme="minorHAnsi" w:cstheme="minorHAnsi"/>
               <w:sz w:val="16"/>
               <w:szCs w:val="16"/>
             </w:rPr>
@@ -6159,7 +5699,7 @@
         <w:p>
           <w:pPr>
             <w:rPr>
-              <w:rFonts w:asciiTheme="minorHAnsi" w:hAnsiTheme="minorHAnsi" w:cstheme="minorBidi"/>
+              <w:rFonts w:asciiTheme="minorHAnsi" w:hAnsiTheme="minorHAnsi" w:cstheme="minorHAnsi"/>
               <w:sz w:val="16"/>
               <w:szCs w:val="16"/>
               <w:highlight w:val="yellow"/>
@@ -6167,7 +5707,7 @@
           </w:pPr>
           <w:r>
             <w:rPr>
-              <w:rFonts w:asciiTheme="minorHAnsi" w:hAnsiTheme="minorHAnsi" w:cstheme="minorBidi"/>
+              <w:rFonts w:asciiTheme="minorHAnsi" w:hAnsiTheme="minorHAnsi" w:cstheme="minorHAnsi"/>
               <w:sz w:val="16"/>
               <w:szCs w:val="16"/>
             </w:rPr>
@@ -6176,7 +5716,7 @@
           <w:proofErr w:type="spellStart"/>
           <w:r>
             <w:rPr>
-              <w:rFonts w:asciiTheme="minorHAnsi" w:hAnsiTheme="minorHAnsi" w:cstheme="minorBidi"/>
+              <w:rFonts w:asciiTheme="minorHAnsi" w:hAnsiTheme="minorHAnsi" w:cstheme="minorHAnsi"/>
               <w:sz w:val="16"/>
               <w:szCs w:val="16"/>
             </w:rPr>
@@ -6185,7 +5725,7 @@
           <w:proofErr w:type="spellEnd"/>
           <w:r>
             <w:rPr>
-              <w:rFonts w:asciiTheme="minorHAnsi" w:hAnsiTheme="minorHAnsi" w:cstheme="minorBidi"/>
+              <w:rFonts w:asciiTheme="minorHAnsi" w:hAnsiTheme="minorHAnsi" w:cstheme="minorHAnsi"/>
               <w:sz w:val="16"/>
               <w:szCs w:val="16"/>
             </w:rPr>
@@ -6193,7 +5733,7 @@
           </w:r>
           <w:r>
             <w:rPr>
-              <w:rFonts w:asciiTheme="minorHAnsi" w:hAnsiTheme="minorHAnsi" w:cstheme="minorBidi"/>
+              <w:rFonts w:asciiTheme="minorHAnsi" w:hAnsiTheme="minorHAnsi" w:cstheme="minorHAnsi"/>
               <w:sz w:val="16"/>
               <w:szCs w:val="16"/>
             </w:rPr>
@@ -6203,7 +5743,7 @@
           <w:proofErr w:type="spellStart"/>
           <w:r>
             <w:rPr>
-              <w:rFonts w:asciiTheme="minorHAnsi" w:hAnsiTheme="minorHAnsi" w:cstheme="minorBidi"/>
+              <w:rFonts w:asciiTheme="minorHAnsi" w:hAnsiTheme="minorHAnsi" w:cstheme="minorHAnsi"/>
               <w:sz w:val="16"/>
               <w:szCs w:val="16"/>
             </w:rPr>
@@ -6212,7 +5752,7 @@
           <w:proofErr w:type="spellEnd"/>
           <w:r>
             <w:rPr>
-              <w:rFonts w:asciiTheme="minorHAnsi" w:hAnsiTheme="minorHAnsi" w:cstheme="minorBidi"/>
+              <w:rFonts w:asciiTheme="minorHAnsi" w:hAnsiTheme="minorHAnsi" w:cstheme="minorHAnsi"/>
               <w:sz w:val="16"/>
               <w:szCs w:val="16"/>
             </w:rPr>
@@ -6228,7 +5768,6 @@
           <w:pPr>
             <w:rPr>
               <w:rFonts w:asciiTheme="minorHAnsi" w:hAnsiTheme="minorHAnsi" w:cstheme="minorHAnsi"/>
-              <w:b/>
               <w:sz w:val="16"/>
               <w:szCs w:val="16"/>
             </w:rPr>
@@ -6262,11 +5801,63 @@
           </w:r>
           <w:r>
             <w:rPr>
-              <w:rFonts w:ascii="Arial" w:hAnsi="Arial" w:cs="Arial"/>
+              <w:rFonts w:asciiTheme="minorHAnsi" w:hAnsiTheme="minorHAnsi" w:cstheme="minorHAnsi"/>
               <w:sz w:val="16"/>
               <w:szCs w:val="16"/>
             </w:rPr>
-            <w:t>{d.rc_office_mailing_address_line_1}</w:t>
+            <w:t>Ministry of MCM</w:t>
+          </w:r>
+        </w:p>
+        <w:p>
+          <w:pPr>
+            <w:rPr>
+              <w:rFonts w:asciiTheme="minorHAnsi" w:hAnsiTheme="minorHAnsi" w:cstheme="minorHAnsi"/>
+              <w:sz w:val="16"/>
+              <w:szCs w:val="16"/>
+            </w:rPr>
+          </w:pPr>
+          <w:r>
+            <w:rPr>
+              <w:rFonts w:asciiTheme="minorHAnsi" w:hAnsiTheme="minorHAnsi" w:cstheme="minorHAnsi"/>
+              <w:sz w:val="16"/>
+              <w:szCs w:val="16"/>
+            </w:rPr>
+            <w:t>1810 Blanshard St.</w:t>
+          </w:r>
+        </w:p>
+        <w:p>
+          <w:pPr>
+            <w:rPr>
+              <w:rFonts w:asciiTheme="minorHAnsi" w:hAnsiTheme="minorHAnsi" w:cstheme="minorHAnsi"/>
+              <w:sz w:val="16"/>
+              <w:szCs w:val="16"/>
+            </w:rPr>
+          </w:pPr>
+          <w:r>
+            <w:rPr>
+              <w:rFonts w:asciiTheme="minorHAnsi" w:hAnsiTheme="minorHAnsi" w:cstheme="minorHAnsi"/>
+              <w:sz w:val="16"/>
+              <w:szCs w:val="16"/>
+            </w:rPr>
+            <w:t xml:space="preserve">PO Box 9320 </w:t>
+          </w:r>
+          <w:proofErr w:type="spellStart"/>
+          <w:r>
+            <w:rPr>
+              <w:rFonts w:asciiTheme="minorHAnsi" w:hAnsiTheme="minorHAnsi" w:cstheme="minorHAnsi"/>
+              <w:sz w:val="16"/>
+              <w:szCs w:val="16"/>
+            </w:rPr>
+            <w:t>Stn</w:t>
+          </w:r>
+          <w:proofErr w:type="spellEnd"/>
+          <w:r>
+            <w:rPr>
+              <w:rFonts w:asciiTheme="minorHAnsi" w:hAnsiTheme="minorHAnsi" w:cstheme="minorHAnsi"/>
+              <w:sz w:val="16"/>
+              <w:szCs w:val="16"/>
+            </w:rPr>
+            <w:t xml:space="preserve"> Prov Govt</w:t>
           </w:r>
         </w:p>
         <w:p>
@@ -6281,23 +5872,23 @@
           <w:r>
             <w:rPr>
               <w:rFonts w:asciiTheme="minorHAnsi" w:hAnsiTheme="minorHAnsi" w:cstheme="minorHAnsi"/>
-              <w:bCs/>
               <w:sz w:val="16"/>
               <w:szCs w:val="16"/>
             </w:rPr>
-            <w:t>{d.rc_office_mailing_address_line_2}</w:t>
+            <w:t>Victoria, BC, V8W 9N3 ATTN: Reclamation Security</w:t>
           </w:r>
         </w:p>
       </w:tc>
     </w:tr>
-    <w:bookmarkEnd w:id="7"/>
     <w:bookmarkEnd w:id="8"/>
     <w:bookmarkEnd w:id="9"/>
+    <w:bookmarkEnd w:id="10"/>
   </w:tbl>
   <w:p>
     <w:pPr>
       <w:pStyle w:val="Footer"/>
       <w:rPr>
+        <w:rFonts w:asciiTheme="minorHAnsi" w:hAnsiTheme="minorHAnsi" w:cstheme="minorHAnsi"/>
         <w:sz w:val="16"/>
         <w:szCs w:val="16"/>
       </w:rPr>
@@ -6661,13 +6252,13 @@
           </w:tabs>
           <w:ind w:left="832" w:firstLine="7088"/>
           <w:rPr>
-            <w:rFonts w:asciiTheme="minorHAnsi" w:hAnsiTheme="minorHAnsi" w:cstheme="minorHAnsi"/>
+            <w:rFonts w:ascii="BC Sans" w:hAnsi="BC Sans" w:cstheme="minorHAnsi"/>
             <w:szCs w:val="24"/>
           </w:rPr>
         </w:pPr>
         <w:r>
           <w:rPr>
-            <w:rFonts w:asciiTheme="minorHAnsi" w:hAnsiTheme="minorHAnsi" w:cstheme="minorHAnsi"/>
+            <w:rFonts w:ascii="BC Sans" w:hAnsi="BC Sans" w:cstheme="minorHAnsi"/>
             <w:noProof/>
             <w:szCs w:val="24"/>
           </w:rPr>
@@ -6783,7 +6374,7 @@
                   <v:stroke joinstyle="miter"/>
                   <v:path gradientshapeok="t" o:connecttype="rect"/>
                 </v:shapetype>
-                <v:shape id="Text Box 2" o:spid="_x0000_s1026" type="#_x0000_t202" style="position:absolute;left:0;text-align:left;margin-left:-14.45pt;margin-top:-11.65pt;width:123.85pt;height:60.5pt;z-index:251658240;visibility:visible;mso-wrap-style:square;mso-wrap-distance-left:9pt;mso-wrap-distance-top:0;mso-wrap-distance-right:9pt;mso-wrap-distance-bottom:0;mso-position-horizontal:absolute;mso-position-horizontal-relative:text;mso-position-vertical:absolute;mso-position-vertical-relative:text;v-text-anchor:top" o:gfxdata="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" fillcolor="white [3201]" stroked="f" strokeweight=".5pt">
+                <v:shape id="Text Box 2" o:spid="_x0000_s1026" type="#_x0000_t202" style="position:absolute;left:0;text-align:left;margin-left:-14.45pt;margin-top:-11.65pt;width:123.85pt;height:60.5pt;z-index:251658240;visibility:visible;mso-wrap-style:square;mso-wrap-distance-left:9pt;mso-wrap-distance-top:0;mso-wrap-distance-right:9pt;mso-wrap-distance-bottom:0;mso-position-horizontal:absolute;mso-position-horizontal-relative:text;mso-position-vertical:absolute;mso-position-vertical-relative:text;v-text-anchor:top" o:gfxdata="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" fillcolor="white [3201]" stroked="f" strokeweight=".5pt">
                   <v:textbox>
                     <w:txbxContent>
                       <w:p>
@@ -6850,14 +6441,14 @@
         </w:r>
         <w:r>
           <w:rPr>
-            <w:rFonts w:asciiTheme="minorHAnsi" w:hAnsiTheme="minorHAnsi" w:cstheme="minorHAnsi"/>
+            <w:rFonts w:ascii="BC Sans" w:hAnsi="BC Sans" w:cstheme="minorHAnsi"/>
             <w:szCs w:val="24"/>
           </w:rPr>
           <w:t xml:space="preserve">Page </w:t>
         </w:r>
         <w:r>
           <w:rPr>
-            <w:rFonts w:asciiTheme="minorHAnsi" w:hAnsiTheme="minorHAnsi" w:cstheme="minorHAnsi"/>
+            <w:rFonts w:ascii="BC Sans" w:hAnsi="BC Sans" w:cstheme="minorHAnsi"/>
             <w:b/>
             <w:bCs/>
             <w:szCs w:val="24"/>
@@ -6866,7 +6457,7 @@
         </w:r>
         <w:r>
           <w:rPr>
-            <w:rFonts w:asciiTheme="minorHAnsi" w:hAnsiTheme="minorHAnsi" w:cstheme="minorHAnsi"/>
+            <w:rFonts w:ascii="BC Sans" w:hAnsi="BC Sans" w:cstheme="minorHAnsi"/>
             <w:b/>
             <w:bCs/>
             <w:szCs w:val="24"/>
@@ -6875,7 +6466,7 @@
         </w:r>
         <w:r>
           <w:rPr>
-            <w:rFonts w:asciiTheme="minorHAnsi" w:hAnsiTheme="minorHAnsi" w:cstheme="minorHAnsi"/>
+            <w:rFonts w:ascii="BC Sans" w:hAnsi="BC Sans" w:cstheme="minorHAnsi"/>
             <w:b/>
             <w:bCs/>
             <w:szCs w:val="24"/>
@@ -6884,7 +6475,7 @@
         </w:r>
         <w:r>
           <w:rPr>
-            <w:rFonts w:asciiTheme="minorHAnsi" w:hAnsiTheme="minorHAnsi" w:cstheme="minorHAnsi"/>
+            <w:rFonts w:ascii="BC Sans" w:hAnsi="BC Sans" w:cstheme="minorHAnsi"/>
             <w:b/>
             <w:bCs/>
             <w:szCs w:val="24"/>
@@ -6893,7 +6484,7 @@
         </w:r>
         <w:r>
           <w:rPr>
-            <w:rFonts w:asciiTheme="minorHAnsi" w:hAnsiTheme="minorHAnsi" w:cstheme="minorHAnsi"/>
+            <w:rFonts w:ascii="BC Sans" w:hAnsi="BC Sans" w:cstheme="minorHAnsi"/>
             <w:b/>
             <w:bCs/>
             <w:szCs w:val="24"/>
@@ -6902,14 +6493,14 @@
         </w:r>
         <w:r>
           <w:rPr>
-            <w:rFonts w:asciiTheme="minorHAnsi" w:hAnsiTheme="minorHAnsi" w:cstheme="minorHAnsi"/>
+            <w:rFonts w:ascii="BC Sans" w:hAnsi="BC Sans" w:cstheme="minorHAnsi"/>
             <w:szCs w:val="24"/>
           </w:rPr>
           <w:t xml:space="preserve"> of </w:t>
         </w:r>
         <w:r>
           <w:rPr>
-            <w:rFonts w:asciiTheme="minorHAnsi" w:hAnsiTheme="minorHAnsi" w:cstheme="minorHAnsi"/>
+            <w:rFonts w:ascii="BC Sans" w:hAnsi="BC Sans" w:cstheme="minorHAnsi"/>
             <w:b/>
             <w:bCs/>
             <w:szCs w:val="24"/>
@@ -6918,7 +6509,7 @@
         </w:r>
         <w:r>
           <w:rPr>
-            <w:rFonts w:asciiTheme="minorHAnsi" w:hAnsiTheme="minorHAnsi" w:cstheme="minorHAnsi"/>
+            <w:rFonts w:ascii="BC Sans" w:hAnsi="BC Sans" w:cstheme="minorHAnsi"/>
             <w:b/>
             <w:bCs/>
             <w:szCs w:val="24"/>
@@ -6927,7 +6518,7 @@
         </w:r>
         <w:r>
           <w:rPr>
-            <w:rFonts w:asciiTheme="minorHAnsi" w:hAnsiTheme="minorHAnsi" w:cstheme="minorHAnsi"/>
+            <w:rFonts w:ascii="BC Sans" w:hAnsi="BC Sans" w:cstheme="minorHAnsi"/>
             <w:b/>
             <w:bCs/>
             <w:szCs w:val="24"/>
@@ -6936,7 +6527,7 @@
         </w:r>
         <w:r>
           <w:rPr>
-            <w:rFonts w:asciiTheme="minorHAnsi" w:hAnsiTheme="minorHAnsi" w:cstheme="minorHAnsi"/>
+            <w:rFonts w:ascii="BC Sans" w:hAnsi="BC Sans" w:cstheme="minorHAnsi"/>
             <w:b/>
             <w:bCs/>
             <w:szCs w:val="24"/>
@@ -6945,7 +6536,7 @@
         </w:r>
         <w:r>
           <w:rPr>
-            <w:rFonts w:asciiTheme="minorHAnsi" w:hAnsiTheme="minorHAnsi" w:cstheme="minorHAnsi"/>
+            <w:rFonts w:ascii="BC Sans" w:hAnsi="BC Sans" w:cstheme="minorHAnsi"/>
             <w:b/>
             <w:bCs/>
             <w:szCs w:val="24"/>

</xml_diff>

<commit_message>
put in placeholder text
</commit_message>
<xml_diff>
--- a/services/core-api/app/templates/now/Acknowledgment Letter.docx
+++ b/services/core-api/app/templates/now/Acknowledgment Letter.docx
@@ -364,8 +364,22 @@
         <w:rPr>
           <w:rFonts w:ascii="BC Sans" w:hAnsi="BC Sans" w:cstheme="minorHAnsi"/>
         </w:rPr>
-        <w:t xml:space="preserve">Copy via electronic mail to </w:t>
-      </w:r>
+        <w:t>Copy via electronic mail to</w:t>
+      </w:r>
+      <w:bookmarkStart w:id="5" w:name="OLE_LINK10"/>
+      <w:r>
+        <w:rPr>
+          <w:rFonts w:ascii="BC Sans" w:hAnsi="BC Sans" w:cstheme="minorHAnsi"/>
+        </w:rPr>
+        <w:t xml:space="preserve"> </w:t>
+      </w:r>
+      <w:r>
+        <w:rPr>
+          <w:rFonts w:ascii="BC Sans" w:hAnsi="BC Sans" w:cstheme="minorHAnsi"/>
+        </w:rPr>
+        <w:t>&lt;APPLICANT EMAIL ADDRESS&gt;</w:t>
+      </w:r>
+      <w:bookmarkEnd w:id="5"/>
     </w:p>
     <w:bookmarkEnd w:id="4"/>
     <w:p>
@@ -385,7 +399,7 @@
           <w:bCs/>
         </w:rPr>
       </w:pPr>
-      <w:bookmarkStart w:id="5" w:name="OLE_LINK4"/>
+      <w:bookmarkStart w:id="6" w:name="OLE_LINK4"/>
       <w:r>
         <w:rPr>
           <w:rFonts w:ascii="BC Sans" w:hAnsi="BC Sans"/>
@@ -520,7 +534,7 @@
           <w:bCs/>
         </w:rPr>
       </w:pPr>
-      <w:bookmarkStart w:id="6" w:name="OLE_LINK3"/>
+      <w:bookmarkStart w:id="7" w:name="OLE_LINK3"/>
       <w:proofErr w:type="gramStart"/>
       <w:r>
         <w:rPr>
@@ -641,7 +655,7 @@
         <w:t>}</w:t>
       </w:r>
     </w:p>
-    <w:bookmarkEnd w:id="6"/>
+    <w:bookmarkEnd w:id="7"/>
     <w:p>
       <w:pPr>
         <w:pStyle w:val="NoSpacing"/>
@@ -697,7 +711,7 @@
         <w:t>}</w:t>
       </w:r>
     </w:p>
-    <w:bookmarkEnd w:id="5"/>
+    <w:bookmarkEnd w:id="6"/>
     <w:p>
       <w:pPr>
         <w:pStyle w:val="NoSpacing"/>
@@ -2032,7 +2046,7 @@
           <w:rFonts w:ascii="BC Sans" w:hAnsi="BC Sans"/>
         </w:rPr>
       </w:pPr>
-      <w:bookmarkStart w:id="7" w:name="OLE_LINK9"/>
+      <w:bookmarkStart w:id="8" w:name="OLE_LINK9"/>
       <w:r>
         <w:rPr>
           <w:rFonts w:ascii="BC Sans" w:hAnsi="BC Sans"/>
@@ -2052,7 +2066,7 @@
         </w:rPr>
         <w:t>Consultation</w:t>
       </w:r>
-      <w:bookmarkEnd w:id="7"/>
+      <w:bookmarkEnd w:id="8"/>
       <w:r>
         <w:rPr>
           <w:rFonts w:ascii="BC Sans" w:hAnsi="BC Sans"/>
@@ -3012,7 +3026,7 @@
           <w:rFonts w:ascii="BC Sans" w:hAnsi="BC Sans"/>
         </w:rPr>
       </w:pPr>
-      <w:bookmarkStart w:id="8" w:name="_Hlk152249434"/>
+      <w:bookmarkStart w:id="9" w:name="_Hlk152249434"/>
       <w:r>
         <w:rPr>
           <w:rFonts w:ascii="BC Sans" w:hAnsi="BC Sans"/>
@@ -3061,7 +3075,7 @@
         <w:lastRenderedPageBreak/>
         <w:t xml:space="preserve">and </w:t>
       </w:r>
-      <w:bookmarkStart w:id="9" w:name="_Int_TdCegxRL"/>
+      <w:bookmarkStart w:id="10" w:name="_Int_TdCegxRL"/>
       <w:proofErr w:type="gramStart"/>
       <w:r>
         <w:rPr>
@@ -3087,7 +3101,7 @@
         </w:rPr>
         <w:t>risk</w:t>
       </w:r>
-      <w:bookmarkEnd w:id="9"/>
+      <w:bookmarkEnd w:id="10"/>
       <w:proofErr w:type="gramEnd"/>
       <w:r>
         <w:rPr>
@@ -3740,7 +3754,7 @@
         <w:t>.</w:t>
       </w:r>
     </w:p>
-    <w:bookmarkEnd w:id="8"/>
+    <w:bookmarkEnd w:id="9"/>
     <w:p>
       <w:pPr>
         <w:pStyle w:val="NoSpacing"/>
@@ -5620,9 +5634,9 @@
         <w:szCs w:val="16"/>
       </w:rPr>
     </w:pPr>
-    <w:bookmarkStart w:id="10" w:name="OLE_LINK6"/>
-    <w:bookmarkStart w:id="11" w:name="OLE_LINK7"/>
-    <w:bookmarkStart w:id="12" w:name="_Hlk199502121"/>
+    <w:bookmarkStart w:id="11" w:name="OLE_LINK6"/>
+    <w:bookmarkStart w:id="12" w:name="OLE_LINK7"/>
+    <w:bookmarkStart w:id="13" w:name="_Hlk199502121"/>
   </w:p>
   <w:tbl>
     <w:tblPr>
@@ -5937,9 +5951,9 @@
         </w:p>
       </w:tc>
     </w:tr>
-    <w:bookmarkEnd w:id="10"/>
     <w:bookmarkEnd w:id="11"/>
     <w:bookmarkEnd w:id="12"/>
+    <w:bookmarkEnd w:id="13"/>
   </w:tbl>
   <w:p>
     <w:pPr>

</xml_diff>

<commit_message>
[MDS-6621] Update Letter Templates (#3653)
* update letter templates

* remove applicant email

* put in placeholder text
</commit_message>
<xml_diff>
--- a/services/core-api/app/templates/now/Acknowledgment Letter.docx
+++ b/services/core-api/app/templates/now/Acknowledgment Letter.docx
@@ -349,66 +349,46 @@
       <w:pPr>
         <w:pStyle w:val="NoSpacing"/>
         <w:rPr>
-          <w:rFonts w:ascii="BC Sans" w:hAnsi="BC Sans"/>
-          <w:b/>
-          <w:bCs/>
-        </w:rPr>
-      </w:pPr>
-      <w:bookmarkStart w:id="4" w:name="OLE_LINK4"/>
-      <w:r>
-        <w:rPr>
-          <w:rFonts w:ascii="BC Sans" w:hAnsi="BC Sans"/>
-          <w:b/>
-          <w:bCs/>
-        </w:rPr>
-        <w:t xml:space="preserve">Re: </w:t>
-      </w:r>
-      <w:r>
-        <w:rPr>
-          <w:rFonts w:ascii="BC Sans" w:hAnsi="BC Sans"/>
-        </w:rPr>
-        <w:tab/>
-      </w:r>
-      <w:r>
-        <w:rPr>
-          <w:rFonts w:ascii="BC Sans" w:hAnsi="BC Sans"/>
-          <w:b/>
-          <w:bCs/>
-        </w:rPr>
-        <w:t xml:space="preserve">Application </w:t>
-      </w:r>
-      <w:r>
-        <w:rPr>
-          <w:rFonts w:ascii="BC Sans" w:hAnsi="BC Sans"/>
-          <w:b/>
-          <w:bCs/>
-        </w:rPr>
-        <w:t xml:space="preserve">for </w:t>
-      </w:r>
-      <w:r>
-        <w:rPr>
-          <w:rFonts w:ascii="BC Sans" w:hAnsi="BC Sans"/>
-          <w:b/>
-          <w:bCs/>
-        </w:rPr>
-        <w:t xml:space="preserve">a </w:t>
-      </w:r>
-      <w:r>
-        <w:rPr>
-          <w:rFonts w:ascii="BC Sans" w:hAnsi="BC Sans"/>
-          <w:b/>
-          <w:bCs/>
-        </w:rPr>
-        <w:t xml:space="preserve">Mines Act </w:t>
-      </w:r>
-      <w:r>
-        <w:rPr>
-          <w:rFonts w:ascii="BC Sans" w:hAnsi="BC Sans"/>
-          <w:b/>
-          <w:bCs/>
-        </w:rPr>
-        <w:t>permit</w:t>
-      </w:r>
+          <w:rFonts w:ascii="BC Sans" w:hAnsi="BC Sans" w:cstheme="minorHAnsi"/>
+        </w:rPr>
+      </w:pPr>
+      <w:bookmarkStart w:id="4" w:name="OLE_LINK8"/>
+      <w:r>
+        <w:rPr>
+          <w:rFonts w:ascii="BC Sans" w:hAnsi="BC Sans" w:cstheme="minorHAnsi"/>
+          <w:color w:val="EE0000"/>
+        </w:rPr>
+        <w:t xml:space="preserve">OPTIONAL </w:t>
+      </w:r>
+      <w:r>
+        <w:rPr>
+          <w:rFonts w:ascii="BC Sans" w:hAnsi="BC Sans" w:cstheme="minorHAnsi"/>
+        </w:rPr>
+        <w:t>Copy via electronic mail to</w:t>
+      </w:r>
+      <w:bookmarkStart w:id="5" w:name="OLE_LINK10"/>
+      <w:r>
+        <w:rPr>
+          <w:rFonts w:ascii="BC Sans" w:hAnsi="BC Sans" w:cstheme="minorHAnsi"/>
+        </w:rPr>
+        <w:t xml:space="preserve"> </w:t>
+      </w:r>
+      <w:r>
+        <w:rPr>
+          <w:rFonts w:ascii="BC Sans" w:hAnsi="BC Sans" w:cstheme="minorHAnsi"/>
+        </w:rPr>
+        <w:t>&lt;APPLICANT EMAIL ADDRESS&gt;</w:t>
+      </w:r>
+      <w:bookmarkEnd w:id="5"/>
+    </w:p>
+    <w:bookmarkEnd w:id="4"/>
+    <w:p>
+      <w:pPr>
+        <w:pStyle w:val="NoSpacing"/>
+        <w:rPr>
+          <w:rFonts w:ascii="BC Sans" w:hAnsi="BC Sans" w:cstheme="minorHAnsi"/>
+        </w:rPr>
+      </w:pPr>
     </w:p>
     <w:p>
       <w:pPr>
@@ -417,6 +397,71 @@
           <w:rFonts w:ascii="BC Sans" w:hAnsi="BC Sans"/>
           <w:b/>
           <w:bCs/>
+        </w:rPr>
+      </w:pPr>
+      <w:bookmarkStart w:id="6" w:name="OLE_LINK4"/>
+      <w:r>
+        <w:rPr>
+          <w:rFonts w:ascii="BC Sans" w:hAnsi="BC Sans"/>
+          <w:b/>
+          <w:bCs/>
+        </w:rPr>
+        <w:t xml:space="preserve">Re: </w:t>
+      </w:r>
+      <w:r>
+        <w:rPr>
+          <w:rFonts w:ascii="BC Sans" w:hAnsi="BC Sans"/>
+        </w:rPr>
+        <w:tab/>
+      </w:r>
+      <w:r>
+        <w:rPr>
+          <w:rFonts w:ascii="BC Sans" w:hAnsi="BC Sans"/>
+          <w:b/>
+          <w:bCs/>
+        </w:rPr>
+        <w:t xml:space="preserve">Application </w:t>
+      </w:r>
+      <w:r>
+        <w:rPr>
+          <w:rFonts w:ascii="BC Sans" w:hAnsi="BC Sans"/>
+          <w:b/>
+          <w:bCs/>
+        </w:rPr>
+        <w:t xml:space="preserve">for </w:t>
+      </w:r>
+      <w:r>
+        <w:rPr>
+          <w:rFonts w:ascii="BC Sans" w:hAnsi="BC Sans"/>
+          <w:b/>
+          <w:bCs/>
+        </w:rPr>
+        <w:t xml:space="preserve">a </w:t>
+      </w:r>
+      <w:r>
+        <w:rPr>
+          <w:rFonts w:ascii="BC Sans" w:hAnsi="BC Sans"/>
+          <w:b/>
+          <w:bCs/>
+        </w:rPr>
+        <w:t xml:space="preserve">Mines Act </w:t>
+      </w:r>
+      <w:r>
+        <w:rPr>
+          <w:rFonts w:ascii="BC Sans" w:hAnsi="BC Sans"/>
+          <w:b/>
+          <w:bCs/>
+        </w:rPr>
+        <w:t>permit</w:t>
+      </w:r>
+    </w:p>
+    <w:p>
+      <w:pPr>
+        <w:pStyle w:val="NoSpacing"/>
+        <w:rPr>
+          <w:rFonts w:ascii="BC Sans" w:hAnsi="BC Sans"/>
+          <w:b/>
+          <w:bCs/>
           <w:color w:val="000000" w:themeColor="text1"/>
         </w:rPr>
       </w:pPr>
@@ -489,7 +534,7 @@
           <w:bCs/>
         </w:rPr>
       </w:pPr>
-      <w:bookmarkStart w:id="5" w:name="OLE_LINK3"/>
+      <w:bookmarkStart w:id="7" w:name="OLE_LINK3"/>
       <w:proofErr w:type="gramStart"/>
       <w:r>
         <w:rPr>
@@ -610,7 +655,7 @@
         <w:t>}</w:t>
       </w:r>
     </w:p>
-    <w:bookmarkEnd w:id="5"/>
+    <w:bookmarkEnd w:id="7"/>
     <w:p>
       <w:pPr>
         <w:pStyle w:val="NoSpacing"/>
@@ -666,7 +711,7 @@
         <w:t>}</w:t>
       </w:r>
     </w:p>
-    <w:bookmarkEnd w:id="4"/>
+    <w:bookmarkEnd w:id="6"/>
     <w:p>
       <w:pPr>
         <w:pStyle w:val="NoSpacing"/>
@@ -740,7 +785,7 @@
               </wp:anchor>
             </w:drawing>
           </mc:Choice>
-          <mc:Fallback xmlns:a="http://schemas.openxmlformats.org/drawingml/2006/main" xmlns:arto="http://schemas.microsoft.com/office/word/2006/arto">
+          <mc:Fallback xmlns:arto="http://schemas.microsoft.com/office/word/2006/arto" xmlns:a="http://schemas.openxmlformats.org/drawingml/2006/main">
             <w:pict w14:anchorId="5E9A1C54">
               <v:line id="Straight Connector 1" style="position:absolute;z-index:251659264;visibility:visible;mso-wrap-style:square;mso-width-percent:0;mso-height-percent:0;mso-wrap-distance-left:9pt;mso-wrap-distance-top:0;mso-wrap-distance-right:9pt;mso-wrap-distance-bottom:0;mso-position-horizontal:absolute;mso-position-horizontal-relative:margin;mso-position-vertical:absolute;mso-position-vertical-relative:text;mso-width-percent:0;mso-height-percent:0;mso-width-relative:margin;mso-height-relative:margin" o:spid="_x0000_s1026" strokecolor="black [3040]" from="0,12.55pt" to="472.05pt,13.9pt" w14:anchorId="2E3E2B0A" o:gfxdata="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">
                 <w10:wrap anchorx="margin"/>
@@ -1576,7 +1621,7 @@
           <w:color w:val="auto"/>
           <w:u w:val="none"/>
         </w:rPr>
-        <w:t xml:space="preserve">Therefore, be advised that it is your responsibility to apply for </w:t>
+        <w:t xml:space="preserve">Therefore, be advised that it is your </w:t>
       </w:r>
       <w:r>
         <w:rPr>
@@ -1585,6 +1630,16 @@
           <w:color w:val="auto"/>
           <w:u w:val="none"/>
         </w:rPr>
+        <w:lastRenderedPageBreak/>
+        <w:t xml:space="preserve">responsibility to apply for </w:t>
+      </w:r>
+      <w:r>
+        <w:rPr>
+          <w:rStyle w:val="Hyperlink"/>
+          <w:rFonts w:ascii="BC Sans" w:hAnsi="BC Sans"/>
+          <w:color w:val="auto"/>
+          <w:u w:val="none"/>
+        </w:rPr>
         <w:t>an</w:t>
       </w:r>
       <w:r>
@@ -1991,6 +2046,7 @@
           <w:rFonts w:ascii="BC Sans" w:hAnsi="BC Sans"/>
         </w:rPr>
       </w:pPr>
+      <w:bookmarkStart w:id="8" w:name="OLE_LINK9"/>
       <w:r>
         <w:rPr>
           <w:rFonts w:ascii="BC Sans" w:hAnsi="BC Sans"/>
@@ -2008,7 +2064,14 @@
         <w:rPr>
           <w:rFonts w:ascii="BC Sans" w:hAnsi="BC Sans"/>
         </w:rPr>
-        <w:t xml:space="preserve">Consultation with </w:t>
+        <w:t>Consultation</w:t>
+      </w:r>
+      <w:bookmarkEnd w:id="8"/>
+      <w:r>
+        <w:rPr>
+          <w:rFonts w:ascii="BC Sans" w:hAnsi="BC Sans"/>
+        </w:rPr>
+        <w:t xml:space="preserve"> with </w:t>
       </w:r>
       <w:r>
         <w:rPr>
@@ -2963,48 +3026,56 @@
           <w:rFonts w:ascii="BC Sans" w:hAnsi="BC Sans"/>
         </w:rPr>
       </w:pPr>
-      <w:bookmarkStart w:id="6" w:name="_Hlk152249434"/>
+      <w:bookmarkStart w:id="9" w:name="_Hlk152249434"/>
       <w:r>
         <w:rPr>
           <w:rFonts w:ascii="BC Sans" w:hAnsi="BC Sans"/>
           <w:color w:val="FF0000"/>
         </w:rPr>
+        <w:t>OPTIONAL</w:t>
+      </w:r>
+      <w:r>
+        <w:rPr>
+          <w:rFonts w:ascii="BC Sans" w:hAnsi="BC Sans"/>
+        </w:rPr>
+        <w:t xml:space="preserve"> Industrial and commercial operators, including those involved in mining activities, have specific obligations under the Wildfire Act</w:t>
+      </w:r>
+      <w:r>
+        <w:rPr>
+          <w:rFonts w:ascii="BC Sans" w:hAnsi="BC Sans"/>
+        </w:rPr>
+        <w:t xml:space="preserve">. </w:t>
+      </w:r>
+      <w:r>
+        <w:rPr>
+          <w:rFonts w:ascii="BC Sans" w:hAnsi="BC Sans"/>
+        </w:rPr>
+        <w:t>En</w:t>
+      </w:r>
+      <w:r>
+        <w:rPr>
+          <w:rFonts w:ascii="BC Sans" w:hAnsi="BC Sans"/>
+        </w:rPr>
+        <w:t xml:space="preserve">sure you understand the definitions of </w:t>
+      </w:r>
+      <w:r>
+        <w:rPr>
+          <w:rFonts w:ascii="BC Sans" w:hAnsi="BC Sans"/>
+          <w:b/>
+          <w:bCs/>
+        </w:rPr>
+        <w:t xml:space="preserve">industrial </w:t>
+      </w:r>
+      <w:r>
+        <w:rPr>
+          <w:rFonts w:ascii="BC Sans" w:hAnsi="BC Sans"/>
+          <w:b/>
+          <w:bCs/>
+        </w:rPr>
         <w:lastRenderedPageBreak/>
-        <w:t>OPTIONAL</w:t>
-      </w:r>
-      <w:r>
-        <w:rPr>
-          <w:rFonts w:ascii="BC Sans" w:hAnsi="BC Sans"/>
-        </w:rPr>
-        <w:t xml:space="preserve"> Industrial and commercial operators, including those involved in mining activities, have specific obligations under the Wildfire Act</w:t>
-      </w:r>
-      <w:r>
-        <w:rPr>
-          <w:rFonts w:ascii="BC Sans" w:hAnsi="BC Sans"/>
-        </w:rPr>
-        <w:t xml:space="preserve">. </w:t>
-      </w:r>
-      <w:r>
-        <w:rPr>
-          <w:rFonts w:ascii="BC Sans" w:hAnsi="BC Sans"/>
-        </w:rPr>
-        <w:t>En</w:t>
-      </w:r>
-      <w:r>
-        <w:rPr>
-          <w:rFonts w:ascii="BC Sans" w:hAnsi="BC Sans"/>
-        </w:rPr>
-        <w:t xml:space="preserve">sure you understand the definitions of </w:t>
-      </w:r>
-      <w:r>
-        <w:rPr>
-          <w:rFonts w:ascii="BC Sans" w:hAnsi="BC Sans"/>
-          <w:b/>
-          <w:bCs/>
-        </w:rPr>
-        <w:t xml:space="preserve">industrial and </w:t>
-      </w:r>
-      <w:bookmarkStart w:id="7" w:name="_Int_TdCegxRL"/>
+        <w:t xml:space="preserve">and </w:t>
+      </w:r>
+      <w:bookmarkStart w:id="10" w:name="_Int_TdCegxRL"/>
       <w:proofErr w:type="gramStart"/>
       <w:r>
         <w:rPr>
@@ -3030,7 +3101,7 @@
         </w:rPr>
         <w:t>risk</w:t>
       </w:r>
-      <w:bookmarkEnd w:id="7"/>
+      <w:bookmarkEnd w:id="10"/>
       <w:proofErr w:type="gramEnd"/>
       <w:r>
         <w:rPr>
@@ -3683,7 +3754,7 @@
         <w:t>.</w:t>
       </w:r>
     </w:p>
-    <w:bookmarkEnd w:id="6"/>
+    <w:bookmarkEnd w:id="9"/>
     <w:p>
       <w:pPr>
         <w:pStyle w:val="NoSpacing"/>
@@ -4141,7 +4212,6 @@
           <w:rFonts w:ascii="BC Sans" w:hAnsi="BC Sans"/>
           <w:color w:val="FF0000"/>
         </w:rPr>
-        <w:lastRenderedPageBreak/>
         <w:t>OPTIONAL</w:t>
       </w:r>
       <w:r>
@@ -4418,6 +4488,7 @@
           <w:rFonts w:ascii="BC Sans" w:eastAsia="BC Sans" w:hAnsi="BC Sans" w:cs="BC Sans"/>
           <w:color w:val="000000" w:themeColor="text1"/>
         </w:rPr>
+        <w:lastRenderedPageBreak/>
         <w:t xml:space="preserve">Mining activities are regulated by the </w:t>
       </w:r>
       <w:r>
@@ -5563,9 +5634,9 @@
         <w:szCs w:val="16"/>
       </w:rPr>
     </w:pPr>
-    <w:bookmarkStart w:id="8" w:name="OLE_LINK6"/>
-    <w:bookmarkStart w:id="9" w:name="OLE_LINK7"/>
-    <w:bookmarkStart w:id="10" w:name="_Hlk199502121"/>
+    <w:bookmarkStart w:id="11" w:name="OLE_LINK6"/>
+    <w:bookmarkStart w:id="12" w:name="OLE_LINK7"/>
+    <w:bookmarkStart w:id="13" w:name="_Hlk199502121"/>
   </w:p>
   <w:tbl>
     <w:tblPr>
@@ -5880,9 +5951,9 @@
         </w:p>
       </w:tc>
     </w:tr>
-    <w:bookmarkEnd w:id="8"/>
-    <w:bookmarkEnd w:id="9"/>
-    <w:bookmarkEnd w:id="10"/>
+    <w:bookmarkEnd w:id="11"/>
+    <w:bookmarkEnd w:id="12"/>
+    <w:bookmarkEnd w:id="13"/>
   </w:tbl>
   <w:p>
     <w:pPr>
@@ -6405,7 +6476,7 @@
                                       <pic:cNvPicPr/>
                                     </pic:nvPicPr>
                                     <pic:blipFill>
-                                      <a:blip r:embed="rId2">
+                                      <a:blip r:embed="rId1">
                                         <a:extLst>
                                           <a:ext uri="{28A0092B-C50C-407E-A947-70E740481C1C}">
                                             <a14:useLocalDpi xmlns:a14="http://schemas.microsoft.com/office/drawing/2010/main" val="0"/>

</xml_diff>